<commit_message>
style(rmk10): humanize prose voice across Bagian A–D; rebuild docx
Gloss-once not every-mention, dissolve rigid Pertama/Kedua enumerations,
remove scattered bold, cut em-dashes, vary sentence rhythm. Facts, figures,
citations, exhibit/diagram placements, and Cornell structure unchanged.

Co-Authored-By: Claude Opus 4.8 (1M context) <noreply@anthropic.com>
</commit_message>
<xml_diff>
--- a/rmk-pkk-pert10-statement-of-cash-flows/output/01079_Dzaki Muhammad Yusfian_RMK Pert. 10.docx
+++ b/rmk-pkk-pert10-statement-of-cash-flows/output/01079_Dzaki Muhammad Yusfian_RMK Pert. 10.docx
@@ -183,7 +183,7 @@
                 <w:i w:val="0"/>
                 <w:sz w:val="22"/>
               </w:rPr>
-              <w:t>Tesis pembuka: "cash is cash is cash"</w:t>
+              <w:t>Mengapa bab ini dibuka dengan "cash is cash is cash"?</w:t>
             </w:r>
           </w:p>
         </w:tc>
@@ -204,7 +204,7 @@
                 <w:i w:val="0"/>
                 <w:sz w:val="22"/>
               </w:rPr>
-              <w:t xml:space="preserve">Bab ini dibuka dengan anekdot dari musikal </w:t>
+              <w:t xml:space="preserve">Wolk membuka pembahasan dengan anekdot dari musikal </w:t>
             </w:r>
             <w:r>
               <w:rPr>
@@ -222,43 +222,7 @@
                 <w:i w:val="0"/>
                 <w:sz w:val="22"/>
               </w:rPr>
-              <w:t xml:space="preserve"> karya Meredith Willson, tempat para penjaja barang menyerukan jual-beli dengan </w:t>
-            </w:r>
-            <w:r>
-              <w:rPr>
-                <w:rFonts w:ascii="Calibri" w:hAnsi="Calibri" w:cs="Calibri"/>
-                <w:b w:val="0"/>
-                <w:i/>
-                <w:sz w:val="22"/>
-              </w:rPr>
-              <w:t>cash terms</w:t>
-            </w:r>
-            <w:r>
-              <w:rPr>
-                <w:rFonts w:ascii="Calibri" w:hAnsi="Calibri" w:cs="Calibri"/>
-                <w:b w:val="0"/>
-                <w:i w:val="0"/>
-                <w:sz w:val="22"/>
-              </w:rPr>
-              <w:t xml:space="preserve"> (syarat tunai) — "cash for the merchandise, cash for the button hooks". Intinya tegas: tagihan, investasi, utang, dan dividen pada akhirnya dilunasi dengan kas, bukan dengan laba. Perusahaan yang gagal menghasilkan kas yang memadai dalam menjalankan bisnisnya akan menghadapi kepunahan (</w:t>
-            </w:r>
-            <w:r>
-              <w:rPr>
-                <w:rFonts w:ascii="Calibri" w:hAnsi="Calibri" w:cs="Calibri"/>
-                <w:b w:val="0"/>
-                <w:i/>
-                <w:sz w:val="22"/>
-              </w:rPr>
-              <w:t>extinction</w:t>
-            </w:r>
-            <w:r>
-              <w:rPr>
-                <w:rFonts w:ascii="Calibri" w:hAnsi="Calibri" w:cs="Calibri"/>
-                <w:b w:val="0"/>
-                <w:i w:val="0"/>
-                <w:sz w:val="22"/>
-              </w:rPr>
-              <w:t xml:space="preserve">). Daya tarik pelaporan berbasis kas terletak pada kelugasan dan tafsir harfiahnya — "kas adalah kas adalah kas". Inilah premis normatif yang menjustifikasi </w:t>
+              <w:t xml:space="preserve">, ketika para penjaja barang berseru menuntut pembayaran tunai atas dagangan mereka. Maksudnya satu: tagihan, investasi, utang, dan dividen pada akhirnya dilunasi dengan kas, bukan dengan laba. Perusahaan yang tidak mampu menghasilkan kas yang memadai dari operasinya cepat atau lambat akan punah, dan justru di situlah letak daya tarik pelaporan berbasis kas — angkanya lugas dan tidak menyisakan ruang tafsir sebanyak laba akrual. Premis normatif inilah yang menjadikan </w:t>
             </w:r>
             <w:r>
               <w:rPr>
@@ -276,7 +240,7 @@
                 <w:i w:val="0"/>
                 <w:sz w:val="22"/>
               </w:rPr>
-              <w:t xml:space="preserve"> (SCF, Laporan Arus Kas) sebagai pelengkap wajib atas laporan berbasis akrual (Wolk et al., 2017).</w:t>
+              <w:t xml:space="preserve"> (SCF, laporan arus kas) sebagai pelengkap wajib bagi laporan keuangan berbasis akrual (Wolk et al., 2017).</w:t>
             </w:r>
           </w:p>
         </w:tc>
@@ -299,7 +263,7 @@
                 <w:i w:val="0"/>
                 <w:sz w:val="22"/>
               </w:rPr>
-              <w:t>Peta jalan bab dan dua masalah struktural</w:t>
+              <w:t>Bagaimana alur bab dan dua masalah strukturalnya?</w:t>
             </w:r>
           </w:p>
         </w:tc>
@@ -320,7 +284,7 @@
                 <w:i w:val="0"/>
                 <w:sz w:val="22"/>
               </w:rPr>
-              <w:t xml:space="preserve">Bab ini terlebih dahulu membahas pendahulu SCF, yaitu </w:t>
+              <w:t xml:space="preserve">Bab ini menelusuri pendahulu SCF, yaitu </w:t>
             </w:r>
             <w:r>
               <w:rPr>
@@ -338,7 +302,7 @@
                 <w:i w:val="0"/>
                 <w:sz w:val="22"/>
               </w:rPr>
-              <w:t xml:space="preserve"> (SCFP, Laporan Perubahan Posisi Keuangan), beserta motivasi dan struktur SCF. Penulis menyoroti dua masalah utama yang menyertai SCF: (1) masalah </w:t>
+              <w:t xml:space="preserve"> (SCFP, laporan perubahan posisi keuangan), sebelum masuk ke motivasi dan struktur SCF itu sendiri. Sepanjang jalan Wolk tidak menyembunyikan dua kelemahan bawaan SCF: ketakterartikulasian (</w:t>
             </w:r>
             <w:r>
               <w:rPr>
@@ -356,25 +320,7 @@
                 <w:i w:val="0"/>
                 <w:sz w:val="22"/>
               </w:rPr>
-              <w:t xml:space="preserve"> (ketakterartikulasian) yang muncul dari penggunaan metode tidak langsung pada bagian operasi, dan (2) masalah klasifikasi serta inkonsistensi dalam trikotomi tiga arah FASB. Penulis menekankan bahwa SCF harus dibaca secara utuh (</w:t>
-            </w:r>
-            <w:r>
-              <w:rPr>
-                <w:rFonts w:ascii="Calibri" w:hAnsi="Calibri" w:cs="Calibri"/>
-                <w:b w:val="0"/>
-                <w:i/>
-                <w:sz w:val="22"/>
-              </w:rPr>
-              <w:t>in its entirety</w:t>
-            </w:r>
-            <w:r>
-              <w:rPr>
-                <w:rFonts w:ascii="Calibri" w:hAnsi="Calibri" w:cs="Calibri"/>
-                <w:b w:val="0"/>
-                <w:i w:val="0"/>
-                <w:sz w:val="22"/>
-              </w:rPr>
-              <w:t xml:space="preserve">), bukan sepotong. Berikutnya bab memperkenalkan </w:t>
+              <w:t xml:space="preserve">) yang lahir dari metode tidak langsung pada bagian operasi, dan inkonsistensi klasifikasi dalam trikotomi tiga arah FASB. Keduanya bermuara pada satu nasihat praktis, bahwa SCF harus dibaca secara utuh dan bukan sepotong demi sepotong. Bagian akhir bab memperkenalkan </w:t>
             </w:r>
             <w:r>
               <w:rPr>
@@ -392,25 +338,7 @@
                 <w:i w:val="0"/>
                 <w:sz w:val="22"/>
               </w:rPr>
-              <w:t xml:space="preserve"> (FCF, arus kas bebas) — sebuah ukuran </w:t>
-            </w:r>
-            <w:r>
-              <w:rPr>
-                <w:rFonts w:ascii="Calibri" w:hAnsi="Calibri" w:cs="Calibri"/>
-                <w:b w:val="0"/>
-                <w:i/>
-                <w:sz w:val="22"/>
-              </w:rPr>
-              <w:t>non-GAAP</w:t>
-            </w:r>
-            <w:r>
-              <w:rPr>
-                <w:rFonts w:ascii="Calibri" w:hAnsi="Calibri" w:cs="Calibri"/>
-                <w:b w:val="0"/>
-                <w:i w:val="0"/>
-                <w:sz w:val="22"/>
-              </w:rPr>
-              <w:t xml:space="preserve"> yang sebagian berkembang justru karena kelemahan SCF — lalu menutup dengan tinjauan riset teoretis-empiris dan rekomendasi perbaikan (Wolk et al., 2017).</w:t>
+              <w:t xml:space="preserve"> (FCF, arus kas bebas), sebuah ukuran non-GAAP yang justru berkembang karena kelemahan SCF, lalu ditutup dengan tinjauan riset dan usulan perbaikan (Wolk et al., 2017).</w:t>
             </w:r>
           </w:p>
         </w:tc>
@@ -433,7 +361,7 @@
                 <w:i w:val="0"/>
                 <w:sz w:val="22"/>
               </w:rPr>
-              <w:t>Warisan SCFP dan APB Opinion No. 19 (1971)</w:t>
+              <w:t>Apa warisan SCFP dan peran APB Opinion No. 19 (1971)?</w:t>
             </w:r>
           </w:p>
         </w:tc>
@@ -454,7 +382,7 @@
                 <w:i w:val="0"/>
                 <w:sz w:val="22"/>
               </w:rPr>
-              <w:t xml:space="preserve">Untuk memahami arti penting SCF, perlu dipahami struktur dan motivasi pendahulunya, SCFP. SCFP sendiri adalah penerus </w:t>
+              <w:t>Arti penting SCF baru tampak jelas bila kita memahami pendahulunya. SCFP adalah penerus laporan arus dana (</w:t>
             </w:r>
             <w:r>
               <w:rPr>
@@ -472,115 +400,7 @@
                 <w:i w:val="0"/>
                 <w:sz w:val="22"/>
               </w:rPr>
-              <w:t xml:space="preserve"> (laporan arus dana), tempat akun-akun modal kerja didefinisikan sebagai saldo dana (</w:t>
-            </w:r>
-            <w:r>
-              <w:rPr>
-                <w:rFonts w:ascii="Calibri" w:hAnsi="Calibri" w:cs="Calibri"/>
-                <w:b w:val="0"/>
-                <w:i/>
-                <w:sz w:val="22"/>
-              </w:rPr>
-              <w:t>fund balance</w:t>
-            </w:r>
-            <w:r>
-              <w:rPr>
-                <w:rFonts w:ascii="Calibri" w:hAnsi="Calibri" w:cs="Calibri"/>
-                <w:b w:val="0"/>
-                <w:i w:val="0"/>
-                <w:sz w:val="22"/>
-              </w:rPr>
-              <w:t xml:space="preserve">); tujuannya menunjukkan bagaimana saldo dana naik dari laba dan sumber lain serta turun dari rugi dan penggunaan lain. </w:t>
-            </w:r>
-            <w:r>
-              <w:rPr>
-                <w:rFonts w:ascii="Calibri" w:hAnsi="Calibri" w:cs="Calibri"/>
-                <w:b w:val="0"/>
-                <w:i/>
-                <w:sz w:val="22"/>
-              </w:rPr>
-              <w:t>APB Opinion No. 19</w:t>
-            </w:r>
-            <w:r>
-              <w:rPr>
-                <w:rFonts w:ascii="Calibri" w:hAnsi="Calibri" w:cs="Calibri"/>
-                <w:b w:val="0"/>
-                <w:i w:val="0"/>
-                <w:sz w:val="22"/>
-              </w:rPr>
-              <w:t xml:space="preserve"> menyatakan tiga tujuan pelaporan SCFP: (a) melengkapi pengungkapan perubahan posisi keuangan, (b) meringkas aktivitas pendanaan dan investasi, dan (c) melaporkan arus dana dari operasi. Karena bertumpu pada definisi dan pengukuran elemen dari laporan laba rugi dan neraca, SCFP digolongkan sebagai laporan keuangan turunan (</w:t>
-            </w:r>
-            <w:r>
-              <w:rPr>
-                <w:rFonts w:ascii="Calibri" w:hAnsi="Calibri" w:cs="Calibri"/>
-                <w:b w:val="0"/>
-                <w:i/>
-                <w:sz w:val="22"/>
-              </w:rPr>
-              <w:t>derivative financial statement</w:t>
-            </w:r>
-            <w:r>
-              <w:rPr>
-                <w:rFonts w:ascii="Calibri" w:hAnsi="Calibri" w:cs="Calibri"/>
-                <w:b w:val="0"/>
-                <w:i w:val="0"/>
-                <w:sz w:val="22"/>
-              </w:rPr>
-              <w:t xml:space="preserve">). Pengakuan atas SCFP berlangsung bertahap: </w:t>
-            </w:r>
-            <w:r>
-              <w:rPr>
-                <w:rFonts w:ascii="Calibri" w:hAnsi="Calibri" w:cs="Calibri"/>
-                <w:b w:val="0"/>
-                <w:i/>
-                <w:sz w:val="22"/>
-              </w:rPr>
-              <w:t>APB Opinion No. 3</w:t>
-            </w:r>
-            <w:r>
-              <w:rPr>
-                <w:rFonts w:ascii="Calibri" w:hAnsi="Calibri" w:cs="Calibri"/>
-                <w:b w:val="0"/>
-                <w:i w:val="0"/>
-                <w:sz w:val="22"/>
-              </w:rPr>
-              <w:t xml:space="preserve"> (1963) </w:t>
-            </w:r>
-            <w:r>
-              <w:rPr>
-                <w:rFonts w:ascii="Calibri" w:hAnsi="Calibri" w:cs="Calibri"/>
-                <w:b w:val="0"/>
-                <w:i/>
-                <w:sz w:val="22"/>
-              </w:rPr>
-              <w:t>merekomendasikan</w:t>
-            </w:r>
-            <w:r>
-              <w:rPr>
-                <w:rFonts w:ascii="Calibri" w:hAnsi="Calibri" w:cs="Calibri"/>
-                <w:b w:val="0"/>
-                <w:i w:val="0"/>
-                <w:sz w:val="22"/>
-              </w:rPr>
-              <w:t xml:space="preserve"> pencantumannya dalam laporan tahunan; SEC mewajibkannya bagi pengajuan statutori mulai 1971; dan sebagai respons, APB menerbitkan </w:t>
-            </w:r>
-            <w:r>
-              <w:rPr>
-                <w:rFonts w:ascii="Calibri" w:hAnsi="Calibri" w:cs="Calibri"/>
-                <w:b w:val="0"/>
-                <w:i/>
-                <w:sz w:val="22"/>
-              </w:rPr>
-              <w:t>APB Opinion No. 19</w:t>
-            </w:r>
-            <w:r>
-              <w:rPr>
-                <w:rFonts w:ascii="Calibri" w:hAnsi="Calibri" w:cs="Calibri"/>
-                <w:b w:val="0"/>
-                <w:i w:val="0"/>
-                <w:sz w:val="22"/>
-              </w:rPr>
-              <w:t xml:space="preserve"> pada 1971 yang mewajibkannya untuk pelaporan keuangan (Wolk et al., 2017).</w:t>
+              <w:t>), yang mendefinisikan akun-akun modal kerja sebagai saldo dana dan bertujuan menunjukkan bagaimana saldo itu bertambah dari laba dan sumber lain serta berkurang dari rugi dan penggunaan lain. APB Opinion No. 19 menetapkan tiga tujuan pelaporannya: melengkapi pengungkapan perubahan posisi keuangan, meringkas aktivitas pendanaan dan investasi, dan melaporkan arus dana dari operasi. Karena seluruh angkanya bertumpu pada elemen yang sudah diukur di laporan laba rugi dan neraca, SCFP tergolong laporan keuangan turunan. Pengakuannya pun berlangsung bertahap: APB Opinion No. 3 (1963) baru merekomendasikan pencantumannya dalam laporan tahunan, SEC mewajibkannya untuk pengajuan statutori pada 1971, dan pada tahun yang sama APB merespons dengan menerbitkan Opinion No. 19 yang mewajibkannya secara penuh (Wolk et al., 2017).</w:t>
             </w:r>
           </w:p>
         </w:tc>
@@ -603,7 +423,7 @@
                 <w:i w:val="0"/>
                 <w:sz w:val="22"/>
               </w:rPr>
-              <w:t>Sources/Uses, persamaan (13.1), dan empat definisi dana</w:t>
+              <w:t>Bagaimana logika sources/uses dan empat definisi dana?</w:t>
             </w:r>
           </w:p>
         </w:tc>
@@ -624,7 +444,7 @@
                 <w:i w:val="0"/>
                 <w:sz w:val="22"/>
               </w:rPr>
-              <w:t xml:space="preserve">SCFP memiliki dua bagian penyeimbang: </w:t>
+              <w:t>SCFP terdiri atas dua sisi yang saling menyeimbangkan: sumber sumber daya (</w:t>
             </w:r>
             <w:r>
               <w:rPr>
@@ -642,7 +462,7 @@
                 <w:i w:val="0"/>
                 <w:sz w:val="22"/>
               </w:rPr>
-              <w:t xml:space="preserve"> (sumber sumber daya = kredit transaksi, timbul dari kenaikan ekuitas dan penurunan aset) dan </w:t>
+              <w:t>), yang timbul dari kenaikan ekuitas dan penurunan aset, dan penggunaan sumber daya (</w:t>
             </w:r>
             <w:r>
               <w:rPr>
@@ -660,25 +480,7 @@
                 <w:i w:val="0"/>
                 <w:sz w:val="22"/>
               </w:rPr>
-              <w:t xml:space="preserve"> (penggunaan sumber daya = debit transaksi, timbul dari penurunan ekuitas dan kenaikan aset). Logika dasarnya dirangkum dalam persamaan </w:t>
-            </w:r>
-            <w:r>
-              <w:rPr>
-                <w:rFonts w:ascii="Calibri" w:hAnsi="Calibri" w:cs="Calibri"/>
-                <w:b/>
-                <w:i w:val="0"/>
-                <w:sz w:val="22"/>
-              </w:rPr>
-              <w:t>(13.1): kredit transaksi = debit transaksi</w:t>
-            </w:r>
-            <w:r>
-              <w:rPr>
-                <w:rFonts w:ascii="Calibri" w:hAnsi="Calibri" w:cs="Calibri"/>
-                <w:b w:val="0"/>
-                <w:i w:val="0"/>
-                <w:sz w:val="22"/>
-              </w:rPr>
-              <w:t xml:space="preserve">. Kenaikan ekuitas mencerminkan pendanaan eksternal (utang, penerbitan saham) maupun internal (laba bersih, hasil pelepasan aset); penurunan ekuitas mencerminkan pengurangan pendanaan (penebusan utang, pembelian saham treasuri, pembayaran dividen, rugi bersih). Dengan menambahkan transaksi yang tidak memengaruhi saldo dana, SCFP menjadi ikhtisar komprehensif yang disebut pendekatan </w:t>
+              <w:t>), yang timbul dari penurunan ekuitas dan kenaikan aset. Seluruhnya bermuara pada persamaan dasar 13.1, bahwa kredit transaksi sama dengan debit transaksi. Kenaikan ekuitas merepresentasikan pendanaan, baik eksternal seperti utang dan penerbitan saham maupun internal seperti laba bersih dan hasil pelepasan aset, sedangkan penurunannya mencerminkan penebusan utang, pembelian saham treasuri, pembayaran dividen, atau rugi. Ketika transaksi yang tidak menyentuh saldo dana ikut dicantumkan — misalnya konversi utang menjadi saham biasa atau penerbitan saham untuk menukar aset nonmoneter — SCFP berubah menjadi ikhtisar menyeluruh yang dikenal sebagai pendekatan mencakup-semua (</w:t>
             </w:r>
             <w:r>
               <w:rPr>
@@ -714,61 +516,7 @@
                 <w:i w:val="0"/>
                 <w:sz w:val="22"/>
               </w:rPr>
-              <w:t xml:space="preserve"> (mencakup-semua / semua-sumber-daya) — contohnya konversi utang konversi menjadi saham biasa, saham yang diterbitkan untuk aset nonmoneter, dan pertukaran aset nonmoneter. APB Opinion No. 19 mengizinkan salah satu dari </w:t>
-            </w:r>
-            <w:r>
-              <w:rPr>
-                <w:rFonts w:ascii="Calibri" w:hAnsi="Calibri" w:cs="Calibri"/>
-                <w:b/>
-                <w:i w:val="0"/>
-                <w:sz w:val="22"/>
-              </w:rPr>
-              <w:t>empat definisi dana</w:t>
-            </w:r>
-            <w:r>
-              <w:rPr>
-                <w:rFonts w:ascii="Calibri" w:hAnsi="Calibri" w:cs="Calibri"/>
-                <w:b w:val="0"/>
-                <w:i w:val="0"/>
-                <w:sz w:val="22"/>
-              </w:rPr>
-              <w:t xml:space="preserve">: (1) kas; (2) kas plus </w:t>
-            </w:r>
-            <w:r>
-              <w:rPr>
-                <w:rFonts w:ascii="Calibri" w:hAnsi="Calibri" w:cs="Calibri"/>
-                <w:b w:val="0"/>
-                <w:i/>
-                <w:sz w:val="22"/>
-              </w:rPr>
-              <w:t>near cash</w:t>
-            </w:r>
-            <w:r>
-              <w:rPr>
-                <w:rFonts w:ascii="Calibri" w:hAnsi="Calibri" w:cs="Calibri"/>
-                <w:b w:val="0"/>
-                <w:i w:val="0"/>
-                <w:sz w:val="22"/>
-              </w:rPr>
-              <w:t xml:space="preserve"> (sekuritas yang dapat dipasarkan jangka pendek dan investasi temporer lain); (3) </w:t>
-            </w:r>
-            <w:r>
-              <w:rPr>
-                <w:rFonts w:ascii="Calibri" w:hAnsi="Calibri" w:cs="Calibri"/>
-                <w:b w:val="0"/>
-                <w:i/>
-                <w:sz w:val="22"/>
-              </w:rPr>
-              <w:t>quick assets</w:t>
-            </w:r>
-            <w:r>
-              <w:rPr>
-                <w:rFonts w:ascii="Calibri" w:hAnsi="Calibri" w:cs="Calibri"/>
-                <w:b w:val="0"/>
-                <w:i w:val="0"/>
-                <w:sz w:val="22"/>
-              </w:rPr>
-              <w:t xml:space="preserve"> (aset lancar tercepat); dan (4) modal kerja. Karena definisi modal kerja membatasi transaksi nondana hanya pada transaksi nonmoneter dan paling murah disusun, mayoritas perusahaan memilih mendefinisikan dana sebagai modal kerja bersih (Wolk et al., 2017; lihat Exhibit 13.1).</w:t>
+              <w:t>). Opinion No. 19 sebenarnya membuka empat pilihan definisi dana, mulai dari kas, kas plus near cash, quick assets, hingga modal kerja. Karena definisi modal kerja paling murah disusun dan paling membatasi transaksi nondana, mayoritas perusahaan akhirnya memilihnya (Wolk et al., 2017; lihat Exhibit 13.1).</w:t>
             </w:r>
           </w:p>
         </w:tc>
@@ -952,7 +700,7 @@
                 <w:i w:val="0"/>
                 <w:sz w:val="22"/>
               </w:rPr>
-              <w:t>Mengapa dana = kas: kelemahan modal kerja bersih</w:t>
+              <w:t>Mengapa pada akhirnya dana didefinisikan sebagai kas?</w:t>
             </w:r>
           </w:p>
         </w:tc>
@@ -973,115 +721,7 @@
                 <w:i w:val="0"/>
                 <w:sz w:val="22"/>
               </w:rPr>
-              <w:t xml:space="preserve">Selama deliberasi FASB yang menuju adopsi SCF, terbentuk konsensus bahwa dana sebaiknya didefinisikan sebagai </w:t>
-            </w:r>
-            <w:r>
-              <w:rPr>
-                <w:rFonts w:ascii="Calibri" w:hAnsi="Calibri" w:cs="Calibri"/>
-                <w:b w:val="0"/>
-                <w:i/>
-                <w:sz w:val="22"/>
-              </w:rPr>
-              <w:t>kas</w:t>
-            </w:r>
-            <w:r>
-              <w:rPr>
-                <w:rFonts w:ascii="Calibri" w:hAnsi="Calibri" w:cs="Calibri"/>
-                <w:b w:val="0"/>
-                <w:i w:val="0"/>
-                <w:sz w:val="22"/>
-              </w:rPr>
-              <w:t>, bukan modal kerja bersih (</w:t>
-            </w:r>
-            <w:r>
-              <w:rPr>
-                <w:rFonts w:ascii="Calibri" w:hAnsi="Calibri" w:cs="Calibri"/>
-                <w:b w:val="0"/>
-                <w:i/>
-                <w:sz w:val="22"/>
-              </w:rPr>
-              <w:t>net working capital</w:t>
-            </w:r>
-            <w:r>
-              <w:rPr>
-                <w:rFonts w:ascii="Calibri" w:hAnsi="Calibri" w:cs="Calibri"/>
-                <w:b w:val="0"/>
-                <w:i w:val="0"/>
-                <w:sz w:val="22"/>
-              </w:rPr>
-              <w:t xml:space="preserve">). Modal kerja bersih dipandang sebagai ukuran likuiditas yang buruk karena tiga alasan. </w:t>
-            </w:r>
-            <w:r>
-              <w:rPr>
-                <w:rFonts w:ascii="Calibri" w:hAnsi="Calibri" w:cs="Calibri"/>
-                <w:b w:val="0"/>
-                <w:i/>
-                <w:sz w:val="22"/>
-              </w:rPr>
-              <w:t>Pertama</w:t>
-            </w:r>
-            <w:r>
-              <w:rPr>
-                <w:rFonts w:ascii="Calibri" w:hAnsi="Calibri" w:cs="Calibri"/>
-                <w:b w:val="0"/>
-                <w:i w:val="0"/>
-                <w:sz w:val="22"/>
-              </w:rPr>
-              <w:t>, beban dan kredit yang ditangguhkan (</w:t>
-            </w:r>
-            <w:r>
-              <w:rPr>
-                <w:rFonts w:ascii="Calibri" w:hAnsi="Calibri" w:cs="Calibri"/>
-                <w:b w:val="0"/>
-                <w:i/>
-                <w:sz w:val="22"/>
-              </w:rPr>
-              <w:t>deferred charges and credits</w:t>
-            </w:r>
-            <w:r>
-              <w:rPr>
-                <w:rFonts w:ascii="Calibri" w:hAnsi="Calibri" w:cs="Calibri"/>
-                <w:b w:val="0"/>
-                <w:i w:val="0"/>
-                <w:sz w:val="22"/>
-              </w:rPr>
-              <w:t xml:space="preserve">) termasuk dalam modal kerja bersih padahal tidak memiliki konsekuensi arus kas. </w:t>
-            </w:r>
-            <w:r>
-              <w:rPr>
-                <w:rFonts w:ascii="Calibri" w:hAnsi="Calibri" w:cs="Calibri"/>
-                <w:b w:val="0"/>
-                <w:i/>
-                <w:sz w:val="22"/>
-              </w:rPr>
-              <w:t>Kedua</w:t>
-            </w:r>
-            <w:r>
-              <w:rPr>
-                <w:rFonts w:ascii="Calibri" w:hAnsi="Calibri" w:cs="Calibri"/>
-                <w:b w:val="0"/>
-                <w:i w:val="0"/>
-                <w:sz w:val="22"/>
-              </w:rPr>
-              <w:t xml:space="preserve">, konversi aset lancar menjadi kas dapat memakan waktu setahun atau lebih bagi perusahaan dengan siklus operasi panjang. </w:t>
-            </w:r>
-            <w:r>
-              <w:rPr>
-                <w:rFonts w:ascii="Calibri" w:hAnsi="Calibri" w:cs="Calibri"/>
-                <w:b w:val="0"/>
-                <w:i/>
-                <w:sz w:val="22"/>
-              </w:rPr>
-              <w:t>Ketiga</w:t>
-            </w:r>
-            <w:r>
-              <w:rPr>
-                <w:rFonts w:ascii="Calibri" w:hAnsi="Calibri" w:cs="Calibri"/>
-                <w:b w:val="0"/>
-                <w:i w:val="0"/>
-                <w:sz w:val="22"/>
-              </w:rPr>
-              <w:t>, pos seperti persediaan dicatat berbasis biaya sehingga tidak secara eksplisit mengukur potensi arus kasnya. Dengan ambiguitas ini, pelaporan arus kas lebih menarik karena kelugasannya (Wolk et al., 2017).</w:t>
+              <w:t>Selama deliberasi yang mengantar lahirnya SCF, FASB sampai pada kesimpulan bahwa dana sebaiknya berarti kas dan bukan modal kerja bersih. Alasannya, modal kerja bersih ternyata ukuran likuiditas yang lemah. Ia memuat beban dan kredit yang ditangguhkan, padahal pos-pos itu tidak berkonsekuensi kas; konversi aset lancarnya menjadi kas bisa memakan waktu setahun atau lebih bagi perusahaan dengan siklus operasi panjang; dan komponen seperti persediaan dicatat berbasis biaya sehingga tidak menggambarkan potensi kas yang sebenarnya. Di tengah keruwetan itu, pelaporan kas menawarkan kejernihan yang tidak dimiliki modal kerja (Wolk et al., 2017).</w:t>
             </w:r>
           </w:p>
         </w:tc>
@@ -1104,7 +744,7 @@
                 <w:i w:val="0"/>
                 <w:sz w:val="22"/>
               </w:rPr>
-              <w:t>SFAS No. 95 (1987) menggantikan SCFP; SFAC No. 1 &amp; No. 5</w:t>
+              <w:t>Bagaimana SFAS No. 95 menggantikan SCFP, dan apa kaitannya dengan SFAC No. 1 dan No. 5?</w:t>
             </w:r>
           </w:p>
         </w:tc>
@@ -1125,79 +765,7 @@
                 <w:i w:val="0"/>
                 <w:sz w:val="22"/>
               </w:rPr>
-              <w:t xml:space="preserve">Pada 1987, FASB mewajibkan SCF melalui </w:t>
-            </w:r>
-            <w:r>
-              <w:rPr>
-                <w:rFonts w:ascii="Calibri" w:hAnsi="Calibri" w:cs="Calibri"/>
-                <w:b w:val="0"/>
-                <w:i/>
-                <w:sz w:val="22"/>
-              </w:rPr>
-              <w:t>SFAS No. 95</w:t>
-            </w:r>
-            <w:r>
-              <w:rPr>
-                <w:rFonts w:ascii="Calibri" w:hAnsi="Calibri" w:cs="Calibri"/>
-                <w:b w:val="0"/>
-                <w:i w:val="0"/>
-                <w:sz w:val="22"/>
-              </w:rPr>
-              <w:t>, yang menggantikan (</w:t>
-            </w:r>
-            <w:r>
-              <w:rPr>
-                <w:rFonts w:ascii="Calibri" w:hAnsi="Calibri" w:cs="Calibri"/>
-                <w:b w:val="0"/>
-                <w:i/>
-                <w:sz w:val="22"/>
-              </w:rPr>
-              <w:t>supersede</w:t>
-            </w:r>
-            <w:r>
-              <w:rPr>
-                <w:rFonts w:ascii="Calibri" w:hAnsi="Calibri" w:cs="Calibri"/>
-                <w:b w:val="0"/>
-                <w:i w:val="0"/>
-                <w:sz w:val="22"/>
-              </w:rPr>
-              <w:t xml:space="preserve">) SCFP. </w:t>
-            </w:r>
-            <w:r>
-              <w:rPr>
-                <w:rFonts w:ascii="Calibri" w:hAnsi="Calibri" w:cs="Calibri"/>
-                <w:b w:val="0"/>
-                <w:i/>
-                <w:sz w:val="22"/>
-              </w:rPr>
-              <w:t>SFAC No. 1</w:t>
-            </w:r>
-            <w:r>
-              <w:rPr>
-                <w:rFonts w:ascii="Calibri" w:hAnsi="Calibri" w:cs="Calibri"/>
-                <w:b w:val="0"/>
-                <w:i w:val="0"/>
-                <w:sz w:val="22"/>
-              </w:rPr>
-              <w:t xml:space="preserve"> mendaftar tiga tujuan umum pelaporan keuangan; tujuan pertama luas — menyediakan informasi yang berguna bagi investor dan kreditor untuk keputusan investasi, kredit, dan serupa — sedangkan dua tujuan lain (informasi tentang sumber daya neto perusahaan dan perubahannya, serta informasi untuk menilai arus kas masa depan) merupakan cara spesifik memenuhi tujuan pertama; kedua tujuan inilah yang pada 1980-an memotivasi adopsi SCF. Dalam </w:t>
-            </w:r>
-            <w:r>
-              <w:rPr>
-                <w:rFonts w:ascii="Calibri" w:hAnsi="Calibri" w:cs="Calibri"/>
-                <w:b w:val="0"/>
-                <w:i/>
-                <w:sz w:val="22"/>
-              </w:rPr>
-              <w:t>SFAC No. 5</w:t>
-            </w:r>
-            <w:r>
-              <w:rPr>
-                <w:rFonts w:ascii="Calibri" w:hAnsi="Calibri" w:cs="Calibri"/>
-                <w:b w:val="0"/>
-                <w:i w:val="0"/>
-                <w:sz w:val="22"/>
-              </w:rPr>
-              <w:t>, FASB mengklaim SCF memberi informasi tentang aktivitas entitas dalam menghasilkan kas dari operasi (untuk melunasi utang, membagi dividen, atau menginvestasikan kembali), aktivitas pendanaan, dan aktivitas investasi; kegunaannya mencakup penilaian likuiditas, fleksibilitas keuangan, profitabilitas, dan risiko entitas (Wolk et al., 2017).</w:t>
+              <w:t>Pada 1987 FASB mewajibkan SCF melalui SFAS No. 95, yang sekaligus menggantikan SCFP. Landasannya sudah disiapkan kerangka konseptual. SFAC No. 1 menyebut tiga tujuan pelaporan keuangan; tujuan pertama bersifat luas, yaitu menyediakan informasi yang berguna bagi keputusan investasi dan kredit, sementara dua tujuan berikutnya — informasi tentang sumber daya neto perusahaan beserta perubahannya, dan informasi untuk menilai arus kas masa depan — adalah cara konkret memenuhi tujuan pertama. Dua tujuan terakhir itulah yang memotivasi adopsi SCF pada dekade 1980-an. SFAC No. 5 kemudian mempertegas bahwa SCF mengungkap bagaimana entitas menghasilkan kas dari operasi untuk melunasi utang, membagi dividen, atau berinvestasi kembali, di samping aktivitas pendanaan dan investasinya, sehingga berguna untuk menilai likuiditas, fleksibilitas keuangan, profitabilitas, dan risiko (Wolk et al., 2017).</w:t>
             </w:r>
           </w:p>
         </w:tc>
@@ -1220,7 +788,7 @@
                 <w:i w:val="0"/>
                 <w:sz w:val="22"/>
               </w:rPr>
-              <w:t>Enam manfaat data arus kas (FASB discussion memorandum)</w:t>
+              <w:t>Apa enam manfaat data arus kas menurut FASB?</w:t>
             </w:r>
           </w:p>
         </w:tc>
@@ -1241,61 +809,7 @@
                 <w:i w:val="0"/>
                 <w:sz w:val="22"/>
               </w:rPr>
-              <w:t xml:space="preserve">Sebuah </w:t>
-            </w:r>
-            <w:r>
-              <w:rPr>
-                <w:rFonts w:ascii="Calibri" w:hAnsi="Calibri" w:cs="Calibri"/>
-                <w:b w:val="0"/>
-                <w:i/>
-                <w:sz w:val="22"/>
-              </w:rPr>
-              <w:t>discussion memorandum</w:t>
-            </w:r>
-            <w:r>
-              <w:rPr>
-                <w:rFonts w:ascii="Calibri" w:hAnsi="Calibri" w:cs="Calibri"/>
-                <w:b w:val="0"/>
-                <w:i w:val="0"/>
-                <w:sz w:val="22"/>
-              </w:rPr>
-              <w:t xml:space="preserve"> FASB terdahulu mengemukakan enam alasan mengapa data arus kas merupakan pengungkapan pelengkap yang berguna: (1) memberi umpan balik atas arus kas aktual; (2) membantu mengidentifikasi hubungan antara laba akuntansi dan arus kas; (3) memberi informasi tentang kualitas laba (</w:t>
-            </w:r>
-            <w:r>
-              <w:rPr>
-                <w:rFonts w:ascii="Calibri" w:hAnsi="Calibri" w:cs="Calibri"/>
-                <w:b w:val="0"/>
-                <w:i/>
-                <w:sz w:val="22"/>
-              </w:rPr>
-              <w:t>quality of income</w:t>
-            </w:r>
-            <w:r>
-              <w:rPr>
-                <w:rFonts w:ascii="Calibri" w:hAnsi="Calibri" w:cs="Calibri"/>
-                <w:b w:val="0"/>
-                <w:i w:val="0"/>
-                <w:sz w:val="22"/>
-              </w:rPr>
-              <w:t>); (4) memperbaiki keterbandingan (</w:t>
-            </w:r>
-            <w:r>
-              <w:rPr>
-                <w:rFonts w:ascii="Calibri" w:hAnsi="Calibri" w:cs="Calibri"/>
-                <w:b w:val="0"/>
-                <w:i/>
-                <w:sz w:val="22"/>
-              </w:rPr>
-              <w:t>comparability</w:t>
-            </w:r>
-            <w:r>
-              <w:rPr>
-                <w:rFonts w:ascii="Calibri" w:hAnsi="Calibri" w:cs="Calibri"/>
-                <w:b w:val="0"/>
-                <w:i w:val="0"/>
-                <w:sz w:val="22"/>
-              </w:rPr>
-              <w:t>) informasi; (5) membantu menilai fleksibilitas dan likuiditas; serta (6) membantu memprediksi arus kas masa depan. Keenam butir ini pada dasarnya berkaitan dengan keterbatasan akuntansi akrual, sehingga data arus kas melengkapi data akrual dalam laporan laba rugi dan neraca (Wolk et al., 2017).</w:t>
+              <w:t>Sebuah discussion memorandum FASB mengajukan enam alasan mengapa data arus kas merupakan pengungkapan pelengkap yang berharga: ia memberi umpan balik atas arus kas aktual, membantu mengaitkan laba akuntansi dengan arus kas, mengungkap kualitas laba, memperbaiki keterbandingan informasi, membantu menilai fleksibilitas dan likuiditas, serta membantu memprediksi arus kas masa depan. Benang merah keenamnya sama, yakni keterbatasan akuntansi akrual; karena itu data arus kas tidak menggantikan, melainkan melengkapi, data akrual di laporan laba rugi dan neraca (Wolk et al., 2017).</w:t>
             </w:r>
           </w:p>
         </w:tc>
@@ -1318,7 +832,7 @@
                 <w:i w:val="0"/>
                 <w:sz w:val="22"/>
               </w:rPr>
-              <w:t>Kualitas laba, keterbandingan, dan masalah keseragaman</w:t>
+              <w:t>Apa itu kualitas laba, dan bagaimana arus kas mengatasi masalah keseragaman?</w:t>
             </w:r>
           </w:p>
         </w:tc>
@@ -1336,10 +850,19 @@
               <w:rPr>
                 <w:rFonts w:ascii="Calibri" w:hAnsi="Calibri" w:cs="Calibri"/>
                 <w:b w:val="0"/>
+                <w:i w:val="0"/>
+                <w:sz w:val="22"/>
+              </w:rPr>
+              <w:t>Kualitas laba (</w:t>
+            </w:r>
+            <w:r>
+              <w:rPr>
+                <w:rFonts w:ascii="Calibri" w:hAnsi="Calibri" w:cs="Calibri"/>
+                <w:b w:val="0"/>
                 <w:i/>
                 <w:sz w:val="22"/>
               </w:rPr>
-              <w:t>Quality of income</w:t>
+              <w:t>quality of income</w:t>
             </w:r>
             <w:r>
               <w:rPr>
@@ -1348,25 +871,7 @@
                 <w:i w:val="0"/>
                 <w:sz w:val="22"/>
               </w:rPr>
-              <w:t xml:space="preserve"> (kualitas laba) adalah istilah analis untuk menggambarkan hubungan antara arus kas dan laba akuntansi: makin tinggi korelasi keduanya, makin tinggi kualitas laba. Konsep ini mengakui bahwa laba akuntansi mengandung banyak akrual dan penangguhan nonkas sehingga tidak selalu menjadi indikator likuiditas yang baik. Pada butir keempat (</w:t>
-            </w:r>
-            <w:r>
-              <w:rPr>
-                <w:rFonts w:ascii="Calibri" w:hAnsi="Calibri" w:cs="Calibri"/>
-                <w:b w:val="0"/>
-                <w:i/>
-                <w:sz w:val="22"/>
-              </w:rPr>
-              <w:t>uniformity problem</w:t>
-            </w:r>
-            <w:r>
-              <w:rPr>
-                <w:rFonts w:ascii="Calibri" w:hAnsi="Calibri" w:cs="Calibri"/>
-                <w:b w:val="0"/>
-                <w:i w:val="0"/>
-                <w:sz w:val="22"/>
-              </w:rPr>
-              <w:t>, masalah keseragaman), fleksibilitas pemilihan kebijakan akuntansi dapat merusak keterbandingan antarperusahaan; arus kas dari operasi tunduk pada lebih sedikit pilihan kebijakan yang sewenang-wenang sehingga lebih seragam dan lebih mudah dibandingkan. Karena itu SCF dianjurkan sebagai cara menangani kesewenang-wenangan pengukuran laba — ada kejernihan dan kelangsungan arus kas yang kontras dengan keabstrakan laba akuntansi (Wolk et al., 2017).</w:t>
+              <w:t>) adalah istilah analis untuk menggambarkan kedekatan antara arus kas dan laba akuntansi: makin tinggi korelasinya, makin tinggi kualitas labanya. Konsep ini berangkat dari kenyataan bahwa laba sarat akrual dan penangguhan nonkas, sehingga tidak selalu menjadi penanda likuiditas yang baik. Persoalan keseragaman muncul dari sisi lain. Fleksibilitas memilih kebijakan akuntansi dapat mengikis keterbandingan antarperusahaan, sedangkan arus kas dari operasi tunduk pada lebih sedikit pilihan yang sewenang-wenang sehingga lebih seragam dan lebih mudah diperbandingkan. Inilah yang membuat SCF dianjurkan sebagai penawar kesewenang-wenangan pengukuran laba; ada kelangsungan dan kejernihan pada arus kas yang kontras dengan keabstrakan laba (Wolk et al., 2017).</w:t>
             </w:r>
           </w:p>
         </w:tc>
@@ -1389,7 +894,7 @@
                 <w:i w:val="0"/>
                 <w:sz w:val="22"/>
               </w:rPr>
-              <w:t>Fleksibilitas keuangan vs likuiditas; batas neraca</w:t>
+              <w:t>Apa beda fleksibilitas keuangan dan likuiditas, dan mengapa neraca tak cukup?</w:t>
             </w:r>
           </w:p>
         </w:tc>
@@ -1407,10 +912,19 @@
               <w:rPr>
                 <w:rFonts w:ascii="Calibri" w:hAnsi="Calibri" w:cs="Calibri"/>
                 <w:b w:val="0"/>
+                <w:i w:val="0"/>
+                <w:sz w:val="22"/>
+              </w:rPr>
+              <w:t>Fleksibilitas keuangan (</w:t>
+            </w:r>
+            <w:r>
+              <w:rPr>
+                <w:rFonts w:ascii="Calibri" w:hAnsi="Calibri" w:cs="Calibri"/>
+                <w:b w:val="0"/>
                 <w:i/>
                 <w:sz w:val="22"/>
               </w:rPr>
-              <w:t>Financial flexibility</w:t>
+              <w:t>financial flexibility</w:t>
             </w:r>
             <w:r>
               <w:rPr>
@@ -1419,7 +933,7 @@
                 <w:i w:val="0"/>
                 <w:sz w:val="22"/>
               </w:rPr>
-              <w:t xml:space="preserve"> (fleksibilitas keuangan) adalah kemampuan perusahaan beradaptasi terhadap situasi dan peluang baru; </w:t>
+              <w:t>) adalah kemampuan perusahaan menyesuaikan diri terhadap keadaan dan peluang baru, sementara likuiditas (</w:t>
             </w:r>
             <w:r>
               <w:rPr>
@@ -1437,7 +951,7 @@
                 <w:i w:val="0"/>
                 <w:sz w:val="22"/>
               </w:rPr>
-              <w:t xml:space="preserve"> (likuiditas) adalah kemampuan mengonversi aset menjadi kas secara cepat tanpa kerugian. Kas yang dihasilkan secara internal dari operasi memberi petunjuk atas keduanya, karena merepresentasikan sumber daya internal untuk pelunasan utang, investasi baru, dan distribusi kepada pemegang saham — alasan asli mengapa funds flow statement dahulu diwajibkan. Informasi likuiditas memang ada di neraca, tetapi klasifikasi lancar–taklancar adalah pemandu likuiditas yang buruk: sebagian pos lancar adalah beban/kredit tangguhan tanpa dampak kas; persediaan belum tentu cepat terkonversi; dan atribut pengukuran neraca umumnya bukan nilai realisasi neto sehingga kas yang dihasilkan aset tidak dapat ditentukan. Neraca, pada hakikatnya, hanyalah "pemeringkatan likuiditas yang kasar". </w:t>
+              <w:t>) adalah kemampuan mengubah aset menjadi kas dengan cepat tanpa menanggung kerugian. Kas yang dihasilkan sendiri dari operasi memberi petunjuk atas keduanya karena ia menjadi sumber internal untuk melunasi utang, mendanai investasi baru, dan membagikan distribusi kepada pemegang saham — persis alasan laporan arus dana dahulu diwajibkan. Memang neraca juga memuat informasi likuiditas, tetapi klasifikasi lancar dan taklancar adalah pemandu yang kasar. Sebagian pos lancar berupa beban tangguhan tanpa dampak kas, persediaan belum tentu cepat terkonversi, dan atribut pengukuran neraca umumnya bukan nilai realisasi neto sehingga kas yang akan dihasilkan suatu aset tidak dapat dipastikan. Akuntansi harga keluar (</w:t>
             </w:r>
             <w:r>
               <w:rPr>
@@ -1446,7 +960,7 @@
                 <w:i/>
                 <w:sz w:val="22"/>
               </w:rPr>
-              <w:t>Exit-price accounting</w:t>
+              <w:t>exit-price accounting</w:t>
             </w:r>
             <w:r>
               <w:rPr>
@@ -1455,43 +969,7 @@
                 <w:i w:val="0"/>
                 <w:sz w:val="22"/>
               </w:rPr>
-              <w:t xml:space="preserve"> (akuntansi harga keluar, Lampiran 1-A) berupaya mengukur fleksibilitas via kas dari likuidasi takterpaksa, tetapi tetap kasar karena yang menentukan likuiditas adalah </w:t>
-            </w:r>
-            <w:r>
-              <w:rPr>
-                <w:rFonts w:ascii="Calibri" w:hAnsi="Calibri" w:cs="Calibri"/>
-                <w:b w:val="0"/>
-                <w:i/>
-                <w:sz w:val="22"/>
-              </w:rPr>
-              <w:t>kecepatan</w:t>
-            </w:r>
-            <w:r>
-              <w:rPr>
-                <w:rFonts w:ascii="Calibri" w:hAnsi="Calibri" w:cs="Calibri"/>
-                <w:b w:val="0"/>
-                <w:i w:val="0"/>
-                <w:sz w:val="22"/>
-              </w:rPr>
-              <w:t xml:space="preserve"> konversi (Wolk et al., 2017). Pada butir keenam, masih belum terselesaikan (</w:t>
-            </w:r>
-            <w:r>
-              <w:rPr>
-                <w:rFonts w:ascii="Calibri" w:hAnsi="Calibri" w:cs="Calibri"/>
-                <w:b w:val="0"/>
-                <w:i/>
-                <w:sz w:val="22"/>
-              </w:rPr>
-              <w:t>unsettled</w:t>
-            </w:r>
-            <w:r>
-              <w:rPr>
-                <w:rFonts w:ascii="Calibri" w:hAnsi="Calibri" w:cs="Calibri"/>
-                <w:b w:val="0"/>
-                <w:i w:val="0"/>
-                <w:sz w:val="22"/>
-              </w:rPr>
-              <w:t>) apakah arus kas, arus dana, atau laba akuntansi yang merupakan prediktor terbaik arus kas masa depan.</w:t>
+              <w:t>) mencoba menakar fleksibilitas lewat kas dari likuidasi takterpaksa, namun tetap kasar karena yang menentukan likuiditas pada akhirnya adalah kecepatan konversi. Adapun apakah arus kas, arus dana, atau laba yang paling andal memprediksi arus kas masa depan masih menjadi persoalan terbuka (Wolk et al., 2017).</w:t>
             </w:r>
           </w:p>
         </w:tc>
@@ -1514,7 +992,7 @@
                 <w:i w:val="0"/>
                 <w:sz w:val="22"/>
               </w:rPr>
-              <w:t>Struktur SCF: trikotomi operasi–investasi–pendanaan</w:t>
+              <w:t>Seperti apa struktur SCF dengan trikotomi operasi–investasi–pendanaan?</w:t>
             </w:r>
           </w:p>
         </w:tc>
@@ -1535,115 +1013,7 @@
                 <w:i w:val="0"/>
                 <w:sz w:val="22"/>
               </w:rPr>
-              <w:t>Jika SCFP menggunakan kerangka biner "sumber dan penggunaan" dana yang mekanis (relasi debit–kredit sempit pada Exhibit 13.1), SCF mengklasifikasikan penerimaan dan pengeluaran kas ke dalam kategori yang lebih bermakna: aktivitas operasi (</w:t>
-            </w:r>
-            <w:r>
-              <w:rPr>
-                <w:rFonts w:ascii="Calibri" w:hAnsi="Calibri" w:cs="Calibri"/>
-                <w:b w:val="0"/>
-                <w:i/>
-                <w:sz w:val="22"/>
-              </w:rPr>
-              <w:t>operating</w:t>
-            </w:r>
-            <w:r>
-              <w:rPr>
-                <w:rFonts w:ascii="Calibri" w:hAnsi="Calibri" w:cs="Calibri"/>
-                <w:b w:val="0"/>
-                <w:i w:val="0"/>
-                <w:sz w:val="22"/>
-              </w:rPr>
-              <w:t>), investasi (</w:t>
-            </w:r>
-            <w:r>
-              <w:rPr>
-                <w:rFonts w:ascii="Calibri" w:hAnsi="Calibri" w:cs="Calibri"/>
-                <w:b w:val="0"/>
-                <w:i/>
-                <w:sz w:val="22"/>
-              </w:rPr>
-              <w:t>investing</w:t>
-            </w:r>
-            <w:r>
-              <w:rPr>
-                <w:rFonts w:ascii="Calibri" w:hAnsi="Calibri" w:cs="Calibri"/>
-                <w:b w:val="0"/>
-                <w:i w:val="0"/>
-                <w:sz w:val="22"/>
-              </w:rPr>
-              <w:t>), dan pendanaan (</w:t>
-            </w:r>
-            <w:r>
-              <w:rPr>
-                <w:rFonts w:ascii="Calibri" w:hAnsi="Calibri" w:cs="Calibri"/>
-                <w:b w:val="0"/>
-                <w:i/>
-                <w:sz w:val="22"/>
-              </w:rPr>
-              <w:t>financing</w:t>
-            </w:r>
-            <w:r>
-              <w:rPr>
-                <w:rFonts w:ascii="Calibri" w:hAnsi="Calibri" w:cs="Calibri"/>
-                <w:b w:val="0"/>
-                <w:i w:val="0"/>
-                <w:sz w:val="22"/>
-              </w:rPr>
-              <w:t xml:space="preserve">) — trikotomi tiga arah. Pemilahan ini memberi konsistensi klasifikasional yang lebih besar dan keterbandingan yang lebih baik daripada SCFP. Namun, </w:t>
-            </w:r>
-            <w:r>
-              <w:rPr>
-                <w:rFonts w:ascii="Calibri" w:hAnsi="Calibri" w:cs="Calibri"/>
-                <w:b/>
-                <w:i w:val="0"/>
-                <w:sz w:val="22"/>
-              </w:rPr>
-              <w:t>tiga dari tujuh anggota FASB menyatakan dissent</w:t>
-            </w:r>
-            <w:r>
-              <w:rPr>
-                <w:rFonts w:ascii="Calibri" w:hAnsi="Calibri" w:cs="Calibri"/>
-                <w:b w:val="0"/>
-                <w:i w:val="0"/>
-                <w:sz w:val="22"/>
-              </w:rPr>
-              <w:t xml:space="preserve">: mereka berpendapat bunga dan dividen yang </w:t>
-            </w:r>
-            <w:r>
-              <w:rPr>
-                <w:rFonts w:ascii="Calibri" w:hAnsi="Calibri" w:cs="Calibri"/>
-                <w:b w:val="0"/>
-                <w:i/>
-                <w:sz w:val="22"/>
-              </w:rPr>
-              <w:t>diterima</w:t>
-            </w:r>
-            <w:r>
-              <w:rPr>
-                <w:rFonts w:ascii="Calibri" w:hAnsi="Calibri" w:cs="Calibri"/>
-                <w:b w:val="0"/>
-                <w:i w:val="0"/>
-                <w:sz w:val="22"/>
-              </w:rPr>
-              <w:t xml:space="preserve"> berasal dari aktivitas investasi (paragraf 22) dan bunga yang </w:t>
-            </w:r>
-            <w:r>
-              <w:rPr>
-                <w:rFonts w:ascii="Calibri" w:hAnsi="Calibri" w:cs="Calibri"/>
-                <w:b w:val="0"/>
-                <w:i/>
-                <w:sz w:val="22"/>
-              </w:rPr>
-              <w:t>dibayar</w:t>
-            </w:r>
-            <w:r>
-              <w:rPr>
-                <w:rFonts w:ascii="Calibri" w:hAnsi="Calibri" w:cs="Calibri"/>
-                <w:b w:val="0"/>
-                <w:i w:val="0"/>
-                <w:sz w:val="22"/>
-              </w:rPr>
-              <w:t xml:space="preserve"> merupakan unsur aktivitas pendanaan, bukan biaya operasi (paragraf 23 Statement 95) — selaras dengan pemikiran disiplin keuangan kontemporer (Wolk et al., 2017).</w:t>
+              <w:t>Jika SCFP bekerja dengan kerangka biner sumber dan penggunaan yang mekanis, SCF menata penerimaan dan pengeluaran kas ke dalam tiga kategori yang lebih bermakna: aktivitas operasi, investasi, dan pendanaan. Pemilahan tiga arah ini memberi konsistensi klasifikasi sekaligus keterbandingan yang lebih baik ketimbang pendahulunya. Meski begitu, tiga dari tujuh anggota FASB menyatakan tidak setuju. Menurut mereka bunga dan dividen yang diterima berasal dari aktivitas investasi (paragraf 22), dan bunga yang dibayar merupakan unsur pendanaan dan bukan biaya operasi (paragraf 23), sebuah posisi yang justru sejalan dengan pemikiran ilmu keuangan kontemporer (Wolk et al., 2017).</w:t>
             </w:r>
           </w:p>
         </w:tc>
@@ -1757,7 +1127,7 @@
                 <w:i w:val="0"/>
                 <w:sz w:val="22"/>
               </w:rPr>
-              <w:t>Kas dan setara kas; pengungkapan nonkas</w:t>
+              <w:t>Bagaimana kas, setara kas, dan transaksi nonkas diperlakukan?</w:t>
             </w:r>
           </w:p>
         </w:tc>
@@ -1778,25 +1148,7 @@
                 <w:i w:val="0"/>
                 <w:sz w:val="22"/>
               </w:rPr>
-              <w:t xml:space="preserve">Dalam SCF, </w:t>
-            </w:r>
-            <w:r>
-              <w:rPr>
-                <w:rFonts w:ascii="Calibri" w:hAnsi="Calibri" w:cs="Calibri"/>
-                <w:b w:val="0"/>
-                <w:i/>
-                <w:sz w:val="22"/>
-              </w:rPr>
-              <w:t>cash</w:t>
-            </w:r>
-            <w:r>
-              <w:rPr>
-                <w:rFonts w:ascii="Calibri" w:hAnsi="Calibri" w:cs="Calibri"/>
-                <w:b w:val="0"/>
-                <w:i w:val="0"/>
-                <w:sz w:val="22"/>
-              </w:rPr>
-              <w:t xml:space="preserve"> (kas) didefinisikan sebagai kas literal di tangan atau simpanan yang dapat ditarik sewaktu-waktu, ditambah </w:t>
+              <w:t>SCF mendefinisikan kas sebagai uang tunai di tangan atau simpanan yang dapat ditarik sewaktu-waktu, ditambah setara kas (</w:t>
             </w:r>
             <w:r>
               <w:rPr>
@@ -1814,61 +1166,7 @@
                 <w:i w:val="0"/>
                 <w:sz w:val="22"/>
               </w:rPr>
-              <w:t xml:space="preserve"> (setara kas) — investasi jangka pendek yang sangat likuid dan dapat dikonversi menjadi kas dalam jumlah yang diketahui. Seperti APB Opinion No. 19, SFAS No. 95 mewajibkan seluruh transaksi investasi dan pendanaan nonkas (</w:t>
-            </w:r>
-            <w:r>
-              <w:rPr>
-                <w:rFonts w:ascii="Calibri" w:hAnsi="Calibri" w:cs="Calibri"/>
-                <w:b w:val="0"/>
-                <w:i/>
-                <w:sz w:val="22"/>
-              </w:rPr>
-              <w:t>noncash</w:t>
-            </w:r>
-            <w:r>
-              <w:rPr>
-                <w:rFonts w:ascii="Calibri" w:hAnsi="Calibri" w:cs="Calibri"/>
-                <w:b w:val="0"/>
-                <w:i w:val="0"/>
-                <w:sz w:val="22"/>
-              </w:rPr>
-              <w:t xml:space="preserve">) dilaporkan sebagai pelengkap SCF, baik dalam skedul maupun format naratif. Ini adalah penerapan konsep </w:t>
-            </w:r>
-            <w:r>
-              <w:rPr>
-                <w:rFonts w:ascii="Calibri" w:hAnsi="Calibri" w:cs="Calibri"/>
-                <w:b w:val="0"/>
-                <w:i/>
-                <w:sz w:val="22"/>
-              </w:rPr>
-              <w:t>all-inclusive</w:t>
-            </w:r>
-            <w:r>
-              <w:rPr>
-                <w:rFonts w:ascii="Calibri" w:hAnsi="Calibri" w:cs="Calibri"/>
-                <w:b w:val="0"/>
-                <w:i w:val="0"/>
-                <w:sz w:val="22"/>
-              </w:rPr>
-              <w:t xml:space="preserve"> / </w:t>
-            </w:r>
-            <w:r>
-              <w:rPr>
-                <w:rFonts w:ascii="Calibri" w:hAnsi="Calibri" w:cs="Calibri"/>
-                <w:b w:val="0"/>
-                <w:i/>
-                <w:sz w:val="22"/>
-              </w:rPr>
-              <w:t>all-resources</w:t>
-            </w:r>
-            <w:r>
-              <w:rPr>
-                <w:rFonts w:ascii="Calibri" w:hAnsi="Calibri" w:cs="Calibri"/>
-                <w:b w:val="0"/>
-                <w:i w:val="0"/>
-                <w:sz w:val="22"/>
-              </w:rPr>
-              <w:t>, yang memastikan semua debit dan kredit transaksi perusahaan terhitung dan tersaji (Wolk et al., 2017).</w:t>
+              <w:t>), yaitu investasi jangka pendek yang sangat likuid dan dapat dikonversi menjadi sejumlah kas yang sudah diketahui. Sebagaimana APB Opinion No. 19, SFAS No. 95 mewajibkan setiap transaksi investasi dan pendanaan yang tidak melibatkan kas tetap dilaporkan sebagai pelengkap, entah dalam bentuk skedul maupun narasi. Inilah penerapan pendekatan mencakup-semua yang memastikan tidak ada debit atau kredit transaksi perusahaan yang luput dari penyajian (Wolk et al., 2017).</w:t>
             </w:r>
           </w:p>
         </w:tc>
@@ -1891,7 +1189,7 @@
                 <w:i w:val="0"/>
                 <w:sz w:val="22"/>
               </w:rPr>
-              <w:t>Metode langsung vs tidak langsung</w:t>
+              <w:t>Apa beda metode langsung dan tidak langsung?</w:t>
             </w:r>
           </w:p>
         </w:tc>
@@ -1912,7 +1210,7 @@
                 <w:i w:val="0"/>
                 <w:sz w:val="22"/>
               </w:rPr>
-              <w:t xml:space="preserve">SFAS No. 95 mengizinkan penyajian arus kas operasi dengan </w:t>
+              <w:t>SFAS No. 95 mengizinkan arus kas operasi disajikan dengan metode langsung (</w:t>
             </w:r>
             <w:r>
               <w:rPr>
@@ -1930,7 +1228,7 @@
                 <w:i w:val="0"/>
                 <w:sz w:val="22"/>
               </w:rPr>
-              <w:t xml:space="preserve"> (metode langsung) atau </w:t>
+              <w:t>) atau metode tidak langsung (</w:t>
             </w:r>
             <w:r>
               <w:rPr>
@@ -1948,43 +1246,7 @@
                 <w:i w:val="0"/>
                 <w:sz w:val="22"/>
               </w:rPr>
-              <w:t xml:space="preserve"> (metode tidak langsung). Metode langsung melaporkan arus kas literal terkait klasifikasi laporan laba rugi (pendapatan, harga pokok penjualan, dan sebagainya), menyajikan lebih banyak informasi, dan lebih disukai FASB. Metode tidak langsung (</w:t>
-            </w:r>
-            <w:r>
-              <w:rPr>
-                <w:rFonts w:ascii="Calibri" w:hAnsi="Calibri" w:cs="Calibri"/>
-                <w:b w:val="0"/>
-                <w:i/>
-                <w:sz w:val="22"/>
-              </w:rPr>
-              <w:t>reconciliation method</w:t>
-            </w:r>
-            <w:r>
-              <w:rPr>
-                <w:rFonts w:ascii="Calibri" w:hAnsi="Calibri" w:cs="Calibri"/>
-                <w:b w:val="0"/>
-                <w:i w:val="0"/>
-                <w:sz w:val="22"/>
-              </w:rPr>
-              <w:t xml:space="preserve">, metode rekonsiliasi) bermula dari laba akrual lalu menyesuaikannya untuk pos nonkas terkait. FASB mengakui metode langsung dapat lebih mahal karena tidak semua perusahaan menata catatannya untuk menghasilkan data yang diperlukan; tidak disebut FASB, dalam praktik biasanya ada </w:t>
-            </w:r>
-            <w:r>
-              <w:rPr>
-                <w:rFonts w:ascii="Calibri" w:hAnsi="Calibri" w:cs="Calibri"/>
-                <w:b w:val="0"/>
-                <w:i/>
-                <w:sz w:val="22"/>
-              </w:rPr>
-              <w:t>plug number</w:t>
-            </w:r>
-            <w:r>
-              <w:rPr>
-                <w:rFonts w:ascii="Calibri" w:hAnsi="Calibri" w:cs="Calibri"/>
-                <w:b w:val="0"/>
-                <w:i w:val="0"/>
-                <w:sz w:val="22"/>
-              </w:rPr>
-              <w:t xml:space="preserve"> (angka penyeimbang) di suatu tempat dalam SCF agar angka seimbang saat memakai metode tidak langsung. Jika metode langsung dipakai, skedul terpisah merekonsiliasi arus kas operasi neto dengan laba bersih — sehingga metode tidak langsung tetap harus disajikan, sendiri atau sebagai pelengkap. Beberapa anggota FASB meyakini izin atas metode tidak langsung menghambat pemahaman pengguna dan menurunkan kualitas pelaporan (Wolk et al., 2017; lihat Exhibit 13.2 dan 13.3).</w:t>
+              <w:t>). Metode langsung melaporkan arus kas literal yang sejajar dengan pos laporan laba rugi seperti pendapatan dan harga pokok penjualan; ia menyajikan lebih banyak informasi dan menjadi pilihan FASB. Metode tidak langsung, atau metode rekonsiliasi, bertolak dari laba akrual lalu menyesuaikannya untuk pos-pos nonkas. FASB mengakui metode langsung bisa lebih mahal karena tidak semua perusahaan menata catatannya untuk menghasilkan data yang dibutuhkan, dan dalam praktik kerap diperlukan angka penyeimbang agar SCF metode tidak langsung benar-benar seimbang. Bila metode langsung dipakai, perusahaan tetap harus melampirkan skedul yang merekonsiliasi arus kas operasi neto dengan laba bersih, sehingga metode tidak langsung praktis selalu hadir. Sebagian anggota FASB bahkan menilai izin atas metode tidak langsung menghambat pemahaman pengguna dan menurunkan mutu pelaporan (Wolk et al., 2017; lihat Exhibit 13.2 dan 13.3).</w:t>
             </w:r>
           </w:p>
         </w:tc>
@@ -2159,7 +1421,7 @@
                 <w:i w:val="0"/>
                 <w:sz w:val="22"/>
               </w:rPr>
-              <w:t>Preferensi praktik dan studi McEnroe</w:t>
+              <w:t>Mengapa praktik condong ke metode tidak langsung, dan apa temuan McEnroe?</w:t>
             </w:r>
           </w:p>
         </w:tc>
@@ -2180,43 +1442,7 @@
                 <w:i w:val="0"/>
                 <w:sz w:val="22"/>
               </w:rPr>
-              <w:t xml:space="preserve">Mayoritas besar perusahaan Amerika menggunakan metode tidak langsung; penyusun tampak dipengaruhi isu biaya. Kedua metode menghasilkan angka arus kas operasi neto yang sama (Company M: $1.365; lihat Exhibit 13.2), tetapi informasi penyusunnya berbeda: (a) angka arus kas untuk penjualan, HPP, dan sejenisnya, versus (b) rekonsiliasi yang menyesuaikan laba akrual ke padanan kasnya. Isunya adalah biaya versus manfaat informasi. Riset empiris terbatas menunjukkan metode langsung lebih disukai, khususnya oleh pengguna eksternal: studi </w:t>
-            </w:r>
-            <w:r>
-              <w:rPr>
-                <w:rFonts w:ascii="Calibri" w:hAnsi="Calibri" w:cs="Calibri"/>
-                <w:b w:val="0"/>
-                <w:i/>
-                <w:sz w:val="22"/>
-              </w:rPr>
-              <w:t>McEnroe</w:t>
-            </w:r>
-            <w:r>
-              <w:rPr>
-                <w:rFonts w:ascii="Calibri" w:hAnsi="Calibri" w:cs="Calibri"/>
-                <w:b w:val="0"/>
-                <w:i w:val="0"/>
-                <w:sz w:val="22"/>
-              </w:rPr>
-              <w:t xml:space="preserve"> atas 282 responden (analis keuangan, penasihat investasi, profesor akuntansi, dan "akuntan") menemukan </w:t>
-            </w:r>
-            <w:r>
-              <w:rPr>
-                <w:rFonts w:ascii="Calibri" w:hAnsi="Calibri" w:cs="Calibri"/>
-                <w:b/>
-                <w:i w:val="0"/>
-                <w:sz w:val="22"/>
-              </w:rPr>
-              <w:t>56% memilih metode langsung melawan 44% metode tidak langsung</w:t>
-            </w:r>
-            <w:r>
-              <w:rPr>
-                <w:rFonts w:ascii="Calibri" w:hAnsi="Calibri" w:cs="Calibri"/>
-                <w:b w:val="0"/>
-                <w:i w:val="0"/>
-                <w:sz w:val="22"/>
-              </w:rPr>
-              <w:t>. Singkatnya, metode langsung mudah dipahami tetapi sulit disusun; metode tidak langsung sebaliknya (Wolk et al., 2017).</w:t>
+              <w:t>Sebagian besar perusahaan Amerika memakai metode tidak langsung, dan pertimbangan biaya tampak menjadi alasan utama penyusun. Kedua metode sebenarnya menghasilkan angka arus kas operasi neto yang sama — pada Company M sebesar $1.365 — tetapi informasi yang ditampilkannya berbeda: yang satu memperlihatkan arus kas untuk penjualan dan harga pokok, yang lain memperlihatkan rekonsiliasi laba akrual ke padanan kasnya. Persoalannya selalu biaya berhadapan dengan manfaat informasi. Riset empiris yang terbatas justru menunjukkan pengguna eksternal lebih menyukai metode langsung; studi McEnroe atas 282 responden, mulai dari analis keuangan, penasihat investasi, profesor akuntansi, hingga akuntan, menemukan 56 persen memilih metode langsung berbanding 44 persen metode tidak langsung. Singkatnya, metode langsung mudah dibaca tetapi sulit disusun, dan metode tidak langsung berlaku sebaliknya (Wolk et al., 2017).</w:t>
             </w:r>
           </w:p>
         </w:tc>
@@ -2239,7 +1465,7 @@
                 <w:i w:val="0"/>
                 <w:sz w:val="22"/>
               </w:rPr>
-              <w:t>Masalah nonartikulasi (Bahnson, Miller &amp; Budge)</w:t>
+              <w:t>Apa masalah nonartikulasi yang ditemukan Bahnson, Miller, dan Budge?</w:t>
             </w:r>
           </w:p>
         </w:tc>
@@ -2260,97 +1486,7 @@
                 <w:i w:val="0"/>
                 <w:sz w:val="22"/>
               </w:rPr>
-              <w:t xml:space="preserve">Sebuah masalah penting muncul terkait metode tidak langsung. Studi ekstensif </w:t>
-            </w:r>
-            <w:r>
-              <w:rPr>
-                <w:rFonts w:ascii="Calibri" w:hAnsi="Calibri" w:cs="Calibri"/>
-                <w:b w:val="0"/>
-                <w:i/>
-                <w:sz w:val="22"/>
-              </w:rPr>
-              <w:t>Bahnson, Miller, dan Budge</w:t>
-            </w:r>
-            <w:r>
-              <w:rPr>
-                <w:rFonts w:ascii="Calibri" w:hAnsi="Calibri" w:cs="Calibri"/>
-                <w:b w:val="0"/>
-                <w:i w:val="0"/>
-                <w:sz w:val="22"/>
-              </w:rPr>
-              <w:t xml:space="preserve"> menemukan </w:t>
-            </w:r>
-            <w:r>
-              <w:rPr>
-                <w:rFonts w:ascii="Calibri" w:hAnsi="Calibri" w:cs="Calibri"/>
-                <w:b w:val="0"/>
-                <w:i/>
-                <w:sz w:val="22"/>
-              </w:rPr>
-              <w:t>nonarticulation</w:t>
-            </w:r>
-            <w:r>
-              <w:rPr>
-                <w:rFonts w:ascii="Calibri" w:hAnsi="Calibri" w:cs="Calibri"/>
-                <w:b w:val="0"/>
-                <w:i w:val="0"/>
-                <w:sz w:val="22"/>
-              </w:rPr>
-              <w:t xml:space="preserve"> (ketakterartikulasian) terjadi ketika arus kas yang timbul dari perubahan akun modal kerja perusahaan terkonsolidasi </w:t>
-            </w:r>
-            <w:r>
-              <w:rPr>
-                <w:rFonts w:ascii="Calibri" w:hAnsi="Calibri" w:cs="Calibri"/>
-                <w:b w:val="0"/>
-                <w:i/>
-                <w:sz w:val="22"/>
-              </w:rPr>
-              <w:t>tidak sama</w:t>
-            </w:r>
-            <w:r>
-              <w:rPr>
-                <w:rFonts w:ascii="Calibri" w:hAnsi="Calibri" w:cs="Calibri"/>
-                <w:b w:val="0"/>
-                <w:i w:val="0"/>
-                <w:sz w:val="22"/>
-              </w:rPr>
-              <w:t xml:space="preserve"> dengan penyesuaian modal kerja yang tercantum pada bagian operasi SCF. Nonartikulasi menimbulkan kebingungan karena membuat SCF tampak tidak konsisten dengan neraca yang mendasarinya. Diskrepansi ini terjadi pada </w:t>
-            </w:r>
-            <w:r>
-              <w:rPr>
-                <w:rFonts w:ascii="Calibri" w:hAnsi="Calibri" w:cs="Calibri"/>
-                <w:b/>
-                <w:i w:val="0"/>
-                <w:sz w:val="22"/>
-              </w:rPr>
-              <w:t>75% situasi</w:t>
-            </w:r>
-            <w:r>
-              <w:rPr>
-                <w:rFonts w:ascii="Calibri" w:hAnsi="Calibri" w:cs="Calibri"/>
-                <w:b w:val="0"/>
-                <w:i w:val="0"/>
-                <w:sz w:val="22"/>
-              </w:rPr>
-              <w:t xml:space="preserve"> dalam sampel peneliti, dan tidak sepele — dalam Exhibit 13.4, perubahan akun neraca 3M untuk piutang usaha, persediaan, dan utang usaha dibandingkan dengan penyesuaian modal kerja di SCF; perhatikan selisih persentase piutang usaha (mencapai 300%), bahkan ada kasus tempat </w:t>
-            </w:r>
-            <w:r>
-              <w:rPr>
-                <w:rFonts w:ascii="Calibri" w:hAnsi="Calibri" w:cs="Calibri"/>
-                <w:b w:val="0"/>
-                <w:i/>
-                <w:sz w:val="22"/>
-              </w:rPr>
-              <w:t>tandanya</w:t>
-            </w:r>
-            <w:r>
-              <w:rPr>
-                <w:rFonts w:ascii="Calibri" w:hAnsi="Calibri" w:cs="Calibri"/>
-                <w:b w:val="0"/>
-                <w:i w:val="0"/>
-                <w:sz w:val="22"/>
-              </w:rPr>
-              <w:t xml:space="preserve"> pun berbeda (Wolk et al., 2017; lihat Exhibit 13.4).</w:t>
+              <w:t>Persoalan penting menyertai metode tidak langsung. Studi ekstensif Bahnson, Miller, dan Budge menunjukkan terjadinya nonartikulasi, yaitu keadaan ketika arus kas yang lahir dari perubahan akun modal kerja pada perusahaan terkonsolidasi tidak sama dengan penyesuaian modal kerja yang tercantum di bagian operasi SCF. Akibatnya SCF tampak tidak konsisten dengan neraca yang mendasarinya, dan ini membingungkan pengguna. Diskrepansi itu muncul pada 75 persen situasi dalam sampel mereka dan sama sekali tidak sepele. Exhibit 13.4 membandingkan perubahan akun neraca 3M untuk piutang usaha, persediaan, dan utang usaha dengan penyesuaian modal kerja di SCF; selisih pada piutang usaha bahkan mencapai sekitar 300 persen, dan pada beberapa kasus tandanya pun berbeda (Wolk et al., 2017; lihat Exhibit 13.4).</w:t>
             </w:r>
           </w:p>
         </w:tc>
@@ -2455,7 +1591,7 @@
                 <w:i w:val="0"/>
                 <w:sz w:val="22"/>
               </w:rPr>
-              <w:t>Tiga penyebab nonartikulasi</w:t>
+              <w:t>Apa tiga penyebab nonartikulasi?</w:t>
             </w:r>
           </w:p>
         </w:tc>
@@ -2476,151 +1612,7 @@
                 <w:i w:val="0"/>
                 <w:sz w:val="22"/>
               </w:rPr>
-              <w:t xml:space="preserve">Penyebab nonartikulasi ada tiga. </w:t>
-            </w:r>
-            <w:r>
-              <w:rPr>
-                <w:rFonts w:ascii="Calibri" w:hAnsi="Calibri" w:cs="Calibri"/>
-                <w:b w:val="0"/>
-                <w:i/>
-                <w:sz w:val="22"/>
-              </w:rPr>
-              <w:t>Pertama</w:t>
-            </w:r>
-            <w:r>
-              <w:rPr>
-                <w:rFonts w:ascii="Calibri" w:hAnsi="Calibri" w:cs="Calibri"/>
-                <w:b w:val="0"/>
-                <w:i w:val="0"/>
-                <w:sz w:val="22"/>
-              </w:rPr>
-              <w:t>, akuisisi anak perusahaan di tengah tahun (</w:t>
-            </w:r>
-            <w:r>
-              <w:rPr>
-                <w:rFonts w:ascii="Calibri" w:hAnsi="Calibri" w:cs="Calibri"/>
-                <w:b w:val="0"/>
-                <w:i/>
-                <w:sz w:val="22"/>
-              </w:rPr>
-              <w:t>mid-year acquisitions</w:t>
-            </w:r>
-            <w:r>
-              <w:rPr>
-                <w:rFonts w:ascii="Calibri" w:hAnsi="Calibri" w:cs="Calibri"/>
-                <w:b w:val="0"/>
-                <w:i w:val="0"/>
-                <w:sz w:val="22"/>
-              </w:rPr>
-              <w:t xml:space="preserve">): saldo modal kerja awal-tahun perusahaan yang diakuisisi tidak termasuk dalam neraca konsolidasi awal, sehingga untuk berartikulasi saldo yang hilang itu harus dimasukkan ke saldo awal-tahun perusahaan terkonsolidasi. </w:t>
-            </w:r>
-            <w:r>
-              <w:rPr>
-                <w:rFonts w:ascii="Calibri" w:hAnsi="Calibri" w:cs="Calibri"/>
-                <w:b w:val="0"/>
-                <w:i/>
-                <w:sz w:val="22"/>
-              </w:rPr>
-              <w:t>Kedua</w:t>
-            </w:r>
-            <w:r>
-              <w:rPr>
-                <w:rFonts w:ascii="Calibri" w:hAnsi="Calibri" w:cs="Calibri"/>
-                <w:b w:val="0"/>
-                <w:i w:val="0"/>
-                <w:sz w:val="22"/>
-              </w:rPr>
-              <w:t>, transaksi akun modal kerja yang tidak memengaruhi kas (juga menimpa perusahaan nonkonsolidasi): penilaian-naik/turun (</w:t>
-            </w:r>
-            <w:r>
-              <w:rPr>
-                <w:rFonts w:ascii="Calibri" w:hAnsi="Calibri" w:cs="Calibri"/>
-                <w:b w:val="0"/>
-                <w:i/>
-                <w:sz w:val="22"/>
-              </w:rPr>
-              <w:t>write-ups/write-downs</w:t>
-            </w:r>
-            <w:r>
-              <w:rPr>
-                <w:rFonts w:ascii="Calibri" w:hAnsi="Calibri" w:cs="Calibri"/>
-                <w:b w:val="0"/>
-                <w:i w:val="0"/>
-                <w:sz w:val="22"/>
-              </w:rPr>
-              <w:t xml:space="preserve">) pos modal kerja — biasanya persediaan — saat akuisisi secara pembelian, alokasi penyusutan ke dalam persediaan yang diproduksi, dan reklasifikasi akun modal kerja antara kategori lancar dan taklancar. </w:t>
-            </w:r>
-            <w:r>
-              <w:rPr>
-                <w:rFonts w:ascii="Calibri" w:hAnsi="Calibri" w:cs="Calibri"/>
-                <w:b w:val="0"/>
-                <w:i/>
-                <w:sz w:val="22"/>
-              </w:rPr>
-              <w:t>Ketiga</w:t>
-            </w:r>
-            <w:r>
-              <w:rPr>
-                <w:rFonts w:ascii="Calibri" w:hAnsi="Calibri" w:cs="Calibri"/>
-                <w:b w:val="0"/>
-                <w:i w:val="0"/>
-                <w:sz w:val="22"/>
-              </w:rPr>
-              <w:t>, satu akun utang usaha (</w:t>
-            </w:r>
-            <w:r>
-              <w:rPr>
-                <w:rFonts w:ascii="Calibri" w:hAnsi="Calibri" w:cs="Calibri"/>
-                <w:b w:val="0"/>
-                <w:i/>
-                <w:sz w:val="22"/>
-              </w:rPr>
-              <w:t>shared accounts</w:t>
-            </w:r>
-            <w:r>
-              <w:rPr>
-                <w:rFonts w:ascii="Calibri" w:hAnsi="Calibri" w:cs="Calibri"/>
-                <w:b w:val="0"/>
-                <w:i w:val="0"/>
-                <w:sz w:val="22"/>
-              </w:rPr>
-              <w:t xml:space="preserve">) digunakan untuk membeli aset modal kerja (persediaan, prabayar) sekaligus aset nonmodal-kerja (peralatan, tanah, paten): pembelian persediaan secara kredit adalah aktivitas operasi, sedangkan pembelian peralatan secara kredit adalah aktivitas investasi, sehingga perubahan utang usaha di neraca tidak akan sama dengan penyesuaian utang usaha di bagian operasi. Sebagai catatan terkait, pada 2008 FASB dan IASB menerbitkan </w:t>
-            </w:r>
-            <w:r>
-              <w:rPr>
-                <w:rFonts w:ascii="Calibri" w:hAnsi="Calibri" w:cs="Calibri"/>
-                <w:b w:val="0"/>
-                <w:i/>
-                <w:sz w:val="22"/>
-              </w:rPr>
-              <w:t>discussion paper</w:t>
-            </w:r>
-            <w:r>
-              <w:rPr>
-                <w:rFonts w:ascii="Calibri" w:hAnsi="Calibri" w:cs="Calibri"/>
-                <w:b w:val="0"/>
-                <w:i w:val="0"/>
-                <w:sz w:val="22"/>
-              </w:rPr>
-              <w:t xml:space="preserve"> yang mengusulkan format penyajian baru; usulan menggabungkan aktivitas operasi dan investasi menjadi satu klasifikasi "business" dipandang bermanfaat karena mengurangi pengalihan klasifikasi (</w:t>
-            </w:r>
-            <w:r>
-              <w:rPr>
-                <w:rFonts w:ascii="Calibri" w:hAnsi="Calibri" w:cs="Calibri"/>
-                <w:b w:val="0"/>
-                <w:i/>
-                <w:sz w:val="22"/>
-              </w:rPr>
-              <w:t>classification shifting</w:t>
-            </w:r>
-            <w:r>
-              <w:rPr>
-                <w:rFonts w:ascii="Calibri" w:hAnsi="Calibri" w:cs="Calibri"/>
-                <w:b w:val="0"/>
-                <w:i w:val="0"/>
-                <w:sz w:val="22"/>
-              </w:rPr>
-              <w:t>) antar keduanya (Wolk et al., 2017).</w:t>
+              <w:t>Ada tiga sumber yang menjelaskan mengapa nonartikulasi terjadi. Yang pertama adalah akuisisi anak perusahaan di tengah tahun: saldo modal kerja awal perusahaan yang diakuisisi tidak masuk ke neraca konsolidasi awal, sehingga agar berartikulasi saldo yang hilang itu mesti ditambahkan ke saldo awal entitas terkonsolidasi. Yang kedua adalah transaksi akun modal kerja yang tidak menyentuh kas, dan ini bahkan menimpa perusahaan nonkonsolidasi — termasuk penilaian-naik atau penilaian-turun pos modal kerja saat akuisisi pembelian (biasanya persediaan), alokasi penyusutan ke persediaan yang diproduksi, serta reklasifikasi akun modal kerja antarkategori lancar dan taklancar. Yang ketiga adalah satu akun utang usaha yang dipakai bersama untuk membeli aset modal kerja sekaligus aset di luar modal kerja: pembelian persediaan secara kredit tergolong operasi, sedangkan pembelian peralatan secara kredit tergolong investasi, sehingga perubahan utang usaha di neraca tidak akan sama dengan penyesuaiannya di bagian operasi. Menariknya, pada 2008 FASB dan IASB menerbitkan discussion paper yang mengusulkan format baru; gagasan menggabungkan aktivitas operasi dan investasi ke dalam satu klasifikasi "business" dipandang berguna karena memperkecil peluang pengalihan klasifikasi di antara keduanya (Wolk et al., 2017).</w:t>
             </w:r>
           </w:p>
         </w:tc>
@@ -2734,7 +1726,7 @@
                 <w:i w:val="0"/>
                 <w:sz w:val="22"/>
               </w:rPr>
-              <w:t>Masalah klasifikasi SFAS No. 95 (Nurnberg)</w:t>
+              <w:t>Apa keberatan Nurnberg atas klasifikasi SFAS No. 95?</w:t>
             </w:r>
           </w:p>
         </w:tc>
@@ -2755,61 +1747,7 @@
                 <w:i w:val="0"/>
                 <w:sz w:val="22"/>
               </w:rPr>
-              <w:t xml:space="preserve">Di luar tiga dissent, </w:t>
-            </w:r>
-            <w:r>
-              <w:rPr>
-                <w:rFonts w:ascii="Calibri" w:hAnsi="Calibri" w:cs="Calibri"/>
-                <w:b w:val="0"/>
-                <w:i/>
-                <w:sz w:val="22"/>
-              </w:rPr>
-              <w:t>Nurnberg</w:t>
-            </w:r>
-            <w:r>
-              <w:rPr>
-                <w:rFonts w:ascii="Calibri" w:hAnsi="Calibri" w:cs="Calibri"/>
-                <w:b w:val="0"/>
-                <w:i w:val="0"/>
-                <w:sz w:val="22"/>
-              </w:rPr>
-              <w:t xml:space="preserve"> mengajukan pertanyaan signifikan atas struktur SCF. Terkait trikotomi, ia mencatat SCF mengklasifikasikan penerimaan bunga dan dividen sebagai arus masuk operasi serta pembayaran bunga sebagai arus keluar operasi, padahal menurut literatur keuangan keduanya masing-masing adalah aktivitas </w:t>
-            </w:r>
-            <w:r>
-              <w:rPr>
-                <w:rFonts w:ascii="Calibri" w:hAnsi="Calibri" w:cs="Calibri"/>
-                <w:b w:val="0"/>
-                <w:i/>
-                <w:sz w:val="22"/>
-              </w:rPr>
-              <w:t>investasi</w:t>
-            </w:r>
-            <w:r>
-              <w:rPr>
-                <w:rFonts w:ascii="Calibri" w:hAnsi="Calibri" w:cs="Calibri"/>
-                <w:b w:val="0"/>
-                <w:i w:val="0"/>
-                <w:sz w:val="22"/>
-              </w:rPr>
-              <w:t xml:space="preserve"> (penerimaan) dan </w:t>
-            </w:r>
-            <w:r>
-              <w:rPr>
-                <w:rFonts w:ascii="Calibri" w:hAnsi="Calibri" w:cs="Calibri"/>
-                <w:b w:val="0"/>
-                <w:i/>
-                <w:sz w:val="22"/>
-              </w:rPr>
-              <w:t>pendanaan</w:t>
-            </w:r>
-            <w:r>
-              <w:rPr>
-                <w:rFonts w:ascii="Calibri" w:hAnsi="Calibri" w:cs="Calibri"/>
-                <w:b w:val="0"/>
-                <w:i w:val="0"/>
-                <w:sz w:val="22"/>
-              </w:rPr>
-              <w:t xml:space="preserve"> (pembayaran). Dalam SFAS No. 95, FASB mengikuti format laporan laba rugi dengan orientasi </w:t>
+              <w:t>Di luar tiga suara dissent tadi, Nurnberg melontarkan pertanyaan mendasar tentang struktur SCF. Ia menyoroti bahwa SCF menggolongkan penerimaan bunga dan dividen sebagai arus masuk operasi dan pembayaran bunga sebagai arus keluar operasi, padahal menurut literatur keuangan yang pertama semestinya investasi dan yang kedua pendanaan. Dalam menyusun SFAS No. 95, FASB mengikuti format laporan laba rugi yang berorientasi teori kepemilikan (</w:t>
             </w:r>
             <w:r>
               <w:rPr>
@@ -2827,7 +1765,7 @@
                 <w:i w:val="0"/>
                 <w:sz w:val="22"/>
               </w:rPr>
-              <w:t xml:space="preserve"> (teori kepemilikan) — pendapatan/beban bunga dan pendapatan dividen sebagai pos operasi. Ini kontras dengan pendekatan </w:t>
+              <w:t>), yang memandang pendapatan dan beban bunga serta pendapatan dividen sebagai pos operasi. Pendekatan ini berlawanan dengan teori entitas (</w:t>
             </w:r>
             <w:r>
               <w:rPr>
@@ -2845,7 +1783,7 @@
                 <w:i w:val="0"/>
                 <w:sz w:val="22"/>
               </w:rPr>
-              <w:t xml:space="preserve"> (teori entitas) yang menempatkan pendapatan bunga/dividen sebagai investasi dan beban bunga sebagai pendanaan. Pertimbangan praktis turut berperan: industri perbankan mendukung klasifikasi bunga sebagai pos operasi — yang memang mungkin tepat bagi bank — guna menghindari pelaporan arus kas operasi negatif. Konsistensi dengan laporan laba rugi plus persoalan perbankan inilah yang mungkin memengaruhi keputusan FASB (Wolk et al., 2017).</w:t>
+              <w:t>), yang menempatkan pendapatan bunga dan dividen sebagai investasi dan beban bunga sebagai pendanaan. Pertimbangan praktis ikut bermain: industri perbankan mendukung klasifikasi bunga sebagai pos operasi — yang memang masuk akal bagi bank — agar tidak melaporkan arus kas operasi negatif. Konsistensi dengan laporan laba rugi ditambah kepentingan perbankan inilah yang boleh jadi membentuk keputusan FASB (Wolk et al., 2017).</w:t>
             </w:r>
           </w:p>
         </w:tc>
@@ -2868,7 +1806,7 @@
                 <w:i w:val="0"/>
                 <w:sz w:val="22"/>
               </w:rPr>
-              <w:t>Fleksibilitas IAS 7</w:t>
+              <w:t>Bagaimana sikap IAS 7 atas bunga dan dividen?</w:t>
             </w:r>
           </w:p>
         </w:tc>
@@ -2886,73 +1824,10 @@
               <w:rPr>
                 <w:rFonts w:ascii="Calibri" w:hAnsi="Calibri" w:cs="Calibri"/>
                 <w:b w:val="0"/>
-                <w:i/>
-                <w:sz w:val="22"/>
-              </w:rPr>
-              <w:t>IAS 7</w:t>
-            </w:r>
-            <w:r>
-              <w:rPr>
-                <w:rFonts w:ascii="Calibri" w:hAnsi="Calibri" w:cs="Calibri"/>
-                <w:b w:val="0"/>
                 <w:i w:val="0"/>
                 <w:sz w:val="22"/>
               </w:rPr>
-              <w:t xml:space="preserve"> dari IASB mengambil pandangan fleksibel terhadap bunga dan dividen yang diterima atau dibayar: keduanya boleh diklasifikasikan sebagai arus kas operasi, investasi, atau pendanaan, </w:t>
-            </w:r>
-            <w:r>
-              <w:rPr>
-                <w:rFonts w:ascii="Calibri" w:hAnsi="Calibri" w:cs="Calibri"/>
-                <w:b w:val="0"/>
-                <w:i/>
-                <w:sz w:val="22"/>
-              </w:rPr>
-              <w:t>sepanjang</w:t>
-            </w:r>
-            <w:r>
-              <w:rPr>
-                <w:rFonts w:ascii="Calibri" w:hAnsi="Calibri" w:cs="Calibri"/>
-                <w:b w:val="0"/>
-                <w:i w:val="0"/>
-                <w:sz w:val="22"/>
-              </w:rPr>
-              <w:t xml:space="preserve"> diklasifikasikan secara konsisten dari periode ke periode. Perlakuan ini berkonflik dengan orientasi </w:t>
-            </w:r>
-            <w:r>
-              <w:rPr>
-                <w:rFonts w:ascii="Calibri" w:hAnsi="Calibri" w:cs="Calibri"/>
-                <w:b w:val="0"/>
-                <w:i/>
-                <w:sz w:val="22"/>
-              </w:rPr>
-              <w:t>proprietary</w:t>
-            </w:r>
-            <w:r>
-              <w:rPr>
-                <w:rFonts w:ascii="Calibri" w:hAnsi="Calibri" w:cs="Calibri"/>
-                <w:b w:val="0"/>
-                <w:i w:val="0"/>
-                <w:sz w:val="22"/>
-              </w:rPr>
-              <w:t xml:space="preserve"> SFAS No. 95 dan pendekatan </w:t>
-            </w:r>
-            <w:r>
-              <w:rPr>
-                <w:rFonts w:ascii="Calibri" w:hAnsi="Calibri" w:cs="Calibri"/>
-                <w:b w:val="0"/>
-                <w:i/>
-                <w:sz w:val="22"/>
-              </w:rPr>
-              <w:t>entity theory</w:t>
-            </w:r>
-            <w:r>
-              <w:rPr>
-                <w:rFonts w:ascii="Calibri" w:hAnsi="Calibri" w:cs="Calibri"/>
-                <w:b w:val="0"/>
-                <w:i w:val="0"/>
-                <w:sz w:val="22"/>
-              </w:rPr>
-              <w:t xml:space="preserve"> yang disarankan bab ini serta Bab 12. Bagi bank, bunga dan dividen wajar dipandang sebagai arus kas operasi; jika IAS 7 diubah untuk mengizinkan klasifikasi ini bagi bank, IASB akan mencapai keseragaman dalam industri (Wolk et al., 2017).</w:t>
+              <w:t>IAS 7 mengambil posisi yang lebih lentur. Bunga dan dividen, baik yang diterima maupun dibayar, boleh diklasifikasikan sebagai arus kas operasi, investasi, atau pendanaan, asalkan diperlakukan secara konsisten dari periode ke periode. Sikap ini bertabrakan dengan orientasi proprietary SFAS No. 95 sekaligus dengan pendekatan entity theory yang dianjurkan bab ini dan Bab 12. Bagi bank, memandang bunga dan dividen sebagai arus kas operasi tetap wajar; seandainya IAS 7 mengizinkan klasifikasi semacam itu khusus bagi bank, IASB justru akan memperoleh keseragaman dalam industri tersebut (Wolk et al., 2017).</w:t>
             </w:r>
           </w:p>
         </w:tc>
@@ -2975,7 +1850,7 @@
                 <w:i w:val="0"/>
                 <w:sz w:val="22"/>
               </w:rPr>
-              <w:t>Premium/diskonto obligasi — empat metode (Vent, Cowling &amp; Sevalstad)</w:t>
+              <w:t>Bagaimana premium dan diskonto obligasi diperlakukan menurut Vent, Cowling, dan Sevalstad?</w:t>
             </w:r>
           </w:p>
         </w:tc>
@@ -2996,187 +1871,7 @@
                 <w:i w:val="0"/>
                 <w:sz w:val="22"/>
               </w:rPr>
-              <w:t xml:space="preserve">Pemisahan antara pendapatan bunga/dividen (operasi), pembelian saham perusahaan lain (investasi), dan peminjaman/pelunasan pokok (pendanaan) memunculkan masalah lanjutan: bagaimana memperlakukan diskonto atau premium obligasi/wesel, yang merupakan penyesuaian bunga tetapi bagian dari pokok yang dipinjam. </w:t>
-            </w:r>
-            <w:r>
-              <w:rPr>
-                <w:rFonts w:ascii="Calibri" w:hAnsi="Calibri" w:cs="Calibri"/>
-                <w:b w:val="0"/>
-                <w:i/>
-                <w:sz w:val="22"/>
-              </w:rPr>
-              <w:t>Vent, Cowling, dan Sevalstad</w:t>
-            </w:r>
-            <w:r>
-              <w:rPr>
-                <w:rFonts w:ascii="Calibri" w:hAnsi="Calibri" w:cs="Calibri"/>
-                <w:b w:val="0"/>
-                <w:i w:val="0"/>
-                <w:sz w:val="22"/>
-              </w:rPr>
-              <w:t xml:space="preserve"> menemukan </w:t>
-            </w:r>
-            <w:r>
-              <w:rPr>
-                <w:rFonts w:ascii="Calibri" w:hAnsi="Calibri" w:cs="Calibri"/>
-                <w:b/>
-                <w:i w:val="0"/>
-                <w:sz w:val="22"/>
-              </w:rPr>
-              <w:t>empat cara</w:t>
-            </w:r>
-            <w:r>
-              <w:rPr>
-                <w:rFonts w:ascii="Calibri" w:hAnsi="Calibri" w:cs="Calibri"/>
-                <w:b w:val="0"/>
-                <w:i w:val="0"/>
-                <w:sz w:val="22"/>
-              </w:rPr>
-              <w:t xml:space="preserve"> dalam laporan tahunan terpublikasi. Ilustrasinya: perusahaan menerbitkan obligasi kupon 8% berjangka empat tahun, nilai nominal (</w:t>
-            </w:r>
-            <w:r>
-              <w:rPr>
-                <w:rFonts w:ascii="Calibri" w:hAnsi="Calibri" w:cs="Calibri"/>
-                <w:b w:val="0"/>
-                <w:i/>
-                <w:sz w:val="22"/>
-              </w:rPr>
-              <w:t>par value</w:t>
-            </w:r>
-            <w:r>
-              <w:rPr>
-                <w:rFonts w:ascii="Calibri" w:hAnsi="Calibri" w:cs="Calibri"/>
-                <w:b w:val="0"/>
-                <w:i w:val="0"/>
-                <w:sz w:val="22"/>
-              </w:rPr>
-              <w:t xml:space="preserve">) total $10.000, terjual seharga $11.000 pada 31 Desember 2000 (premium $1.000); dengan amortisasi garis lurus, beban bunga tahunan = </w:t>
-            </w:r>
-            <w:r>
-              <w:rPr>
-                <w:rFonts w:ascii="Calibri" w:hAnsi="Calibri" w:cs="Calibri"/>
-                <w:b/>
-                <w:i w:val="0"/>
-                <w:sz w:val="22"/>
-              </w:rPr>
-              <w:t>$550 ($800 kupon dikurangi $250 amortisasi premium)</w:t>
-            </w:r>
-            <w:r>
-              <w:rPr>
-                <w:rFonts w:ascii="Calibri" w:hAnsi="Calibri" w:cs="Calibri"/>
-                <w:b w:val="0"/>
-                <w:i w:val="0"/>
-                <w:sz w:val="22"/>
-              </w:rPr>
-              <w:t xml:space="preserve">. </w:t>
-            </w:r>
-            <w:r>
-              <w:rPr>
-                <w:rFonts w:ascii="Calibri" w:hAnsi="Calibri" w:cs="Calibri"/>
-                <w:b w:val="0"/>
-                <w:i/>
-                <w:sz w:val="22"/>
-              </w:rPr>
-              <w:t>Metode 1</w:t>
-            </w:r>
-            <w:r>
-              <w:rPr>
-                <w:rFonts w:ascii="Calibri" w:hAnsi="Calibri" w:cs="Calibri"/>
-                <w:b w:val="0"/>
-                <w:i w:val="0"/>
-                <w:sz w:val="22"/>
-              </w:rPr>
-              <w:t xml:space="preserve"> paling mudah diikuti dan kemungkinan dipakai dengan metode langsung; jumlah arus operasinya tidak sama dengan beban bunga akrual karena premium $1.000 menjadi bagian arus pendanaan tahun 2000. </w:t>
-            </w:r>
-            <w:r>
-              <w:rPr>
-                <w:rFonts w:ascii="Calibri" w:hAnsi="Calibri" w:cs="Calibri"/>
-                <w:b w:val="0"/>
-                <w:i/>
-                <w:sz w:val="22"/>
-              </w:rPr>
-              <w:t>Metode 2</w:t>
-            </w:r>
-            <w:r>
-              <w:rPr>
-                <w:rFonts w:ascii="Calibri" w:hAnsi="Calibri" w:cs="Calibri"/>
-                <w:b w:val="0"/>
-                <w:i w:val="0"/>
-                <w:sz w:val="22"/>
-              </w:rPr>
-              <w:t xml:space="preserve"> dan </w:t>
-            </w:r>
-            <w:r>
-              <w:rPr>
-                <w:rFonts w:ascii="Calibri" w:hAnsi="Calibri" w:cs="Calibri"/>
-                <w:b w:val="0"/>
-                <w:i/>
-                <w:sz w:val="22"/>
-              </w:rPr>
-              <w:t>3</w:t>
-            </w:r>
-            <w:r>
-              <w:rPr>
-                <w:rFonts w:ascii="Calibri" w:hAnsi="Calibri" w:cs="Calibri"/>
-                <w:b w:val="0"/>
-                <w:i w:val="0"/>
-                <w:sz w:val="22"/>
-              </w:rPr>
-              <w:t xml:space="preserve"> memindahkan premium dari arus investasi ke kategori operasi (Metode 2 pada tahun pembayaran 2004; Metode 3 pada tahun penerbitan 2000). </w:t>
-            </w:r>
-            <w:r>
-              <w:rPr>
-                <w:rFonts w:ascii="Calibri" w:hAnsi="Calibri" w:cs="Calibri"/>
-                <w:b w:val="0"/>
-                <w:i/>
-                <w:sz w:val="22"/>
-              </w:rPr>
-              <w:t>Metode 4</w:t>
-            </w:r>
-            <w:r>
-              <w:rPr>
-                <w:rFonts w:ascii="Calibri" w:hAnsi="Calibri" w:cs="Calibri"/>
-                <w:b w:val="0"/>
-                <w:i w:val="0"/>
-                <w:sz w:val="22"/>
-              </w:rPr>
-              <w:t xml:space="preserve"> mengalokasikan premium sepanjang umur obligasi. Preferensi penulis jatuh pada </w:t>
-            </w:r>
-            <w:r>
-              <w:rPr>
-                <w:rFonts w:ascii="Calibri" w:hAnsi="Calibri" w:cs="Calibri"/>
-                <w:b w:val="0"/>
-                <w:i/>
-                <w:sz w:val="22"/>
-              </w:rPr>
-              <w:t>Metode 1</w:t>
-            </w:r>
-            <w:r>
-              <w:rPr>
-                <w:rFonts w:ascii="Calibri" w:hAnsi="Calibri" w:cs="Calibri"/>
-                <w:b w:val="0"/>
-                <w:i w:val="0"/>
-                <w:sz w:val="22"/>
-              </w:rPr>
-              <w:t xml:space="preserve"> meski ada ketaksamaan antara nilai akrual dan kas; </w:t>
-            </w:r>
-            <w:r>
-              <w:rPr>
-                <w:rFonts w:ascii="Calibri" w:hAnsi="Calibri" w:cs="Calibri"/>
-                <w:b/>
-                <w:i w:val="0"/>
-                <w:sz w:val="22"/>
-              </w:rPr>
-              <w:t>Metode 4 paling tidak masuk akal</w:t>
-            </w:r>
-            <w:r>
-              <w:rPr>
-                <w:rFonts w:ascii="Calibri" w:hAnsi="Calibri" w:cs="Calibri"/>
-                <w:b w:val="0"/>
-                <w:i w:val="0"/>
-                <w:sz w:val="22"/>
-              </w:rPr>
-              <w:t xml:space="preserve"> karena memecah arus kas tahunan $800 (2001–2004) menjadi dua segmen, sehingga keliru merepresentasikan arus kas riil. Ini adalah contoh lain dari masalah alokasi (Wolk et al., 2017; lihat Exhibit 13.5).</w:t>
+              <w:t>Pemisahan antara pendapatan bunga di operasi, pembelian saham perusahaan lain di investasi, dan peminjaman atau pelunasan pokok di pendanaan memunculkan persoalan turunan: ke mana premium atau diskonto obligasi digolongkan, mengingat ia penyesuaian bunga sekaligus bagian dari pokok yang dipinjam. Vent, Cowling, dan Sevalstad menemukan empat cara berbeda dalam laporan tahunan yang terbit. Ilustrasinya, sebuah perusahaan menerbitkan obligasi kupon 8 persen berjangka empat tahun dengan nilai nominal $10.000 yang laku $11.000 pada 31 Desember 2000, sehingga ada premium $1.000; dengan amortisasi garis lurus, beban bunga tahunannya $550, yaitu kupon $800 dikurangi amortisasi premium $250. Metode pertama paling mudah diikuti dan cocok dengan metode langsung, meski jumlah arus operasinya tidak sama dengan beban bunga akrual karena premium $1.000 masuk ke arus pendanaan tahun 2000. Metode kedua dan ketiga memindahkan premium dari arus investasi ke kategori operasi, masing-masing pada tahun pembayaran 2004 dan tahun penerbitan 2000, sedangkan metode keempat menyebar premium sepanjang umur obligasi. Wolk lebih memilih metode pertama meski ada ketaksamaan antara nilai akrual dan kas, dan menilai metode keempat paling tidak masuk akal karena memecah arus kas tahunan $800 menjadi dua segmen sehingga keliru menggambarkan arus kas riil. Sekali lagi, ini contoh persoalan alokasi (Wolk et al., 2017; lihat Exhibit 13.5).</w:t>
             </w:r>
           </w:p>
         </w:tc>
@@ -3281,7 +1976,7 @@
                 <w:i w:val="0"/>
                 <w:sz w:val="22"/>
               </w:rPr>
-              <w:t>Bunga dikapitalisasi (SFAS No. 34) dan sewa</w:t>
+              <w:t>Bagaimana bunga dikapitalisasi (SFAS No. 34) dan sewa menimbulkan dilema serupa?</w:t>
             </w:r>
           </w:p>
         </w:tc>
@@ -3299,109 +1994,10 @@
               <w:rPr>
                 <w:rFonts w:ascii="Calibri" w:hAnsi="Calibri" w:cs="Calibri"/>
                 <w:b w:val="0"/>
-                <w:i/>
-                <w:sz w:val="22"/>
-              </w:rPr>
-              <w:t>Munter</w:t>
-            </w:r>
-            <w:r>
-              <w:rPr>
-                <w:rFonts w:ascii="Calibri" w:hAnsi="Calibri" w:cs="Calibri"/>
-                <w:b w:val="0"/>
                 <w:i w:val="0"/>
                 <w:sz w:val="22"/>
               </w:rPr>
-              <w:t xml:space="preserve"> mengangkat isu serupa. Jika pembayaran bunga dikapitalisasi sesuai </w:t>
-            </w:r>
-            <w:r>
-              <w:rPr>
-                <w:rFonts w:ascii="Calibri" w:hAnsi="Calibri" w:cs="Calibri"/>
-                <w:b w:val="0"/>
-                <w:i/>
-                <w:sz w:val="22"/>
-              </w:rPr>
-              <w:t>SFAS No. 34</w:t>
-            </w:r>
-            <w:r>
-              <w:rPr>
-                <w:rFonts w:ascii="Calibri" w:hAnsi="Calibri" w:cs="Calibri"/>
-                <w:b w:val="0"/>
-                <w:i w:val="0"/>
-                <w:sz w:val="22"/>
-              </w:rPr>
-              <w:t xml:space="preserve">, bunga itu dikeluarkan dari aktivitas operasi dan dimasukkan ke aktivitas investasi sebagai bagian biaya perolehan aset tetap. Ini memunculkan pertanyaan apakah suatu kejadian diklasifikasikan menurut </w:t>
-            </w:r>
-            <w:r>
-              <w:rPr>
-                <w:rFonts w:ascii="Calibri" w:hAnsi="Calibri" w:cs="Calibri"/>
-                <w:b w:val="0"/>
-                <w:i/>
-                <w:sz w:val="22"/>
-              </w:rPr>
-              <w:t>sifat dasar</w:t>
-            </w:r>
-            <w:r>
-              <w:rPr>
-                <w:rFonts w:ascii="Calibri" w:hAnsi="Calibri" w:cs="Calibri"/>
-                <w:b w:val="0"/>
-                <w:i w:val="0"/>
-                <w:sz w:val="22"/>
-              </w:rPr>
-              <w:t xml:space="preserve"> penerimaan/pengeluaran (pembayaran bunga) atau menurut </w:t>
-            </w:r>
-            <w:r>
-              <w:rPr>
-                <w:rFonts w:ascii="Calibri" w:hAnsi="Calibri" w:cs="Calibri"/>
-                <w:b w:val="0"/>
-                <w:i/>
-                <w:sz w:val="22"/>
-              </w:rPr>
-              <w:t>tujuan akhir</w:t>
-            </w:r>
-            <w:r>
-              <w:rPr>
-                <w:rFonts w:ascii="Calibri" w:hAnsi="Calibri" w:cs="Calibri"/>
-                <w:b w:val="0"/>
-                <w:i w:val="0"/>
-                <w:sz w:val="22"/>
-              </w:rPr>
-              <w:t xml:space="preserve"> peristiwa (perolehan aset). Pembelahan serupa muncul dalam transaksi sewa: pada </w:t>
-            </w:r>
-            <w:r>
-              <w:rPr>
-                <w:rFonts w:ascii="Calibri" w:hAnsi="Calibri" w:cs="Calibri"/>
-                <w:b w:val="0"/>
-                <w:i/>
-                <w:sz w:val="22"/>
-              </w:rPr>
-              <w:t>operating lease</w:t>
-            </w:r>
-            <w:r>
-              <w:rPr>
-                <w:rFonts w:ascii="Calibri" w:hAnsi="Calibri" w:cs="Calibri"/>
-                <w:b w:val="0"/>
-                <w:i w:val="0"/>
-                <w:sz w:val="22"/>
-              </w:rPr>
-              <w:t xml:space="preserve"> (sewa operasi), seluruh pengeluaran kas diklasifikasikan sebagai arus keluar operasi; pada </w:t>
-            </w:r>
-            <w:r>
-              <w:rPr>
-                <w:rFonts w:ascii="Calibri" w:hAnsi="Calibri" w:cs="Calibri"/>
-                <w:b w:val="0"/>
-                <w:i/>
-                <w:sz w:val="22"/>
-              </w:rPr>
-              <w:t>capital lease</w:t>
-            </w:r>
-            <w:r>
-              <w:rPr>
-                <w:rFonts w:ascii="Calibri" w:hAnsi="Calibri" w:cs="Calibri"/>
-                <w:b w:val="0"/>
-                <w:i w:val="0"/>
-                <w:sz w:val="22"/>
-              </w:rPr>
-              <w:t xml:space="preserve"> (sewa pembiayaan), porsi bunga adalah aktivitas operasi sedangkan porsi pengurangan pokok adalah aktivitas pendanaan. Apakah sifat dasar atau tujuan akhir yang seharusnya menentukan tetap menjadi pertanyaan tak terjawab (Wolk et al., 2017).</w:t>
+              <w:t>Munter mengangkat persoalan yang sebangun. Ketika pembayaran bunga dikapitalisasi sesuai SFAS No. 34, bunga itu keluar dari aktivitas operasi dan masuk ke investasi sebagai bagian biaya perolehan aset tetap. Pertanyaannya kemudian, apakah suatu kejadian digolongkan menurut sifat dasar penerimaan atau pengeluarannya, ataukah menurut tujuan akhirnya. Dilema yang sama muncul pada sewa: pada sewa operasi seluruh pengeluaran kas tergolong arus keluar operasi, sedangkan pada sewa pembiayaan porsi bunga tergolong operasi dan porsi pengurangan pokok tergolong pendanaan. Mana di antara sifat dasar dan tujuan akhir yang seharusnya menentukan tetap belum terjawab (Wolk et al., 2017).</w:t>
             </w:r>
           </w:p>
         </w:tc>
@@ -3424,7 +2020,7 @@
                 <w:i w:val="0"/>
                 <w:sz w:val="22"/>
               </w:rPr>
-              <w:t>Fleksibilitas penyajian: SFAS No. 104 atas lindung nilai</w:t>
+              <w:t>Bagaimana SFAS No. 104 melonggarkan penyajian lindung nilai?</w:t>
             </w:r>
           </w:p>
         </w:tc>
@@ -3463,79 +2059,7 @@
                 <w:i w:val="0"/>
                 <w:sz w:val="22"/>
               </w:rPr>
-              <w:t xml:space="preserve">) dianggap aktivitas investasi — klasifikasi kaku berdasarkan sifat transaksi (konsep </w:t>
-            </w:r>
-            <w:r>
-              <w:rPr>
-                <w:rFonts w:ascii="Calibri" w:hAnsi="Calibri" w:cs="Calibri"/>
-                <w:b w:val="0"/>
-                <w:i/>
-                <w:sz w:val="22"/>
-              </w:rPr>
-              <w:t>rigid uniformity</w:t>
-            </w:r>
-            <w:r>
-              <w:rPr>
-                <w:rFonts w:ascii="Calibri" w:hAnsi="Calibri" w:cs="Calibri"/>
-                <w:b w:val="0"/>
-                <w:i w:val="0"/>
-                <w:sz w:val="22"/>
-              </w:rPr>
-              <w:t xml:space="preserve">, keseragaman kaku). Sebaliknya, </w:t>
-            </w:r>
-            <w:r>
-              <w:rPr>
-                <w:rFonts w:ascii="Calibri" w:hAnsi="Calibri" w:cs="Calibri"/>
-                <w:b w:val="0"/>
-                <w:i/>
-                <w:sz w:val="22"/>
-              </w:rPr>
-              <w:t>SFAS No. 104</w:t>
-            </w:r>
-            <w:r>
-              <w:rPr>
-                <w:rFonts w:ascii="Calibri" w:hAnsi="Calibri" w:cs="Calibri"/>
-                <w:b w:val="0"/>
-                <w:i w:val="0"/>
-                <w:sz w:val="22"/>
-              </w:rPr>
-              <w:t xml:space="preserve"> yang mengamendemen SFAS No. 95 mengizinkan pengaitan dengan akun neraca spesifik transaksi lindung nilai: jika teridentifikasi dengan pos tertentu seperti persediaan (misalnya melindungi dari kenaikan harga persediaan), lindung nilai (kontrak forward, futures, opsi, atau swap) boleh diklasifikasikan bersama pos itu sebagai unsur operasi atau sebagai aktivitas investasi. </w:t>
-            </w:r>
-            <w:r>
-              <w:rPr>
-                <w:rFonts w:ascii="Calibri" w:hAnsi="Calibri" w:cs="Calibri"/>
-                <w:b w:val="0"/>
-                <w:i/>
-                <w:sz w:val="22"/>
-              </w:rPr>
-              <w:t>Nurnberg dan Largay</w:t>
-            </w:r>
-            <w:r>
-              <w:rPr>
-                <w:rFonts w:ascii="Calibri" w:hAnsi="Calibri" w:cs="Calibri"/>
-                <w:b w:val="0"/>
-                <w:i w:val="0"/>
-                <w:sz w:val="22"/>
-              </w:rPr>
-              <w:t xml:space="preserve"> meyakini peningkatan fleksibilitas ini umumnya menurunkan keterbandingan, tetapi dapat dibenarkan sebagai peningkatan "</w:t>
-            </w:r>
-            <w:r>
-              <w:rPr>
-                <w:rFonts w:ascii="Calibri" w:hAnsi="Calibri" w:cs="Calibri"/>
-                <w:b w:val="0"/>
-                <w:i/>
-                <w:sz w:val="22"/>
-              </w:rPr>
-              <w:t>fineness</w:t>
-            </w:r>
-            <w:r>
-              <w:rPr>
-                <w:rFonts w:ascii="Calibri" w:hAnsi="Calibri" w:cs="Calibri"/>
-                <w:b w:val="0"/>
-                <w:i w:val="0"/>
-                <w:sz w:val="22"/>
-              </w:rPr>
-              <w:t>" (kehalusan) dalam situasi tertentu (Wolk et al., 2017).</w:t>
+              <w:t>) dipandang sebagai aktivitas investasi — sebuah klasifikasi kaku yang bersandar semata pada sifat transaksi. SFAS No. 104 yang mengamendemennya melonggarkan hal ini dengan membolehkan lindung nilai dikaitkan ke akun neraca yang spesifik. Bila sebuah kontrak forward, futures, opsi, atau swap teridentifikasi dengan pos tertentu seperti persediaan, misalnya untuk melindungi dari kenaikan harga persediaan, lindung nilai itu boleh diklasifikasikan bersama pos tersebut sebagai unsur operasi, atau tetap sebagai investasi. Nurnberg dan Largay menilai pelonggaran ini umumnya menurunkan keterbandingan, tetapi dapat dibenarkan sebagai peningkatan kehalusan informasi dalam situasi tertentu (Wolk et al., 2017).</w:t>
             </w:r>
           </w:p>
         </w:tc>
@@ -3558,7 +2082,7 @@
                 <w:i w:val="0"/>
                 <w:sz w:val="22"/>
               </w:rPr>
-              <w:t>Kegunaan analitis: model Ingram &amp; Lee</w:t>
+              <w:t>Seberapa berguna SCF secara analitis menurut model Ingram dan Lee?</w:t>
             </w:r>
           </w:p>
         </w:tc>
@@ -3579,133 +2103,7 @@
                 <w:i w:val="0"/>
                 <w:sz w:val="22"/>
               </w:rPr>
-              <w:t xml:space="preserve">Meski memiliki masalah klasifikasi dan nonartikulasi, SCF jelas sangat berguna, sebagaimana ditunjukkan riset </w:t>
-            </w:r>
-            <w:r>
-              <w:rPr>
-                <w:rFonts w:ascii="Calibri" w:hAnsi="Calibri" w:cs="Calibri"/>
-                <w:b w:val="0"/>
-                <w:i/>
-                <w:sz w:val="22"/>
-              </w:rPr>
-              <w:t>Ingram dan Lee</w:t>
-            </w:r>
-            <w:r>
-              <w:rPr>
-                <w:rFonts w:ascii="Calibri" w:hAnsi="Calibri" w:cs="Calibri"/>
-                <w:b w:val="0"/>
-                <w:i w:val="0"/>
-                <w:sz w:val="22"/>
-              </w:rPr>
-              <w:t xml:space="preserve"> yang memakai laporan laba rugi dan SCF bersama-sama. Mereka mendalilkan bahwa dari waktu ke waktu, perusahaan yang </w:t>
-            </w:r>
-            <w:r>
-              <w:rPr>
-                <w:rFonts w:ascii="Calibri" w:hAnsi="Calibri" w:cs="Calibri"/>
-                <w:b w:val="0"/>
-                <w:i/>
-                <w:sz w:val="22"/>
-              </w:rPr>
-              <w:t>tumbuh</w:t>
-            </w:r>
-            <w:r>
-              <w:rPr>
-                <w:rFonts w:ascii="Calibri" w:hAnsi="Calibri" w:cs="Calibri"/>
-                <w:b w:val="0"/>
-                <w:i w:val="0"/>
-                <w:sz w:val="22"/>
-              </w:rPr>
-              <w:t xml:space="preserve"> memiliki laba </w:t>
-            </w:r>
-            <w:r>
-              <w:rPr>
-                <w:rFonts w:ascii="Calibri" w:hAnsi="Calibri" w:cs="Calibri"/>
-                <w:b w:val="0"/>
-                <w:i/>
-                <w:sz w:val="22"/>
-              </w:rPr>
-              <w:t>lebih tinggi</w:t>
-            </w:r>
-            <w:r>
-              <w:rPr>
-                <w:rFonts w:ascii="Calibri" w:hAnsi="Calibri" w:cs="Calibri"/>
-                <w:b w:val="0"/>
-                <w:i w:val="0"/>
-                <w:sz w:val="22"/>
-              </w:rPr>
-              <w:t xml:space="preserve"> tetapi arus kas operasi </w:t>
-            </w:r>
-            <w:r>
-              <w:rPr>
-                <w:rFonts w:ascii="Calibri" w:hAnsi="Calibri" w:cs="Calibri"/>
-                <w:b w:val="0"/>
-                <w:i/>
-                <w:sz w:val="22"/>
-              </w:rPr>
-              <w:t>lebih rendah</w:t>
-            </w:r>
-            <w:r>
-              <w:rPr>
-                <w:rFonts w:ascii="Calibri" w:hAnsi="Calibri" w:cs="Calibri"/>
-                <w:b w:val="0"/>
-                <w:i w:val="0"/>
-                <w:sz w:val="22"/>
-              </w:rPr>
-              <w:t xml:space="preserve"> — karena ekspansi meningkatkan persediaan dan piutang usaha; meski sebagian terimbangi kenaikan utang usaha, efek neto pertumbuhan modal kerja membuat perubahan laba melampaui perubahan arus kas operasi tiap tahun. Saat berekspansi, ada arus keluar investasi neto (perolehan aset tetap) dan arus masuk pendanaan (utang/ekuitas baru), sementara dividen rendah. Bagi perusahaan yang </w:t>
-            </w:r>
-            <w:r>
-              <w:rPr>
-                <w:rFonts w:ascii="Calibri" w:hAnsi="Calibri" w:cs="Calibri"/>
-                <w:b w:val="0"/>
-                <w:i/>
-                <w:sz w:val="22"/>
-              </w:rPr>
-              <w:t>menyusut</w:t>
-            </w:r>
-            <w:r>
-              <w:rPr>
-                <w:rFonts w:ascii="Calibri" w:hAnsi="Calibri" w:cs="Calibri"/>
-                <w:b w:val="0"/>
-                <w:i w:val="0"/>
-                <w:sz w:val="22"/>
-              </w:rPr>
-              <w:t xml:space="preserve"> (</w:t>
-            </w:r>
-            <w:r>
-              <w:rPr>
-                <w:rFonts w:ascii="Calibri" w:hAnsi="Calibri" w:cs="Calibri"/>
-                <w:b w:val="0"/>
-                <w:i/>
-                <w:sz w:val="22"/>
-              </w:rPr>
-              <w:t>contracting</w:t>
-            </w:r>
-            <w:r>
-              <w:rPr>
-                <w:rFonts w:ascii="Calibri" w:hAnsi="Calibri" w:cs="Calibri"/>
-                <w:b w:val="0"/>
-                <w:i w:val="0"/>
-                <w:sz w:val="22"/>
-              </w:rPr>
-              <w:t xml:space="preserve">), hubungan ini sebagian besar terbalik. Analisis statistik mereka melibatkan hampir 1.000 perusahaan sepanjang 1974–1992, secara umum mendukung analisis deduktif dan menemukan bahwa perusahaan yang berekspansi cenderung memiliki </w:t>
-            </w:r>
-            <w:r>
-              <w:rPr>
-                <w:rFonts w:ascii="Calibri" w:hAnsi="Calibri" w:cs="Calibri"/>
-                <w:b w:val="0"/>
-                <w:i/>
-                <w:sz w:val="22"/>
-              </w:rPr>
-              <w:t>leverage</w:t>
-            </w:r>
-            <w:r>
-              <w:rPr>
-                <w:rFonts w:ascii="Calibri" w:hAnsi="Calibri" w:cs="Calibri"/>
-                <w:b w:val="0"/>
-                <w:i w:val="0"/>
-                <w:sz w:val="22"/>
-              </w:rPr>
-              <w:t xml:space="preserve"> keuangan lebih besar daripada yang menyusut (Wolk et al., 2017).</w:t>
+              <w:t>Sekalipun menanggung masalah klasifikasi dan nonartikulasi, SCF tetap sangat berguna, dan riset Ingram dan Lee menunjukkannya dengan memakai laporan laba rugi dan SCF secara bersama. Argumen mereka, dari waktu ke waktu perusahaan yang sedang tumbuh cenderung berlaba lebih tinggi tetapi berarus kas operasi lebih rendah, karena ekspansi menambah persediaan dan piutang usaha; meski sebagian terimbangi kenaikan utang usaha, efek neto pertumbuhan modal kerja membuat perubahan laba melampaui perubahan arus kas operasi setiap tahun. Pada fase ekspansi juga muncul arus keluar investasi neto untuk membeli aset tetap dan arus masuk pendanaan dari utang atau ekuitas baru, sementara dividen ditekan. Bagi perusahaan yang menyusut, pola itu sebagian besar berbalik. Analisis statistik mereka atas hampir 1.000 perusahaan sepanjang 1974 hingga 1992 secara umum menyokong penalaran deduktif tersebut, sekaligus menemukan bahwa perusahaan yang berekspansi cenderung memikul leverage keuangan lebih besar daripada yang menyusut (Wolk et al., 2017).</w:t>
             </w:r>
           </w:p>
         </w:tc>
@@ -3728,7 +2126,7 @@
                 <w:i w:val="0"/>
                 <w:sz w:val="22"/>
               </w:rPr>
-              <w:t>Manipulasi klasifikasi: Tyco dan industri otomotif</w:t>
+              <w:t>Bagaimana klasifikasi dimanipulasi pada Tyco dan industri otomotif?</w:t>
             </w:r>
           </w:p>
         </w:tc>
@@ -3749,169 +2147,7 @@
                 <w:i w:val="0"/>
                 <w:sz w:val="22"/>
               </w:rPr>
-              <w:t xml:space="preserve">SCF lebih sulit dimanipulasi daripada laba, tetapi tidak kebal. Karena arus kas dari operasi (CFO) dipandang banyak pengguna sebagai bagian terpenting, ada upaya menaikkannya dengan menggeser arus keluar dari operasi ke investasi atau menggeser arus masuk dari investasi ke operasi; total kas tak berubah, tetapi tanpa pencermatan pengguna memandangnya positif. </w:t>
-            </w:r>
-            <w:r>
-              <w:rPr>
-                <w:rFonts w:ascii="Calibri" w:hAnsi="Calibri" w:cs="Calibri"/>
-                <w:b w:val="0"/>
-                <w:i/>
-                <w:sz w:val="22"/>
-              </w:rPr>
-              <w:t>Maremont</w:t>
-            </w:r>
-            <w:r>
-              <w:rPr>
-                <w:rFonts w:ascii="Calibri" w:hAnsi="Calibri" w:cs="Calibri"/>
-                <w:b w:val="0"/>
-                <w:i w:val="0"/>
-                <w:sz w:val="22"/>
-              </w:rPr>
-              <w:t xml:space="preserve"> mencontohkan </w:t>
-            </w:r>
-            <w:r>
-              <w:rPr>
-                <w:rFonts w:ascii="Calibri" w:hAnsi="Calibri" w:cs="Calibri"/>
-                <w:b w:val="0"/>
-                <w:i/>
-                <w:sz w:val="22"/>
-              </w:rPr>
-              <w:t>Tyco International</w:t>
-            </w:r>
-            <w:r>
-              <w:rPr>
-                <w:rFonts w:ascii="Calibri" w:hAnsi="Calibri" w:cs="Calibri"/>
-                <w:b w:val="0"/>
-                <w:i w:val="0"/>
-                <w:sz w:val="22"/>
-              </w:rPr>
-              <w:t xml:space="preserve"> (sistem alarm keamanan rumah): kas untuk mengembangkan penjualan internal dan kas untuk membeli kontrak layanan dari dealer lain semestinya diperlakukan serupa, tetapi Tyco memperlakukan kontrak dealer yang dibeli sebagai "akuisisi" dan mengakuinya sebagai arus keluar operasi atas dasar yang jauh lebih lambat. </w:t>
-            </w:r>
-            <w:r>
-              <w:rPr>
-                <w:rFonts w:ascii="Calibri" w:hAnsi="Calibri" w:cs="Calibri"/>
-                <w:b w:val="0"/>
-                <w:i/>
-                <w:sz w:val="22"/>
-              </w:rPr>
-              <w:t>Mulford</w:t>
-            </w:r>
-            <w:r>
-              <w:rPr>
-                <w:rFonts w:ascii="Calibri" w:hAnsi="Calibri" w:cs="Calibri"/>
-                <w:b w:val="0"/>
-                <w:i w:val="0"/>
-                <w:sz w:val="22"/>
-              </w:rPr>
-              <w:t xml:space="preserve"> (Wall Street Journal) mencontohkan industri otomotif: </w:t>
-            </w:r>
-            <w:r>
-              <w:rPr>
-                <w:rFonts w:ascii="Calibri" w:hAnsi="Calibri" w:cs="Calibri"/>
-                <w:b w:val="0"/>
-                <w:i/>
-                <w:sz w:val="22"/>
-              </w:rPr>
-              <w:t>Ford</w:t>
-            </w:r>
-            <w:r>
-              <w:rPr>
-                <w:rFonts w:ascii="Calibri" w:hAnsi="Calibri" w:cs="Calibri"/>
-                <w:b w:val="0"/>
-                <w:i w:val="0"/>
-                <w:sz w:val="22"/>
-              </w:rPr>
-              <w:t xml:space="preserve">, </w:t>
-            </w:r>
-            <w:r>
-              <w:rPr>
-                <w:rFonts w:ascii="Calibri" w:hAnsi="Calibri" w:cs="Calibri"/>
-                <w:b w:val="0"/>
-                <w:i/>
-                <w:sz w:val="22"/>
-              </w:rPr>
-              <w:t>General Motors</w:t>
-            </w:r>
-            <w:r>
-              <w:rPr>
-                <w:rFonts w:ascii="Calibri" w:hAnsi="Calibri" w:cs="Calibri"/>
-                <w:b w:val="0"/>
-                <w:i w:val="0"/>
-                <w:sz w:val="22"/>
-              </w:rPr>
-              <w:t xml:space="preserve">, dan </w:t>
-            </w:r>
-            <w:r>
-              <w:rPr>
-                <w:rFonts w:ascii="Calibri" w:hAnsi="Calibri" w:cs="Calibri"/>
-                <w:b w:val="0"/>
-                <w:i/>
-                <w:sz w:val="22"/>
-              </w:rPr>
-              <w:t>Harley-Davidson</w:t>
-            </w:r>
-            <w:r>
-              <w:rPr>
-                <w:rFonts w:ascii="Calibri" w:hAnsi="Calibri" w:cs="Calibri"/>
-                <w:b w:val="0"/>
-                <w:i w:val="0"/>
-                <w:sz w:val="22"/>
-              </w:rPr>
-              <w:t xml:space="preserve"> meminjamkan dana ke dealer berbentuk piutang wesel agar dealer membeli persediaan; perusahaan mengakui pendapatan penjualan tetapi mengklasifikasikan pinjaman sebagai aktivitas investasi, menaikkan CFO. Pada kasus GM, CFO terlaporkan </w:t>
-            </w:r>
-            <w:r>
-              <w:rPr>
-                <w:rFonts w:ascii="Calibri" w:hAnsi="Calibri" w:cs="Calibri"/>
-                <w:b/>
-                <w:i w:val="0"/>
-                <w:sz w:val="22"/>
-              </w:rPr>
-              <w:t>$7,6 miliar</w:t>
-            </w:r>
-            <w:r>
-              <w:rPr>
-                <w:rFonts w:ascii="Calibri" w:hAnsi="Calibri" w:cs="Calibri"/>
-                <w:b w:val="0"/>
-                <w:i w:val="0"/>
-                <w:sz w:val="22"/>
-              </w:rPr>
-              <w:t xml:space="preserve">; seandainya piutang wesel diperlakukan sebagai aktivitas operasi, CFO hanya </w:t>
-            </w:r>
-            <w:r>
-              <w:rPr>
-                <w:rFonts w:ascii="Calibri" w:hAnsi="Calibri" w:cs="Calibri"/>
-                <w:b/>
-                <w:i w:val="0"/>
-                <w:sz w:val="22"/>
-              </w:rPr>
-              <w:t>$3,5 miliar</w:t>
-            </w:r>
-            <w:r>
-              <w:rPr>
-                <w:rFonts w:ascii="Calibri" w:hAnsi="Calibri" w:cs="Calibri"/>
-                <w:b w:val="0"/>
-                <w:i w:val="0"/>
-                <w:sz w:val="22"/>
-              </w:rPr>
-              <w:t xml:space="preserve">. Sebagai kontras, </w:t>
-            </w:r>
-            <w:r>
-              <w:rPr>
-                <w:rFonts w:ascii="Calibri" w:hAnsi="Calibri" w:cs="Calibri"/>
-                <w:b w:val="0"/>
-                <w:i/>
-                <w:sz w:val="22"/>
-              </w:rPr>
-              <w:t>Navistar</w:t>
-            </w:r>
-            <w:r>
-              <w:rPr>
-                <w:rFonts w:ascii="Calibri" w:hAnsi="Calibri" w:cs="Calibri"/>
-                <w:b w:val="0"/>
-                <w:i w:val="0"/>
-                <w:sz w:val="22"/>
-              </w:rPr>
-              <w:t xml:space="preserve"> justru mereklasifikasi piutang wesel dealer menjadi operasi pada hasil konsolidasinya — Mark Oberle (direktur hubungan investor) menyebutnya "bagian bisnis inti" perusahaan manufaktur dengan anak usaha pembiayaan. Bahkan saat aturan tidak dilanggar, kekaburan penerapannya memungkinkan perusahaan dalam industri sama memberi gambaran yang sangat berbeda (Wolk et al., 2017).</w:t>
+              <w:t>SCF memang lebih sukar dimanipulasi daripada laba, tetapi tidak kebal. Karena banyak pengguna menganggap arus kas dari operasi (CFO) sebagai bagian terpenting, muncul godaan menaikkannya dengan menggeser arus keluar dari operasi ke investasi atau menarik arus masuk dari investasi ke operasi; total kasnya tak berubah, namun tanpa pencermatan pengguna terlanjur menilainya positif. Maremont mencontohkan Tyco International di bisnis sistem alarm rumah: kas untuk mengembangkan penjualan sendiri dan kas untuk membeli kontrak layanan dari dealer lain semestinya diperlakukan setara, tetapi Tyco mencatat kontrak dealer yang dibeli sebagai "akuisisi" dan mengakuinya sebagai arus keluar operasi atas dasar yang jauh lebih lambat. Mulford, dalam Wall Street Journal, mencontohkan industri otomotif. Ford, General Motors, dan Harley-Davidson meminjamkan dana ke dealer dalam bentuk piutang wesel agar dealer membeli persediaan; perusahaan mengakui pendapatan penjualan tetapi menggolongkan pinjaman itu sebagai aktivitas investasi, sehingga CFO terangkat. Pada GM, CFO terlapor $7,6 miliar, padahal seandainya piutang wesel diperlakukan sebagai aktivitas operasi angkanya hanya $3,5 miliar. Sebaliknya Navistar justru mereklasifikasi piutang wesel dealernya menjadi operasi; Mark Oberle selaku direktur hubungan investor menyebutnya bagian dari bisnis inti perusahaan manufaktur yang memiliki anak usaha pembiayaan. Bahkan tanpa pelanggaran aturan sekalipun, kekaburan penerapan ini memungkinkan perusahaan dalam satu industri menampilkan gambaran yang sangat berlainan (Wolk et al., 2017).</w:t>
             </w:r>
           </w:p>
         </w:tc>
@@ -3934,7 +2170,7 @@
                 <w:i w:val="0"/>
                 <w:sz w:val="22"/>
               </w:rPr>
-              <w:t>SCF lebih dari sekadar CFO: kasus WorldCom</w:t>
+              <w:t>Mengapa SCF harus dibaca utuh, dan apa pelajaran kasus WorldCom?</w:t>
             </w:r>
           </w:p>
         </w:tc>
@@ -3955,79 +2191,7 @@
                 <w:i w:val="0"/>
                 <w:sz w:val="22"/>
               </w:rPr>
-              <w:t xml:space="preserve">Pemusatan perhatian berlebih pada satu bagian SCF (yakni CFO) bersifat problematik; SCF terdiri atas tiga bagian dan semuanya penting. Pada 21 Juli 2002, </w:t>
-            </w:r>
-            <w:r>
-              <w:rPr>
-                <w:rFonts w:ascii="Calibri" w:hAnsi="Calibri" w:cs="Calibri"/>
-                <w:b w:val="0"/>
-                <w:i/>
-                <w:sz w:val="22"/>
-              </w:rPr>
-              <w:t>WorldCom Inc.</w:t>
-            </w:r>
-            <w:r>
-              <w:rPr>
-                <w:rFonts w:ascii="Calibri" w:hAnsi="Calibri" w:cs="Calibri"/>
-                <w:b w:val="0"/>
-                <w:i w:val="0"/>
-                <w:sz w:val="22"/>
-              </w:rPr>
-              <w:t xml:space="preserve"> mengajukan permohonan reorganisasi sukarela berdasarkan Bab 11 Undang-Undang Kepailitan AS. Sebelum pailit, WorldCom melakukan ketidakberesan akuntansi dengan mengapitalisasi beban yang seharusnya diklasifikasikan sebagai aktivitas operasi — kesalahklasifikasian ini menggelembungkan CFO terlaporkan dan meminjamkan kredibilitas bagi laba bersihnya. Meski banyak investor terkecoh, SCF </w:t>
-            </w:r>
-            <w:r>
-              <w:rPr>
-                <w:rFonts w:ascii="Calibri" w:hAnsi="Calibri" w:cs="Calibri"/>
-                <w:b w:val="0"/>
-                <w:i/>
-                <w:sz w:val="22"/>
-              </w:rPr>
-              <w:t>secara utuh</w:t>
-            </w:r>
-            <w:r>
-              <w:rPr>
-                <w:rFonts w:ascii="Calibri" w:hAnsi="Calibri" w:cs="Calibri"/>
-                <w:b w:val="0"/>
-                <w:i w:val="0"/>
-                <w:sz w:val="22"/>
-              </w:rPr>
-              <w:t xml:space="preserve"> memberi cukup petunjuk untuk skeptis. Exhibit 13.6 menyajikan pos-pos terpilih SCF WorldCom: laba bersih positif selama tiga tahun sebelum pailit, tetapi jika CFI mencerminkan investasi yang diperlukan, selisih CFO − CFI menunjukkan berapa kas yang tersedia bagi investor — dan WorldCom kehabisan kas (</w:t>
-            </w:r>
-            <w:r>
-              <w:rPr>
-                <w:rFonts w:ascii="Calibri" w:hAnsi="Calibri" w:cs="Calibri"/>
-                <w:b w:val="0"/>
-                <w:i/>
-                <w:sz w:val="22"/>
-              </w:rPr>
-              <w:t>hemorrhaging cash</w:t>
-            </w:r>
-            <w:r>
-              <w:rPr>
-                <w:rFonts w:ascii="Calibri" w:hAnsi="Calibri" w:cs="Calibri"/>
-                <w:b w:val="0"/>
-                <w:i w:val="0"/>
-                <w:sz w:val="22"/>
-              </w:rPr>
-              <w:t xml:space="preserve">) pada tiga dari empat tahun sebelum pailit, dengan efek kumulatif menggali "lubang" </w:t>
-            </w:r>
-            <w:r>
-              <w:rPr>
-                <w:rFonts w:ascii="Calibri" w:hAnsi="Calibri" w:cs="Calibri"/>
-                <w:b/>
-                <w:i w:val="0"/>
-                <w:sz w:val="22"/>
-              </w:rPr>
-              <w:t>$12 miliar</w:t>
-            </w:r>
-            <w:r>
-              <w:rPr>
-                <w:rFonts w:ascii="Calibri" w:hAnsi="Calibri" w:cs="Calibri"/>
-                <w:b w:val="0"/>
-                <w:i w:val="0"/>
-                <w:sz w:val="22"/>
-              </w:rPr>
-              <w:t xml:space="preserve"> hingga 31 Desember 2001. Pertanyaan retorisnya: kapan "lubang" itu berhenti makin dalam? Investor yang mengabaikan satu atau lebih bagian SCF menanggung risikonya sendiri (Wolk et al., 2017; lihat Exhibit 13.6).</w:t>
+              <w:t>Memusatkan perhatian berlebihan pada satu bagian SCF, dalam hal ini CFO, jelas berisiko, sebab laporan ini terdiri atas tiga bagian yang semuanya penting. Pada 21 Juli 2002 WorldCom mengajukan reorganisasi sukarela berdasarkan Bab 11 Undang-Undang Kepailitan Amerika Serikat. Sebelum jatuh, perusahaan ini mengapitalisasi beban yang seharusnya digolongkan sebagai aktivitas operasi; kesalahan klasifikasi tersebut menggelembungkan CFO yang dilaporkan dan meminjamkan kredibilitas semu bagi laba bersihnya. Banyak investor terkecoh, tetapi SCF yang dibaca secara utuh sebenarnya menyediakan cukup alasan untuk skeptis. Exhibit 13.6 menampilkan pos-pos terpilih SCF WorldCom: laba bersih positif sepanjang tiga tahun menjelang pailit, namun bila CFI mencerminkan investasi yang diperlukan, selisih CFO dikurangi CFI memperlihatkan berapa kas yang benar-benar tersedia bagi investor — dan WorldCom terus kehabisan kas pada tiga dari empat tahun terakhir, menggali defisit kumulatif sebesar $12 miliar hingga 31 Desember 2001. Pertanyaannya tinggal kapan defisit itu berhenti membesar. Investor yang mengabaikan satu atau lebih bagian SCF menanggung sendiri akibatnya (Wolk et al., 2017; lihat Exhibit 13.6).</w:t>
             </w:r>
           </w:p>
         </w:tc>
@@ -4132,7 +2296,7 @@
                 <w:i w:val="0"/>
                 <w:sz w:val="22"/>
               </w:rPr>
-              <w:t>Kebutuhan pengguna: Buffett dan logika NPV</w:t>
+              <w:t>Apa kebutuhan pengguna menurut Buffett dan logika NPV?</w:t>
             </w:r>
           </w:p>
         </w:tc>
@@ -4153,97 +2317,7 @@
                 <w:i w:val="0"/>
                 <w:sz w:val="22"/>
               </w:rPr>
-              <w:t xml:space="preserve">Dalam suratnya tahun 1988 kepada pemegang saham Berkshire Hathaway, </w:t>
-            </w:r>
-            <w:r>
-              <w:rPr>
-                <w:rFonts w:ascii="Calibri" w:hAnsi="Calibri" w:cs="Calibri"/>
-                <w:b w:val="0"/>
-                <w:i/>
-                <w:sz w:val="22"/>
-              </w:rPr>
-              <w:t>Warren Buffett</w:t>
-            </w:r>
-            <w:r>
-              <w:rPr>
-                <w:rFonts w:ascii="Calibri" w:hAnsi="Calibri" w:cs="Calibri"/>
-                <w:b w:val="0"/>
-                <w:i w:val="0"/>
-                <w:sz w:val="22"/>
-              </w:rPr>
-              <w:t xml:space="preserve"> merangkum apa yang perlu dilaporkan: data yang membantu pembaca melek-finansial menjawab tiga pertanyaan kunci — (1) kira-kira berapa nilai perusahaan ini? (2) seberapa besar kemungkinan ia memenuhi kewajiban masa depan? (3) seberapa baik kinerja manajernya? Singkatnya, laporan keuangan harus menyediakan informasi untuk menilai perusahaan, membuat keputusan kredit, dan menilai kinerja manajerial. Penilaian kinerja manajerial menuntut ukuran arus kas </w:t>
-            </w:r>
-            <w:r>
-              <w:rPr>
-                <w:rFonts w:ascii="Calibri" w:hAnsi="Calibri" w:cs="Calibri"/>
-                <w:b w:val="0"/>
-                <w:i/>
-                <w:sz w:val="22"/>
-              </w:rPr>
-              <w:t>historis</w:t>
-            </w:r>
-            <w:r>
-              <w:rPr>
-                <w:rFonts w:ascii="Calibri" w:hAnsi="Calibri" w:cs="Calibri"/>
-                <w:b w:val="0"/>
-                <w:i w:val="0"/>
-                <w:sz w:val="22"/>
-              </w:rPr>
-              <w:t xml:space="preserve"> yang akurat; keputusan kredit dan valuasi menuntut prediksi arus kas </w:t>
-            </w:r>
-            <w:r>
-              <w:rPr>
-                <w:rFonts w:ascii="Calibri" w:hAnsi="Calibri" w:cs="Calibri"/>
-                <w:b w:val="0"/>
-                <w:i/>
-                <w:sz w:val="22"/>
-              </w:rPr>
-              <w:t>masa depan</w:t>
-            </w:r>
-            <w:r>
-              <w:rPr>
-                <w:rFonts w:ascii="Calibri" w:hAnsi="Calibri" w:cs="Calibri"/>
-                <w:b w:val="0"/>
-                <w:i w:val="0"/>
-                <w:sz w:val="22"/>
-              </w:rPr>
-              <w:t xml:space="preserve"> yang takbias (sejalan SFAC No. 1). Keputusan investasi adalah keputusan alokasi modal yang menggunakan kriteria </w:t>
-            </w:r>
-            <w:r>
-              <w:rPr>
-                <w:rFonts w:ascii="Calibri" w:hAnsi="Calibri" w:cs="Calibri"/>
-                <w:b w:val="0"/>
-                <w:i/>
-                <w:sz w:val="22"/>
-              </w:rPr>
-              <w:t>capital budgeting</w:t>
-            </w:r>
-            <w:r>
-              <w:rPr>
-                <w:rFonts w:ascii="Calibri" w:hAnsi="Calibri" w:cs="Calibri"/>
-                <w:b w:val="0"/>
-                <w:i w:val="0"/>
-                <w:sz w:val="22"/>
-              </w:rPr>
-              <w:t xml:space="preserve"> (penganggaran modal): terima investasi jika nilai kini arus kas neto yang diharapkan positif — yakni jika </w:t>
-            </w:r>
-            <w:r>
-              <w:rPr>
-                <w:rFonts w:ascii="Calibri" w:hAnsi="Calibri" w:cs="Calibri"/>
-                <w:b w:val="0"/>
-                <w:i/>
-                <w:sz w:val="22"/>
-              </w:rPr>
-              <w:t>NPV</w:t>
-            </w:r>
-            <w:r>
-              <w:rPr>
-                <w:rFonts w:ascii="Calibri" w:hAnsi="Calibri" w:cs="Calibri"/>
-                <w:b w:val="0"/>
-                <w:i w:val="0"/>
-                <w:sz w:val="22"/>
-              </w:rPr>
-              <w:t xml:space="preserve"> (</w:t>
+              <w:t>Dalam surat 1988 kepada pemegang saham Berkshire Hathaway, Warren Buffett merangkum apa yang sebenarnya perlu dilaporkan, yakni data yang membantu pembaca yang melek finansial menjawab tiga hal: kira-kira berapa nilai perusahaan, seberapa besar kemungkinannya memenuhi kewajiban masa depan, dan seberapa baik kinerja manajernya. Dengan kata lain, laporan keuangan harus menjadi bahan untuk menilai perusahaan, mengambil keputusan kredit, dan mengukur kinerja manajerial. Penilaian kinerja menuntut ukuran arus kas historis yang akurat, sedangkan keputusan kredit dan valuasi menuntut prediksi arus kas masa depan yang takbias, sejalan dengan SFAC No. 1. Keputusan investasi pada hakikatnya adalah alokasi modal yang memakai kriteria penganggaran modal: sebuah investasi diterima bila nilai kini arus kas neto yang diharapkan positif, atau dengan kata lain bila NPV (</w:t>
             </w:r>
             <w:r>
               <w:rPr>
@@ -4261,25 +2335,7 @@
                 <w:i w:val="0"/>
                 <w:sz w:val="22"/>
               </w:rPr>
-              <w:t xml:space="preserve">, nilai sekarang bersih) positif. Serupa, pembelian saham layak jika nilai kini per-saham arus kas masa depan — </w:t>
-            </w:r>
-            <w:r>
-              <w:rPr>
-                <w:rFonts w:ascii="Calibri" w:hAnsi="Calibri" w:cs="Calibri"/>
-                <w:b w:val="0"/>
-                <w:i/>
-                <w:sz w:val="22"/>
-              </w:rPr>
-              <w:t>intrinsic value</w:t>
-            </w:r>
-            <w:r>
-              <w:rPr>
-                <w:rFonts w:ascii="Calibri" w:hAnsi="Calibri" w:cs="Calibri"/>
-                <w:b w:val="0"/>
-                <w:i w:val="0"/>
-                <w:sz w:val="22"/>
-              </w:rPr>
-              <w:t xml:space="preserve"> (nilai intrinsik) — melebihi harga pasar. Buffett mendefinisikan nilai intrinsik sebagai nilai terdiskonto kas yang dapat ditarik dari bisnis sepanjang sisa umurnya (Wolk et al., 2017).</w:t>
+              <w:t>, nilai sekarang bersih) positif. Begitu pula pembelian saham, layak dilakukan bila nilai kini arus kas masa depan per saham — nilai intrinsiknya — melampaui harga pasar. Buffett sendiri mendefinisikan nilai intrinsik sebagai nilai terdiskonto dari kas yang dapat ditarik sepanjang sisa umur usaha (Wolk et al., 2017).</w:t>
             </w:r>
           </w:p>
         </w:tc>
@@ -4302,7 +2358,7 @@
                 <w:i w:val="0"/>
                 <w:sz w:val="22"/>
               </w:rPr>
-              <w:t>Free Cash Flow: definisi dan persamaan (13.2)</w:t>
+              <w:t>Apa definisi free cash flow dan persamaan 13.2?</w:t>
             </w:r>
           </w:p>
         </w:tc>
@@ -4323,133 +2379,7 @@
                 <w:i w:val="0"/>
                 <w:sz w:val="22"/>
               </w:rPr>
-              <w:t xml:space="preserve">Arus kas untuk menentukan nilai intrinsik, bagi perusahaan, disebut </w:t>
-            </w:r>
-            <w:r>
-              <w:rPr>
-                <w:rFonts w:ascii="Calibri" w:hAnsi="Calibri" w:cs="Calibri"/>
-                <w:b w:val="0"/>
-                <w:i/>
-                <w:sz w:val="22"/>
-              </w:rPr>
-              <w:t>free cash flows</w:t>
-            </w:r>
-            <w:r>
-              <w:rPr>
-                <w:rFonts w:ascii="Calibri" w:hAnsi="Calibri" w:cs="Calibri"/>
-                <w:b w:val="0"/>
-                <w:i w:val="0"/>
-                <w:sz w:val="22"/>
-              </w:rPr>
-              <w:t xml:space="preserve"> (FCF, arus kas bebas). </w:t>
-            </w:r>
-            <w:r>
-              <w:rPr>
-                <w:rFonts w:ascii="Calibri" w:hAnsi="Calibri" w:cs="Calibri"/>
-                <w:b w:val="0"/>
-                <w:i/>
-                <w:sz w:val="22"/>
-              </w:rPr>
-              <w:t>Mulford dan Comiskey</w:t>
-            </w:r>
-            <w:r>
-              <w:rPr>
-                <w:rFonts w:ascii="Calibri" w:hAnsi="Calibri" w:cs="Calibri"/>
-                <w:b w:val="0"/>
-                <w:i w:val="0"/>
-                <w:sz w:val="22"/>
-              </w:rPr>
-              <w:t xml:space="preserve"> menyatakan istilah "</w:t>
-            </w:r>
-            <w:r>
-              <w:rPr>
-                <w:rFonts w:ascii="Calibri" w:hAnsi="Calibri" w:cs="Calibri"/>
-                <w:b w:val="0"/>
-                <w:i/>
-                <w:sz w:val="22"/>
-              </w:rPr>
-              <w:t>free</w:t>
-            </w:r>
-            <w:r>
-              <w:rPr>
-                <w:rFonts w:ascii="Calibri" w:hAnsi="Calibri" w:cs="Calibri"/>
-                <w:b w:val="0"/>
-                <w:i w:val="0"/>
-                <w:sz w:val="22"/>
-              </w:rPr>
-              <w:t xml:space="preserve">" merujuk pada ketiadaan klaim superior — kas yang tersedia untuk dipakai tanpa ikatan dan pemakaiannya tidak mengganggu kemampuan perusahaan menghasilkan kas lebih lanjut. Mengikuti </w:t>
-            </w:r>
-            <w:r>
-              <w:rPr>
-                <w:rFonts w:ascii="Calibri" w:hAnsi="Calibri" w:cs="Calibri"/>
-                <w:b w:val="0"/>
-                <w:i/>
-                <w:sz w:val="22"/>
-              </w:rPr>
-              <w:t>entity theory</w:t>
-            </w:r>
-            <w:r>
-              <w:rPr>
-                <w:rFonts w:ascii="Calibri" w:hAnsi="Calibri" w:cs="Calibri"/>
-                <w:b w:val="0"/>
-                <w:i w:val="0"/>
-                <w:sz w:val="22"/>
-              </w:rPr>
-              <w:t>, penulis berfokus pada arus kas ke perusahaan (</w:t>
-            </w:r>
-            <w:r>
-              <w:rPr>
-                <w:rFonts w:ascii="Calibri" w:hAnsi="Calibri" w:cs="Calibri"/>
-                <w:b w:val="0"/>
-                <w:i/>
-                <w:sz w:val="22"/>
-              </w:rPr>
-              <w:t>cash flow to the firm</w:t>
-            </w:r>
-            <w:r>
-              <w:rPr>
-                <w:rFonts w:ascii="Calibri" w:hAnsi="Calibri" w:cs="Calibri"/>
-                <w:b w:val="0"/>
-                <w:i w:val="0"/>
-                <w:sz w:val="22"/>
-              </w:rPr>
-              <w:t xml:space="preserve">). FCF tidak dapat diperoleh langsung dari SCF, dan didefinisikan dalam </w:t>
-            </w:r>
-            <w:r>
-              <w:rPr>
-                <w:rFonts w:ascii="Calibri" w:hAnsi="Calibri" w:cs="Calibri"/>
-                <w:b/>
-                <w:i w:val="0"/>
-                <w:sz w:val="22"/>
-              </w:rPr>
-              <w:t>persamaan (13.2): FCF = NOPLAT − investasi pada modal terinvestasi operasi</w:t>
-            </w:r>
-            <w:r>
-              <w:rPr>
-                <w:rFonts w:ascii="Calibri" w:hAnsi="Calibri" w:cs="Calibri"/>
-                <w:b w:val="0"/>
-                <w:i w:val="0"/>
-                <w:sz w:val="22"/>
-              </w:rPr>
-              <w:t xml:space="preserve">. </w:t>
-            </w:r>
-            <w:r>
-              <w:rPr>
-                <w:rFonts w:ascii="Calibri" w:hAnsi="Calibri" w:cs="Calibri"/>
-                <w:b w:val="0"/>
-                <w:i/>
-                <w:sz w:val="22"/>
-              </w:rPr>
-              <w:t>NOPLAT</w:t>
-            </w:r>
-            <w:r>
-              <w:rPr>
-                <w:rFonts w:ascii="Calibri" w:hAnsi="Calibri" w:cs="Calibri"/>
-                <w:b w:val="0"/>
-                <w:i w:val="0"/>
-                <w:sz w:val="22"/>
-              </w:rPr>
-              <w:t xml:space="preserve"> (</w:t>
+              <w:t>Arus kas yang menjadi dasar penilaian nilai intrinsik suatu perusahaan disebut free cash flow (FCF, arus kas bebas). Menurut Mulford dan Comiskey, kata "bebas" menunjuk pada ketiadaan klaim yang lebih utama atasnya: kas itu tersedia untuk dipakai tanpa ikatan, dan pemakaiannya tidak mengganggu kemampuan perusahaan menghasilkan kas berikutnya. Mengikuti teori entitas, Wolk berfokus pada arus kas ke perusahaan. FCF tidak dapat dibaca langsung dari SCF, melainkan dirumuskan dalam persamaan 13.2: FCF sama dengan NOPLAT dikurangi investasi pada modal terinvestasi operasi. NOPLAT (</w:t>
             </w:r>
             <w:r>
               <w:rPr>
@@ -4467,25 +2397,7 @@
                 <w:i w:val="0"/>
                 <w:sz w:val="22"/>
               </w:rPr>
-              <w:t xml:space="preserve">) adalah laba operasi neto dikurangi pajak yang disesuaikan; dalam kasus sederhana, NOPLAT = laba operasi setelah pajak. Investasi pada modal terinvestasi operasi biasanya dipecah menjadi investasi pada modal kerja operasi neto dan investasi pada aset taklancar. FCF </w:t>
-            </w:r>
-            <w:r>
-              <w:rPr>
-                <w:rFonts w:ascii="Calibri" w:hAnsi="Calibri" w:cs="Calibri"/>
-                <w:b w:val="0"/>
-                <w:i/>
-                <w:sz w:val="22"/>
-              </w:rPr>
-              <w:t>tidak</w:t>
-            </w:r>
-            <w:r>
-              <w:rPr>
-                <w:rFonts w:ascii="Calibri" w:hAnsi="Calibri" w:cs="Calibri"/>
-                <w:b w:val="0"/>
-                <w:i w:val="0"/>
-                <w:sz w:val="22"/>
-              </w:rPr>
-              <w:t xml:space="preserve"> memuat beban bunga (suatu beban pendanaan), dan — konsisten dengan asumsi kelangsungan usaha — kas operasi diperlakukan sebagai bagian modal kerja operasi neto, sama seperti piutang dan persediaan (Wolk et al., 2017).</w:t>
+              <w:t>) adalah laba operasi neto setelah pajak yang disesuaikan, yang dalam kasus sederhana berarti laba operasi setelah pajak. Investasi pada modal terinvestasi operasi biasanya dipecah menjadi investasi pada modal kerja operasi neto dan pada aset taklancar. Yang perlu dicatat, FCF tidak memasukkan beban bunga karena bunga adalah beban pendanaan, dan sejalan dengan asumsi kelangsungan usaha, kas operasi diperlakukan sebagai bagian modal kerja operasi neto sebagaimana piutang dan persediaan (Wolk et al., 2017).</w:t>
             </w:r>
           </w:p>
         </w:tc>
@@ -4508,7 +2420,7 @@
                 <w:i w:val="0"/>
                 <w:sz w:val="22"/>
               </w:rPr>
-              <w:t>Ilustrasi ABC Company dan jembatan CFO→FCF</w:t>
+              <w:t>Bagaimana ilustrasi ABC Company menjembatani CFO ke FCF?</w:t>
             </w:r>
           </w:p>
         </w:tc>
@@ -4529,97 +2441,7 @@
                 <w:i w:val="0"/>
                 <w:sz w:val="22"/>
               </w:rPr>
-              <w:t xml:space="preserve">Penulis mengilustrasikan konstruksi FCF melalui ABC Company. Exhibit 13.7 menyajikan laporan laba rugi dan neraca ABC; dari keduanya disusun SCF (Exhibit 13.8) dengan CFO $527/466/434, CFI $(277)/(309)/(360), dan CFF $(306)/(78)/(58) untuk 2005/2006/2007. Exhibit 13.9 menyusun </w:t>
-            </w:r>
-            <w:r>
-              <w:rPr>
-                <w:rFonts w:ascii="Calibri" w:hAnsi="Calibri" w:cs="Calibri"/>
-                <w:b w:val="0"/>
-                <w:i/>
-                <w:sz w:val="22"/>
-              </w:rPr>
-              <w:t>statement of free cash flows</w:t>
-            </w:r>
-            <w:r>
-              <w:rPr>
-                <w:rFonts w:ascii="Calibri" w:hAnsi="Calibri" w:cs="Calibri"/>
-                <w:b w:val="0"/>
-                <w:i w:val="0"/>
-                <w:sz w:val="22"/>
-              </w:rPr>
-              <w:t xml:space="preserve">: dari laba operasi dikurangi pajak basis-kas diperoleh NOPLAT $346/333/353, ditambah penyusutan menjadi </w:t>
-            </w:r>
-            <w:r>
-              <w:rPr>
-                <w:rFonts w:ascii="Calibri" w:hAnsi="Calibri" w:cs="Calibri"/>
-                <w:b w:val="0"/>
-                <w:i/>
-                <w:sz w:val="22"/>
-              </w:rPr>
-              <w:t>gross cash flow</w:t>
-            </w:r>
-            <w:r>
-              <w:rPr>
-                <w:rFonts w:ascii="Calibri" w:hAnsi="Calibri" w:cs="Calibri"/>
-                <w:b w:val="0"/>
-                <w:i w:val="0"/>
-                <w:sz w:val="22"/>
-              </w:rPr>
-              <w:t xml:space="preserve"> $561/553/581, dikurangi total investasi sehingga FCF dari aset operasi = </w:t>
-            </w:r>
-            <w:r>
-              <w:rPr>
-                <w:rFonts w:ascii="Calibri" w:hAnsi="Calibri" w:cs="Calibri"/>
-                <w:b/>
-                <w:i w:val="0"/>
-                <w:sz w:val="22"/>
-              </w:rPr>
-              <w:t>$332/99/80</w:t>
-            </w:r>
-            <w:r>
-              <w:rPr>
-                <w:rFonts w:ascii="Calibri" w:hAnsi="Calibri" w:cs="Calibri"/>
-                <w:b w:val="0"/>
-                <w:i w:val="0"/>
-                <w:sz w:val="22"/>
-              </w:rPr>
-              <w:t xml:space="preserve"> (yang juga setara dengan FCF ke ekuitas). Exhibit 13.10 menunjukkan cara menghitung FCF dari SCF: mulai dari CFO, </w:t>
-            </w:r>
-            <w:r>
-              <w:rPr>
-                <w:rFonts w:ascii="Calibri" w:hAnsi="Calibri" w:cs="Calibri"/>
-                <w:b w:val="0"/>
-                <w:i/>
-                <w:sz w:val="22"/>
-              </w:rPr>
-              <w:t>tambahkan</w:t>
-            </w:r>
-            <w:r>
-              <w:rPr>
-                <w:rFonts w:ascii="Calibri" w:hAnsi="Calibri" w:cs="Calibri"/>
-                <w:b w:val="0"/>
-                <w:i w:val="0"/>
-                <w:sz w:val="22"/>
-              </w:rPr>
-              <w:t xml:space="preserve"> beban bunga setelah pajak (untuk menghapus efek pendanaan dalam CFO), </w:t>
-            </w:r>
-            <w:r>
-              <w:rPr>
-                <w:rFonts w:ascii="Calibri" w:hAnsi="Calibri" w:cs="Calibri"/>
-                <w:b w:val="0"/>
-                <w:i/>
-                <w:sz w:val="22"/>
-              </w:rPr>
-              <w:t>kurangi</w:t>
-            </w:r>
-            <w:r>
-              <w:rPr>
-                <w:rFonts w:ascii="Calibri" w:hAnsi="Calibri" w:cs="Calibri"/>
-                <w:b w:val="0"/>
-                <w:i w:val="0"/>
-                <w:sz w:val="22"/>
-              </w:rPr>
-              <w:t xml:space="preserve"> kenaikan kas operasi (sebagai bagian modal terinvestasi), dan tambahkan CFI (yang umumnya negatif, mis. $(277) pada 2005 sehingga menurunkan FCF), menghasilkan FCF $332/99/80 (Wolk et al., 2017).</w:t>
+              <w:t>Wolk memakai ABC Company untuk memperagakan penyusunan FCF. Exhibit 13.7 menyajikan laporan laba rugi dan neraca ABC, yang dari keduanya lahir SCF pada Exhibit 13.8 dengan CFO $527, $466, dan $434, CFI $(277), $(309), dan $(360), serta CFF $(306), $(78), dan $(58) untuk 2005, 2006, dan 2007. Exhibit 13.9 lalu menyusun statement of free cash flows: dari laba operasi dikurangi pajak basis kas diperoleh NOPLAT $346, $333, dan $353, ditambah penyusutan menjadi gross cash flow $561, $553, dan $581, lalu dikurangi total investasi sehingga FCF dari aset operasi menjadi $332, $99, dan $80, yang juga setara dengan FCF ke ekuitas. Exhibit 13.10 menutup dengan cara menghitung FCF langsung dari SCF: bertolak dari CFO, beban bunga setelah pajak ditambahkan untuk menghapus efek pendanaan, kenaikan kas operasi dikurangkan karena ia bagian modal terinvestasi, lalu CFI ditambahkan — angka yang umumnya negatif, seperti $(277) pada 2005 yang menekan FCF — sehingga diperoleh kembali FCF $332, $99, dan $80 (Wolk et al., 2017).</w:t>
             </w:r>
           </w:p>
         </w:tc>
@@ -5013,7 +2835,7 @@
                 <w:i w:val="0"/>
                 <w:sz w:val="22"/>
               </w:rPr>
-              <w:t>Empat ukuran kinerja dan diskonto WACC</w:t>
+              <w:t>Apa empat ukuran kinerja kas dan peran diskonto WACC?</w:t>
             </w:r>
           </w:p>
         </w:tc>
@@ -5034,97 +2856,7 @@
                 <w:i w:val="0"/>
                 <w:sz w:val="22"/>
               </w:rPr>
-              <w:t xml:space="preserve">Pilihan ukuran kinerja bergantung pada waktu, sumber daya, dan tujuan valuasi. Untuk hemat waktu, sebagian pengguna hanya mempertimbangkan </w:t>
-            </w:r>
-            <w:r>
-              <w:rPr>
-                <w:rFonts w:ascii="Calibri" w:hAnsi="Calibri" w:cs="Calibri"/>
-                <w:b w:val="0"/>
-                <w:i/>
-                <w:sz w:val="22"/>
-              </w:rPr>
-              <w:t>laba bersih</w:t>
-            </w:r>
-            <w:r>
-              <w:rPr>
-                <w:rFonts w:ascii="Calibri" w:hAnsi="Calibri" w:cs="Calibri"/>
-                <w:b w:val="0"/>
-                <w:i w:val="0"/>
-                <w:sz w:val="22"/>
-              </w:rPr>
-              <w:t xml:space="preserve">. Untuk memahami operasi dan menilai kualitas laba, pengguna berfokus pada </w:t>
-            </w:r>
-            <w:r>
-              <w:rPr>
-                <w:rFonts w:ascii="Calibri" w:hAnsi="Calibri" w:cs="Calibri"/>
-                <w:b w:val="0"/>
-                <w:i/>
-                <w:sz w:val="22"/>
-              </w:rPr>
-              <w:t>CFO</w:t>
-            </w:r>
-            <w:r>
-              <w:rPr>
-                <w:rFonts w:ascii="Calibri" w:hAnsi="Calibri" w:cs="Calibri"/>
-                <w:b w:val="0"/>
-                <w:i w:val="0"/>
-                <w:sz w:val="22"/>
-              </w:rPr>
-              <w:t xml:space="preserve">. Untuk menghindari masalah pengklasifikasian beban operasi sebagai investasi dan mendapatkan gambaran kemampuan menghasilkan kas neto, masuk akal mengurangkan CFI, yakni </w:t>
-            </w:r>
-            <w:r>
-              <w:rPr>
-                <w:rFonts w:ascii="Calibri" w:hAnsi="Calibri" w:cs="Calibri"/>
-                <w:b w:val="0"/>
-                <w:i/>
-                <w:sz w:val="22"/>
-              </w:rPr>
-              <w:t>CFO − CFI</w:t>
-            </w:r>
-            <w:r>
-              <w:rPr>
-                <w:rFonts w:ascii="Calibri" w:hAnsi="Calibri" w:cs="Calibri"/>
-                <w:b w:val="0"/>
-                <w:i w:val="0"/>
-                <w:sz w:val="22"/>
-              </w:rPr>
-              <w:t xml:space="preserve">. Karena CFO "terkontaminasi" beban bunga (pendanaan), untuk berfokus pada operasi dan mengakui kas operasi sebagai bagian modal terinvestasi, dapat dihitung </w:t>
-            </w:r>
-            <w:r>
-              <w:rPr>
-                <w:rFonts w:ascii="Calibri" w:hAnsi="Calibri" w:cs="Calibri"/>
-                <w:b w:val="0"/>
-                <w:i/>
-                <w:sz w:val="22"/>
-              </w:rPr>
-              <w:t>FCF</w:t>
-            </w:r>
-            <w:r>
-              <w:rPr>
-                <w:rFonts w:ascii="Calibri" w:hAnsi="Calibri" w:cs="Calibri"/>
-                <w:b w:val="0"/>
-                <w:i w:val="0"/>
-                <w:sz w:val="22"/>
-              </w:rPr>
-              <w:t xml:space="preserve">. Bagi ABC, keempatnya untuk 2005/2006/2007 adalah laba bersih $320/312/331; CFO $527/466/434; CFO−CFI $250/157/74; dan FCF $332/99/80. Investor dapat menaksir nilai intrinsik dengan mendiskontokan FCF yang diproyeksikan memakai </w:t>
-            </w:r>
-            <w:r>
-              <w:rPr>
-                <w:rFonts w:ascii="Calibri" w:hAnsi="Calibri" w:cs="Calibri"/>
-                <w:b w:val="0"/>
-                <w:i/>
-                <w:sz w:val="22"/>
-              </w:rPr>
-              <w:t>WACC</w:t>
-            </w:r>
-            <w:r>
-              <w:rPr>
-                <w:rFonts w:ascii="Calibri" w:hAnsi="Calibri" w:cs="Calibri"/>
-                <w:b w:val="0"/>
-                <w:i w:val="0"/>
-                <w:sz w:val="22"/>
-              </w:rPr>
-              <w:t xml:space="preserve"> (</w:t>
+              <w:t>Ukuran kinerja mana yang dipakai bergantung pada waktu, sumber daya, dan tujuan valuasi pengguna. Yang ingin cepat cukup melihat laba bersih. Yang ingin memahami operasi dan menimbang kualitas laba berfokus pada CFO. Untuk menghindari persoalan beban operasi yang digolongkan sebagai investasi dan untuk menangkap kemampuan menghasilkan kas neto, masuk akal mengurangkan CFI sehingga diperoleh selisih CFO dikurangi CFI. Dan karena CFO masih tercampur beban bunga yang sejatinya pendanaan, FCF dihitung untuk benar-benar berfokus pada operasi sekaligus mengakui kas operasi sebagai bagian modal terinvestasi. Bagi ABC, keempat ukuran untuk 2005, 2006, dan 2007 adalah laba bersih $320, $312, dan $331; CFO $527, $466, dan $434; selisih CFO dikurangi CFI $250, $157, dan $74; serta FCF $332, $99, dan $80. Investor dapat menaksir nilai intrinsik dengan mendiskontokan FCF yang diproyeksikan memakai WACC (</w:t>
             </w:r>
             <w:r>
               <w:rPr>
@@ -5142,7 +2874,7 @@
                 <w:i w:val="0"/>
                 <w:sz w:val="22"/>
               </w:rPr>
-              <w:t>, biaya modal rata-rata tertimbang). Dengan empat ukuran yang dapat memberi pandangan berbeda, "dunia nyata tidak pernah sederhana" (Wolk et al., 2017).</w:t>
+              <w:t>, biaya modal rata-rata tertimbang). Dengan empat ukuran yang bisa memberi gambaran berbeda-beda, memang dunia nyata tidak pernah sesederhana yang diharapkan (Wolk et al., 2017).</w:t>
             </w:r>
           </w:p>
         </w:tc>
@@ -5256,7 +2988,7 @@
                 <w:i w:val="0"/>
                 <w:sz w:val="22"/>
               </w:rPr>
-              <w:t>Riset kas vs akrual (Lawson &amp; Lee)</w:t>
+              <w:t>Apa pandangan riset kas versus akrual (Lawson dan Lee)?</w:t>
             </w:r>
           </w:p>
         </w:tc>
@@ -5277,61 +3009,7 @@
                 <w:i w:val="0"/>
                 <w:sz w:val="22"/>
               </w:rPr>
-              <w:t xml:space="preserve">Dua pendukung lama pelaporan arus kas, </w:t>
-            </w:r>
-            <w:r>
-              <w:rPr>
-                <w:rFonts w:ascii="Calibri" w:hAnsi="Calibri" w:cs="Calibri"/>
-                <w:b w:val="0"/>
-                <w:i/>
-                <w:sz w:val="22"/>
-              </w:rPr>
-              <w:t>Lawson dan Lee</w:t>
-            </w:r>
-            <w:r>
-              <w:rPr>
-                <w:rFonts w:ascii="Calibri" w:hAnsi="Calibri" w:cs="Calibri"/>
-                <w:b w:val="0"/>
-                <w:i w:val="0"/>
-                <w:sz w:val="22"/>
-              </w:rPr>
-              <w:t xml:space="preserve">, berargumen bahwa laporan arus kas diperlukan untuk melaporkan kinerja perusahaan — likuiditas adalah bagian integral kinerja. Lee bahkan menegaskan: "Arus kas, bukan laba, adalah hasil akhir aktivitas entitas. Laba adalah abstraksi; kas adalah sumber daya fisik." Model valuasi arus kas dari literatur ekonomi keuangan sependapat bahwa arus kas perusahaanlah penentu akhir nilai perusahaan, bukan laba akrual. Namun, riset pasar modal yang berkembang menunjukkan akrual akuntansi memberi informasi melampaui arus kas literal terkait harga sekuritas. Interpretasinya: kas dan akrual lebih berguna </w:t>
-            </w:r>
-            <w:r>
-              <w:rPr>
-                <w:rFonts w:ascii="Calibri" w:hAnsi="Calibri" w:cs="Calibri"/>
-                <w:b w:val="0"/>
-                <w:i/>
-                <w:sz w:val="22"/>
-              </w:rPr>
-              <w:t>bersama-sama</w:t>
-            </w:r>
-            <w:r>
-              <w:rPr>
-                <w:rFonts w:ascii="Calibri" w:hAnsi="Calibri" w:cs="Calibri"/>
-                <w:b w:val="0"/>
-                <w:i w:val="0"/>
-                <w:sz w:val="22"/>
-              </w:rPr>
-              <w:t xml:space="preserve">, sehingga SCF bersifat komplementer terhadap laporan akrual. Survei investor/analis konsisten menunjukkan analisis profitabilitas berbasis akrual masih dominan, tetapi survei yang ditugaskan </w:t>
-            </w:r>
-            <w:r>
-              <w:rPr>
-                <w:rFonts w:ascii="Calibri" w:hAnsi="Calibri" w:cs="Calibri"/>
-                <w:b w:val="0"/>
-                <w:i/>
-                <w:sz w:val="22"/>
-              </w:rPr>
-              <w:t>Financial Accounting Foundation</w:t>
-            </w:r>
-            <w:r>
-              <w:rPr>
-                <w:rFonts w:ascii="Calibri" w:hAnsi="Calibri" w:cs="Calibri"/>
-                <w:b w:val="0"/>
-                <w:i w:val="0"/>
-                <w:sz w:val="22"/>
-              </w:rPr>
-              <w:t xml:space="preserve"> menemukan data arus dana meningkat kepentingannya sementara data akrual menurun (Wolk et al., 2017).</w:t>
+              <w:t>Lawson dan Lee, dua pendukung lama pelaporan arus kas, berpendirian bahwa laporan arus kas diperlukan untuk menggambarkan kinerja, sebab likuiditas adalah bagian tak terpisahkan dari kinerja itu sendiri. Lee bahkan menyatakan arus kas, bukan laba, adalah hasil akhir aktivitas entitas, karena laba sekadar abstraksi sedangkan kas adalah sumber daya yang nyata. Model valuasi dalam literatur ekonomi keuangan sependapat bahwa arus kas perusahaanlah penentu akhir nilainya, bukan laba akrual. Namun riset pasar modal yang terus berkembang memperlihatkan akrual memberi informasi melampaui arus kas literal dalam kaitannya dengan harga sekuritas. Maka penafsiran yang masuk akal adalah kas dan akrual lebih berguna bila dibaca bersama, sehingga SCF bersifat melengkapi laporan akrual. Survei terhadap investor dan analis secara konsisten menunjukkan analisis profitabilitas berbasis akrual masih dominan, meski survei yang ditugaskan Financial Accounting Foundation menemukan kepentingan data arus dana meningkat sementara data akrual menurun (Wolk et al., 2017).</w:t>
             </w:r>
           </w:p>
         </w:tc>
@@ -5354,7 +3032,7 @@
                 <w:i w:val="0"/>
                 <w:sz w:val="22"/>
               </w:rPr>
-              <w:t>Perbaikan SCF: tiga rekomendasi Broome</w:t>
+              <w:t>Apa tiga rekomendasi Broome untuk memperbaiki SCF?</w:t>
             </w:r>
           </w:p>
         </w:tc>
@@ -5375,61 +3053,7 @@
                 <w:i w:val="0"/>
                 <w:sz w:val="22"/>
               </w:rPr>
-              <w:t xml:space="preserve">SCF adalah alat penting bagi investor, kreditor, dan manajer, tetapi masih dapat diperbaiki. Dengan latar belakang serangkaian skandal akuntansi — </w:t>
-            </w:r>
-            <w:r>
-              <w:rPr>
-                <w:rFonts w:ascii="Calibri" w:hAnsi="Calibri" w:cs="Calibri"/>
-                <w:b w:val="0"/>
-                <w:i/>
-                <w:sz w:val="22"/>
-              </w:rPr>
-              <w:t>Adelphia, Dynegy, Qwest, Tyco, WorldCom</w:t>
-            </w:r>
-            <w:r>
-              <w:rPr>
-                <w:rFonts w:ascii="Calibri" w:hAnsi="Calibri" w:cs="Calibri"/>
-                <w:b w:val="0"/>
-                <w:i w:val="0"/>
-                <w:sz w:val="22"/>
-              </w:rPr>
-              <w:t xml:space="preserve">, dan lainnya — </w:t>
-            </w:r>
-            <w:r>
-              <w:rPr>
-                <w:rFonts w:ascii="Calibri" w:hAnsi="Calibri" w:cs="Calibri"/>
-                <w:b w:val="0"/>
-                <w:i/>
-                <w:sz w:val="22"/>
-              </w:rPr>
-              <w:t>Broome</w:t>
-            </w:r>
-            <w:r>
-              <w:rPr>
-                <w:rFonts w:ascii="Calibri" w:hAnsi="Calibri" w:cs="Calibri"/>
-                <w:b w:val="0"/>
-                <w:i w:val="0"/>
-                <w:sz w:val="22"/>
-              </w:rPr>
-              <w:t xml:space="preserve"> berargumen SCF dapat dan seharusnya diperbaiki, karena fleksibilitas SFAS No. 95 dalam mengizinkan metode langsung atau tidak langsung menimbulkan kebingungan; penyesuaian rumit metode tidak langsung sulit dipahami dan, dalam banyak kasus, tidak dapat direkonsiliasi dengan perubahan akun neraca yang teramati. Broome merekomendasikan tiga hal: (1) FASB mewajibkan metode langsung </w:t>
-            </w:r>
-            <w:r>
-              <w:rPr>
-                <w:rFonts w:ascii="Calibri" w:hAnsi="Calibri" w:cs="Calibri"/>
-                <w:b w:val="0"/>
-                <w:i/>
-                <w:sz w:val="22"/>
-              </w:rPr>
-              <w:t>dan</w:t>
-            </w:r>
-            <w:r>
-              <w:rPr>
-                <w:rFonts w:ascii="Calibri" w:hAnsi="Calibri" w:cs="Calibri"/>
-                <w:b w:val="0"/>
-                <w:i w:val="0"/>
-                <w:sz w:val="22"/>
-              </w:rPr>
-              <w:t xml:space="preserve"> rekonsiliasi laba bersih ke arus kas operasi; (2) FASB memberi lebih banyak panduan klasifikasi untuk ketiga bagian; (3) rekonsiliasi pelengkap dimulai dari arus kas operasi menuju laba bersih (kebalikan praktik saat ini). Penulis setuju metode langsung sebaiknya diwajibkan; namun jika sistem pilihan dipertahankan, perusahaan sebaiknya wajib menyajikan skedul transaksi nonkas yang memengaruhi akun modal kerja, skedul rekonsiliasi untuk akuisisi tengah-tahun, dan secara umum menjelaskan sumber setiap nonartikulasi pada bagian operasi SCF (Wolk et al., 2017).</w:t>
+              <w:t>SCF adalah alat penting bagi investor, kreditor, dan manajer, tetapi masih menyisakan ruang perbaikan. Berlatar serangkaian skandal akuntansi seperti Adelphia, Dynegy, Qwest, Tyco, dan WorldCom, Broome berpendapat SCF dapat dan sepatutnya dibenahi, sebab keleluasaan SFAS No. 95 yang membolehkan metode langsung atau tidak langsung justru menimbulkan kebingungan; penyesuaian rumit pada metode tidak langsung sulit dipahami dan dalam banyak kasus tidak dapat direkonsiliasi dengan perubahan akun neraca yang teramati. Tiga usulannya, FASB sebaiknya mewajibkan metode langsung sekaligus rekonsiliasi laba bersih ke arus kas operasi, memberi panduan klasifikasi yang lebih jelas bagi ketiga bagian, dan menyusun rekonsiliasi pelengkap yang justru bermula dari arus kas operasi menuju laba bersih, kebalikan dari praktik sekarang. Wolk setuju metode langsung sebaiknya diwajibkan; namun seandainya sistem pilihan tetap dipertahankan, perusahaan semestinya diwajibkan menyajikan skedul transaksi nonkas yang memengaruhi akun modal kerja, skedul rekonsiliasi untuk akuisisi tengah tahun, dan secara umum menjelaskan asal setiap nonartikulasi pada bagian operasi SCF (Wolk et al., 2017).</w:t>
             </w:r>
           </w:p>
         </w:tc>
@@ -5462,79 +3086,7 @@
           <w:i w:val="0"/>
           <w:sz w:val="24"/>
         </w:rPr>
-        <w:t xml:space="preserve">Bab 13 menelusuri evolusi pelaporan arus kas dari pendahulunya, </w:t>
-      </w:r>
-      <w:r>
-        <w:rPr>
-          <w:rFonts w:ascii="Calibri" w:hAnsi="Calibri" w:cs="Calibri"/>
-          <w:b w:val="0"/>
-          <w:i/>
-          <w:sz w:val="24"/>
-        </w:rPr>
-        <w:t>Statement of Changes in Financial Position</w:t>
-      </w:r>
-      <w:r>
-        <w:rPr>
-          <w:rFonts w:ascii="Calibri" w:hAnsi="Calibri" w:cs="Calibri"/>
-          <w:b w:val="0"/>
-          <w:i w:val="0"/>
-          <w:sz w:val="24"/>
-        </w:rPr>
-        <w:t xml:space="preserve"> (SCFP), menuju </w:t>
-      </w:r>
-      <w:r>
-        <w:rPr>
-          <w:rFonts w:ascii="Calibri" w:hAnsi="Calibri" w:cs="Calibri"/>
-          <w:b w:val="0"/>
-          <w:i/>
-          <w:sz w:val="24"/>
-        </w:rPr>
-        <w:t>Statement of Cash Flows</w:t>
-      </w:r>
-      <w:r>
-        <w:rPr>
-          <w:rFonts w:ascii="Calibri" w:hAnsi="Calibri" w:cs="Calibri"/>
-          <w:b w:val="0"/>
-          <w:i w:val="0"/>
-          <w:sz w:val="24"/>
-        </w:rPr>
-        <w:t xml:space="preserve"> (SCF) modern. SCFP yang diwajibkan </w:t>
-      </w:r>
-      <w:r>
-        <w:rPr>
-          <w:rFonts w:ascii="Calibri" w:hAnsi="Calibri" w:cs="Calibri"/>
-          <w:b w:val="0"/>
-          <w:i/>
-          <w:sz w:val="24"/>
-        </w:rPr>
-        <w:t>APB Opinion No. 19</w:t>
-      </w:r>
-      <w:r>
-        <w:rPr>
-          <w:rFonts w:ascii="Calibri" w:hAnsi="Calibri" w:cs="Calibri"/>
-          <w:b w:val="0"/>
-          <w:i w:val="0"/>
-          <w:sz w:val="24"/>
-        </w:rPr>
-        <w:t xml:space="preserve"> (1971) adalah laporan arus dana berkerangka biner "sumber dan penggunaan" yang fleksibel terhadap definisi dana — kas, kas plus near cash, quick assets, atau modal kerja — dengan mayoritas perusahaan memilih modal kerja demi biaya rendah. Karena modal kerja bersih dinilai sebagai ukuran likuiditas yang lemah (memuat pos tangguhan tanpa konsekuensi kas, siklus operasi panjang, dan persediaan berbasis biaya), FASB melalui </w:t>
-      </w:r>
-      <w:r>
-        <w:rPr>
-          <w:rFonts w:ascii="Calibri" w:hAnsi="Calibri" w:cs="Calibri"/>
-          <w:b w:val="0"/>
-          <w:i/>
-          <w:sz w:val="24"/>
-        </w:rPr>
-        <w:t>SFAS No. 95</w:t>
-      </w:r>
-      <w:r>
-        <w:rPr>
-          <w:rFonts w:ascii="Calibri" w:hAnsi="Calibri" w:cs="Calibri"/>
-          <w:b w:val="0"/>
-          <w:i w:val="0"/>
-          <w:sz w:val="24"/>
-        </w:rPr>
-        <w:t xml:space="preserve"> (1987) mendefinisikan ulang dana sebagai kas dan menggantikan SCFP. Inti SFAS No. 95 adalah trikotomi tiga arah — aktivitas operasi, investasi, dan pendanaan — yang memberi konsistensi klasifikasional lebih tinggi, dengan definisi kas dan setara kas serta kewajiban mengungkapkan transaksi nonkas. Arus kas operasi dapat disajikan dengan metode langsung (disukai FASB, lebih informatif, tetapi mahal) atau metode tidak langsung (dominan dalam praktik karena murah, meski lebih sulit dipahami).</w:t>
+        <w:t>Bab 13 menelusuri bagaimana pelaporan arus kas berevolusi dari Statement of Changes in Financial Position (SCFP) menuju Statement of Cash Flows (SCF) yang kita kenal sekarang. SCFP yang diwajibkan APB Opinion No. 19 pada 1971 masih berupa laporan arus dana dengan kerangka biner sumber dan penggunaan, dan membuka empat kemungkinan definisi dana, mulai dari kas hingga modal kerja, dengan kebanyakan perusahaan memilih modal kerja karena paling murah disusun. Persoalannya, modal kerja bersih ternyata ukuran likuiditas yang lemah: ia memuat pos tangguhan tanpa konsekuensi kas, mengandaikan siklus operasi yang bisa melebihi setahun, dan menilai persediaan berbasis biaya. Atas dasar itu FASB lewat SFAS No. 95 pada 1987 mendefinisikan ulang dana sebagai kas dan menggantikan SCFP. Jantung SFAS No. 95 adalah trikotomi tiga arah, yakni aktivitas operasi, investasi, dan pendanaan, yang menjanjikan konsistensi klasifikasi lebih tinggi, lengkap dengan definisi kas dan setara kas serta kewajiban mengungkapkan transaksi nonkas. Arus kas operasinya boleh disajikan dengan metode langsung, yang lebih informatif dan disukai FASB meski lebih mahal, atau dengan metode tidak langsung yang mendominasi praktik karena lebih murah walau lebih sukar dibaca.</w:t>
       </w:r>
     </w:p>
     <w:p>
@@ -5549,79 +3101,7 @@
           <w:i w:val="0"/>
           <w:sz w:val="24"/>
         </w:rPr>
-        <w:t xml:space="preserve">Bab ini secara jujur memaparkan dua keterbatasan SCF. </w:t>
-      </w:r>
-      <w:r>
-        <w:rPr>
-          <w:rFonts w:ascii="Calibri" w:hAnsi="Calibri" w:cs="Calibri"/>
-          <w:b w:val="0"/>
-          <w:i/>
-          <w:sz w:val="24"/>
-        </w:rPr>
-        <w:t>Pertama</w:t>
-      </w:r>
-      <w:r>
-        <w:rPr>
-          <w:rFonts w:ascii="Calibri" w:hAnsi="Calibri" w:cs="Calibri"/>
-          <w:b w:val="0"/>
-          <w:i w:val="0"/>
-          <w:sz w:val="24"/>
-        </w:rPr>
-        <w:t xml:space="preserve">, nonartikulasi (Bahnson, Miller &amp; Budge): penyesuaian modal kerja pada bagian operasi kerap tidak sama dengan perubahan akun neraca — terjadi pada 75% sampel, dengan kasus 3M memperlihatkan selisih piutang hingga 300% — akibat akuisisi tengah-tahun, transaksi nonkas, dan akun bersama. </w:t>
-      </w:r>
-      <w:r>
-        <w:rPr>
-          <w:rFonts w:ascii="Calibri" w:hAnsi="Calibri" w:cs="Calibri"/>
-          <w:b w:val="0"/>
-          <w:i/>
-          <w:sz w:val="24"/>
-        </w:rPr>
-        <w:t>Kedua</w:t>
-      </w:r>
-      <w:r>
-        <w:rPr>
-          <w:rFonts w:ascii="Calibri" w:hAnsi="Calibri" w:cs="Calibri"/>
-          <w:b w:val="0"/>
-          <w:i w:val="0"/>
-          <w:sz w:val="24"/>
-        </w:rPr>
-        <w:t xml:space="preserve">, masalah klasifikasi: orientasi </w:t>
-      </w:r>
-      <w:r>
-        <w:rPr>
-          <w:rFonts w:ascii="Calibri" w:hAnsi="Calibri" w:cs="Calibri"/>
-          <w:b w:val="0"/>
-          <w:i/>
-          <w:sz w:val="24"/>
-        </w:rPr>
-        <w:t>proprietary</w:t>
-      </w:r>
-      <w:r>
-        <w:rPr>
-          <w:rFonts w:ascii="Calibri" w:hAnsi="Calibri" w:cs="Calibri"/>
-          <w:b w:val="0"/>
-          <w:i w:val="0"/>
-          <w:sz w:val="24"/>
-        </w:rPr>
-        <w:t xml:space="preserve"> menempatkan bunga dan dividen di bagian operasi, padahal teori entitas dan literatur keuangan menggolongkannya sebagai investasi/pendanaan; fleksibilitas penerapan (IAS 7, premium obligasi versi Vent, Cowling &amp; Sevalstad, bunga dikapitalisasi SFAS No. 34, lindung nilai SFAS No. 104) membuka ruang manipulasi yang diilustrasikan kasus Tyco, otomotif (GM $7,6 miliar vs $3,5 miliar), dan WorldCom. Meski demikian, SCF tetap sangat berguna secara analitis (model Ingram &amp; Lee, kebutuhan valuasi ala Buffett), dan memunculkan </w:t>
-      </w:r>
-      <w:r>
-        <w:rPr>
-          <w:rFonts w:ascii="Calibri" w:hAnsi="Calibri" w:cs="Calibri"/>
-          <w:b w:val="0"/>
-          <w:i/>
-          <w:sz w:val="24"/>
-        </w:rPr>
-        <w:t>free cash flow</w:t>
-      </w:r>
-      <w:r>
-        <w:rPr>
-          <w:rFonts w:ascii="Calibri" w:hAnsi="Calibri" w:cs="Calibri"/>
-          <w:b w:val="0"/>
-          <w:i w:val="0"/>
-          <w:sz w:val="24"/>
-        </w:rPr>
-        <w:t xml:space="preserve"> (FCF = NOPLAT − investasi pada modal terinvestasi operasi) sebagai ukuran non-GAAP untuk valuasi. Penulis menyimpulkan bahwa perpindahan dari SCFP ke SCF meningkatkan konsistensi dan daya prediksi karena melepaskan diri dari "kesewenang-wenangan" laba — selama SCF dibaca secara utuh, bukan terbatas pada arus kas operasi (Wolk et al., 2017).</w:t>
+        <w:t>Yang menarik, bab ini tidak menutup-nutupi dua keterbatasan SCF. Pertama, nonartikulasi yang didokumentasikan Bahnson, Miller, dan Budge: penyesuaian modal kerja di bagian operasi sering tidak sama dengan perubahan akun neraca, terjadi pada 75 persen sampel, dengan kasus 3M memperlihatkan selisih piutang hingga 300 persen, akibat akuisisi tengah tahun, transaksi nonkas, dan akun yang dipakai bersama. Kedua, persoalan klasifikasi: orientasi proprietary menempatkan bunga dan dividen di bagian operasi, padahal teori entitas dan literatur keuangan menggolongkannya sebagai investasi atau pendanaan, sementara kelonggaran penerapan pada IAS 7, premium obligasi versi Vent, Cowling, dan Sevalstad, bunga dikapitalisasi SFAS No. 34, serta lindung nilai SFAS No. 104 membuka ruang manipulasi yang tampak nyata pada kasus Tyco, industri otomotif (CFO GM $7,6 miliar yang sejatinya $3,5 miliar), dan WorldCom. Kendati demikian SCF tetap berdaya guna secara analitis, sebagaimana ditunjukkan model Ingram dan Lee maupun kebutuhan valuasi ala Buffett, dan dari sanalah free cash flow lahir sebagai ukuran non-GAAP untuk valuasi, dengan FCF sama dengan NOPLAT dikurangi investasi pada modal terinvestasi operasi. Kesimpulan Wolk, perpindahan dari SCFP ke SCF meningkatkan konsistensi dan daya prediksi karena melepaskan diri dari kesewenang-wenangan laba, sepanjang SCF dibaca secara utuh dan tidak dipersempit pada arus kas operasi saja (Wolk et al., 2017).</w:t>
       </w:r>
     </w:p>
     <w:p>
@@ -5666,61 +3146,7 @@
           <w:i w:val="0"/>
           <w:sz w:val="24"/>
         </w:rPr>
-        <w:t xml:space="preserve">Pemahaman saya adalah bahwa SCF bukanlah sekadar laporan keuangan keempat yang berdiri sendiri, melainkan sebuah </w:t>
-      </w:r>
-      <w:r>
-        <w:rPr>
-          <w:rFonts w:ascii="Calibri" w:hAnsi="Calibri" w:cs="Calibri"/>
-          <w:b w:val="0"/>
-          <w:i/>
-          <w:sz w:val="24"/>
-        </w:rPr>
-        <w:t>laporan turunan</w:t>
-      </w:r>
-      <w:r>
-        <w:rPr>
-          <w:rFonts w:ascii="Calibri" w:hAnsi="Calibri" w:cs="Calibri"/>
-          <w:b w:val="0"/>
-          <w:i w:val="0"/>
-          <w:sz w:val="24"/>
-        </w:rPr>
-        <w:t xml:space="preserve"> yang merekonfigurasi data yang sudah ada di laporan laba rugi dan neraca ke dalam tiga lensa baru: operasi, investasi, dan pendanaan. Yang membuatnya bernilai justru bukan kebaruan datanya, melainkan dekomposisinya — pemisahan komponen kas dari komponen akrual yang menghasilkan </w:t>
-      </w:r>
-      <w:r>
-        <w:rPr>
-          <w:rFonts w:ascii="Calibri" w:hAnsi="Calibri" w:cs="Calibri"/>
-          <w:b w:val="0"/>
-          <w:i/>
-          <w:sz w:val="24"/>
-        </w:rPr>
-        <w:t>informasi baru</w:t>
-      </w:r>
-      <w:r>
-        <w:rPr>
-          <w:rFonts w:ascii="Calibri" w:hAnsi="Calibri" w:cs="Calibri"/>
-          <w:b w:val="0"/>
-          <w:i w:val="0"/>
-          <w:sz w:val="24"/>
-        </w:rPr>
-        <w:t xml:space="preserve"> tentang likuiditas dan kualitas laba. Saya juga memahami bahwa keunggulan utama SCF, yaitu kelugasan kas ("kas adalah kas"), sekaligus menjadi sumber ketegangan teoretisnya: begitu standar harus memutuskan </w:t>
-      </w:r>
-      <w:r>
-        <w:rPr>
-          <w:rFonts w:ascii="Calibri" w:hAnsi="Calibri" w:cs="Calibri"/>
-          <w:b w:val="0"/>
-          <w:i/>
-          <w:sz w:val="24"/>
-        </w:rPr>
-        <w:t>di bagian mana</w:t>
-      </w:r>
-      <w:r>
-        <w:rPr>
-          <w:rFonts w:ascii="Calibri" w:hAnsi="Calibri" w:cs="Calibri"/>
-          <w:b w:val="0"/>
-          <w:i w:val="0"/>
-          <w:sz w:val="24"/>
-        </w:rPr>
-        <w:t xml:space="preserve"> suatu arus kas digolongkan, kelugasan itu terganggu oleh pilihan teori (proprietary vs entity) dan oleh fleksibilitas metode (langsung vs tidak langsung). Dengan demikian, SCF adalah laporan yang konsepnya sederhana namun penyajiannya sarat keputusan normatif.</w:t>
+        <w:t>Bagi saya, SCF bukan sekadar laporan keuangan keempat yang berdiri sendiri, melainkan laporan turunan yang menata ulang data dari laporan laba rugi dan neraca ke dalam tiga lensa baru, yaitu operasi, investasi, dan pendanaan. Nilainya tidak terletak pada kebaruan data, sebab datanya memang sudah ada, tetapi pada cara ia memisahkan komponen kas dari komponen akrual sehingga lahir informasi baru tentang likuiditas dan kualitas laba. Yang menarik, keunggulan terbesar SCF, yakni kelugasan kas, sekaligus menjadi pangkal ketegangan teoretisnya. Begitu sebuah standar harus memutuskan di bagian mana suatu arus kas digolongkan, kelugasan itu mulai terganggu oleh pilihan teori antara proprietary dan entity, juga oleh kebebasan memilih metode langsung atau tidak langsung. SCF karena itu adalah laporan yang konsepnya sederhana tetapi penyajiannya sarat keputusan normatif.</w:t>
       </w:r>
     </w:p>
     <w:p>
@@ -5750,25 +3176,7 @@
           <w:i w:val="0"/>
           <w:sz w:val="24"/>
         </w:rPr>
-        <w:t xml:space="preserve">Materi ini penting karena menyentuh pertanyaan paling fundamental kelangsungan usaha: apakah perusahaan menghasilkan kas yang cukup untuk bertahan? Laba akrual dapat positif sementara kas menipis — sebuah disjungsi yang berulang kali terbukti fatal. Penguasaan SCF melatih analis untuk tidak terpaku pada satu angka (laba bersih atau bahkan arus kas operasi) melainkan membaca interaksi ketiga bagian secara simultan. Lebih jauh, materi ini penting secara </w:t>
-      </w:r>
-      <w:r>
-        <w:rPr>
-          <w:rFonts w:ascii="Calibri" w:hAnsi="Calibri" w:cs="Calibri"/>
-          <w:b w:val="0"/>
-          <w:i/>
-          <w:sz w:val="24"/>
-        </w:rPr>
-        <w:t>epistemologis</w:t>
-      </w:r>
-      <w:r>
-        <w:rPr>
-          <w:rFonts w:ascii="Calibri" w:hAnsi="Calibri" w:cs="Calibri"/>
-          <w:b w:val="0"/>
-          <w:i w:val="0"/>
-          <w:sz w:val="24"/>
-        </w:rPr>
-        <w:t>: ia memperlihatkan bahwa standar akuntansi adalah produk kompromi politik-ekonomi (misalnya tekanan industri perbankan atas klasifikasi bunga), bukan kebenaran netral — pelajaran inti dari kerangka kursus Pelaporan Keuangan Korporat.</w:t>
+        <w:t>Materi ini menyentuh pertanyaan paling mendasar tentang kelangsungan usaha: apakah perusahaan menghasilkan kas yang cukup untuk bertahan. Laba akrual bisa saja positif sementara kas menipis, dan disjungsi semacam itu sudah berkali-kali terbukti mematikan. Menguasai SCF berarti melatih diri untuk tidak terpaku pada satu angka, entah laba bersih atau bahkan arus kas operasi, melainkan membaca interaksi ketiga bagiannya sekaligus. Ada pula nilai yang lebih dalam dari sekadar teknis. Materi ini memperlihatkan bahwa standar akuntansi adalah hasil kompromi politik dan ekonomi, sebagaimana terlihat dari tekanan industri perbankan atas klasifikasi bunga, dan bukan kebenaran yang netral. Justru itulah pelajaran inti dari kerangka mata kuliah Pelaporan Keuangan Korporat.</w:t>
       </w:r>
     </w:p>
     <w:p>
@@ -5798,7 +3206,7 @@
           <w:i w:val="0"/>
           <w:sz w:val="24"/>
         </w:rPr>
-        <w:t>Penerapannya tampak paling tajam dalam analisis solvabilitas dan deteksi manipulasi. Kasus WorldCom memperlihatkan bahwa selisih CFO − CFI yang terus negatif (kumulatif "lubang" $12 miliar) memberi sinyal bahaya bahkan ketika laba bersih dan CFO tampak sehat akibat kapitalisasi beban. Pelajaran serupa muncul pada industri otomotif (GM melaporkan CFO $7,6 miliar yang sejatinya $3,5 miliar bila piutang dealer digolongkan operasi). Dalam praktik valuasi, FCF yang didiskontokan dengan WACC menjadi tulang punggung penilaian ekuitas — persis logika nilai intrinsik yang dianjurkan Buffett. Seorang analis kredit maupun investor karena itu harus merekonstruksi arus kas, bukan menelannya mentah.</w:t>
+        <w:t>Penerapan SCF terasa paling tajam dalam analisis solvabilitas dan deteksi manipulasi. WorldCom adalah contohnya yang paling terang: selisih CFO dikurangi CFI yang terus-menerus negatif, dengan defisit kumulatif $12 miliar, sudah memberi sinyal bahaya jauh sebelum laba bersih dan CFO yang dipoles lewat kapitalisasi beban runtuh. Pola serupa terlihat pada industri otomotif, ketika GM melaporkan CFO $7,6 miliar yang sebenarnya hanya $3,5 miliar seandainya piutang dealer digolongkan operasi. Dalam praktik valuasi, FCF yang didiskontokan dengan WACC menjadi tulang punggung penilaian ekuitas, dan itu persis logika nilai intrinsik yang dianjurkan Buffett. Maka baik analis kredit maupun investor sepatutnya merekonstruksi arus kas terlebih dahulu, bukan menelan angka yang tersaji begitu saja.</w:t>
       </w:r>
     </w:p>
     <w:p>
@@ -5828,79 +3236,7 @@
           <w:i w:val="0"/>
           <w:sz w:val="24"/>
         </w:rPr>
-        <w:t xml:space="preserve">Materi ini berdiri di persimpangan beberapa disiplin. Dengan </w:t>
-      </w:r>
-      <w:r>
-        <w:rPr>
-          <w:rFonts w:ascii="Calibri" w:hAnsi="Calibri" w:cs="Calibri"/>
-          <w:b w:val="0"/>
-          <w:i/>
-          <w:sz w:val="24"/>
-        </w:rPr>
-        <w:t>analisis laporan keuangan</w:t>
-      </w:r>
-      <w:r>
-        <w:rPr>
-          <w:rFonts w:ascii="Calibri" w:hAnsi="Calibri" w:cs="Calibri"/>
-          <w:b w:val="0"/>
-          <w:i w:val="0"/>
-          <w:sz w:val="24"/>
-        </w:rPr>
-        <w:t xml:space="preserve">, SCF menyediakan basis rasio likuiditas dan kualitas laba yang lebih andal daripada rasio neraca. Dengan </w:t>
-      </w:r>
-      <w:r>
-        <w:rPr>
-          <w:rFonts w:ascii="Calibri" w:hAnsi="Calibri" w:cs="Calibri"/>
-          <w:b w:val="0"/>
-          <w:i/>
-          <w:sz w:val="24"/>
-        </w:rPr>
-        <w:t>manajemen keuangan</w:t>
-      </w:r>
-      <w:r>
-        <w:rPr>
-          <w:rFonts w:ascii="Calibri" w:hAnsi="Calibri" w:cs="Calibri"/>
-          <w:b w:val="0"/>
-          <w:i w:val="0"/>
-          <w:sz w:val="24"/>
-        </w:rPr>
-        <w:t xml:space="preserve">, konsep FCF, NOPLAT, NPV, dan WACC adalah jembatan langsung ke teori penilaian dan penganggaran modal — bahkan definisi FCF di bab ini identik dengan yang dipakai dalam </w:t>
-      </w:r>
-      <w:r>
-        <w:rPr>
-          <w:rFonts w:ascii="Calibri" w:hAnsi="Calibri" w:cs="Calibri"/>
-          <w:b w:val="0"/>
-          <w:i/>
-          <w:sz w:val="24"/>
-        </w:rPr>
-        <w:t>corporate valuation</w:t>
-      </w:r>
-      <w:r>
-        <w:rPr>
-          <w:rFonts w:ascii="Calibri" w:hAnsi="Calibri" w:cs="Calibri"/>
-          <w:b w:val="0"/>
-          <w:i w:val="0"/>
-          <w:sz w:val="24"/>
-        </w:rPr>
-        <w:t xml:space="preserve">. Dengan </w:t>
-      </w:r>
-      <w:r>
-        <w:rPr>
-          <w:rFonts w:ascii="Calibri" w:hAnsi="Calibri" w:cs="Calibri"/>
-          <w:b w:val="0"/>
-          <w:i/>
-          <w:sz w:val="24"/>
-        </w:rPr>
-        <w:t>audit</w:t>
-      </w:r>
-      <w:r>
-        <w:rPr>
-          <w:rFonts w:ascii="Calibri" w:hAnsi="Calibri" w:cs="Calibri"/>
-          <w:b w:val="0"/>
-          <w:i w:val="0"/>
-          <w:sz w:val="24"/>
-        </w:rPr>
-        <w:t>, masalah nonartikulasi dan ruang klasifikasi menjadi area risiko yang menuntut pengujian substantif, karena di situlah manajemen memiliki diskresi untuk membingkai ulang kinerja.</w:t>
+        <w:t>Materi ini berdiri di persimpangan beberapa disiplin. Dalam analisis laporan keuangan, SCF memasok dasar rasio likuiditas dan kualitas laba yang lebih dapat diandalkan ketimbang rasio yang ditarik dari neraca. Dalam manajemen keuangan, konsep FCF, NOPLAT, NPV, dan WACC menjadi jembatan langsung menuju teori penilaian dan penganggaran modal; definisi FCF di bab ini bahkan identik dengan yang dipakai dalam corporate valuation. Dalam audit, masalah nonartikulasi dan ruang klasifikasi berubah menjadi area berisiko yang menuntut pengujian substantif, karena di titik itulah manajemen memiliki keleluasaan untuk membingkai ulang kinerjanya.</w:t>
       </w:r>
     </w:p>
     <w:p>
@@ -5930,79 +3266,7 @@
           <w:i w:val="0"/>
           <w:sz w:val="24"/>
         </w:rPr>
-        <w:t xml:space="preserve">Kelebihan SCF nyata: ia mengurangi kesewenang-wenangan pengukuran laba, meningkatkan keterbandingan antarperusahaan, dan memberi dasar yang relatif keras untuk menilai likuiditas dan daya prediksi. Namun keterbatasannya tidak boleh ditutupi. </w:t>
-      </w:r>
-      <w:r>
-        <w:rPr>
-          <w:rFonts w:ascii="Calibri" w:hAnsi="Calibri" w:cs="Calibri"/>
-          <w:b w:val="0"/>
-          <w:i/>
-          <w:sz w:val="24"/>
-        </w:rPr>
-        <w:t>Nonartikulasi</w:t>
-      </w:r>
-      <w:r>
-        <w:rPr>
-          <w:rFonts w:ascii="Calibri" w:hAnsi="Calibri" w:cs="Calibri"/>
-          <w:b w:val="0"/>
-          <w:i w:val="0"/>
-          <w:sz w:val="24"/>
-        </w:rPr>
-        <w:t xml:space="preserve"> membuat SCF metode tidak langsung tampak inkonsisten dengan neraca pada 75% kasus. </w:t>
-      </w:r>
-      <w:r>
-        <w:rPr>
-          <w:rFonts w:ascii="Calibri" w:hAnsi="Calibri" w:cs="Calibri"/>
-          <w:b w:val="0"/>
-          <w:i/>
-          <w:sz w:val="24"/>
-        </w:rPr>
-        <w:t>Ruang klasifikasi</w:t>
-      </w:r>
-      <w:r>
-        <w:rPr>
-          <w:rFonts w:ascii="Calibri" w:hAnsi="Calibri" w:cs="Calibri"/>
-          <w:b w:val="0"/>
-          <w:i w:val="0"/>
-          <w:sz w:val="24"/>
-        </w:rPr>
-        <w:t xml:space="preserve"> SFAS No. 95 — bunga proprietary, fleksibilitas IAS 7, empat metode premium, lindung nilai SFAS No. 104 — memungkinkan perusahaan sejenis memberi gambaran berlawanan, sehingga keterbandingan yang dijanjikan tergerus. Adapun </w:t>
-      </w:r>
-      <w:r>
-        <w:rPr>
-          <w:rFonts w:ascii="Calibri" w:hAnsi="Calibri" w:cs="Calibri"/>
-          <w:b w:val="0"/>
-          <w:i/>
-          <w:sz w:val="24"/>
-        </w:rPr>
-        <w:t>FCF</w:t>
-      </w:r>
-      <w:r>
-        <w:rPr>
-          <w:rFonts w:ascii="Calibri" w:hAnsi="Calibri" w:cs="Calibri"/>
-          <w:b w:val="0"/>
-          <w:i w:val="0"/>
-          <w:sz w:val="24"/>
-        </w:rPr>
-        <w:t xml:space="preserve">, meski populer untuk valuasi, bersifat </w:t>
-      </w:r>
-      <w:r>
-        <w:rPr>
-          <w:rFonts w:ascii="Calibri" w:hAnsi="Calibri" w:cs="Calibri"/>
-          <w:b w:val="0"/>
-          <w:i/>
-          <w:sz w:val="24"/>
-        </w:rPr>
-        <w:t>non-GAAP</w:t>
-      </w:r>
-      <w:r>
-        <w:rPr>
-          <w:rFonts w:ascii="Calibri" w:hAnsi="Calibri" w:cs="Calibri"/>
-          <w:b w:val="0"/>
-          <w:i w:val="0"/>
-          <w:sz w:val="24"/>
-        </w:rPr>
-        <w:t>: tidak terstandardisasi, tidak dapat diambil langsung dari SCF, dan rentan terhadap variasi definisi antarperusahaan. Dengan kata lain, SCF unggul justru pada apa yang lebih objektif (kas), tetapi tetap mewarisi masalah alokasi dan klasifikasi yang ingin dihindarinya.</w:t>
+        <w:t>Kelebihan SCF cukup nyata. Ia mengurangi kesewenang-wenangan pengukuran laba, memperbaiki keterbandingan antarperusahaan, dan memberi dasar yang relatif kokoh untuk menilai likuiditas dan daya prediksi. Namun keterbatasannya tidak pantas ditutupi. Nonartikulasi membuat SCF metode tidak langsung tampak berselisih dengan neraca pada 75 persen kasus. Ruang klasifikasi yang dibiarkan SFAS No. 95, mulai dari bunga yang diperlakukan secara proprietary, kelenturan IAS 7, empat metode premium, hingga lindung nilai SFAS No. 104, memungkinkan perusahaan sejenis menampilkan gambaran yang berlawanan, sehingga keterbandingan yang dijanjikan ikut tergerus. FCF sendiri, betapapun populer untuk valuasi, tetap berstatus non-GAAP: tidak terstandar, tidak dapat ditarik langsung dari SCF, dan rentan terhadap perbedaan definisi antarperusahaan. Pada akhirnya SCF memang unggul pada hal yang lebih objektif, yaitu kas, tetapi ia tetap mewarisi masalah alokasi dan klasifikasi yang justru ingin dihindarinya.</w:t>
       </w:r>
     </w:p>
     <w:p>
@@ -6032,7 +3296,7 @@
           <w:i w:val="0"/>
           <w:sz w:val="24"/>
         </w:rPr>
-        <w:t>Berdasarkan pembahasan yang telah dilakukan, dapat disimpulkan bahwa Statement of Cash Flows merupakan kasus khusus dari Statement of Changes in Financial Position dengan dana didefinisikan sebagai kas, dan tetap berkarakter sebagai laporan turunan yang menata ulang data laba rugi dan neraca ke dalam trikotomi operasi, investasi, dan pendanaan. Inti materinya adalah bahwa kas, bukan laba akrual, merupakan penentu akhir kelangsungan dan nilai perusahaan, sehingga SCF hadir untuk meredam kesewenang-wenangan pengukuran laba serta meningkatkan keterbandingan dan daya prediksi. Manfaatnya bersifat ganda: bagi pengguna eksternal ia menyediakan dasar penilaian likuiditas, fleksibilitas keuangan, dan kualitas laba; bagi analis valuasi ia menjadi pangkal perhitungan free cash flow yang didiskontokan dengan biaya modal. Implikasi praktisnya nyata dalam analisis solvabilitas dan deteksi kecurangan — kasus WorldCom serta industri otomotif menunjukkan bahwa pembacaan SCF secara utuh, lintas ketiga bagiannya, mampu mengungkap tekanan kas yang tersembunyi di balik laba positif. Namun materi ini juga mengajarkan kerendahan hati metodologis: nonartikulasi, ruang klasifikasi SFAS No. 95, dan sifat non-GAAP dari FCF membatasi klaim objektivitas SCF. Kontribusinya terhadap ilmu akuntansi terletak pada penegasan bahwa pelaporan berbasis kas dan berbasis akrual bersifat komplementer, bukan substitutif, dan bahwa kualitas suatu standar diukur tidak hanya dari kelengkapannya melainkan dari sejauh mana ia membatasi diskresi yang dapat menyesatkan pengguna (Wolk et al., 2017).</w:t>
+        <w:t>Dari keseluruhan pembahasan, Statement of Cash Flows pada dasarnya adalah kasus khusus dari Statement of Changes in Financial Position dengan dana didefinisikan sebagai kas, dan tetap berwatak sebagai laporan turunan yang menata ulang data laba rugi dan neraca ke dalam trikotomi operasi, investasi, dan pendanaan. Pesan utamanya, kaslah yang menentukan kelangsungan dan nilai perusahaan, bukan laba akrual, sehingga SCF hadir untuk meredam kesewenang-wenangan pengukuran laba sekaligus mempertinggi keterbandingan dan daya prediksi. Manfaatnya berjalan di dua arah: bagi pengguna eksternal ia menjadi dasar menilai likuiditas, fleksibilitas keuangan, dan kualitas laba, sedangkan bagi analis valuasi ia menjadi titik tolak perhitungan free cash flow yang didiskontokan dengan biaya modal. Dalam praktik, manfaat itu terlihat pada analisis solvabilitas dan deteksi kecurangan; kasus WorldCom maupun industri otomotif menunjukkan bahwa membaca SCF secara utuh, lintas ketiga bagiannya, mampu menyingkap tekanan kas yang tersembunyi di balik laba yang tampak sehat. Namun bab ini juga mengajarkan kerendahan hati metodologis, sebab nonartikulasi, ruang klasifikasi SFAS No. 95, dan sifat non-GAAP dari FCF membatasi klaim objektivitas SCF. Sumbangannya bagi ilmu akuntansi terletak pada penegasan bahwa pelaporan berbasis kas dan berbasis akrual saling melengkapi alih-alih saling menggantikan, dan bahwa mutu sebuah standar diukur bukan dari kelengkapannya semata, melainkan dari sejauh mana ia membatasi diskresi yang berpotensi menyesatkan pengguna (Wolk et al., 2017).</w:t>
       </w:r>
     </w:p>
     <w:p>

</xml_diff>

<commit_message>
style(rmk10): humanize Bagian E active-recall prose; rebuild docx
Co-Authored-By: Claude Opus 4.8 (1M context) <noreply@anthropic.com>
</commit_message>
<xml_diff>
--- a/rmk-pkk-pert10-statement-of-cash-flows/output/01079_Dzaki Muhammad Yusfian_RMK Pert. 10.docx
+++ b/rmk-pkk-pert10-statement-of-cash-flows/output/01079_Dzaki Muhammad Yusfian_RMK Pert. 10.docx
@@ -3336,7 +3336,7 @@
           <w:i w:val="0"/>
           <w:sz w:val="24"/>
         </w:rPr>
-        <w:t xml:space="preserve">Mengapa FASB melalui SFAS No. 95 (1987) memutuskan mendefinisikan dana sebagai </w:t>
+        <w:t xml:space="preserve">Mengapa FASB lewat SFAS No. 95 (1987) akhirnya mendefinisikan dana sebagai kas dan menggantikan SCFP, dan apa tiga kelemahan modal kerja bersih sebagai ukuran likuiditas? </w:t>
       </w:r>
       <w:r>
         <w:rPr>
@@ -3345,25 +3345,7 @@
           <w:i/>
           <w:sz w:val="24"/>
         </w:rPr>
-        <w:t>kas</w:t>
-      </w:r>
-      <w:r>
-        <w:rPr>
-          <w:rFonts w:ascii="Calibri" w:hAnsi="Calibri" w:cs="Calibri"/>
-          <w:b w:val="0"/>
-          <w:i w:val="0"/>
-          <w:sz w:val="24"/>
-        </w:rPr>
-        <w:t xml:space="preserve"> dan menggantikan SCFP, dan sebutkan tiga alasan modal kerja bersih dipandang sebagai ukuran likuiditas yang buruk. </w:t>
-      </w:r>
-      <w:r>
-        <w:rPr>
-          <w:rFonts w:ascii="Calibri" w:hAnsi="Calibri" w:cs="Calibri"/>
-          <w:b w:val="0"/>
-          <w:i/>
-          <w:sz w:val="24"/>
-        </w:rPr>
-        <w:t>(Jawaban: karena kelugasan kas; tiga alasan — beban/kredit tangguhan tanpa konsekuensi kas, siklus operasi yang dapat melebihi setahun, dan persediaan berbasis biaya yang tak mengukur potensi kas.)</w:t>
+        <w:t>Jawaban: karena kas jauh lebih lugas untuk dibaca. Modal kerja bersih dinilai lemah sebab memuat beban dan kredit tangguhan yang tak berkonsekuensi kas, mengandaikan siklus operasi yang bisa melebihi setahun, serta menilai persediaan berbasis biaya sehingga tidak menggambarkan potensi kasnya.</w:t>
       </w:r>
     </w:p>
     <w:p>
@@ -3388,7 +3370,7 @@
           <w:i w:val="0"/>
           <w:sz w:val="24"/>
         </w:rPr>
-        <w:t xml:space="preserve">Jelaskan trikotomi tiga arah dalam SCF dan sebutkan satu butir dissent tiga anggota FASB. </w:t>
+        <w:t xml:space="preserve">Apa yang dimaksud trikotomi tiga arah dalam SCF, dan apa isi keberatan tiga anggota FASB? </w:t>
       </w:r>
       <w:r>
         <w:rPr>
@@ -3397,7 +3379,7 @@
           <w:i/>
           <w:sz w:val="24"/>
         </w:rPr>
-        <w:t>(Jawaban: aktivitas operasi, investasi, dan pendanaan; dissent menyatakan bunga/dividen diterima adalah investasi dan bunga dibayar adalah pendanaan, bukan operasi.)</w:t>
+        <w:t>Jawaban: SCF menggolongkan arus kas ke dalam aktivitas operasi, investasi, dan pendanaan. Tiga anggota yang dissent berpendapat bunga dan dividen yang diterima sebenarnya aktivitas investasi, dan bunga yang dibayar adalah pendanaan, bukan operasi.</w:t>
       </w:r>
     </w:p>
     <w:p>
@@ -3422,7 +3404,7 @@
           <w:i w:val="0"/>
           <w:sz w:val="24"/>
         </w:rPr>
-        <w:t xml:space="preserve">Apa perbedaan metode langsung dan tidak langsung, dan mengapa mayoritas perusahaan AS memilih metode tidak langsung meski FASB lebih menyukai metode langsung? </w:t>
+        <w:t xml:space="preserve">Apa beda metode langsung dan tidak langsung, dan mengapa mayoritas perusahaan Amerika memilih metode tidak langsung meski FASB lebih menyukai yang langsung? </w:t>
       </w:r>
       <w:r>
         <w:rPr>
@@ -3431,7 +3413,7 @@
           <w:i/>
           <w:sz w:val="24"/>
         </w:rPr>
-        <w:t>(Jawaban: metode langsung melaporkan arus kas literal dan lebih informatif tetapi mahal; metode tidak langsung merekonsiliasi laba akrual ke kas, lebih murah disusun — itulah alasan dominasinya; studi McEnroe: 56% vs 44% mendukung langsung.)</w:t>
+        <w:t>Jawaban: metode langsung melaporkan arus kas literal dan lebih informatif tetapi mahal disusun, sedangkan metode tidak langsung merekonsiliasi laba akrual ke kas dan lebih murah, itulah sebab dominasinya. Studi McEnroe menemukan 56 persen pengguna justru memilih metode langsung berbanding 44 persen.</w:t>
       </w:r>
     </w:p>
     <w:p>
@@ -3456,7 +3438,7 @@
           <w:i w:val="0"/>
           <w:sz w:val="24"/>
         </w:rPr>
-        <w:t xml:space="preserve">Apa yang dimaksud masalah nonartikulasi, siapa peneliti yang mendokumentasikannya, dan apa tiga penyebab utamanya? </w:t>
+        <w:t xml:space="preserve">Apa itu masalah nonartikulasi, siapa yang mendokumentasikannya, dan apa tiga penyebab utamanya? </w:t>
       </w:r>
       <w:r>
         <w:rPr>
@@ -3465,7 +3447,7 @@
           <w:i/>
           <w:sz w:val="24"/>
         </w:rPr>
-        <w:t>(Jawaban: penyesuaian modal kerja di bagian operasi ≠ perubahan akun neraca; Bahnson, Miller &amp; Budge — 75% sampel; penyebab: akuisisi tengah-tahun, transaksi modal kerja nonkas, dan satu akun utang usaha bersama.)</w:t>
+        <w:t>Jawaban: keadaan ketika penyesuaian modal kerja di bagian operasi tidak sama dengan perubahan akun neraca, yang ditemukan Bahnson, Miller, dan Budge pada 75 persen sampel. Penyebabnya adalah akuisisi tengah tahun, transaksi modal kerja yang tidak menyentuh kas, dan satu akun utang usaha yang dipakai bersama untuk pembelian operasi maupun investasi.</w:t>
       </w:r>
     </w:p>
     <w:p>
@@ -3490,7 +3472,7 @@
           <w:i w:val="0"/>
           <w:sz w:val="24"/>
         </w:rPr>
-        <w:t xml:space="preserve">Tuliskan persamaan free cash flow dan jelaskan mengapa FCF tidak dapat diambil langsung dari SCF. </w:t>
+        <w:t xml:space="preserve">Tuliskan persamaan free cash flow dan jelaskan mengapa FCF tidak bisa dibaca langsung dari SCF. </w:t>
       </w:r>
       <w:r>
         <w:rPr>
@@ -3499,7 +3481,7 @@
           <w:i/>
           <w:sz w:val="24"/>
         </w:rPr>
-        <w:t>(Jawaban: FCF = NOPLAT − investasi pada modal terinvestasi operasi; karena CFO mengandung beban bunga pendanaan dan tidak memperlakukan kenaikan kas operasi sebagai investasi, sehingga perlu penyesuaian — tambah bunga setelah pajak, kurangi kenaikan kas operasi, tambahkan CFI.)</w:t>
+        <w:t>Jawaban: FCF sama dengan NOPLAT dikurangi investasi pada modal terinvestasi operasi. Ia tidak dapat ditarik langsung karena CFO masih mengandung beban bunga pendanaan dan tidak memperlakukan kenaikan kas operasi sebagai investasi, sehingga perlu disesuaikan dengan menambah bunga setelah pajak, mengurangi kenaikan kas operasi, lalu menambahkan CFI.</w:t>
       </w:r>
     </w:p>
     <w:p>
@@ -3524,7 +3506,7 @@
           <w:i w:val="0"/>
           <w:sz w:val="24"/>
         </w:rPr>
-        <w:t xml:space="preserve">Dengan kasus WorldCom, jelaskan mengapa SCF harus dibaca secara utuh dan bukan hanya pada arus kas operasi. </w:t>
+        <w:t xml:space="preserve">Berkaca pada WorldCom, mengapa SCF harus dibaca secara utuh dan tidak berhenti pada arus kas operasi? </w:t>
       </w:r>
       <w:r>
         <w:rPr>
@@ -3533,7 +3515,7 @@
           <w:i/>
           <w:sz w:val="24"/>
         </w:rPr>
-        <w:t>(Jawaban: WorldCom mengapitalisasi beban operasi sehingga CFO membengkak dan laba bersih terlihat kredibel; namun selisih CFO − CFI yang terus negatif mengungkap "lubang" kumulatif $12 miliar hingga 31 Desember 2001 — sinyal yang hanya terlihat bila ketiga bagian dibaca bersama.)</w:t>
+        <w:t>Jawaban: WorldCom mengapitalisasi beban operasi sehingga CFO membengkak dan laba bersih tampak kredibel. Selisih CFO dikurangi CFI yang terus negatif justru menyingkap defisit kumulatif $12 miliar hingga 31 Desember 2001, sinyal yang hanya terbaca bila ketiga bagian SCF dibaca bersama.</w:t>
       </w:r>
     </w:p>
     <w:p>
@@ -3558,7 +3540,7 @@
           <w:i w:val="0"/>
           <w:sz w:val="24"/>
         </w:rPr>
-        <w:t xml:space="preserve">Mengapa klasifikasi bunga dan dividen di SCF mencerminkan ketegangan antara </w:t>
+        <w:t xml:space="preserve">Mengapa klasifikasi bunga dan dividen mencerminkan ketegangan antara proprietary theory dan entity theory, dan bagaimana IAS 7 menyikapinya? </w:t>
       </w:r>
       <w:r>
         <w:rPr>
@@ -3567,43 +3549,7 @@
           <w:i/>
           <w:sz w:val="24"/>
         </w:rPr>
-        <w:t>proprietary theory</w:t>
-      </w:r>
-      <w:r>
-        <w:rPr>
-          <w:rFonts w:ascii="Calibri" w:hAnsi="Calibri" w:cs="Calibri"/>
-          <w:b w:val="0"/>
-          <w:i w:val="0"/>
-          <w:sz w:val="24"/>
-        </w:rPr>
-        <w:t xml:space="preserve"> dan </w:t>
-      </w:r>
-      <w:r>
-        <w:rPr>
-          <w:rFonts w:ascii="Calibri" w:hAnsi="Calibri" w:cs="Calibri"/>
-          <w:b w:val="0"/>
-          <w:i/>
-          <w:sz w:val="24"/>
-        </w:rPr>
-        <w:t>entity theory</w:t>
-      </w:r>
-      <w:r>
-        <w:rPr>
-          <w:rFonts w:ascii="Calibri" w:hAnsi="Calibri" w:cs="Calibri"/>
-          <w:b w:val="0"/>
-          <w:i w:val="0"/>
-          <w:sz w:val="24"/>
-        </w:rPr>
-        <w:t xml:space="preserve">, dan bagaimana IAS 7 menyikapinya? </w:t>
-      </w:r>
-      <w:r>
-        <w:rPr>
-          <w:rFonts w:ascii="Calibri" w:hAnsi="Calibri" w:cs="Calibri"/>
-          <w:b w:val="0"/>
-          <w:i/>
-          <w:sz w:val="24"/>
-        </w:rPr>
-        <w:t>(Jawaban: SFAS No. 95 berorientasi proprietary sehingga bunga/dividen masuk operasi, sedangkan entity theory menggolongkannya investasi/pendanaan; IAS 7 fleksibel — boleh operasi/investasi/pendanaan asalkan konsisten antarperiode.)</w:t>
+        <w:t>Jawaban: SFAS No. 95 berorientasi proprietary sehingga bunga dan dividen masuk ke operasi, sedangkan entity theory menggolongkannya sebagai investasi atau pendanaan. IAS 7 mengambil sikap lentur dengan membolehkan klasifikasi operasi, investasi, atau pendanaan, asalkan diterapkan konsisten antarperiode.</w:t>
       </w:r>
     </w:p>
     <w:p>

</xml_diff>

<commit_message>
style(rmk10): recast Bagian A–E in casual study-notes voice; rebuild docx
Plain conversational Indonesian for self-study readability while keeping
graduate depth. All figures, names, citations, exhibit/diagram placements,
and Cornell structure unchanged.

Co-Authored-By: Claude Opus 4.8 (1M context) <noreply@anthropic.com>
</commit_message>
<xml_diff>
--- a/rmk-pkk-pert10-statement-of-cash-flows/output/01079_Dzaki Muhammad Yusfian_RMK Pert. 10.docx
+++ b/rmk-pkk-pert10-statement-of-cash-flows/output/01079_Dzaki Muhammad Yusfian_RMK Pert. 10.docx
@@ -183,7 +183,7 @@
                 <w:i w:val="0"/>
                 <w:sz w:val="22"/>
               </w:rPr>
-              <w:t>Mengapa bab ini dibuka dengan "cash is cash is cash"?</w:t>
+              <w:t>Kenapa bab ini buka dengan "cash is cash is cash"?</w:t>
             </w:r>
           </w:p>
         </w:tc>
@@ -204,7 +204,7 @@
                 <w:i w:val="0"/>
                 <w:sz w:val="22"/>
               </w:rPr>
-              <w:t xml:space="preserve">Wolk membuka pembahasan dengan anekdot dari musikal </w:t>
+              <w:t xml:space="preserve">Wolk mulai dengan cerita dari musikal </w:t>
             </w:r>
             <w:r>
               <w:rPr>
@@ -222,7 +222,7 @@
                 <w:i w:val="0"/>
                 <w:sz w:val="22"/>
               </w:rPr>
-              <w:t xml:space="preserve">, ketika para penjaja barang berseru menuntut pembayaran tunai atas dagangan mereka. Maksudnya satu: tagihan, investasi, utang, dan dividen pada akhirnya dilunasi dengan kas, bukan dengan laba. Perusahaan yang tidak mampu menghasilkan kas yang memadai dari operasinya cepat atau lambat akan punah, dan justru di situlah letak daya tarik pelaporan berbasis kas — angkanya lugas dan tidak menyisakan ruang tafsir sebanyak laba akrual. Premis normatif inilah yang menjadikan </w:t>
+              <w:t xml:space="preserve">, waktu para pedagang teriak minta dibayar tunai untuk barang dagangan mereka. Pesannya simpel: pada akhirnya semua tagihan, investasi, utang, dan dividen dibayar pakai kas, bukan pakai laba. Perusahaan yang nggak bisa menghasilkan kas yang cukup dari operasinya, lama-lama bakal mati. Nah, di situlah daya tarik laporan berbasis kas: angkanya apa adanya, nggak banyak bisa ditafsir macam-macam seperti laba akrual. Inilah alasan dasar kenapa </w:t>
             </w:r>
             <w:r>
               <w:rPr>
@@ -240,7 +240,7 @@
                 <w:i w:val="0"/>
                 <w:sz w:val="22"/>
               </w:rPr>
-              <w:t xml:space="preserve"> (SCF, laporan arus kas) sebagai pelengkap wajib bagi laporan keuangan berbasis akrual (Wolk et al., 2017).</w:t>
+              <w:t xml:space="preserve"> (SCF, laporan arus kas) jadi pelengkap wajib di samping laporan keuangan berbasis akrual (Wolk et al., 2017).</w:t>
             </w:r>
           </w:p>
         </w:tc>
@@ -263,7 +263,7 @@
                 <w:i w:val="0"/>
                 <w:sz w:val="22"/>
               </w:rPr>
-              <w:t>Bagaimana alur bab dan dua masalah strukturalnya?</w:t>
+              <w:t>Gimana alur bab ini, dan dua masalah utamanya apa?</w:t>
             </w:r>
           </w:p>
         </w:tc>
@@ -284,7 +284,7 @@
                 <w:i w:val="0"/>
                 <w:sz w:val="22"/>
               </w:rPr>
-              <w:t xml:space="preserve">Bab ini menelusuri pendahulu SCF, yaitu </w:t>
+              <w:t xml:space="preserve">Bab ini pertama-tama ngomongin pendahulu SCF, yaitu </w:t>
             </w:r>
             <w:r>
               <w:rPr>
@@ -302,7 +302,7 @@
                 <w:i w:val="0"/>
                 <w:sz w:val="22"/>
               </w:rPr>
-              <w:t xml:space="preserve"> (SCFP, laporan perubahan posisi keuangan), sebelum masuk ke motivasi dan struktur SCF itu sendiri. Sepanjang jalan Wolk tidak menyembunyikan dua kelemahan bawaan SCF: ketakterartikulasian (</w:t>
+              <w:t xml:space="preserve"> (SCFP, laporan perubahan posisi keuangan), baru masuk ke kenapa dan bagaimana SCF disusun. Sepanjang jalan, Wolk jujur soal dua kelemahan bawaan SCF: pertama ketakterartikulasian (</w:t>
             </w:r>
             <w:r>
               <w:rPr>
@@ -320,7 +320,7 @@
                 <w:i w:val="0"/>
                 <w:sz w:val="22"/>
               </w:rPr>
-              <w:t xml:space="preserve">) yang lahir dari metode tidak langsung pada bagian operasi, dan inkonsistensi klasifikasi dalam trikotomi tiga arah FASB. Keduanya bermuara pada satu nasihat praktis, bahwa SCF harus dibaca secara utuh dan bukan sepotong demi sepotong. Bagian akhir bab memperkenalkan </w:t>
+              <w:t xml:space="preserve">) yang muncul gara-gara metode tidak langsung di bagian operasi, dan kedua masalah klasifikasi dalam pembagian tiga arah ala FASB. Dua-duanya bermuara ke satu nasihat praktis: SCF harus dibaca utuh, jangan cuma sepotong. Di bagian akhir, bab ini ngenalin </w:t>
             </w:r>
             <w:r>
               <w:rPr>
@@ -338,7 +338,7 @@
                 <w:i w:val="0"/>
                 <w:sz w:val="22"/>
               </w:rPr>
-              <w:t xml:space="preserve"> (FCF, arus kas bebas), sebuah ukuran non-GAAP yang justru berkembang karena kelemahan SCF, lalu ditutup dengan tinjauan riset dan usulan perbaikan (Wolk et al., 2017).</w:t>
+              <w:t xml:space="preserve"> (FCF, arus kas bebas), ukuran non-GAAP yang justru lahir karena SCF punya kelemahan tadi, lalu ditutup dengan ulasan riset dan usulan perbaikan (Wolk et al., 2017).</w:t>
             </w:r>
           </w:p>
         </w:tc>
@@ -382,7 +382,7 @@
                 <w:i w:val="0"/>
                 <w:sz w:val="22"/>
               </w:rPr>
-              <w:t>Arti penting SCF baru tampak jelas bila kita memahami pendahulunya. SCFP adalah penerus laporan arus dana (</w:t>
+              <w:t>Biar paham kenapa SCF penting, kita perlu lihat dulu pendahulunya. SCFP itu kelanjutan dari laporan arus dana (</w:t>
             </w:r>
             <w:r>
               <w:rPr>
@@ -400,7 +400,7 @@
                 <w:i w:val="0"/>
                 <w:sz w:val="22"/>
               </w:rPr>
-              <w:t>), yang mendefinisikan akun-akun modal kerja sebagai saldo dana dan bertujuan menunjukkan bagaimana saldo itu bertambah dari laba dan sumber lain serta berkurang dari rugi dan penggunaan lain. APB Opinion No. 19 menetapkan tiga tujuan pelaporannya: melengkapi pengungkapan perubahan posisi keuangan, meringkas aktivitas pendanaan dan investasi, dan melaporkan arus dana dari operasi. Karena seluruh angkanya bertumpu pada elemen yang sudah diukur di laporan laba rugi dan neraca, SCFP tergolong laporan keuangan turunan. Pengakuannya pun berlangsung bertahap: APB Opinion No. 3 (1963) baru merekomendasikan pencantumannya dalam laporan tahunan, SEC mewajibkannya untuk pengajuan statutori pada 1971, dan pada tahun yang sama APB merespons dengan menerbitkan Opinion No. 19 yang mewajibkannya secara penuh (Wolk et al., 2017).</w:t>
+              <w:t>), yang menganggap akun-akun modal kerja sebagai "saldo dana", dan tujuannya nunjukin gimana saldo itu naik karena laba dan turun karena rugi atau penggunaan lain. APB Opinion No. 19 nyebut tiga tujuan laporan ini: melengkapi pengungkapan perubahan posisi keuangan, meringkas aktivitas pendanaan dan investasi, dan melaporkan arus dana dari operasi. Karena semua angkanya cuma "mendaur ulang" data yang sudah ada di laporan laba rugi dan neraca, SCFP disebut laporan turunan. Pengakuannya nggak langsung jadi: APB Opinion No. 3 (1963) baru sebatas menyarankan, SEC mewajibkannya untuk pelaporan resmi pada 1971, dan di tahun yang sama APB merespons dengan Opinion No. 19 yang mewajibkannya penuh (Wolk et al., 2017).</w:t>
             </w:r>
           </w:p>
         </w:tc>
@@ -423,7 +423,7 @@
                 <w:i w:val="0"/>
                 <w:sz w:val="22"/>
               </w:rPr>
-              <w:t>Bagaimana logika sources/uses dan empat definisi dana?</w:t>
+              <w:t>Gimana logika sources/uses dan empat pilihan definisi dana?</w:t>
             </w:r>
           </w:p>
         </w:tc>
@@ -444,7 +444,7 @@
                 <w:i w:val="0"/>
                 <w:sz w:val="22"/>
               </w:rPr>
-              <w:t>SCFP terdiri atas dua sisi yang saling menyeimbangkan: sumber sumber daya (</w:t>
+              <w:t>SCFP punya dua sisi yang saling mengimbangi. Ada sumber sumber daya (</w:t>
             </w:r>
             <w:r>
               <w:rPr>
@@ -462,7 +462,7 @@
                 <w:i w:val="0"/>
                 <w:sz w:val="22"/>
               </w:rPr>
-              <w:t>), yang timbul dari kenaikan ekuitas dan penurunan aset, dan penggunaan sumber daya (</w:t>
+              <w:t>), yang datang dari naiknya ekuitas dan turunnya aset, dan ada penggunaan sumber daya (</w:t>
             </w:r>
             <w:r>
               <w:rPr>
@@ -480,7 +480,7 @@
                 <w:i w:val="0"/>
                 <w:sz w:val="22"/>
               </w:rPr>
-              <w:t>), yang timbul dari penurunan ekuitas dan kenaikan aset. Seluruhnya bermuara pada persamaan dasar 13.1, bahwa kredit transaksi sama dengan debit transaksi. Kenaikan ekuitas merepresentasikan pendanaan, baik eksternal seperti utang dan penerbitan saham maupun internal seperti laba bersih dan hasil pelepasan aset, sedangkan penurunannya mencerminkan penebusan utang, pembelian saham treasuri, pembayaran dividen, atau rugi. Ketika transaksi yang tidak menyentuh saldo dana ikut dicantumkan — misalnya konversi utang menjadi saham biasa atau penerbitan saham untuk menukar aset nonmoneter — SCFP berubah menjadi ikhtisar menyeluruh yang dikenal sebagai pendekatan mencakup-semua (</w:t>
+              <w:t>), yang datang dari turunnya ekuitas dan naiknya aset. Semuanya ujungnya ke satu persamaan dasar 13.1: kredit transaksi = debit transaksi. Naiknya ekuitas itu artinya ada pendanaan, entah dari luar (utang, jual saham) atau dari dalam (laba, jual aset), sementara turunnya ekuitas berarti bayar utang, beli saham treasuri, bagi dividen, atau rugi. Kalau transaksi yang nggak nyentuh kas ikut dimasukin — misalnya utang yang diubah jadi saham, atau saham yang dipakai nuker aset nonkas — SCFP berubah jadi ringkasan menyeluruh yang disebut pendekatan mencakup-semua (</w:t>
             </w:r>
             <w:r>
               <w:rPr>
@@ -498,25 +498,7 @@
                 <w:i w:val="0"/>
                 <w:sz w:val="22"/>
               </w:rPr>
-              <w:t xml:space="preserve"> atau </w:t>
-            </w:r>
-            <w:r>
-              <w:rPr>
-                <w:rFonts w:ascii="Calibri" w:hAnsi="Calibri" w:cs="Calibri"/>
-                <w:b w:val="0"/>
-                <w:i/>
-                <w:sz w:val="22"/>
-              </w:rPr>
-              <w:t>all-resources</w:t>
-            </w:r>
-            <w:r>
-              <w:rPr>
-                <w:rFonts w:ascii="Calibri" w:hAnsi="Calibri" w:cs="Calibri"/>
-                <w:b w:val="0"/>
-                <w:i w:val="0"/>
-                <w:sz w:val="22"/>
-              </w:rPr>
-              <w:t>). Opinion No. 19 sebenarnya membuka empat pilihan definisi dana, mulai dari kas, kas plus near cash, quick assets, hingga modal kerja. Karena definisi modal kerja paling murah disusun dan paling membatasi transaksi nondana, mayoritas perusahaan akhirnya memilihnya (Wolk et al., 2017; lihat Exhibit 13.1).</w:t>
+              <w:t>). Sebenarnya Opinion No. 19 ngasih empat pilihan arti "dana": kas, kas plus near cash, quick assets, atau modal kerja. Tapi karena definisi modal kerja paling murah dibuat dan paling sedikit ribet, kebanyakan perusahaan milih itu (Wolk et al., 2017; lihat Exhibit 13.1).</w:t>
             </w:r>
           </w:p>
         </w:tc>
@@ -700,7 +682,7 @@
                 <w:i w:val="0"/>
                 <w:sz w:val="22"/>
               </w:rPr>
-              <w:t>Mengapa pada akhirnya dana didefinisikan sebagai kas?</w:t>
+              <w:t>Kenapa akhirnya "dana" diartikan sebagai kas?</w:t>
             </w:r>
           </w:p>
         </w:tc>
@@ -721,7 +703,7 @@
                 <w:i w:val="0"/>
                 <w:sz w:val="22"/>
               </w:rPr>
-              <w:t>Selama deliberasi yang mengantar lahirnya SCF, FASB sampai pada kesimpulan bahwa dana sebaiknya berarti kas dan bukan modal kerja bersih. Alasannya, modal kerja bersih ternyata ukuran likuiditas yang lemah. Ia memuat beban dan kredit yang ditangguhkan, padahal pos-pos itu tidak berkonsekuensi kas; konversi aset lancarnya menjadi kas bisa memakan waktu setahun atau lebih bagi perusahaan dengan siklus operasi panjang; dan komponen seperti persediaan dicatat berbasis biaya sehingga tidak menggambarkan potensi kas yang sebenarnya. Di tengah keruwetan itu, pelaporan kas menawarkan kejernihan yang tidak dimiliki modal kerja (Wolk et al., 2017).</w:t>
+              <w:t>Pas FASB lagi godok SCF, mereka sepakat bahwa "dana" mendingan diartikan kas, bukan modal kerja bersih. Soalnya modal kerja bersih itu ukuran likuiditas yang payah. Ada tiga alasannya kalau dipikir-pikir: di dalamnya ada beban dan kredit tangguhan yang sebenarnya nggak ada urusannya sama kas; buat perusahaan dengan siklus operasi panjang, ngubah aset lancar jadi kas bisa makan waktu setahun lebih; dan pos seperti persediaan dicatat pakai biaya, jadi nggak nunjukin berapa kas yang bisa dihasilkan. Di tengah kerumitan kayak gini, lapor pakai kas jelas lebih gampang dipahami (Wolk et al., 2017).</w:t>
             </w:r>
           </w:p>
         </w:tc>
@@ -744,7 +726,7 @@
                 <w:i w:val="0"/>
                 <w:sz w:val="22"/>
               </w:rPr>
-              <w:t>Bagaimana SFAS No. 95 menggantikan SCFP, dan apa kaitannya dengan SFAC No. 1 dan No. 5?</w:t>
+              <w:t>Gimana SFAS No. 95 menggantikan SCFP, dan apa hubungannya dengan SFAC No. 1 dan No. 5?</w:t>
             </w:r>
           </w:p>
         </w:tc>
@@ -765,7 +747,7 @@
                 <w:i w:val="0"/>
                 <w:sz w:val="22"/>
               </w:rPr>
-              <w:t>Pada 1987 FASB mewajibkan SCF melalui SFAS No. 95, yang sekaligus menggantikan SCFP. Landasannya sudah disiapkan kerangka konseptual. SFAC No. 1 menyebut tiga tujuan pelaporan keuangan; tujuan pertama bersifat luas, yaitu menyediakan informasi yang berguna bagi keputusan investasi dan kredit, sementara dua tujuan berikutnya — informasi tentang sumber daya neto perusahaan beserta perubahannya, dan informasi untuk menilai arus kas masa depan — adalah cara konkret memenuhi tujuan pertama. Dua tujuan terakhir itulah yang memotivasi adopsi SCF pada dekade 1980-an. SFAC No. 5 kemudian mempertegas bahwa SCF mengungkap bagaimana entitas menghasilkan kas dari operasi untuk melunasi utang, membagi dividen, atau berinvestasi kembali, di samping aktivitas pendanaan dan investasinya, sehingga berguna untuk menilai likuiditas, fleksibilitas keuangan, profitabilitas, dan risiko (Wolk et al., 2017).</w:t>
+              <w:t>Tahun 1987 FASB mewajibkan SCF lewat SFAS No. 95, sekaligus "memensiunkan" SCFP. Dasarnya sudah disiapkan kerangka konseptual. SFAC No. 1 nyebut tiga tujuan pelaporan keuangan: tujuan pertama luas (ngasih info yang berguna buat keputusan investasi dan kredit), sedangkan dua tujuan lain — info soal sumber daya bersih perusahaan beserta perubahannya, dan info buat menilai arus kas masa depan — sebenarnya cara konkret mewujudkan tujuan pertama. Dua tujuan terakhir inilah yang bikin SCF diadopsi di era 1980-an. SFAC No. 5 mempertegas: SCF nunjukin gimana perusahaan menghasilkan kas dari operasi buat bayar utang, bagi dividen, atau investasi lagi, plus aktivitas pendanaan dan investasinya. Gunanya buat menilai likuiditas, fleksibilitas keuangan, profitabilitas, dan risiko (Wolk et al., 2017).</w:t>
             </w:r>
           </w:p>
         </w:tc>
@@ -809,7 +791,7 @@
                 <w:i w:val="0"/>
                 <w:sz w:val="22"/>
               </w:rPr>
-              <w:t>Sebuah discussion memorandum FASB mengajukan enam alasan mengapa data arus kas merupakan pengungkapan pelengkap yang berharga: ia memberi umpan balik atas arus kas aktual, membantu mengaitkan laba akuntansi dengan arus kas, mengungkap kualitas laba, memperbaiki keterbandingan informasi, membantu menilai fleksibilitas dan likuiditas, serta membantu memprediksi arus kas masa depan. Benang merah keenamnya sama, yakni keterbatasan akuntansi akrual; karena itu data arus kas tidak menggantikan, melainkan melengkapi, data akrual di laporan laba rugi dan neraca (Wolk et al., 2017).</w:t>
+              <w:t>Sebuah discussion memorandum FASB ngasih enam alasan kenapa data arus kas itu pelengkap yang berharga: ngasih umpan balik soal arus kas yang sebenarnya, bantu ngaitin laba akuntansi dengan arus kas, nunjukin kualitas laba, bikin info lebih bisa dibandingkan, bantu menilai fleksibilitas dan likuiditas, dan bantu memprediksi arus kas ke depan. Benang merahnya satu: semuanya soal keterbatasan akuntansi akrual. Jadi data arus kas bukan buat ngegantiin data akrual, tapi buat ngelengkapinnya (Wolk et al., 2017).</w:t>
             </w:r>
           </w:p>
         </w:tc>
@@ -832,7 +814,7 @@
                 <w:i w:val="0"/>
                 <w:sz w:val="22"/>
               </w:rPr>
-              <w:t>Apa itu kualitas laba, dan bagaimana arus kas mengatasi masalah keseragaman?</w:t>
+              <w:t>Apa itu kualitas laba, dan gimana arus kas bantu masalah keseragaman?</w:t>
             </w:r>
           </w:p>
         </w:tc>
@@ -871,7 +853,7 @@
                 <w:i w:val="0"/>
                 <w:sz w:val="22"/>
               </w:rPr>
-              <w:t>) adalah istilah analis untuk menggambarkan kedekatan antara arus kas dan laba akuntansi: makin tinggi korelasinya, makin tinggi kualitas labanya. Konsep ini berangkat dari kenyataan bahwa laba sarat akrual dan penangguhan nonkas, sehingga tidak selalu menjadi penanda likuiditas yang baik. Persoalan keseragaman muncul dari sisi lain. Fleksibilitas memilih kebijakan akuntansi dapat mengikis keterbandingan antarperusahaan, sedangkan arus kas dari operasi tunduk pada lebih sedikit pilihan yang sewenang-wenang sehingga lebih seragam dan lebih mudah diperbandingkan. Inilah yang membuat SCF dianjurkan sebagai penawar kesewenang-wenangan pengukuran laba; ada kelangsungan dan kejernihan pada arus kas yang kontras dengan keabstrakan laba (Wolk et al., 2017).</w:t>
+              <w:t>) itu istilah analis buat ngegambarin seberapa dekat arus kas dengan laba akuntansi: makin nyambung keduanya, makin tinggi kualitas labanya. Idenya, laba itu penuh akrual dan penundaan yang nggak melibatkan kas, jadi nggak selalu jadi penanda likuiditas yang bagus. Ada juga sisi lain, yaitu soal keseragaman. Kebebasan milih kebijakan akuntansi bisa bikin perusahaan susah dibandingin satu sama lain, sedangkan arus kas operasi lebih sedikit pilihannya jadi lebih seragam dan gampang diadu. Itulah kenapa SCF dianggap obat buat kesewenang-wenangan dalam ngukur laba — arus kas itu jernih dan nyata, beda sama laba yang abstrak (Wolk et al., 2017).</w:t>
             </w:r>
           </w:p>
         </w:tc>
@@ -894,7 +876,7 @@
                 <w:i w:val="0"/>
                 <w:sz w:val="22"/>
               </w:rPr>
-              <w:t>Apa beda fleksibilitas keuangan dan likuiditas, dan mengapa neraca tak cukup?</w:t>
+              <w:t>Apa beda fleksibilitas keuangan dan likuiditas, dan kenapa neraca nggak cukup?</w:t>
             </w:r>
           </w:p>
         </w:tc>
@@ -933,7 +915,7 @@
                 <w:i w:val="0"/>
                 <w:sz w:val="22"/>
               </w:rPr>
-              <w:t>) adalah kemampuan perusahaan menyesuaikan diri terhadap keadaan dan peluang baru, sementara likuiditas (</w:t>
+              <w:t>) itu kemampuan perusahaan nyesuaiin diri sama keadaan dan peluang baru, sedangkan likuiditas (</w:t>
             </w:r>
             <w:r>
               <w:rPr>
@@ -951,7 +933,7 @@
                 <w:i w:val="0"/>
                 <w:sz w:val="22"/>
               </w:rPr>
-              <w:t>) adalah kemampuan mengubah aset menjadi kas dengan cepat tanpa menanggung kerugian. Kas yang dihasilkan sendiri dari operasi memberi petunjuk atas keduanya karena ia menjadi sumber internal untuk melunasi utang, mendanai investasi baru, dan membagikan distribusi kepada pemegang saham — persis alasan laporan arus dana dahulu diwajibkan. Memang neraca juga memuat informasi likuiditas, tetapi klasifikasi lancar dan taklancar adalah pemandu yang kasar. Sebagian pos lancar berupa beban tangguhan tanpa dampak kas, persediaan belum tentu cepat terkonversi, dan atribut pengukuran neraca umumnya bukan nilai realisasi neto sehingga kas yang akan dihasilkan suatu aset tidak dapat dipastikan. Akuntansi harga keluar (</w:t>
+              <w:t>) itu kemampuan ngubah aset jadi kas dengan cepat tanpa rugi. Kas hasil operasi sendiri ngasih petunjuk soal dua-duanya, soalnya kas itu yang dipakai buat bayar utang, danai investasi baru, dan bagi-bagi ke pemegang saham — persis alasan kenapa dulu laporan arus dana diwajibkan. Memang di neraca juga ada info likuiditas, tapi pembagian lancar dan taklancar itu pemandu yang kasar banget. Soalnya sebagian pos lancar cuma beban tangguhan tanpa efek kas, persediaan belum tentu cepat jadi kas, dan angka di neraca biasanya bukan nilai jual bersih jadi kita nggak tahu pasti berapa kas yang bakal dihasilkan suatu aset. Ada juga akuntansi harga keluar (</w:t>
             </w:r>
             <w:r>
               <w:rPr>
@@ -969,7 +951,7 @@
                 <w:i w:val="0"/>
                 <w:sz w:val="22"/>
               </w:rPr>
-              <w:t>) mencoba menakar fleksibilitas lewat kas dari likuidasi takterpaksa, namun tetap kasar karena yang menentukan likuiditas pada akhirnya adalah kecepatan konversi. Adapun apakah arus kas, arus dana, atau laba yang paling andal memprediksi arus kas masa depan masih menjadi persoalan terbuka (Wolk et al., 2017).</w:t>
+              <w:t>) yang coba ngukur fleksibilitas lewat kas kalau aset dilikuidasi tanpa paksaan, tapi tetap kasar karena yang nentuin likuiditas itu kecepatan ngubahnya jadi kas. Soal apakah arus kas, arus dana, atau laba yang paling jitu meramal arus kas masa depan, itu masih jadi pertanyaan terbuka (Wolk et al., 2017).</w:t>
             </w:r>
           </w:p>
         </w:tc>
@@ -1013,7 +995,7 @@
                 <w:i w:val="0"/>
                 <w:sz w:val="22"/>
               </w:rPr>
-              <w:t>Jika SCFP bekerja dengan kerangka biner sumber dan penggunaan yang mekanis, SCF menata penerimaan dan pengeluaran kas ke dalam tiga kategori yang lebih bermakna: aktivitas operasi, investasi, dan pendanaan. Pemilahan tiga arah ini memberi konsistensi klasifikasi sekaligus keterbandingan yang lebih baik ketimbang pendahulunya. Meski begitu, tiga dari tujuh anggota FASB menyatakan tidak setuju. Menurut mereka bunga dan dividen yang diterima berasal dari aktivitas investasi (paragraf 22), dan bunga yang dibayar merupakan unsur pendanaan dan bukan biaya operasi (paragraf 23), sebuah posisi yang justru sejalan dengan pemikiran ilmu keuangan kontemporer (Wolk et al., 2017).</w:t>
+              <w:t>Kalau SCFP cuma main di kerangka "sumber dan penggunaan" yang mekanis, SCF nyusun penerimaan dan pengeluaran kas ke tiga kelompok yang lebih bermakna: aktivitas operasi, investasi, dan pendanaan. Pembagian tiga arah ini bikin klasifikasinya lebih konsisten dan lebih gampang dibandingin daripada SCFP. Tapi nggak semua setuju: tiga dari tujuh anggota FASB menolak. Menurut mereka, bunga dan dividen yang diterima itu sebenarnya aktivitas investasi (paragraf 22), dan bunga yang dibayar itu pendanaan, bukan biaya operasi (paragraf 23) — pandangan yang malah lebih cocok sama cara berpikir ilmu keuangan zaman sekarang (Wolk et al., 2017).</w:t>
             </w:r>
           </w:p>
         </w:tc>
@@ -1127,7 +1109,7 @@
                 <w:i w:val="0"/>
                 <w:sz w:val="22"/>
               </w:rPr>
-              <w:t>Bagaimana kas, setara kas, dan transaksi nonkas diperlakukan?</w:t>
+              <w:t>Gimana kas, setara kas, dan transaksi nonkas diperlakukan?</w:t>
             </w:r>
           </w:p>
         </w:tc>
@@ -1148,7 +1130,7 @@
                 <w:i w:val="0"/>
                 <w:sz w:val="22"/>
               </w:rPr>
-              <w:t>SCF mendefinisikan kas sebagai uang tunai di tangan atau simpanan yang dapat ditarik sewaktu-waktu, ditambah setara kas (</w:t>
+              <w:t>Di SCF, kas itu uang tunai di tangan atau simpanan yang bisa diambil kapan aja, ditambah setara kas (</w:t>
             </w:r>
             <w:r>
               <w:rPr>
@@ -1166,7 +1148,7 @@
                 <w:i w:val="0"/>
                 <w:sz w:val="22"/>
               </w:rPr>
-              <w:t>), yaitu investasi jangka pendek yang sangat likuid dan dapat dikonversi menjadi sejumlah kas yang sudah diketahui. Sebagaimana APB Opinion No. 19, SFAS No. 95 mewajibkan setiap transaksi investasi dan pendanaan yang tidak melibatkan kas tetap dilaporkan sebagai pelengkap, entah dalam bentuk skedul maupun narasi. Inilah penerapan pendekatan mencakup-semua yang memastikan tidak ada debit atau kredit transaksi perusahaan yang luput dari penyajian (Wolk et al., 2017).</w:t>
+              <w:t>), yaitu investasi jangka pendek yang gampang banget dicairkan jadi sejumlah kas yang sudah ketahuan nilainya. Sama seperti APB Opinion No. 19, SFAS No. 95 minta setiap transaksi investasi dan pendanaan yang nggak pakai kas tetap dilaporkan sebagai pelengkap, entah lewat skedul atau ditulis dalam bentuk cerita. Ini penerapan pendekatan mencakup-semua tadi, biar nggak ada satu pun transaksi perusahaan yang kelewat dari laporan (Wolk et al., 2017).</w:t>
             </w:r>
           </w:p>
         </w:tc>
@@ -1210,7 +1192,7 @@
                 <w:i w:val="0"/>
                 <w:sz w:val="22"/>
               </w:rPr>
-              <w:t>SFAS No. 95 mengizinkan arus kas operasi disajikan dengan metode langsung (</w:t>
+              <w:t>SFAS No. 95 ngebolehin arus kas operasi disajikan pakai metode langsung (</w:t>
             </w:r>
             <w:r>
               <w:rPr>
@@ -1228,7 +1210,7 @@
                 <w:i w:val="0"/>
                 <w:sz w:val="22"/>
               </w:rPr>
-              <w:t>) atau metode tidak langsung (</w:t>
+              <w:t>) atau tidak langsung (</w:t>
             </w:r>
             <w:r>
               <w:rPr>
@@ -1246,7 +1228,7 @@
                 <w:i w:val="0"/>
                 <w:sz w:val="22"/>
               </w:rPr>
-              <w:t>). Metode langsung melaporkan arus kas literal yang sejajar dengan pos laporan laba rugi seperti pendapatan dan harga pokok penjualan; ia menyajikan lebih banyak informasi dan menjadi pilihan FASB. Metode tidak langsung, atau metode rekonsiliasi, bertolak dari laba akrual lalu menyesuaikannya untuk pos-pos nonkas. FASB mengakui metode langsung bisa lebih mahal karena tidak semua perusahaan menata catatannya untuk menghasilkan data yang dibutuhkan, dan dalam praktik kerap diperlukan angka penyeimbang agar SCF metode tidak langsung benar-benar seimbang. Bila metode langsung dipakai, perusahaan tetap harus melampirkan skedul yang merekonsiliasi arus kas operasi neto dengan laba bersih, sehingga metode tidak langsung praktis selalu hadir. Sebagian anggota FASB bahkan menilai izin atas metode tidak langsung menghambat pemahaman pengguna dan menurunkan mutu pelaporan (Wolk et al., 2017; lihat Exhibit 13.2 dan 13.3).</w:t>
+              <w:t>). Metode langsung ngelaporin arus kas apa adanya yang sejajar sama pos laporan laba rugi seperti pendapatan dan harga pokok; infonya lebih kaya dan ini yang disukai FASB. Metode tidak langsung (atau metode rekonsiliasi) mulai dari laba akrual, lalu disesuaikan buat pos-pos yang nggak melibatkan kas. FASB ngaku metode langsung bisa lebih mahal, soalnya nggak semua perusahaan punya catatan yang rapi buat ngehasilin datanya, dan dalam praktik sering butuh "angka penyeimbang" biar laporannya pas. Kalau pakai metode langsung pun, perusahaan tetap wajib lampirin skedul yang nyocokin arus kas operasi sama laba bersih — jadi metode tidak langsung praktis selalu nongol. Bahkan sebagian anggota FASB ngerasa bolehnya metode tidak langsung itu malah bikin pengguna susah paham dan nurunin mutu laporan (Wolk et al., 2017; lihat Exhibit 13.2 dan 13.3).</w:t>
             </w:r>
           </w:p>
         </w:tc>
@@ -1421,7 +1403,7 @@
                 <w:i w:val="0"/>
                 <w:sz w:val="22"/>
               </w:rPr>
-              <w:t>Mengapa praktik condong ke metode tidak langsung, dan apa temuan McEnroe?</w:t>
+              <w:t>Kenapa praktik lebih milih metode tidak langsung, dan apa temuan McEnroe?</w:t>
             </w:r>
           </w:p>
         </w:tc>
@@ -1442,7 +1424,7 @@
                 <w:i w:val="0"/>
                 <w:sz w:val="22"/>
               </w:rPr>
-              <w:t>Sebagian besar perusahaan Amerika memakai metode tidak langsung, dan pertimbangan biaya tampak menjadi alasan utama penyusun. Kedua metode sebenarnya menghasilkan angka arus kas operasi neto yang sama — pada Company M sebesar $1.365 — tetapi informasi yang ditampilkannya berbeda: yang satu memperlihatkan arus kas untuk penjualan dan harga pokok, yang lain memperlihatkan rekonsiliasi laba akrual ke padanan kasnya. Persoalannya selalu biaya berhadapan dengan manfaat informasi. Riset empiris yang terbatas justru menunjukkan pengguna eksternal lebih menyukai metode langsung; studi McEnroe atas 282 responden, mulai dari analis keuangan, penasihat investasi, profesor akuntansi, hingga akuntan, menemukan 56 persen memilih metode langsung berbanding 44 persen metode tidak langsung. Singkatnya, metode langsung mudah dibaca tetapi sulit disusun, dan metode tidak langsung berlaku sebaliknya (Wolk et al., 2017).</w:t>
+              <w:t>Kebanyakan perusahaan Amerika pakai metode tidak langsung, dan alasan utamanya kelihatannya soal biaya. Padahal dua metode ini ngehasilin angka arus kas operasi bersih yang sama persis — di Company M sama-sama $1.365 — yang beda cuma info yang ditampilkan: yang satu nunjukin arus kas buat penjualan dan harga pokok, yang lain nunjukin proses nyocokin laba akrual ke versi kasnya. Jadi ini soal biaya lawan manfaat info. Lucunya, riset (walau terbatas) malah nunjukin pengguna luar lebih suka metode langsung. Studi McEnroe ke 282 responden — ada analis keuangan, penasihat investasi, dosen akuntansi, sampai akuntan — nemu 56 persen milih metode langsung, 44 persen metode tidak langsung. Intinya: metode langsung gampang dibaca tapi susah dibuat, metode tidak langsung kebalikannya (Wolk et al., 2017).</w:t>
             </w:r>
           </w:p>
         </w:tc>
@@ -1486,7 +1468,7 @@
                 <w:i w:val="0"/>
                 <w:sz w:val="22"/>
               </w:rPr>
-              <w:t>Persoalan penting menyertai metode tidak langsung. Studi ekstensif Bahnson, Miller, dan Budge menunjukkan terjadinya nonartikulasi, yaitu keadaan ketika arus kas yang lahir dari perubahan akun modal kerja pada perusahaan terkonsolidasi tidak sama dengan penyesuaian modal kerja yang tercantum di bagian operasi SCF. Akibatnya SCF tampak tidak konsisten dengan neraca yang mendasarinya, dan ini membingungkan pengguna. Diskrepansi itu muncul pada 75 persen situasi dalam sampel mereka dan sama sekali tidak sepele. Exhibit 13.4 membandingkan perubahan akun neraca 3M untuk piutang usaha, persediaan, dan utang usaha dengan penyesuaian modal kerja di SCF; selisih pada piutang usaha bahkan mencapai sekitar 300 persen, dan pada beberapa kasus tandanya pun berbeda (Wolk et al., 2017; lihat Exhibit 13.4).</w:t>
+              <w:t>Ada satu masalah penting yang nempel di metode tidak langsung. Studi besar dari Bahnson, Miller, dan Budge nunjukin terjadinya nonartikulasi, yaitu pas arus kas yang muncul dari perubahan akun modal kerja perusahaan ternyata nggak sama dengan penyesuaian modal kerja yang ditulis di bagian operasi SCF. Akibatnya SCF kelihatan nggak nyambung sama neracanya sendiri, dan itu bikin pengguna bingung. Selisih kayak gini muncul di 75 persen kasus dalam sampel mereka, dan ukurannya nggak main-main. Di Exhibit 13.4, perubahan akun neraca 3M buat piutang usaha, persediaan, dan utang usaha diadu sama penyesuaian modal kerja di SCF; selisih di piutang usaha aja sampai sekitar 300 persen, bahkan ada kasus yang tandanya (plus/minus) malah kebalik (Wolk et al., 2017; lihat Exhibit 13.4).</w:t>
             </w:r>
           </w:p>
         </w:tc>
@@ -1612,7 +1594,7 @@
                 <w:i w:val="0"/>
                 <w:sz w:val="22"/>
               </w:rPr>
-              <w:t>Ada tiga sumber yang menjelaskan mengapa nonartikulasi terjadi. Yang pertama adalah akuisisi anak perusahaan di tengah tahun: saldo modal kerja awal perusahaan yang diakuisisi tidak masuk ke neraca konsolidasi awal, sehingga agar berartikulasi saldo yang hilang itu mesti ditambahkan ke saldo awal entitas terkonsolidasi. Yang kedua adalah transaksi akun modal kerja yang tidak menyentuh kas, dan ini bahkan menimpa perusahaan nonkonsolidasi — termasuk penilaian-naik atau penilaian-turun pos modal kerja saat akuisisi pembelian (biasanya persediaan), alokasi penyusutan ke persediaan yang diproduksi, serta reklasifikasi akun modal kerja antarkategori lancar dan taklancar. Yang ketiga adalah satu akun utang usaha yang dipakai bersama untuk membeli aset modal kerja sekaligus aset di luar modal kerja: pembelian persediaan secara kredit tergolong operasi, sedangkan pembelian peralatan secara kredit tergolong investasi, sehingga perubahan utang usaha di neraca tidak akan sama dengan penyesuaiannya di bagian operasi. Menariknya, pada 2008 FASB dan IASB menerbitkan discussion paper yang mengusulkan format baru; gagasan menggabungkan aktivitas operasi dan investasi ke dalam satu klasifikasi "business" dipandang berguna karena memperkecil peluang pengalihan klasifikasi di antara keduanya (Wolk et al., 2017).</w:t>
+              <w:t>Ada tiga hal yang bikin nonartikulasi kejadian. Pertama, akuisisi anak perusahaan di tengah tahun: saldo modal kerja awal perusahaan yang dibeli nggak masuk ke neraca konsolidasi awal, jadi biar nyambung saldo yang ketinggalan itu harus ditambahin ke saldo awal. Kedua, transaksi akun modal kerja yang nggak nyentuh kas — ini bahkan kejadian di perusahaan yang nggak konsolidasi — misalnya nilai persediaan dinaikin/diturunin pas akuisisi, penyusutan yang dialokasiin ke persediaan yang diproduksi, atau akun modal kerja yang dipindah-pindah antara kategori lancar dan taklancar. Ketiga, satu akun utang usaha dipakai bareng buat beli aset modal kerja sekaligus aset di luar modal kerja: beli persediaan secara kredit itu operasi, tapi beli peralatan secara kredit itu investasi, jadi perubahan utang usaha di neraca nggak bakal sama dengan penyesuaiannya di bagian operasi. Oh iya, pada 2008 FASB dan IASB ngeluarin discussion paper yang ngusulin format baru; gabungin aktivitas operasi dan investasi jadi satu kelompok "business" dianggap berguna karena ngurangin peluang mindahin klasifikasi antar keduanya (Wolk et al., 2017).</w:t>
             </w:r>
           </w:p>
         </w:tc>
@@ -1726,7 +1708,7 @@
                 <w:i w:val="0"/>
                 <w:sz w:val="22"/>
               </w:rPr>
-              <w:t>Apa keberatan Nurnberg atas klasifikasi SFAS No. 95?</w:t>
+              <w:t>Apa keberatan Nurnberg soal klasifikasi SFAS No. 95?</w:t>
             </w:r>
           </w:p>
         </w:tc>
@@ -1747,7 +1729,7 @@
                 <w:i w:val="0"/>
                 <w:sz w:val="22"/>
               </w:rPr>
-              <w:t>Di luar tiga suara dissent tadi, Nurnberg melontarkan pertanyaan mendasar tentang struktur SCF. Ia menyoroti bahwa SCF menggolongkan penerimaan bunga dan dividen sebagai arus masuk operasi dan pembayaran bunga sebagai arus keluar operasi, padahal menurut literatur keuangan yang pertama semestinya investasi dan yang kedua pendanaan. Dalam menyusun SFAS No. 95, FASB mengikuti format laporan laba rugi yang berorientasi teori kepemilikan (</w:t>
+              <w:t>Selain tiga suara penolak tadi, Nurnberg ngajuin pertanyaan mendasar soal struktur SCF. Dia nyorot bahwa SCF naro penerimaan bunga dan dividen sebagai arus masuk operasi, dan pembayaran bunga sebagai arus keluar operasi — padahal menurut ilmu keuangan, yang pertama harusnya investasi dan yang kedua pendanaan. Pas nyusun SFAS No. 95, FASB ngikutin format laporan laba rugi yang berorientasi teori kepemilikan (</w:t>
             </w:r>
             <w:r>
               <w:rPr>
@@ -1765,7 +1747,7 @@
                 <w:i w:val="0"/>
                 <w:sz w:val="22"/>
               </w:rPr>
-              <w:t>), yang memandang pendapatan dan beban bunga serta pendapatan dividen sebagai pos operasi. Pendekatan ini berlawanan dengan teori entitas (</w:t>
+              <w:t>), yang mandang pendapatan dan beban bunga serta pendapatan dividen sebagai pos operasi. Ini beda sama teori entitas (</w:t>
             </w:r>
             <w:r>
               <w:rPr>
@@ -1783,7 +1765,7 @@
                 <w:i w:val="0"/>
                 <w:sz w:val="22"/>
               </w:rPr>
-              <w:t>), yang menempatkan pendapatan bunga dan dividen sebagai investasi dan beban bunga sebagai pendanaan. Pertimbangan praktis ikut bermain: industri perbankan mendukung klasifikasi bunga sebagai pos operasi — yang memang masuk akal bagi bank — agar tidak melaporkan arus kas operasi negatif. Konsistensi dengan laporan laba rugi ditambah kepentingan perbankan inilah yang boleh jadi membentuk keputusan FASB (Wolk et al., 2017).</w:t>
+              <w:t>), yang naro pendapatan bunga dan dividen sebagai investasi, dan beban bunga sebagai pendanaan. Ada juga alasan praktis: industri perbankan dukung bunga dimasukin ke operasi — yang buat bank emang masuk akal — biar nggak kelihatan punya arus kas operasi negatif. Konsistensi sama laporan laba rugi plus kepentingan bank inilah yang mungkin ngebentuk keputusan FASB (Wolk et al., 2017).</w:t>
             </w:r>
           </w:p>
         </w:tc>
@@ -1806,7 +1788,7 @@
                 <w:i w:val="0"/>
                 <w:sz w:val="22"/>
               </w:rPr>
-              <w:t>Bagaimana sikap IAS 7 atas bunga dan dividen?</w:t>
+              <w:t>Gimana sikap IAS 7 soal bunga dan dividen?</w:t>
             </w:r>
           </w:p>
         </w:tc>
@@ -1827,7 +1809,7 @@
                 <w:i w:val="0"/>
                 <w:sz w:val="22"/>
               </w:rPr>
-              <w:t>IAS 7 mengambil posisi yang lebih lentur. Bunga dan dividen, baik yang diterima maupun dibayar, boleh diklasifikasikan sebagai arus kas operasi, investasi, atau pendanaan, asalkan diperlakukan secara konsisten dari periode ke periode. Sikap ini bertabrakan dengan orientasi proprietary SFAS No. 95 sekaligus dengan pendekatan entity theory yang dianjurkan bab ini dan Bab 12. Bagi bank, memandang bunga dan dividen sebagai arus kas operasi tetap wajar; seandainya IAS 7 mengizinkan klasifikasi semacam itu khusus bagi bank, IASB justru akan memperoleh keseragaman dalam industri tersebut (Wolk et al., 2017).</w:t>
+              <w:t>IAS 7 ambil posisi yang lebih santai. Bunga dan dividen, baik yang diterima maupun dibayar, boleh dimasukin ke operasi, investasi, atau pendanaan, asalkan diperlakukan konsisten dari tahun ke tahun. Sikap ini bentrok sama orientasi proprietary-nya SFAS No. 95, sekaligus sama pendekatan entity theory yang dianjurin bab ini dan Bab 12. Buat bank, mandang bunga dan dividen sebagai arus kas operasi tetap wajar; jadi kalau IAS 7 ngebolehin klasifikasi itu khusus buat bank, IASB justru bakal dapet keseragaman di industri perbankan (Wolk et al., 2017).</w:t>
             </w:r>
           </w:p>
         </w:tc>
@@ -1850,7 +1832,7 @@
                 <w:i w:val="0"/>
                 <w:sz w:val="22"/>
               </w:rPr>
-              <w:t>Bagaimana premium dan diskonto obligasi diperlakukan menurut Vent, Cowling, dan Sevalstad?</w:t>
+              <w:t>Gimana premium dan diskonto obligasi diperlakukan menurut Vent, Cowling, dan Sevalstad?</w:t>
             </w:r>
           </w:p>
         </w:tc>
@@ -1871,7 +1853,7 @@
                 <w:i w:val="0"/>
                 <w:sz w:val="22"/>
               </w:rPr>
-              <w:t>Pemisahan antara pendapatan bunga di operasi, pembelian saham perusahaan lain di investasi, dan peminjaman atau pelunasan pokok di pendanaan memunculkan persoalan turunan: ke mana premium atau diskonto obligasi digolongkan, mengingat ia penyesuaian bunga sekaligus bagian dari pokok yang dipinjam. Vent, Cowling, dan Sevalstad menemukan empat cara berbeda dalam laporan tahunan yang terbit. Ilustrasinya, sebuah perusahaan menerbitkan obligasi kupon 8 persen berjangka empat tahun dengan nilai nominal $10.000 yang laku $11.000 pada 31 Desember 2000, sehingga ada premium $1.000; dengan amortisasi garis lurus, beban bunga tahunannya $550, yaitu kupon $800 dikurangi amortisasi premium $250. Metode pertama paling mudah diikuti dan cocok dengan metode langsung, meski jumlah arus operasinya tidak sama dengan beban bunga akrual karena premium $1.000 masuk ke arus pendanaan tahun 2000. Metode kedua dan ketiga memindahkan premium dari arus investasi ke kategori operasi, masing-masing pada tahun pembayaran 2004 dan tahun penerbitan 2000, sedangkan metode keempat menyebar premium sepanjang umur obligasi. Wolk lebih memilih metode pertama meski ada ketaksamaan antara nilai akrual dan kas, dan menilai metode keempat paling tidak masuk akal karena memecah arus kas tahunan $800 menjadi dua segmen sehingga keliru menggambarkan arus kas riil. Sekali lagi, ini contoh persoalan alokasi (Wolk et al., 2017; lihat Exhibit 13.5).</w:t>
+              <w:t>Misahin pendapatan bunga (operasi), beli saham perusahaan lain (investasi), dan pinjam atau lunasin pokok (pendanaan) bikin muncul pertanyaan lanjutan: premium atau diskonto obligasi masuk ke mana? Soalnya dia itu penyesuaian bunga, tapi sekaligus bagian dari pokok yang dipinjam. Vent, Cowling, dan Sevalstad nemu empat cara berbeda di laporan tahunan yang beneran terbit. Contohnya gini: perusahaan nerbitin obligasi kupon 8 persen, jangka empat tahun, nilai nominal $10.000, laku $11.000 pada 31 Desember 2000 — jadi ada premium $1.000. Dengan amortisasi garis lurus, beban bunga setahun jadi $550, yaitu kupon $800 dikurangi amortisasi premium $250. Cara pertama paling gampang diikutin dan cocok buat metode langsung, walau jumlah arus operasinya beda dari beban bunga akrual karena premium $1.000 masuk ke arus pendanaan tahun 2000. Cara kedua dan ketiga mindahin premium dari arus investasi ke operasi (cara kedua di tahun bayar 2004, cara ketiga di tahun terbit 2000). Cara keempat nyebar premium sepanjang umur obligasi. Wolk lebih milih cara pertama walau ada selisih antara nilai akrual dan kas, dan dia anggap cara keempat paling nggak masuk akal karena mecah arus kas tahunan $800 jadi dua bagian, jadinya malah salah ngegambarin arus kas yang sebenarnya. Ini contoh lain dari masalah alokasi (Wolk et al., 2017; lihat Exhibit 13.5).</w:t>
             </w:r>
           </w:p>
         </w:tc>
@@ -1976,7 +1958,7 @@
                 <w:i w:val="0"/>
                 <w:sz w:val="22"/>
               </w:rPr>
-              <w:t>Bagaimana bunga dikapitalisasi (SFAS No. 34) dan sewa menimbulkan dilema serupa?</w:t>
+              <w:t>Gimana bunga dikapitalisasi (SFAS No. 34) dan sewa bikin dilema serupa?</w:t>
             </w:r>
           </w:p>
         </w:tc>
@@ -1997,7 +1979,7 @@
                 <w:i w:val="0"/>
                 <w:sz w:val="22"/>
               </w:rPr>
-              <w:t>Munter mengangkat persoalan yang sebangun. Ketika pembayaran bunga dikapitalisasi sesuai SFAS No. 34, bunga itu keluar dari aktivitas operasi dan masuk ke investasi sebagai bagian biaya perolehan aset tetap. Pertanyaannya kemudian, apakah suatu kejadian digolongkan menurut sifat dasar penerimaan atau pengeluarannya, ataukah menurut tujuan akhirnya. Dilema yang sama muncul pada sewa: pada sewa operasi seluruh pengeluaran kas tergolong arus keluar operasi, sedangkan pada sewa pembiayaan porsi bunga tergolong operasi dan porsi pengurangan pokok tergolong pendanaan. Mana di antara sifat dasar dan tujuan akhir yang seharusnya menentukan tetap belum terjawab (Wolk et al., 2017).</w:t>
+              <w:t>Munter ngangkat masalah yang mirip. Pas pembayaran bunga dikapitalisasi sesuai SFAS No. 34, bunga itu keluar dari aktivitas operasi dan masuk ke investasi, jadi bagian dari biaya beli aset tetap. Nah, pertanyaannya: suatu kejadian itu digolongin berdasarkan sifat dasarnya (ini kan pembayaran bunga) atau berdasarkan tujuan akhirnya (buat dapetin aset)? Dilema yang sama muncul di sewa: pada sewa operasi semua pengeluaran kas masuk arus keluar operasi, sedangkan pada sewa pembiayaan porsi bunganya operasi tapi porsi pelunasan pokoknya pendanaan. Mana yang harusnya nentuin — sifat dasar atau tujuan akhir — sampai sekarang belum ada jawaban pastinya (Wolk et al., 2017).</w:t>
             </w:r>
           </w:p>
         </w:tc>
@@ -2020,7 +2002,7 @@
                 <w:i w:val="0"/>
                 <w:sz w:val="22"/>
               </w:rPr>
-              <w:t>Bagaimana SFAS No. 104 melonggarkan penyajian lindung nilai?</w:t>
+              <w:t>Gimana SFAS No. 104 ngelonggarin penyajian lindung nilai?</w:t>
             </w:r>
           </w:p>
         </w:tc>
@@ -2041,7 +2023,7 @@
                 <w:i w:val="0"/>
                 <w:sz w:val="22"/>
               </w:rPr>
-              <w:t>Dalam SFAS No. 95, aktivitas lindung nilai (</w:t>
+              <w:t>Di SFAS No. 95, kegiatan lindung nilai (</w:t>
             </w:r>
             <w:r>
               <w:rPr>
@@ -2059,7 +2041,7 @@
                 <w:i w:val="0"/>
                 <w:sz w:val="22"/>
               </w:rPr>
-              <w:t>) dipandang sebagai aktivitas investasi — sebuah klasifikasi kaku yang bersandar semata pada sifat transaksi. SFAS No. 104 yang mengamendemennya melonggarkan hal ini dengan membolehkan lindung nilai dikaitkan ke akun neraca yang spesifik. Bila sebuah kontrak forward, futures, opsi, atau swap teridentifikasi dengan pos tertentu seperti persediaan, misalnya untuk melindungi dari kenaikan harga persediaan, lindung nilai itu boleh diklasifikasikan bersama pos tersebut sebagai unsur operasi, atau tetap sebagai investasi. Nurnberg dan Largay menilai pelonggaran ini umumnya menurunkan keterbandingan, tetapi dapat dibenarkan sebagai peningkatan kehalusan informasi dalam situasi tertentu (Wolk et al., 2017).</w:t>
+              <w:t>) dianggap aktivitas investasi — kaku, cuma ngeliat sifat transaksinya. SFAS No. 104 yang ngerevisi aturan itu ngelonggarin dengan ngebolehin lindung nilai dikaitin ke akun neraca yang spesifik. Jadi kalau sebuah kontrak forward, futures, opsi, atau swap nyambung sama pos tertentu kayak persediaan — misalnya buat jagain dari naiknya harga persediaan — lindung nilai itu boleh ditaro bareng pos tersebut sebagai operasi, atau tetap dianggap investasi. Nurnberg dan Largay ngerasa kelonggaran ini umumnya nurunin keterbandingan, tapi bisa dimaklumi sebagai info yang lebih "halus" di situasi tertentu (Wolk et al., 2017).</w:t>
             </w:r>
           </w:p>
         </w:tc>
@@ -2082,7 +2064,7 @@
                 <w:i w:val="0"/>
                 <w:sz w:val="22"/>
               </w:rPr>
-              <w:t>Seberapa berguna SCF secara analitis menurut model Ingram dan Lee?</w:t>
+              <w:t>Seberapa berguna SCF buat analisis menurut model Ingram dan Lee?</w:t>
             </w:r>
           </w:p>
         </w:tc>
@@ -2103,7 +2085,7 @@
                 <w:i w:val="0"/>
                 <w:sz w:val="22"/>
               </w:rPr>
-              <w:t>Sekalipun menanggung masalah klasifikasi dan nonartikulasi, SCF tetap sangat berguna, dan riset Ingram dan Lee menunjukkannya dengan memakai laporan laba rugi dan SCF secara bersama. Argumen mereka, dari waktu ke waktu perusahaan yang sedang tumbuh cenderung berlaba lebih tinggi tetapi berarus kas operasi lebih rendah, karena ekspansi menambah persediaan dan piutang usaha; meski sebagian terimbangi kenaikan utang usaha, efek neto pertumbuhan modal kerja membuat perubahan laba melampaui perubahan arus kas operasi setiap tahun. Pada fase ekspansi juga muncul arus keluar investasi neto untuk membeli aset tetap dan arus masuk pendanaan dari utang atau ekuitas baru, sementara dividen ditekan. Bagi perusahaan yang menyusut, pola itu sebagian besar berbalik. Analisis statistik mereka atas hampir 1.000 perusahaan sepanjang 1974 hingga 1992 secara umum menyokong penalaran deduktif tersebut, sekaligus menemukan bahwa perusahaan yang berekspansi cenderung memikul leverage keuangan lebih besar daripada yang menyusut (Wolk et al., 2017).</w:t>
+              <w:t>Walaupun punya masalah klasifikasi dan nonartikulasi, SCF tetap berguna banget, dan riset Ingram dan Lee ngebuktiinnya dengan makai laporan laba rugi dan SCF barengan. Logika mereka: dari waktu ke waktu, perusahaan yang lagi tumbuh biasanya labanya lebih tinggi tapi arus kas operasinya lebih rendah. Kenapa? Karena ekspansi nambah persediaan dan piutang usaha; walau sebagian ketutup kenaikan utang usaha, efek bersih pertumbuhan modal kerja bikin kenaikan laba lebih gede dari kenaikan arus kas operasi tiap tahun. Pas ekspansi juga ada arus keluar buat beli aset tetap dan arus masuk dari utang atau saham baru, sementara dividen ditahan. Buat perusahaan yang lagi menyusut, polanya kebalik. Analisis statistik mereka ke hampir 1.000 perusahaan dari 1974 sampai 1992 secara umum ngedukung logika tadi, sekaligus nemu bahwa perusahaan yang lagi ekspansi cenderung punya utang (leverage) lebih besar daripada yang menyusut (Wolk et al., 2017).</w:t>
             </w:r>
           </w:p>
         </w:tc>
@@ -2126,7 +2108,7 @@
                 <w:i w:val="0"/>
                 <w:sz w:val="22"/>
               </w:rPr>
-              <w:t>Bagaimana klasifikasi dimanipulasi pada Tyco dan industri otomotif?</w:t>
+              <w:t>Gimana klasifikasi dimanipulasi di Tyco dan industri otomotif?</w:t>
             </w:r>
           </w:p>
         </w:tc>
@@ -2147,7 +2129,7 @@
                 <w:i w:val="0"/>
                 <w:sz w:val="22"/>
               </w:rPr>
-              <w:t>SCF memang lebih sukar dimanipulasi daripada laba, tetapi tidak kebal. Karena banyak pengguna menganggap arus kas dari operasi (CFO) sebagai bagian terpenting, muncul godaan menaikkannya dengan menggeser arus keluar dari operasi ke investasi atau menarik arus masuk dari investasi ke operasi; total kasnya tak berubah, namun tanpa pencermatan pengguna terlanjur menilainya positif. Maremont mencontohkan Tyco International di bisnis sistem alarm rumah: kas untuk mengembangkan penjualan sendiri dan kas untuk membeli kontrak layanan dari dealer lain semestinya diperlakukan setara, tetapi Tyco mencatat kontrak dealer yang dibeli sebagai "akuisisi" dan mengakuinya sebagai arus keluar operasi atas dasar yang jauh lebih lambat. Mulford, dalam Wall Street Journal, mencontohkan industri otomotif. Ford, General Motors, dan Harley-Davidson meminjamkan dana ke dealer dalam bentuk piutang wesel agar dealer membeli persediaan; perusahaan mengakui pendapatan penjualan tetapi menggolongkan pinjaman itu sebagai aktivitas investasi, sehingga CFO terangkat. Pada GM, CFO terlapor $7,6 miliar, padahal seandainya piutang wesel diperlakukan sebagai aktivitas operasi angkanya hanya $3,5 miliar. Sebaliknya Navistar justru mereklasifikasi piutang wesel dealernya menjadi operasi; Mark Oberle selaku direktur hubungan investor menyebutnya bagian dari bisnis inti perusahaan manufaktur yang memiliki anak usaha pembiayaan. Bahkan tanpa pelanggaran aturan sekalipun, kekaburan penerapan ini memungkinkan perusahaan dalam satu industri menampilkan gambaran yang sangat berlainan (Wolk et al., 2017).</w:t>
+              <w:t>SCF emang lebih susah diakalin daripada laba, tapi bukan berarti kebal. Karena banyak orang nganggap arus kas dari operasi (CFO) sebagai bagian paling penting, ada godaan buat naikin angkanya: geser arus keluar dari operasi ke investasi, atau tarik arus masuk dari investasi ke operasi. Total kasnya nggak berubah, tapi kalau nggak diteliti, orang langsung mikir positif. Maremont kasih contoh Tyco International di bisnis alarm rumah: kas buat ngembangin penjualan sendiri sama kas buat beli kontrak layanan dari dealer lain semestinya diperlakukan sama, tapi Tyco nyatet kontrak dealer yang dibeli sebagai "akuisisi" dan ngakuinnya sebagai arus keluar operasi dengan ritme yang jauh lebih lambat. Mulford, di Wall Street Journal, kasih contoh industri otomotif. Ford, General Motors, dan Harley-Davidson minjemin dana ke dealer lewat piutang wesel biar dealer beli persediaan; perusahaan ngakuin pendapatan penjualan tapi naro pinjaman itu sebagai aktivitas investasi, jadi CFO-nya keangkat. Di GM, CFO yang dilaporin $7,6 miliar, padahal kalau piutang wesel dianggap operasi, angkanya cuma $3,5 miliar. Sebaliknya Navistar malah mindahin piutang wesel dealernya ke operasi; Mark Oberle, direktur hubungan investor, nyebut itu bagian bisnis inti perusahaan manufaktur yang punya anak usaha pembiayaan. Jadi walau aturannya nggak dilanggar, area abu-abu kayak gini bikin perusahaan di industri yang sama bisa nampilin gambaran yang beda jauh (Wolk et al., 2017).</w:t>
             </w:r>
           </w:p>
         </w:tc>
@@ -2170,7 +2152,7 @@
                 <w:i w:val="0"/>
                 <w:sz w:val="22"/>
               </w:rPr>
-              <w:t>Mengapa SCF harus dibaca utuh, dan apa pelajaran kasus WorldCom?</w:t>
+              <w:t>Kenapa SCF harus dibaca utuh, dan apa pelajaran dari WorldCom?</w:t>
             </w:r>
           </w:p>
         </w:tc>
@@ -2191,7 +2173,7 @@
                 <w:i w:val="0"/>
                 <w:sz w:val="22"/>
               </w:rPr>
-              <w:t>Memusatkan perhatian berlebihan pada satu bagian SCF, dalam hal ini CFO, jelas berisiko, sebab laporan ini terdiri atas tiga bagian yang semuanya penting. Pada 21 Juli 2002 WorldCom mengajukan reorganisasi sukarela berdasarkan Bab 11 Undang-Undang Kepailitan Amerika Serikat. Sebelum jatuh, perusahaan ini mengapitalisasi beban yang seharusnya digolongkan sebagai aktivitas operasi; kesalahan klasifikasi tersebut menggelembungkan CFO yang dilaporkan dan meminjamkan kredibilitas semu bagi laba bersihnya. Banyak investor terkecoh, tetapi SCF yang dibaca secara utuh sebenarnya menyediakan cukup alasan untuk skeptis. Exhibit 13.6 menampilkan pos-pos terpilih SCF WorldCom: laba bersih positif sepanjang tiga tahun menjelang pailit, namun bila CFI mencerminkan investasi yang diperlukan, selisih CFO dikurangi CFI memperlihatkan berapa kas yang benar-benar tersedia bagi investor — dan WorldCom terus kehabisan kas pada tiga dari empat tahun terakhir, menggali defisit kumulatif sebesar $12 miliar hingga 31 Desember 2001. Pertanyaannya tinggal kapan defisit itu berhenti membesar. Investor yang mengabaikan satu atau lebih bagian SCF menanggung sendiri akibatnya (Wolk et al., 2017; lihat Exhibit 13.6).</w:t>
+              <w:t>Kebanyakan mantengin satu bagian SCF doang (yaitu CFO) itu bahaya, soalnya laporan ini ada tiga bagian dan semuanya penting. Pada 21 Juli 2002, WorldCom ngajuin reorganisasi sukarela berdasarkan Bab 11 Undang-Undang Kepailitan Amerika. Sebelum jatuh, perusahaan ini ngapitalisasi beban yang harusnya masuk aktivitas operasi; salah klasifikasi ini bikin CFO yang dilaporin ngegelembung dan laba bersihnya kelihatan meyakinkan. Banyak investor ketipu, tapi sebenarnya kalau SCF dibaca utuh, ada cukup tanda buat curiga. Exhibit 13.6 nampilin pos-pos terpilih SCF WorldCom: laba bersihnya positif selama tiga tahun sebelum bangkrut, tapi kalau CFI nunjukin investasi yang memang dibutuhkan, selisih CFO dikurangi CFI ngasih tahu berapa kas yang beneran tersisa buat investor — dan ternyata WorldCom terus kehabisan kas di tiga dari empat tahun terakhir, sampai bikin "lubang" kumulatif sebesar $12 miliar per 31 Desember 2001. Tinggal nunggu kapan lubang itu berhenti makin dalam. Investor yang cuekin satu atau lebih bagian SCF, ya nanggung sendiri akibatnya (Wolk et al., 2017; lihat Exhibit 13.6).</w:t>
             </w:r>
           </w:p>
         </w:tc>
@@ -2296,7 +2278,7 @@
                 <w:i w:val="0"/>
                 <w:sz w:val="22"/>
               </w:rPr>
-              <w:t>Apa kebutuhan pengguna menurut Buffett dan logika NPV?</w:t>
+              <w:t>Apa yang dibutuhin pengguna menurut Buffett dan logika NPV?</w:t>
             </w:r>
           </w:p>
         </w:tc>
@@ -2317,7 +2299,7 @@
                 <w:i w:val="0"/>
                 <w:sz w:val="22"/>
               </w:rPr>
-              <w:t>Dalam surat 1988 kepada pemegang saham Berkshire Hathaway, Warren Buffett merangkum apa yang sebenarnya perlu dilaporkan, yakni data yang membantu pembaca yang melek finansial menjawab tiga hal: kira-kira berapa nilai perusahaan, seberapa besar kemungkinannya memenuhi kewajiban masa depan, dan seberapa baik kinerja manajernya. Dengan kata lain, laporan keuangan harus menjadi bahan untuk menilai perusahaan, mengambil keputusan kredit, dan mengukur kinerja manajerial. Penilaian kinerja menuntut ukuran arus kas historis yang akurat, sedangkan keputusan kredit dan valuasi menuntut prediksi arus kas masa depan yang takbias, sejalan dengan SFAC No. 1. Keputusan investasi pada hakikatnya adalah alokasi modal yang memakai kriteria penganggaran modal: sebuah investasi diterima bila nilai kini arus kas neto yang diharapkan positif, atau dengan kata lain bila NPV (</w:t>
+              <w:t>Di suratnya tahun 1988 ke pemegang saham Berkshire Hathaway, Warren Buffett ngerangkum apa yang sebenernya perlu dilaporin: data yang bantu pembaca yang ngerti keuangan jawab tiga hal — kira-kira perusahaan ini berharga berapa, seberapa mungkin dia bisa bayar kewajibannya nanti, dan seberapa bagus kerja manajernya. Singkatnya, laporan keuangan harus jadi bahan buat menilai perusahaan, ngambil keputusan kredit, dan ngukur kinerja manajemen. Buat nilai kinerja, kita butuh angka arus kas masa lalu yang akurat; buat keputusan kredit dan valuasi, kita butuh ramalan arus kas masa depan yang nggak bias (ini nyambung sama SFAC No. 1). Keputusan investasi pada dasarnya soal ngalokasiin modal pakai logika penganggaran modal: terima investasi kalau nilai sekarang dari arus kas bersih yang diharapkan itu positif — alias kalau NPV (</w:t>
             </w:r>
             <w:r>
               <w:rPr>
@@ -2335,7 +2317,7 @@
                 <w:i w:val="0"/>
                 <w:sz w:val="22"/>
               </w:rPr>
-              <w:t>, nilai sekarang bersih) positif. Begitu pula pembelian saham, layak dilakukan bila nilai kini arus kas masa depan per saham — nilai intrinsiknya — melampaui harga pasar. Buffett sendiri mendefinisikan nilai intrinsik sebagai nilai terdiskonto dari kas yang dapat ditarik sepanjang sisa umur usaha (Wolk et al., 2017).</w:t>
+              <w:t>, nilai sekarang bersih) positif. Sama halnya, beli saham itu layak kalau nilai sekarang arus kas masa depan per saham — alias nilai intrinsiknya — lebih gede dari harga pasar. Buffett ngedefinisiin nilai intrinsik sebagai nilai terdiskonto dari kas yang bisa ditarik dari bisnis sepanjang sisa umurnya (Wolk et al., 2017).</w:t>
             </w:r>
           </w:p>
         </w:tc>
@@ -2379,7 +2361,7 @@
                 <w:i w:val="0"/>
                 <w:sz w:val="22"/>
               </w:rPr>
-              <w:t>Arus kas yang menjadi dasar penilaian nilai intrinsik suatu perusahaan disebut free cash flow (FCF, arus kas bebas). Menurut Mulford dan Comiskey, kata "bebas" menunjuk pada ketiadaan klaim yang lebih utama atasnya: kas itu tersedia untuk dipakai tanpa ikatan, dan pemakaiannya tidak mengganggu kemampuan perusahaan menghasilkan kas berikutnya. Mengikuti teori entitas, Wolk berfokus pada arus kas ke perusahaan. FCF tidak dapat dibaca langsung dari SCF, melainkan dirumuskan dalam persamaan 13.2: FCF sama dengan NOPLAT dikurangi investasi pada modal terinvestasi operasi. NOPLAT (</w:t>
+              <w:t>Arus kas yang jadi dasar nentuin nilai intrinsik perusahaan itu namanya free cash flow (FCF, arus kas bebas). Kata Mulford dan Comiskey, kata "bebas" itu maksudnya nggak ada klaim yang lebih utama atas kas itu: kas yang beneran bebas dipakai, dan makainya nggak ganggu kemampuan perusahaan buat ngehasilin kas berikutnya. Ngikutin teori entitas, Wolk fokus ke arus kas ke perusahaan. FCF nggak bisa langsung dibaca dari SCF, tapi dirumusin di persamaan 13.2: FCF = NOPLAT dikurangi investasi pada modal terinvestasi operasi. NOPLAT (</w:t>
             </w:r>
             <w:r>
               <w:rPr>
@@ -2397,7 +2379,7 @@
                 <w:i w:val="0"/>
                 <w:sz w:val="22"/>
               </w:rPr>
-              <w:t>) adalah laba operasi neto setelah pajak yang disesuaikan, yang dalam kasus sederhana berarti laba operasi setelah pajak. Investasi pada modal terinvestasi operasi biasanya dipecah menjadi investasi pada modal kerja operasi neto dan pada aset taklancar. Yang perlu dicatat, FCF tidak memasukkan beban bunga karena bunga adalah beban pendanaan, dan sejalan dengan asumsi kelangsungan usaha, kas operasi diperlakukan sebagai bagian modal kerja operasi neto sebagaimana piutang dan persediaan (Wolk et al., 2017).</w:t>
+              <w:t>) itu laba operasi bersih setelah pajak yang disesuaikan; dalam kasus sederhana, ya laba operasi setelah pajak. Investasi pada modal terinvestasi operasi biasanya dipecah jadi investasi di modal kerja operasi bersih dan di aset taklancar. Yang perlu diinget: FCF nggak masukin beban bunga (karena itu beban pendanaan), dan sejalan sama asumsi perusahaan bakal terus jalan, kas operasi dianggap bagian dari modal kerja operasi bersih, sama kayak piutang dan persediaan (Wolk et al., 2017).</w:t>
             </w:r>
           </w:p>
         </w:tc>
@@ -2420,7 +2402,7 @@
                 <w:i w:val="0"/>
                 <w:sz w:val="22"/>
               </w:rPr>
-              <w:t>Bagaimana ilustrasi ABC Company menjembatani CFO ke FCF?</w:t>
+              <w:t>Gimana contoh ABC Company nyambungin CFO ke FCF?</w:t>
             </w:r>
           </w:p>
         </w:tc>
@@ -2441,7 +2423,7 @@
                 <w:i w:val="0"/>
                 <w:sz w:val="22"/>
               </w:rPr>
-              <w:t>Wolk memakai ABC Company untuk memperagakan penyusunan FCF. Exhibit 13.7 menyajikan laporan laba rugi dan neraca ABC, yang dari keduanya lahir SCF pada Exhibit 13.8 dengan CFO $527, $466, dan $434, CFI $(277), $(309), dan $(360), serta CFF $(306), $(78), dan $(58) untuk 2005, 2006, dan 2007. Exhibit 13.9 lalu menyusun statement of free cash flows: dari laba operasi dikurangi pajak basis kas diperoleh NOPLAT $346, $333, dan $353, ditambah penyusutan menjadi gross cash flow $561, $553, dan $581, lalu dikurangi total investasi sehingga FCF dari aset operasi menjadi $332, $99, dan $80, yang juga setara dengan FCF ke ekuitas. Exhibit 13.10 menutup dengan cara menghitung FCF langsung dari SCF: bertolak dari CFO, beban bunga setelah pajak ditambahkan untuk menghapus efek pendanaan, kenaikan kas operasi dikurangkan karena ia bagian modal terinvestasi, lalu CFI ditambahkan — angka yang umumnya negatif, seperti $(277) pada 2005 yang menekan FCF — sehingga diperoleh kembali FCF $332, $99, dan $80 (Wolk et al., 2017).</w:t>
+              <w:t>Wolk pakai ABC Company buat nunjukin cara nyusun FCF. Exhibit 13.7 nampilin laporan laba rugi dan neraca ABC, dan dari situ disusun SCF di Exhibit 13.8 dengan CFO $527, $466, $434; CFI $(277), $(309), $(360); dan CFF $(306), $(78), $(58) buat 2005, 2006, 2007. Exhibit 13.9 terus nyusun statement of free cash flows: dari laba operasi dikurangi pajak basis kas ketemu NOPLAT $346, $333, $353, ditambah penyusutan jadi gross cash flow $561, $553, $581, dikurangi total investasi sampai FCF dari aset operasi jadi $332, $99, $80 (yang juga sama dengan FCF ke ekuitas). Exhibit 13.10 nutup dengan cara ngitung FCF langsung dari SCF: mulai dari CFO, tambahin beban bunga setelah pajak (buat ngebuang efek pendanaan), kurangin kenaikan kas operasi (karena dia bagian modal terinvestasi), lalu tambahin CFI (yang biasanya negatif, kayak $(277) di 2005 yang nurunin FCF), dan ketemu lagi FCF $332, $99, $80 (Wolk et al., 2017).</w:t>
             </w:r>
           </w:p>
         </w:tc>
@@ -2856,7 +2838,7 @@
                 <w:i w:val="0"/>
                 <w:sz w:val="22"/>
               </w:rPr>
-              <w:t>Ukuran kinerja mana yang dipakai bergantung pada waktu, sumber daya, dan tujuan valuasi pengguna. Yang ingin cepat cukup melihat laba bersih. Yang ingin memahami operasi dan menimbang kualitas laba berfokus pada CFO. Untuk menghindari persoalan beban operasi yang digolongkan sebagai investasi dan untuk menangkap kemampuan menghasilkan kas neto, masuk akal mengurangkan CFI sehingga diperoleh selisih CFO dikurangi CFI. Dan karena CFO masih tercampur beban bunga yang sejatinya pendanaan, FCF dihitung untuk benar-benar berfokus pada operasi sekaligus mengakui kas operasi sebagai bagian modal terinvestasi. Bagi ABC, keempat ukuran untuk 2005, 2006, dan 2007 adalah laba bersih $320, $312, dan $331; CFO $527, $466, dan $434; selisih CFO dikurangi CFI $250, $157, dan $74; serta FCF $332, $99, dan $80. Investor dapat menaksir nilai intrinsik dengan mendiskontokan FCF yang diproyeksikan memakai WACC (</w:t>
+              <w:t>Ukuran kinerja mana yang dipakai itu tergantung waktu, sumber daya, dan tujuan valuasi kita. Yang pengen cepet, cukup lihat laba bersih. Yang mau ngerti operasi dan nimbang kualitas laba, fokus ke CFO. Buat ngehindarin masalah beban operasi yang digolongin investasi, dan biar dapet gambaran kemampuan ngehasilin kas bersih, masuk akal ngurangin CFI, jadi pakai selisih CFO dikurangi CFI. Dan karena CFO masih "kecampuran" beban bunga yang sebenernya pendanaan, kita bisa ngitung FCF biar bener-bener fokus ke operasi sekaligus ngakuin kas operasi sebagai bagian modal terinvestasi. Buat ABC, keempat ukuran ini di 2005, 2006, 2007 adalah laba bersih $320, $312, $331; CFO $527, $466, $434; CFO dikurangi CFI $250, $157, $74; dan FCF $332, $99, $80. Investor bisa naksir nilai intrinsik dengan ngediskontoin FCF yang diramalkan pakai WACC (</w:t>
             </w:r>
             <w:r>
               <w:rPr>
@@ -2874,7 +2856,7 @@
                 <w:i w:val="0"/>
                 <w:sz w:val="22"/>
               </w:rPr>
-              <w:t>, biaya modal rata-rata tertimbang). Dengan empat ukuran yang bisa memberi gambaran berbeda-beda, memang dunia nyata tidak pernah sesederhana yang diharapkan (Wolk et al., 2017).</w:t>
+              <w:t>, biaya modal rata-rata tertimbang). Dengan empat ukuran yang bisa ngasih gambaran beda-beda, ya emang dunia nyata nggak pernah sesederhana itu (Wolk et al., 2017).</w:t>
             </w:r>
           </w:p>
         </w:tc>
@@ -2988,7 +2970,7 @@
                 <w:i w:val="0"/>
                 <w:sz w:val="22"/>
               </w:rPr>
-              <w:t>Apa pandangan riset kas versus akrual (Lawson dan Lee)?</w:t>
+              <w:t>Apa kata riset soal kas versus akrual (Lawson dan Lee)?</w:t>
             </w:r>
           </w:p>
         </w:tc>
@@ -3009,7 +2991,7 @@
                 <w:i w:val="0"/>
                 <w:sz w:val="22"/>
               </w:rPr>
-              <w:t>Lawson dan Lee, dua pendukung lama pelaporan arus kas, berpendirian bahwa laporan arus kas diperlukan untuk menggambarkan kinerja, sebab likuiditas adalah bagian tak terpisahkan dari kinerja itu sendiri. Lee bahkan menyatakan arus kas, bukan laba, adalah hasil akhir aktivitas entitas, karena laba sekadar abstraksi sedangkan kas adalah sumber daya yang nyata. Model valuasi dalam literatur ekonomi keuangan sependapat bahwa arus kas perusahaanlah penentu akhir nilainya, bukan laba akrual. Namun riset pasar modal yang terus berkembang memperlihatkan akrual memberi informasi melampaui arus kas literal dalam kaitannya dengan harga sekuritas. Maka penafsiran yang masuk akal adalah kas dan akrual lebih berguna bila dibaca bersama, sehingga SCF bersifat melengkapi laporan akrual. Survei terhadap investor dan analis secara konsisten menunjukkan analisis profitabilitas berbasis akrual masih dominan, meski survei yang ditugaskan Financial Accounting Foundation menemukan kepentingan data arus dana meningkat sementara data akrual menurun (Wolk et al., 2017).</w:t>
+              <w:t>Lawson dan Lee, dua orang yang dari dulu dukung pelaporan arus kas, berpendapat bahwa laporan arus kas itu perlu buat ngegambarin kinerja, soalnya likuiditas itu bagian nggak terpisahin dari kinerja. Lee malah bilang arus kas, bukan laba, yang jadi hasil akhir aktivitas perusahaan — karena laba cuma abstraksi sedangkan kas itu sumber daya nyata. Model valuasi di literatur ekonomi keuangan sependapat bahwa arus kas perusahaanlah penentu akhir nilainya, bukan laba akrual. Tapi riset pasar modal yang terus berkembang nunjukin akrual ngasih info tambahan di luar arus kas literal soal harga saham. Jadi tafsiran yang masuk akal: kas dan akrual lebih berguna kalau dibaca barengan, jadi SCF itu pelengkap buat laporan akrual. Survei ke investor dan analis konsisten nunjukin analisis berbasis akrual masih dominan, walau survei yang dipesen Financial Accounting Foundation nemu bahwa data arus dana makin penting sementara data akrual makin turun (Wolk et al., 2017).</w:t>
             </w:r>
           </w:p>
         </w:tc>
@@ -3032,7 +3014,7 @@
                 <w:i w:val="0"/>
                 <w:sz w:val="22"/>
               </w:rPr>
-              <w:t>Apa tiga rekomendasi Broome untuk memperbaiki SCF?</w:t>
+              <w:t>Apa tiga rekomendasi Broome buat memperbaiki SCF?</w:t>
             </w:r>
           </w:p>
         </w:tc>
@@ -3053,7 +3035,7 @@
                 <w:i w:val="0"/>
                 <w:sz w:val="22"/>
               </w:rPr>
-              <w:t>SCF adalah alat penting bagi investor, kreditor, dan manajer, tetapi masih menyisakan ruang perbaikan. Berlatar serangkaian skandal akuntansi seperti Adelphia, Dynegy, Qwest, Tyco, dan WorldCom, Broome berpendapat SCF dapat dan sepatutnya dibenahi, sebab keleluasaan SFAS No. 95 yang membolehkan metode langsung atau tidak langsung justru menimbulkan kebingungan; penyesuaian rumit pada metode tidak langsung sulit dipahami dan dalam banyak kasus tidak dapat direkonsiliasi dengan perubahan akun neraca yang teramati. Tiga usulannya, FASB sebaiknya mewajibkan metode langsung sekaligus rekonsiliasi laba bersih ke arus kas operasi, memberi panduan klasifikasi yang lebih jelas bagi ketiga bagian, dan menyusun rekonsiliasi pelengkap yang justru bermula dari arus kas operasi menuju laba bersih, kebalikan dari praktik sekarang. Wolk setuju metode langsung sebaiknya diwajibkan; namun seandainya sistem pilihan tetap dipertahankan, perusahaan semestinya diwajibkan menyajikan skedul transaksi nonkas yang memengaruhi akun modal kerja, skedul rekonsiliasi untuk akuisisi tengah tahun, dan secara umum menjelaskan asal setiap nonartikulasi pada bagian operasi SCF (Wolk et al., 2017).</w:t>
+              <w:t>SCF itu alat penting buat investor, kreditor, dan manajer, tapi masih bisa diperbaiki. Berkaca dari rentetan skandal akuntansi kayak Adelphia, Dynegy, Qwest, Tyco, dan WorldCom, Broome berpendapat SCF bisa dan harus dibenahi, soalnya kebebasan SFAS No. 95 buat milih metode langsung atau tidak langsung malah bikin bingung; penyesuaian ribet di metode tidak langsung susah dipahami dan sering nggak bisa dicocokin sama perubahan akun neraca yang keliatan. Tiga usulannya: FASB sebaiknya mewajibkan metode langsung sekaligus rekonsiliasi laba bersih ke arus kas operasi; ngasih panduan klasifikasi yang lebih jelas buat ketiga bagian; dan nyusun rekonsiliasi pelengkap yang malah mulai dari arus kas operasi menuju laba bersih (kebalikan dari yang sekarang). Wolk setuju metode langsung sebaiknya diwajibkan; tapi kalau sistem pilihan tetap dipertahanin, perusahaan harusnya wajib nyajiin skedul transaksi nonkas yang ngaruh ke akun modal kerja, skedul rekonsiliasi buat akuisisi tengah tahun, dan secara umum ngejelasin asal tiap nonartikulasi di bagian operasi SCF (Wolk et al., 2017).</w:t>
             </w:r>
           </w:p>
         </w:tc>
@@ -3086,7 +3068,7 @@
           <w:i w:val="0"/>
           <w:sz w:val="24"/>
         </w:rPr>
-        <w:t>Bab 13 menelusuri bagaimana pelaporan arus kas berevolusi dari Statement of Changes in Financial Position (SCFP) menuju Statement of Cash Flows (SCF) yang kita kenal sekarang. SCFP yang diwajibkan APB Opinion No. 19 pada 1971 masih berupa laporan arus dana dengan kerangka biner sumber dan penggunaan, dan membuka empat kemungkinan definisi dana, mulai dari kas hingga modal kerja, dengan kebanyakan perusahaan memilih modal kerja karena paling murah disusun. Persoalannya, modal kerja bersih ternyata ukuran likuiditas yang lemah: ia memuat pos tangguhan tanpa konsekuensi kas, mengandaikan siklus operasi yang bisa melebihi setahun, dan menilai persediaan berbasis biaya. Atas dasar itu FASB lewat SFAS No. 95 pada 1987 mendefinisikan ulang dana sebagai kas dan menggantikan SCFP. Jantung SFAS No. 95 adalah trikotomi tiga arah, yakni aktivitas operasi, investasi, dan pendanaan, yang menjanjikan konsistensi klasifikasi lebih tinggi, lengkap dengan definisi kas dan setara kas serta kewajiban mengungkapkan transaksi nonkas. Arus kas operasinya boleh disajikan dengan metode langsung, yang lebih informatif dan disukai FASB meski lebih mahal, atau dengan metode tidak langsung yang mendominasi praktik karena lebih murah walau lebih sukar dibaca.</w:t>
+        <w:t>Inti Bab 13 ini sebenarnya cerita soal gimana laporan arus kas berkembang. Dulu ada Statement of Changes in Financial Position (SCFP), terus berubah jadi Statement of Cash Flows (SCF) yang kita pakai sekarang. SCFP yang diwajibkan APB Opinion No. 19 pada 1971 itu masih berupa laporan arus dana model "sumber dan penggunaan", dan ngebolehin "dana" diartikan macam-macam — kas, kas plus near cash, quick assets, atau modal kerja — dan kebanyakan perusahaan milih modal kerja karena paling murah dibuat. Masalahnya, modal kerja bersih itu ukuran likuiditas yang payah: ada pos tangguhan yang nggak ada urusannya sama kas, siklus operasinya bisa lebih dari setahun, dan persediaan dicatat pakai biaya. Makanya FASB lewat SFAS No. 95 pada 1987 ngeubah arti "dana" jadi kas dan ngegantiin SCFP. Jantung SFAS No. 95 itu pembagian tiga arah: aktivitas operasi, investasi, dan pendanaan, yang bikin klasifikasinya lebih konsisten, plus ada definisi kas dan setara kas serta kewajiban ngungkapin transaksi nonkas. Arus kas operasinya boleh disajikan pakai metode langsung (lebih informatif dan disukai FASB tapi mahal) atau metode tidak langsung (paling banyak dipakai karena murah, walau lebih susah dibaca).</w:t>
       </w:r>
     </w:p>
     <w:p>
@@ -3101,7 +3083,7 @@
           <w:i w:val="0"/>
           <w:sz w:val="24"/>
         </w:rPr>
-        <w:t>Yang menarik, bab ini tidak menutup-nutupi dua keterbatasan SCF. Pertama, nonartikulasi yang didokumentasikan Bahnson, Miller, dan Budge: penyesuaian modal kerja di bagian operasi sering tidak sama dengan perubahan akun neraca, terjadi pada 75 persen sampel, dengan kasus 3M memperlihatkan selisih piutang hingga 300 persen, akibat akuisisi tengah tahun, transaksi nonkas, dan akun yang dipakai bersama. Kedua, persoalan klasifikasi: orientasi proprietary menempatkan bunga dan dividen di bagian operasi, padahal teori entitas dan literatur keuangan menggolongkannya sebagai investasi atau pendanaan, sementara kelonggaran penerapan pada IAS 7, premium obligasi versi Vent, Cowling, dan Sevalstad, bunga dikapitalisasi SFAS No. 34, serta lindung nilai SFAS No. 104 membuka ruang manipulasi yang tampak nyata pada kasus Tyco, industri otomotif (CFO GM $7,6 miliar yang sejatinya $3,5 miliar), dan WorldCom. Kendati demikian SCF tetap berdaya guna secara analitis, sebagaimana ditunjukkan model Ingram dan Lee maupun kebutuhan valuasi ala Buffett, dan dari sanalah free cash flow lahir sebagai ukuran non-GAAP untuk valuasi, dengan FCF sama dengan NOPLAT dikurangi investasi pada modal terinvestasi operasi. Kesimpulan Wolk, perpindahan dari SCFP ke SCF meningkatkan konsistensi dan daya prediksi karena melepaskan diri dari kesewenang-wenangan laba, sepanjang SCF dibaca secara utuh dan tidak dipersempit pada arus kas operasi saja (Wolk et al., 2017).</w:t>
+        <w:t>Yang bagus, bab ini jujur soal dua kelemahan SCF. Pertama, nonartikulasi (temuan Bahnson, Miller &amp; Budge): penyesuaian modal kerja di bagian operasi sering nggak sama dengan perubahan akun neraca — kejadian di 75 persen sampel, dengan kasus 3M yang selisih piutangnya sampai 300 persen — gara-gara akuisisi tengah tahun, transaksi nonkas, dan akun yang dipakai bareng. Kedua, masalah klasifikasi: orientasi proprietary naro bunga dan dividen di operasi, padahal teori entitas dan ilmu keuangan ngegolongin keduanya investasi atau pendanaan; ditambah kelonggaran penerapan (IAS 7, premium obligasi versi Vent, Cowling &amp; Sevalstad, bunga dikapitalisasi SFAS No. 34, lindung nilai SFAS No. 104) yang ngebuka ruang manipulasi seperti di kasus Tyco, otomotif (CFO GM $7,6 miliar yang sebenernya $3,5 miliar), dan WorldCom. Tapi meski gitu, SCF tetap berguna banget buat analisis (model Ingram &amp; Lee, kebutuhan valuasi ala Buffett), dan dari sini lahir free cash flow (FCF = NOPLAT − investasi pada modal terinvestasi operasi) sebagai ukuran non-GAAP buat valuasi. Kesimpulan Wolk: pindah dari SCFP ke SCF bikin laporan lebih konsisten dan lebih bisa diandalkan buat meramal, karena lepas dari "kesewenang-wenangan" laba — asalkan SCF dibaca utuh, bukan cuma bagian arus kas operasinya doang (Wolk et al., 2017).</w:t>
       </w:r>
     </w:p>
     <w:p>
@@ -3146,7 +3128,7 @@
           <w:i w:val="0"/>
           <w:sz w:val="24"/>
         </w:rPr>
-        <w:t>Bagi saya, SCF bukan sekadar laporan keuangan keempat yang berdiri sendiri, melainkan laporan turunan yang menata ulang data dari laporan laba rugi dan neraca ke dalam tiga lensa baru, yaitu operasi, investasi, dan pendanaan. Nilainya tidak terletak pada kebaruan data, sebab datanya memang sudah ada, tetapi pada cara ia memisahkan komponen kas dari komponen akrual sehingga lahir informasi baru tentang likuiditas dan kualitas laba. Yang menarik, keunggulan terbesar SCF, yakni kelugasan kas, sekaligus menjadi pangkal ketegangan teoretisnya. Begitu sebuah standar harus memutuskan di bagian mana suatu arus kas digolongkan, kelugasan itu mulai terganggu oleh pilihan teori antara proprietary dan entity, juga oleh kebebasan memilih metode langsung atau tidak langsung. SCF karena itu adalah laporan yang konsepnya sederhana tetapi penyajiannya sarat keputusan normatif.</w:t>
+        <w:t>Buat saya, SCF itu bukan laporan keuangan keempat yang berdiri sendiri, tapi laporan turunan yang nyusun ulang data dari laporan laba rugi dan neraca ke dalam tiga sudut pandang: operasi, investasi, dan pendanaan. Yang bikin dia berharga bukan datanya yang baru — datanya ya itu-itu juga — tapi caranya misahin bagian kas dari bagian akrual, sehingga muncul info baru soal likuiditas dan kualitas laba. Yang menarik, kelebihan terbesar SCF, yaitu kejelasan kas, justru jadi sumber masalahnya. Begitu standar harus mutusin suatu arus kas masuk ke bagian yang mana, kejelasan itu langsung terganggu sama pilihan teori (proprietary atau entity) dan pilihan metode (langsung atau tidak langsung). Jadi SCF itu konsepnya gampang, tapi cara nyajiinnya penuh keputusan yang nggak netral.</w:t>
       </w:r>
     </w:p>
     <w:p>
@@ -3176,7 +3158,7 @@
           <w:i w:val="0"/>
           <w:sz w:val="24"/>
         </w:rPr>
-        <w:t>Materi ini menyentuh pertanyaan paling mendasar tentang kelangsungan usaha: apakah perusahaan menghasilkan kas yang cukup untuk bertahan. Laba akrual bisa saja positif sementara kas menipis, dan disjungsi semacam itu sudah berkali-kali terbukti mematikan. Menguasai SCF berarti melatih diri untuk tidak terpaku pada satu angka, entah laba bersih atau bahkan arus kas operasi, melainkan membaca interaksi ketiga bagiannya sekaligus. Ada pula nilai yang lebih dalam dari sekadar teknis. Materi ini memperlihatkan bahwa standar akuntansi adalah hasil kompromi politik dan ekonomi, sebagaimana terlihat dari tekanan industri perbankan atas klasifikasi bunga, dan bukan kebenaran yang netral. Justru itulah pelajaran inti dari kerangka mata kuliah Pelaporan Keuangan Korporat.</w:t>
+        <w:t>Materi ini penting karena nyentuh pertanyaan paling dasar soal bertahan hidupnya perusahaan: apakah dia ngehasilin kas yang cukup buat terus jalan? Laba bisa aja keliatan positif padahal kasnya menipis, dan kejadian kayak gini udah berkali-kali terbukti fatal. Belajar SCF itu ngelatih kita biar nggak cuma terpaku ke satu angka — entah laba bersih atau bahkan arus kas operasi — tapi baca interaksi ketiga bagiannya sekaligus. Ada pelajaran yang lebih dalam juga: materi ini nunjukin bahwa standar akuntansi itu hasil tawar-menawar politik dan ekonomi (contohnya tekanan industri perbankan soal klasifikasi bunga), bukan kebenaran yang netral. Justru ini pelajaran inti dari mata kuliah Pelaporan Keuangan Korporat.</w:t>
       </w:r>
     </w:p>
     <w:p>
@@ -3206,7 +3188,7 @@
           <w:i w:val="0"/>
           <w:sz w:val="24"/>
         </w:rPr>
-        <w:t>Penerapan SCF terasa paling tajam dalam analisis solvabilitas dan deteksi manipulasi. WorldCom adalah contohnya yang paling terang: selisih CFO dikurangi CFI yang terus-menerus negatif, dengan defisit kumulatif $12 miliar, sudah memberi sinyal bahaya jauh sebelum laba bersih dan CFO yang dipoles lewat kapitalisasi beban runtuh. Pola serupa terlihat pada industri otomotif, ketika GM melaporkan CFO $7,6 miliar yang sebenarnya hanya $3,5 miliar seandainya piutang dealer digolongkan operasi. Dalam praktik valuasi, FCF yang didiskontokan dengan WACC menjadi tulang punggung penilaian ekuitas, dan itu persis logika nilai intrinsik yang dianjurkan Buffett. Maka baik analis kredit maupun investor sepatutnya merekonstruksi arus kas terlebih dahulu, bukan menelan angka yang tersaji begitu saja.</w:t>
+        <w:t>Penerapan SCF paling kerasa di analisis solvabilitas dan deteksi manipulasi. Contoh paling jelas ya WorldCom: selisih CFO dikurangi CFI yang terus negatif (sampai bikin "lubang" $12 miliar) udah ngasih tanda bahaya jauh sebelum laba bersih dan CFO yang dipoles lewat kapitalisasi beban itu ambruk. Pola yang sama keliatan di industri otomotif, pas GM ngelaporin CFO $7,6 miliar yang sebenernya cuma $3,5 miliar kalau piutang dealer dianggap operasi. Di praktik valuasi, FCF yang didiskontoin pakai WACC jadi tulang punggung penilaian saham — persis logika nilai intrinsik yang dianjurin Buffett. Jadi baik analis kredit maupun investor harusnya nyusun ulang arus kasnya dulu, jangan langsung ditelan mentah-mentah.</w:t>
       </w:r>
     </w:p>
     <w:p>
@@ -3236,7 +3218,7 @@
           <w:i w:val="0"/>
           <w:sz w:val="24"/>
         </w:rPr>
-        <w:t>Materi ini berdiri di persimpangan beberapa disiplin. Dalam analisis laporan keuangan, SCF memasok dasar rasio likuiditas dan kualitas laba yang lebih dapat diandalkan ketimbang rasio yang ditarik dari neraca. Dalam manajemen keuangan, konsep FCF, NOPLAT, NPV, dan WACC menjadi jembatan langsung menuju teori penilaian dan penganggaran modal; definisi FCF di bab ini bahkan identik dengan yang dipakai dalam corporate valuation. Dalam audit, masalah nonartikulasi dan ruang klasifikasi berubah menjadi area berisiko yang menuntut pengujian substantif, karena di titik itulah manajemen memiliki keleluasaan untuk membingkai ulang kinerjanya.</w:t>
+        <w:t>Materi ini nyambung ke beberapa mata kuliah sekaligus. Di analisis laporan keuangan, SCF ngasih dasar rasio likuiditas dan kualitas laba yang lebih bisa dipercaya daripada rasio dari neraca. Di manajemen keuangan, konsep FCF, NOPLAT, NPV, dan WACC itu jembatan langsung ke teori penilaian dan penganggaran modal — bahkan definisi FCF di bab ini sama persis sama yang dipakai di corporate valuation. Di audit, masalah nonartikulasi dan ruang klasifikasi jadi area berisiko yang butuh pengujian lebih dalam, soalnya di situlah manajemen punya celah buat ngebingkai ulang kinerjanya.</w:t>
       </w:r>
     </w:p>
     <w:p>
@@ -3266,7 +3248,7 @@
           <w:i w:val="0"/>
           <w:sz w:val="24"/>
         </w:rPr>
-        <w:t>Kelebihan SCF cukup nyata. Ia mengurangi kesewenang-wenangan pengukuran laba, memperbaiki keterbandingan antarperusahaan, dan memberi dasar yang relatif kokoh untuk menilai likuiditas dan daya prediksi. Namun keterbatasannya tidak pantas ditutupi. Nonartikulasi membuat SCF metode tidak langsung tampak berselisih dengan neraca pada 75 persen kasus. Ruang klasifikasi yang dibiarkan SFAS No. 95, mulai dari bunga yang diperlakukan secara proprietary, kelenturan IAS 7, empat metode premium, hingga lindung nilai SFAS No. 104, memungkinkan perusahaan sejenis menampilkan gambaran yang berlawanan, sehingga keterbandingan yang dijanjikan ikut tergerus. FCF sendiri, betapapun populer untuk valuasi, tetap berstatus non-GAAP: tidak terstandar, tidak dapat ditarik langsung dari SCF, dan rentan terhadap perbedaan definisi antarperusahaan. Pada akhirnya SCF memang unggul pada hal yang lebih objektif, yaitu kas, tetapi ia tetap mewarisi masalah alokasi dan klasifikasi yang justru ingin dihindarinya.</w:t>
+        <w:t>Kelebihan SCF cukup nyata: dia ngurangin kesewenang-wenangan dalam ngukur laba, bikin perusahaan lebih bisa dibandingin, dan ngasih dasar yang relatif kuat buat nilai likuiditas dan daya ramal. Tapi keterbatasannya jangan ditutup-tutupi. Nonartikulasi bikin SCF metode tidak langsung keliatan nggak nyambung sama neraca di 75 persen kasus. Ruang klasifikasi yang dibiarin SFAS No. 95 — bunga yang proprietary, kelonggaran IAS 7, empat metode premium, lindung nilai SFAS No. 104 — bikin perusahaan sejenis bisa nampilin gambaran yang kebalik, jadi janji keterbandingan tadi ikut luntur. FCF sendiri, walau populer buat valuasi, statusnya non-GAAP: nggak terstandar, nggak bisa diambil langsung dari SCF, dan definisinya bisa beda-beda antarperusahaan. Jadi intinya, SCF unggul di hal yang lebih objektif (kas), tapi tetap kebawa masalah alokasi dan klasifikasi yang sebenernya pengen dia hindari.</w:t>
       </w:r>
     </w:p>
     <w:p>
@@ -3296,7 +3278,7 @@
           <w:i w:val="0"/>
           <w:sz w:val="24"/>
         </w:rPr>
-        <w:t>Dari keseluruhan pembahasan, Statement of Cash Flows pada dasarnya adalah kasus khusus dari Statement of Changes in Financial Position dengan dana didefinisikan sebagai kas, dan tetap berwatak sebagai laporan turunan yang menata ulang data laba rugi dan neraca ke dalam trikotomi operasi, investasi, dan pendanaan. Pesan utamanya, kaslah yang menentukan kelangsungan dan nilai perusahaan, bukan laba akrual, sehingga SCF hadir untuk meredam kesewenang-wenangan pengukuran laba sekaligus mempertinggi keterbandingan dan daya prediksi. Manfaatnya berjalan di dua arah: bagi pengguna eksternal ia menjadi dasar menilai likuiditas, fleksibilitas keuangan, dan kualitas laba, sedangkan bagi analis valuasi ia menjadi titik tolak perhitungan free cash flow yang didiskontokan dengan biaya modal. Dalam praktik, manfaat itu terlihat pada analisis solvabilitas dan deteksi kecurangan; kasus WorldCom maupun industri otomotif menunjukkan bahwa membaca SCF secara utuh, lintas ketiga bagiannya, mampu menyingkap tekanan kas yang tersembunyi di balik laba yang tampak sehat. Namun bab ini juga mengajarkan kerendahan hati metodologis, sebab nonartikulasi, ruang klasifikasi SFAS No. 95, dan sifat non-GAAP dari FCF membatasi klaim objektivitas SCF. Sumbangannya bagi ilmu akuntansi terletak pada penegasan bahwa pelaporan berbasis kas dan berbasis akrual saling melengkapi alih-alih saling menggantikan, dan bahwa mutu sebuah standar diukur bukan dari kelengkapannya semata, melainkan dari sejauh mana ia membatasi diskresi yang berpotensi menyesatkan pengguna (Wolk et al., 2017).</w:t>
+        <w:t>Kalau ditarik dari semua pembahasan, SCF itu pada dasarnya versi khusus dari SCFP, bedanya "dana" diartikan sebagai kas, dan dia tetap berupa laporan turunan yang nyusun ulang data laba rugi dan neraca ke dalam tiga bagian: operasi, investasi, dan pendanaan. Pesan utamanya, yang nentuin nasib dan nilai perusahaan itu kas, bukan laba akrual, makanya SCF hadir buat ngeredam kesewenang-wenangan dalam ngukur laba sekaligus bikin laporan lebih bisa dibandingin dan lebih bisa diandalkan buat meramal. Manfaatnya jalan ke dua arah: buat pengguna luar, dia jadi dasar nilai likuiditas, fleksibilitas keuangan, dan kualitas laba; buat analis valuasi, dia jadi titik awal ngitung free cash flow yang didiskontoin pakai biaya modal. Di praktik, manfaat ini keliatan di analisis solvabilitas dan deteksi kecurangan — kasus WorldCom dan industri otomotif nunjukin bahwa baca SCF secara utuh, lintas tiga bagiannya, bisa nyingkap tekanan kas yang ngumpet di balik laba yang keliatan sehat. Tapi bab ini juga ngajarin kita buat rendah hati: nonartikulasi, ruang klasifikasi SFAS No. 95, dan sifat non-GAAP dari FCF bikin klaim objektivitas SCF ada batasnya. Sumbangan terbesarnya buat ilmu akuntansi adalah penegasan bahwa laporan berbasis kas dan berbasis akrual itu saling melengkapi, bukan saling gantiin, dan bahwa bagus-tidaknya sebuah standar diukur bukan dari selengkap apa, tapi dari seberapa jauh dia ngebatasin celah yang bisa nyesatin pengguna (Wolk et al., 2017).</w:t>
       </w:r>
     </w:p>
     <w:p>
@@ -3336,7 +3318,7 @@
           <w:i w:val="0"/>
           <w:sz w:val="24"/>
         </w:rPr>
-        <w:t xml:space="preserve">Mengapa FASB lewat SFAS No. 95 (1987) akhirnya mendefinisikan dana sebagai kas dan menggantikan SCFP, dan apa tiga kelemahan modal kerja bersih sebagai ukuran likuiditas? </w:t>
+        <w:t xml:space="preserve">Kenapa FASB lewat SFAS No. 95 (1987) akhirnya ngeartiin "dana" sebagai kas dan ngegantiin SCFP, dan apa tiga kelemahan modal kerja bersih sebagai ukuran likuiditas? </w:t>
       </w:r>
       <w:r>
         <w:rPr>
@@ -3345,7 +3327,7 @@
           <w:i/>
           <w:sz w:val="24"/>
         </w:rPr>
-        <w:t>Jawaban: karena kas jauh lebih lugas untuk dibaca. Modal kerja bersih dinilai lemah sebab memuat beban dan kredit tangguhan yang tak berkonsekuensi kas, mengandaikan siklus operasi yang bisa melebihi setahun, serta menilai persediaan berbasis biaya sehingga tidak menggambarkan potensi kasnya.</w:t>
+        <w:t>Jawaban: karena kas jauh lebih gampang dibaca. Modal kerja bersih dianggap lemah soalnya ada beban dan kredit tangguhan yang nggak ada urusannya sama kas, siklus operasinya bisa lebih dari setahun, dan persediaan dicatat pakai biaya jadi nggak nunjukin potensi kasnya.</w:t>
       </w:r>
     </w:p>
     <w:p>
@@ -3370,7 +3352,7 @@
           <w:i w:val="0"/>
           <w:sz w:val="24"/>
         </w:rPr>
-        <w:t xml:space="preserve">Apa yang dimaksud trikotomi tiga arah dalam SCF, dan apa isi keberatan tiga anggota FASB? </w:t>
+        <w:t xml:space="preserve">Apa itu pembagian tiga arah dalam SCF, dan apa isi keberatan tiga anggota FASB? </w:t>
       </w:r>
       <w:r>
         <w:rPr>
@@ -3379,7 +3361,7 @@
           <w:i/>
           <w:sz w:val="24"/>
         </w:rPr>
-        <w:t>Jawaban: SCF menggolongkan arus kas ke dalam aktivitas operasi, investasi, dan pendanaan. Tiga anggota yang dissent berpendapat bunga dan dividen yang diterima sebenarnya aktivitas investasi, dan bunga yang dibayar adalah pendanaan, bukan operasi.</w:t>
+        <w:t>Jawaban: SCF ngebagi arus kas ke aktivitas operasi, investasi, dan pendanaan. Tiga anggota yang nolak berpendapat bunga dan dividen yang diterima itu sebenernya investasi, dan bunga yang dibayar itu pendanaan, bukan operasi.</w:t>
       </w:r>
     </w:p>
     <w:p>
@@ -3404,7 +3386,7 @@
           <w:i w:val="0"/>
           <w:sz w:val="24"/>
         </w:rPr>
-        <w:t xml:space="preserve">Apa beda metode langsung dan tidak langsung, dan mengapa mayoritas perusahaan Amerika memilih metode tidak langsung meski FASB lebih menyukai yang langsung? </w:t>
+        <w:t xml:space="preserve">Apa beda metode langsung dan tidak langsung, dan kenapa kebanyakan perusahaan Amerika milih metode tidak langsung padahal FASB lebih suka yang langsung? </w:t>
       </w:r>
       <w:r>
         <w:rPr>
@@ -3413,7 +3395,7 @@
           <w:i/>
           <w:sz w:val="24"/>
         </w:rPr>
-        <w:t>Jawaban: metode langsung melaporkan arus kas literal dan lebih informatif tetapi mahal disusun, sedangkan metode tidak langsung merekonsiliasi laba akrual ke kas dan lebih murah, itulah sebab dominasinya. Studi McEnroe menemukan 56 persen pengguna justru memilih metode langsung berbanding 44 persen.</w:t>
+        <w:t>Jawaban: metode langsung ngelaporin arus kas apa adanya dan lebih informatif tapi mahal dibuat, sedangkan metode tidak langsung nyocokin laba akrual ke kas dan lebih murah — itu alasan dia dominan. Studi McEnroe malah nemu 56 persen pengguna milih metode langsung, 44 persen tidak langsung.</w:t>
       </w:r>
     </w:p>
     <w:p>
@@ -3438,7 +3420,7 @@
           <w:i w:val="0"/>
           <w:sz w:val="24"/>
         </w:rPr>
-        <w:t xml:space="preserve">Apa itu masalah nonartikulasi, siapa yang mendokumentasikannya, dan apa tiga penyebab utamanya? </w:t>
+        <w:t xml:space="preserve">Apa itu masalah nonartikulasi, siapa yang nelitiinnya, dan apa tiga penyebab utamanya? </w:t>
       </w:r>
       <w:r>
         <w:rPr>
@@ -3447,7 +3429,7 @@
           <w:i/>
           <w:sz w:val="24"/>
         </w:rPr>
-        <w:t>Jawaban: keadaan ketika penyesuaian modal kerja di bagian operasi tidak sama dengan perubahan akun neraca, yang ditemukan Bahnson, Miller, dan Budge pada 75 persen sampel. Penyebabnya adalah akuisisi tengah tahun, transaksi modal kerja yang tidak menyentuh kas, dan satu akun utang usaha yang dipakai bersama untuk pembelian operasi maupun investasi.</w:t>
+        <w:t>Jawaban: keadaan pas penyesuaian modal kerja di bagian operasi nggak sama dengan perubahan akun neraca, yang ditemuin Bahnson, Miller &amp; Budge di 75 persen sampel. Penyebabnya: akuisisi tengah tahun, transaksi modal kerja yang nggak nyentuh kas, dan satu akun utang usaha yang dipakai bareng buat pembelian operasi maupun investasi.</w:t>
       </w:r>
     </w:p>
     <w:p>
@@ -3472,7 +3454,7 @@
           <w:i w:val="0"/>
           <w:sz w:val="24"/>
         </w:rPr>
-        <w:t xml:space="preserve">Tuliskan persamaan free cash flow dan jelaskan mengapa FCF tidak bisa dibaca langsung dari SCF. </w:t>
+        <w:t xml:space="preserve">Tulis rumus free cash flow dan jelasin kenapa FCF nggak bisa diambil langsung dari SCF. </w:t>
       </w:r>
       <w:r>
         <w:rPr>
@@ -3481,7 +3463,7 @@
           <w:i/>
           <w:sz w:val="24"/>
         </w:rPr>
-        <w:t>Jawaban: FCF sama dengan NOPLAT dikurangi investasi pada modal terinvestasi operasi. Ia tidak dapat ditarik langsung karena CFO masih mengandung beban bunga pendanaan dan tidak memperlakukan kenaikan kas operasi sebagai investasi, sehingga perlu disesuaikan dengan menambah bunga setelah pajak, mengurangi kenaikan kas operasi, lalu menambahkan CFI.</w:t>
+        <w:t>Jawaban: FCF = NOPLAT − investasi pada modal terinvestasi operasi. Nggak bisa langsung soalnya CFO masih ngandung beban bunga pendanaan dan nggak nganggep kenaikan kas operasi sebagai investasi, jadi perlu disesuaikan — tambah bunga setelah pajak, kurangi kenaikan kas operasi, terus tambahin CFI.</w:t>
       </w:r>
     </w:p>
     <w:p>
@@ -3506,7 +3488,7 @@
           <w:i w:val="0"/>
           <w:sz w:val="24"/>
         </w:rPr>
-        <w:t xml:space="preserve">Berkaca pada WorldCom, mengapa SCF harus dibaca secara utuh dan tidak berhenti pada arus kas operasi? </w:t>
+        <w:t xml:space="preserve">Pakai kasus WorldCom, jelasin kenapa SCF harus dibaca utuh dan jangan berhenti di arus kas operasi aja. </w:t>
       </w:r>
       <w:r>
         <w:rPr>
@@ -3515,7 +3497,7 @@
           <w:i/>
           <w:sz w:val="24"/>
         </w:rPr>
-        <w:t>Jawaban: WorldCom mengapitalisasi beban operasi sehingga CFO membengkak dan laba bersih tampak kredibel. Selisih CFO dikurangi CFI yang terus negatif justru menyingkap defisit kumulatif $12 miliar hingga 31 Desember 2001, sinyal yang hanya terbaca bila ketiga bagian SCF dibaca bersama.</w:t>
+        <w:t>Jawaban: WorldCom ngapitalisasi beban operasi jadi CFO-nya ngegelembung dan laba bersih keliatan meyakinkan. Tapi selisih CFO dikurangi CFI yang terus negatif nyingkap "lubang" kumulatif $12 miliar per 31 Desember 2001 — tanda yang cuma keliatan kalau ketiga bagian SCF dibaca barengan.</w:t>
       </w:r>
     </w:p>
     <w:p>
@@ -3540,7 +3522,7 @@
           <w:i w:val="0"/>
           <w:sz w:val="24"/>
         </w:rPr>
-        <w:t xml:space="preserve">Mengapa klasifikasi bunga dan dividen mencerminkan ketegangan antara proprietary theory dan entity theory, dan bagaimana IAS 7 menyikapinya? </w:t>
+        <w:t xml:space="preserve">Kenapa klasifikasi bunga dan dividen nunjukin ketegangan antara proprietary theory dan entity theory, dan gimana sikap IAS 7? </w:t>
       </w:r>
       <w:r>
         <w:rPr>
@@ -3549,7 +3531,7 @@
           <w:i/>
           <w:sz w:val="24"/>
         </w:rPr>
-        <w:t>Jawaban: SFAS No. 95 berorientasi proprietary sehingga bunga dan dividen masuk ke operasi, sedangkan entity theory menggolongkannya sebagai investasi atau pendanaan. IAS 7 mengambil sikap lentur dengan membolehkan klasifikasi operasi, investasi, atau pendanaan, asalkan diterapkan konsisten antarperiode.</w:t>
+        <w:t>Jawaban: SFAS No. 95 berorientasi proprietary jadi bunga dan dividen masuk operasi, sedangkan entity theory ngegolongin keduanya investasi atau pendanaan. IAS 7 lebih santai — boleh operasi, investasi, atau pendanaan, asalkan konsisten dari tahun ke tahun.</w:t>
       </w:r>
     </w:p>
     <w:p>

</xml_diff>

<commit_message>
style(rmk10): simplify to plain professional register (Bagian A–E); rebuild docx
Shorter direct sentences and plainer vocabulary for easier comprehension while
keeping a formal professional academic voice (no slang). Facts, figures,
citations, exhibit/diagram placements, and Cornell structure unchanged.

Co-Authored-By: Claude Opus 4.8 (1M context) <noreply@anthropic.com>
</commit_message>
<xml_diff>
--- a/rmk-pkk-pert10-statement-of-cash-flows/output/01079_Dzaki Muhammad Yusfian_RMK Pert. 10.docx
+++ b/rmk-pkk-pert10-statement-of-cash-flows/output/01079_Dzaki Muhammad Yusfian_RMK Pert. 10.docx
@@ -183,7 +183,7 @@
                 <w:i w:val="0"/>
                 <w:sz w:val="22"/>
               </w:rPr>
-              <w:t>Kenapa bab ini buka dengan "cash is cash is cash"?</w:t>
+              <w:t>Mengapa bab ini dibuka dengan ungkapan "cash is cash is cash"?</w:t>
             </w:r>
           </w:p>
         </w:tc>
@@ -204,7 +204,7 @@
                 <w:i w:val="0"/>
                 <w:sz w:val="22"/>
               </w:rPr>
-              <w:t xml:space="preserve">Wolk mulai dengan cerita dari musikal </w:t>
+              <w:t xml:space="preserve">Wolk membuka bab ini dengan anekdot dari musikal </w:t>
             </w:r>
             <w:r>
               <w:rPr>
@@ -222,7 +222,7 @@
                 <w:i w:val="0"/>
                 <w:sz w:val="22"/>
               </w:rPr>
-              <w:t xml:space="preserve">, waktu para pedagang teriak minta dibayar tunai untuk barang dagangan mereka. Pesannya simpel: pada akhirnya semua tagihan, investasi, utang, dan dividen dibayar pakai kas, bukan pakai laba. Perusahaan yang nggak bisa menghasilkan kas yang cukup dari operasinya, lama-lama bakal mati. Nah, di situlah daya tarik laporan berbasis kas: angkanya apa adanya, nggak banyak bisa ditafsir macam-macam seperti laba akrual. Inilah alasan dasar kenapa </w:t>
+              <w:t xml:space="preserve">. Dalam adegan itu, para pedagang menuntut pembayaran tunai atas barang dagangan mereka. Pesannya satu: pada akhirnya semua tagihan, investasi, utang, dan dividen dibayar dengan kas, bukan dengan laba. Perusahaan yang tidak mampu menghasilkan kas yang cukup dari operasinya akan tutup. Di sinilah letak kelebihan laporan berbasis kas, yaitu angkanya jelas dan tidak banyak menyisakan ruang tafsir seperti laba akrual. Alasan inilah yang menjadikan </w:t>
             </w:r>
             <w:r>
               <w:rPr>
@@ -240,7 +240,7 @@
                 <w:i w:val="0"/>
                 <w:sz w:val="22"/>
               </w:rPr>
-              <w:t xml:space="preserve"> (SCF, laporan arus kas) jadi pelengkap wajib di samping laporan keuangan berbasis akrual (Wolk et al., 2017).</w:t>
+              <w:t xml:space="preserve"> (SCF, laporan arus kas) sebagai pelengkap wajib bagi laporan keuangan berbasis akrual (Wolk et al., 2017).</w:t>
             </w:r>
           </w:p>
         </w:tc>
@@ -263,7 +263,7 @@
                 <w:i w:val="0"/>
                 <w:sz w:val="22"/>
               </w:rPr>
-              <w:t>Gimana alur bab ini, dan dua masalah utamanya apa?</w:t>
+              <w:t>Bagaimana alur bab ini dan apa dua masalah utamanya?</w:t>
             </w:r>
           </w:p>
         </w:tc>
@@ -284,7 +284,7 @@
                 <w:i w:val="0"/>
                 <w:sz w:val="22"/>
               </w:rPr>
-              <w:t xml:space="preserve">Bab ini pertama-tama ngomongin pendahulu SCF, yaitu </w:t>
+              <w:t xml:space="preserve">Bab ini lebih dulu membahas pendahulu SCF, yaitu </w:t>
             </w:r>
             <w:r>
               <w:rPr>
@@ -302,7 +302,7 @@
                 <w:i w:val="0"/>
                 <w:sz w:val="22"/>
               </w:rPr>
-              <w:t xml:space="preserve"> (SCFP, laporan perubahan posisi keuangan), baru masuk ke kenapa dan bagaimana SCF disusun. Sepanjang jalan, Wolk jujur soal dua kelemahan bawaan SCF: pertama ketakterartikulasian (</w:t>
+              <w:t xml:space="preserve"> (SCFP, laporan perubahan posisi keuangan), baru kemudian masuk ke alasan dan struktur SCF. Wolk juga terus terang menyebut dua kelemahan SCF. Pertama, ketakterartikulasian (</w:t>
             </w:r>
             <w:r>
               <w:rPr>
@@ -320,7 +320,7 @@
                 <w:i w:val="0"/>
                 <w:sz w:val="22"/>
               </w:rPr>
-              <w:t xml:space="preserve">) yang muncul gara-gara metode tidak langsung di bagian operasi, dan kedua masalah klasifikasi dalam pembagian tiga arah ala FASB. Dua-duanya bermuara ke satu nasihat praktis: SCF harus dibaca utuh, jangan cuma sepotong. Di bagian akhir, bab ini ngenalin </w:t>
+              <w:t xml:space="preserve">), yang muncul dari pemakaian metode tidak langsung pada bagian operasi. Kedua, masalah klasifikasi dalam pembagian tiga arah ala FASB. Keduanya mengarah pada satu pesan praktis: SCF harus dibaca secara utuh, bukan sepotong-sepotong. Bagian akhir bab memperkenalkan </w:t>
             </w:r>
             <w:r>
               <w:rPr>
@@ -338,7 +338,7 @@
                 <w:i w:val="0"/>
                 <w:sz w:val="22"/>
               </w:rPr>
-              <w:t xml:space="preserve"> (FCF, arus kas bebas), ukuran non-GAAP yang justru lahir karena SCF punya kelemahan tadi, lalu ditutup dengan ulasan riset dan usulan perbaikan (Wolk et al., 2017).</w:t>
+              <w:t xml:space="preserve"> (FCF, arus kas bebas), sebuah ukuran non-GAAP yang justru lahir karena kelemahan SCF, lalu ditutup dengan ulasan riset dan usulan perbaikan (Wolk et al., 2017).</w:t>
             </w:r>
           </w:p>
         </w:tc>
@@ -382,7 +382,7 @@
                 <w:i w:val="0"/>
                 <w:sz w:val="22"/>
               </w:rPr>
-              <w:t>Biar paham kenapa SCF penting, kita perlu lihat dulu pendahulunya. SCFP itu kelanjutan dari laporan arus dana (</w:t>
+              <w:t>Untuk memahami pentingnya SCF, kita perlu melihat pendahulunya. SCFP adalah kelanjutan dari laporan arus dana (</w:t>
             </w:r>
             <w:r>
               <w:rPr>
@@ -400,7 +400,7 @@
                 <w:i w:val="0"/>
                 <w:sz w:val="22"/>
               </w:rPr>
-              <w:t>), yang menganggap akun-akun modal kerja sebagai "saldo dana", dan tujuannya nunjukin gimana saldo itu naik karena laba dan turun karena rugi atau penggunaan lain. APB Opinion No. 19 nyebut tiga tujuan laporan ini: melengkapi pengungkapan perubahan posisi keuangan, meringkas aktivitas pendanaan dan investasi, dan melaporkan arus dana dari operasi. Karena semua angkanya cuma "mendaur ulang" data yang sudah ada di laporan laba rugi dan neraca, SCFP disebut laporan turunan. Pengakuannya nggak langsung jadi: APB Opinion No. 3 (1963) baru sebatas menyarankan, SEC mewajibkannya untuk pelaporan resmi pada 1971, dan di tahun yang sama APB merespons dengan Opinion No. 19 yang mewajibkannya penuh (Wolk et al., 2017).</w:t>
+              <w:t>). Laporan ini memperlakukan akun-akun modal kerja sebagai saldo dana, dan tujuannya menunjukkan bagaimana saldo itu naik karena laba dan turun karena rugi atau penggunaan lain. APB Opinion No. 19 menetapkan tiga tujuan laporan ini: melengkapi pengungkapan perubahan posisi keuangan, meringkas aktivitas pendanaan dan investasi, serta melaporkan arus dana dari operasi. Karena seluruh angkanya hanya menata ulang data yang sudah ada di laporan laba rugi dan neraca, SCFP disebut laporan turunan. Pengakuannya berlangsung bertahap. APB Opinion No. 3 (1963) baru menyarankan pencantumannya, SEC mewajibkannya untuk pelaporan resmi pada 1971, dan pada tahun yang sama APB merespons dengan Opinion No. 19 yang mewajibkannya secara penuh (Wolk et al., 2017).</w:t>
             </w:r>
           </w:p>
         </w:tc>
@@ -423,7 +423,7 @@
                 <w:i w:val="0"/>
                 <w:sz w:val="22"/>
               </w:rPr>
-              <w:t>Gimana logika sources/uses dan empat pilihan definisi dana?</w:t>
+              <w:t>Bagaimana logika sources/uses dan empat pilihan definisi dana?</w:t>
             </w:r>
           </w:p>
         </w:tc>
@@ -444,7 +444,7 @@
                 <w:i w:val="0"/>
                 <w:sz w:val="22"/>
               </w:rPr>
-              <w:t>SCFP punya dua sisi yang saling mengimbangi. Ada sumber sumber daya (</w:t>
+              <w:t>SCFP memiliki dua sisi yang saling mengimbangi. Sisi pertama adalah sumber sumber daya (</w:t>
             </w:r>
             <w:r>
               <w:rPr>
@@ -462,7 +462,7 @@
                 <w:i w:val="0"/>
                 <w:sz w:val="22"/>
               </w:rPr>
-              <w:t>), yang datang dari naiknya ekuitas dan turunnya aset, dan ada penggunaan sumber daya (</w:t>
+              <w:t>), yang berasal dari kenaikan ekuitas dan penurunan aset. Sisi kedua adalah penggunaan sumber daya (</w:t>
             </w:r>
             <w:r>
               <w:rPr>
@@ -480,7 +480,7 @@
                 <w:i w:val="0"/>
                 <w:sz w:val="22"/>
               </w:rPr>
-              <w:t>), yang datang dari turunnya ekuitas dan naiknya aset. Semuanya ujungnya ke satu persamaan dasar 13.1: kredit transaksi = debit transaksi. Naiknya ekuitas itu artinya ada pendanaan, entah dari luar (utang, jual saham) atau dari dalam (laba, jual aset), sementara turunnya ekuitas berarti bayar utang, beli saham treasuri, bagi dividen, atau rugi. Kalau transaksi yang nggak nyentuh kas ikut dimasukin — misalnya utang yang diubah jadi saham, atau saham yang dipakai nuker aset nonkas — SCFP berubah jadi ringkasan menyeluruh yang disebut pendekatan mencakup-semua (</w:t>
+              <w:t>), yang berasal dari penurunan ekuitas dan kenaikan aset. Keduanya bertemu pada satu persamaan dasar, yaitu persamaan 13.1: kredit transaksi sama dengan debit transaksi. Kenaikan ekuitas menandakan adanya pendanaan, baik dari luar (utang dan penerbitan saham) maupun dari dalam (laba dan hasil penjualan aset). Sebaliknya, penurunan ekuitas menandakan pembayaran utang, pembelian saham treasuri, pembagian dividen, atau rugi. Bila transaksi yang tidak melibatkan kas ikut dicatat, misalnya utang yang diubah menjadi saham, SCFP menjadi ringkasan menyeluruh yang disebut pendekatan mencakup-semua (</w:t>
             </w:r>
             <w:r>
               <w:rPr>
@@ -498,7 +498,7 @@
                 <w:i w:val="0"/>
                 <w:sz w:val="22"/>
               </w:rPr>
-              <w:t>). Sebenarnya Opinion No. 19 ngasih empat pilihan arti "dana": kas, kas plus near cash, quick assets, atau modal kerja. Tapi karena definisi modal kerja paling murah dibuat dan paling sedikit ribet, kebanyakan perusahaan milih itu (Wolk et al., 2017; lihat Exhibit 13.1).</w:t>
+              <w:t>). Opinion No. 19 sebenarnya menyediakan empat pilihan arti dana, yaitu kas, kas plus near cash, quick assets, atau modal kerja. Karena definisi modal kerja paling murah disusun dan paling sederhana, sebagian besar perusahaan memilihnya (Wolk et al., 2017; lihat Exhibit 13.1).</w:t>
             </w:r>
           </w:p>
         </w:tc>
@@ -682,7 +682,7 @@
                 <w:i w:val="0"/>
                 <w:sz w:val="22"/>
               </w:rPr>
-              <w:t>Kenapa akhirnya "dana" diartikan sebagai kas?</w:t>
+              <w:t>Mengapa pada akhirnya dana didefinisikan sebagai kas?</w:t>
             </w:r>
           </w:p>
         </w:tc>
@@ -703,7 +703,7 @@
                 <w:i w:val="0"/>
                 <w:sz w:val="22"/>
               </w:rPr>
-              <w:t>Pas FASB lagi godok SCF, mereka sepakat bahwa "dana" mendingan diartikan kas, bukan modal kerja bersih. Soalnya modal kerja bersih itu ukuran likuiditas yang payah. Ada tiga alasannya kalau dipikir-pikir: di dalamnya ada beban dan kredit tangguhan yang sebenarnya nggak ada urusannya sama kas; buat perusahaan dengan siklus operasi panjang, ngubah aset lancar jadi kas bisa makan waktu setahun lebih; dan pos seperti persediaan dicatat pakai biaya, jadi nggak nunjukin berapa kas yang bisa dihasilkan. Di tengah kerumitan kayak gini, lapor pakai kas jelas lebih gampang dipahami (Wolk et al., 2017).</w:t>
+              <w:t>Saat menyusun SCF, FASB menyimpulkan bahwa dana sebaiknya berarti kas, bukan modal kerja bersih. Alasannya, modal kerja bersih adalah ukuran likuiditas yang lemah, dan ada tiga sebabnya. Pertama, di dalamnya terdapat beban dan kredit tangguhan yang sebenarnya tidak berkaitan dengan kas. Kedua, bagi perusahaan dengan siklus operasi panjang, mengubah aset lancar menjadi kas bisa memakan waktu setahun atau lebih. Ketiga, pos seperti persediaan dicatat berdasarkan biaya, sehingga tidak menunjukkan berapa kas yang dapat dihasilkan. Di tengah kerumitan itu, pelaporan berbasis kas jauh lebih mudah dipahami (Wolk et al., 2017).</w:t>
             </w:r>
           </w:p>
         </w:tc>
@@ -726,7 +726,7 @@
                 <w:i w:val="0"/>
                 <w:sz w:val="22"/>
               </w:rPr>
-              <w:t>Gimana SFAS No. 95 menggantikan SCFP, dan apa hubungannya dengan SFAC No. 1 dan No. 5?</w:t>
+              <w:t>Bagaimana SFAS No. 95 menggantikan SCFP, dan apa kaitannya dengan SFAC No. 1 dan No. 5?</w:t>
             </w:r>
           </w:p>
         </w:tc>
@@ -747,7 +747,7 @@
                 <w:i w:val="0"/>
                 <w:sz w:val="22"/>
               </w:rPr>
-              <w:t>Tahun 1987 FASB mewajibkan SCF lewat SFAS No. 95, sekaligus "memensiunkan" SCFP. Dasarnya sudah disiapkan kerangka konseptual. SFAC No. 1 nyebut tiga tujuan pelaporan keuangan: tujuan pertama luas (ngasih info yang berguna buat keputusan investasi dan kredit), sedangkan dua tujuan lain — info soal sumber daya bersih perusahaan beserta perubahannya, dan info buat menilai arus kas masa depan — sebenarnya cara konkret mewujudkan tujuan pertama. Dua tujuan terakhir inilah yang bikin SCF diadopsi di era 1980-an. SFAC No. 5 mempertegas: SCF nunjukin gimana perusahaan menghasilkan kas dari operasi buat bayar utang, bagi dividen, atau investasi lagi, plus aktivitas pendanaan dan investasinya. Gunanya buat menilai likuiditas, fleksibilitas keuangan, profitabilitas, dan risiko (Wolk et al., 2017).</w:t>
+              <w:t>Pada 1987 FASB mewajibkan SCF melalui SFAS No. 95, sekaligus menggantikan SCFP. Dasarnya sudah disiapkan oleh kerangka konseptual. SFAC No. 1 menyebut tiga tujuan pelaporan keuangan. Tujuan pertama bersifat luas, yaitu menyediakan informasi yang berguna untuk keputusan investasi dan kredit. Dua tujuan berikutnya, yaitu informasi tentang sumber daya bersih perusahaan beserta perubahannya dan informasi untuk menilai arus kas masa depan, sebenarnya merupakan cara konkret mewujudkan tujuan pertama. Dua tujuan terakhir inilah yang mendorong adopsi SCF pada 1980-an. SFAC No. 5 menegaskan bahwa SCF menunjukkan bagaimana perusahaan menghasilkan kas dari operasi untuk membayar utang, membagi dividen, atau berinvestasi kembali, di samping aktivitas pendanaan dan investasinya. Informasi ini berguna untuk menilai likuiditas, fleksibilitas keuangan, profitabilitas, dan risiko (Wolk et al., 2017).</w:t>
             </w:r>
           </w:p>
         </w:tc>
@@ -791,7 +791,7 @@
                 <w:i w:val="0"/>
                 <w:sz w:val="22"/>
               </w:rPr>
-              <w:t>Sebuah discussion memorandum FASB ngasih enam alasan kenapa data arus kas itu pelengkap yang berharga: ngasih umpan balik soal arus kas yang sebenarnya, bantu ngaitin laba akuntansi dengan arus kas, nunjukin kualitas laba, bikin info lebih bisa dibandingkan, bantu menilai fleksibilitas dan likuiditas, dan bantu memprediksi arus kas ke depan. Benang merahnya satu: semuanya soal keterbatasan akuntansi akrual. Jadi data arus kas bukan buat ngegantiin data akrual, tapi buat ngelengkapinnya (Wolk et al., 2017).</w:t>
+              <w:t>Sebuah discussion memorandum FASB menyebut enam alasan mengapa data arus kas adalah pelengkap yang berharga. Data ini memberi umpan balik atas arus kas yang sebenarnya, membantu mengaitkan laba akuntansi dengan arus kas, menunjukkan kualitas laba, memperbaiki keterbandingan informasi, membantu menilai fleksibilitas dan likuiditas, serta membantu memprediksi arus kas masa depan. Keenam alasan ini sebenarnya berakar pada satu hal yang sama, yaitu keterbatasan akuntansi akrual. Karena itu, data arus kas tidak menggantikan data akrual, melainkan melengkapinya (Wolk et al., 2017).</w:t>
             </w:r>
           </w:p>
         </w:tc>
@@ -814,7 +814,7 @@
                 <w:i w:val="0"/>
                 <w:sz w:val="22"/>
               </w:rPr>
-              <w:t>Apa itu kualitas laba, dan gimana arus kas bantu masalah keseragaman?</w:t>
+              <w:t>Apa itu kualitas laba, dan bagaimana arus kas membantu masalah keseragaman?</w:t>
             </w:r>
           </w:p>
         </w:tc>
@@ -853,7 +853,7 @@
                 <w:i w:val="0"/>
                 <w:sz w:val="22"/>
               </w:rPr>
-              <w:t>) itu istilah analis buat ngegambarin seberapa dekat arus kas dengan laba akuntansi: makin nyambung keduanya, makin tinggi kualitas labanya. Idenya, laba itu penuh akrual dan penundaan yang nggak melibatkan kas, jadi nggak selalu jadi penanda likuiditas yang bagus. Ada juga sisi lain, yaitu soal keseragaman. Kebebasan milih kebijakan akuntansi bisa bikin perusahaan susah dibandingin satu sama lain, sedangkan arus kas operasi lebih sedikit pilihannya jadi lebih seragam dan gampang diadu. Itulah kenapa SCF dianggap obat buat kesewenang-wenangan dalam ngukur laba — arus kas itu jernih dan nyata, beda sama laba yang abstrak (Wolk et al., 2017).</w:t>
+              <w:t>) adalah istilah analis untuk menggambarkan seberapa dekat arus kas dengan laba akuntansi. Semakin sejalan keduanya, semakin tinggi kualitas labanya. Konsep ini berangkat dari kenyataan bahwa laba penuh dengan akrual dan penundaan yang tidak melibatkan kas, sehingga tidak selalu menjadi penanda likuiditas yang baik. Ada pula sisi lain, yaitu masalah keseragaman. Kebebasan memilih kebijakan akuntansi dapat membuat perusahaan sulit dibandingkan satu sama lain. Sebaliknya, arus kas operasi memiliki lebih sedikit pilihan kebijakan, sehingga lebih seragam dan lebih mudah dibandingkan. Itulah sebabnya SCF dianjurkan sebagai penawar kesewenang-wenangan dalam mengukur laba, sebab arus kas bersifat jelas dan nyata, berbeda dengan laba yang abstrak (Wolk et al., 2017).</w:t>
             </w:r>
           </w:p>
         </w:tc>
@@ -876,7 +876,7 @@
                 <w:i w:val="0"/>
                 <w:sz w:val="22"/>
               </w:rPr>
-              <w:t>Apa beda fleksibilitas keuangan dan likuiditas, dan kenapa neraca nggak cukup?</w:t>
+              <w:t>Apa beda fleksibilitas keuangan dan likuiditas, dan mengapa neraca tidak cukup?</w:t>
             </w:r>
           </w:p>
         </w:tc>
@@ -915,7 +915,7 @@
                 <w:i w:val="0"/>
                 <w:sz w:val="22"/>
               </w:rPr>
-              <w:t>) itu kemampuan perusahaan nyesuaiin diri sama keadaan dan peluang baru, sedangkan likuiditas (</w:t>
+              <w:t>) adalah kemampuan perusahaan menyesuaikan diri dengan keadaan dan peluang baru. Likuiditas (</w:t>
             </w:r>
             <w:r>
               <w:rPr>
@@ -933,7 +933,7 @@
                 <w:i w:val="0"/>
                 <w:sz w:val="22"/>
               </w:rPr>
-              <w:t>) itu kemampuan ngubah aset jadi kas dengan cepat tanpa rugi. Kas hasil operasi sendiri ngasih petunjuk soal dua-duanya, soalnya kas itu yang dipakai buat bayar utang, danai investasi baru, dan bagi-bagi ke pemegang saham — persis alasan kenapa dulu laporan arus dana diwajibkan. Memang di neraca juga ada info likuiditas, tapi pembagian lancar dan taklancar itu pemandu yang kasar banget. Soalnya sebagian pos lancar cuma beban tangguhan tanpa efek kas, persediaan belum tentu cepat jadi kas, dan angka di neraca biasanya bukan nilai jual bersih jadi kita nggak tahu pasti berapa kas yang bakal dihasilkan suatu aset. Ada juga akuntansi harga keluar (</w:t>
+              <w:t>) adalah kemampuan mengubah aset menjadi kas dengan cepat tanpa mengalami kerugian. Kas yang dihasilkan sendiri dari operasi memberi petunjuk atas keduanya, sebab kas itulah yang dipakai untuk membayar utang, mendanai investasi baru, dan membagikan hasil kepada pemegang saham. Inilah alasan laporan arus dana dahulu diwajibkan. Neraca memang memuat informasi likuiditas, tetapi pembagian lancar dan taklancar adalah pemandu yang kasar. Sebagian pos lancar hanya beban tangguhan tanpa dampak kas, persediaan belum tentu cepat menjadi kas, dan angka di neraca umumnya bukan nilai jual bersih sehingga kas yang akan dihasilkan suatu aset tidak dapat dipastikan. Ada pula akuntansi harga keluar (</w:t>
             </w:r>
             <w:r>
               <w:rPr>
@@ -951,7 +951,7 @@
                 <w:i w:val="0"/>
                 <w:sz w:val="22"/>
               </w:rPr>
-              <w:t>) yang coba ngukur fleksibilitas lewat kas kalau aset dilikuidasi tanpa paksaan, tapi tetap kasar karena yang nentuin likuiditas itu kecepatan ngubahnya jadi kas. Soal apakah arus kas, arus dana, atau laba yang paling jitu meramal arus kas masa depan, itu masih jadi pertanyaan terbuka (Wolk et al., 2017).</w:t>
+              <w:t>) yang mencoba mengukur fleksibilitas melalui kas dari likuidasi tanpa paksaan, tetapi tetap kasar karena yang menentukan likuiditas adalah kecepatan mengubahnya menjadi kas. Soal mana yang paling tepat meramalkan arus kas masa depan, antara arus kas, arus dana, atau laba, masih menjadi pertanyaan terbuka (Wolk et al., 2017).</w:t>
             </w:r>
           </w:p>
         </w:tc>
@@ -995,7 +995,7 @@
                 <w:i w:val="0"/>
                 <w:sz w:val="22"/>
               </w:rPr>
-              <w:t>Kalau SCFP cuma main di kerangka "sumber dan penggunaan" yang mekanis, SCF nyusun penerimaan dan pengeluaran kas ke tiga kelompok yang lebih bermakna: aktivitas operasi, investasi, dan pendanaan. Pembagian tiga arah ini bikin klasifikasinya lebih konsisten dan lebih gampang dibandingin daripada SCFP. Tapi nggak semua setuju: tiga dari tujuh anggota FASB menolak. Menurut mereka, bunga dan dividen yang diterima itu sebenarnya aktivitas investasi (paragraf 22), dan bunga yang dibayar itu pendanaan, bukan biaya operasi (paragraf 23) — pandangan yang malah lebih cocok sama cara berpikir ilmu keuangan zaman sekarang (Wolk et al., 2017).</w:t>
+              <w:t>SCFP hanya bekerja dengan kerangka sumber dan penggunaan yang mekanis. SCF melangkah lebih jauh dengan menata penerimaan dan pengeluaran kas ke dalam tiga kelompok yang lebih bermakna, yaitu aktivitas operasi, investasi, dan pendanaan. Pembagian tiga arah ini membuat klasifikasinya lebih konsisten dan lebih mudah dibandingkan daripada SCFP. Meski begitu, tiga dari tujuh anggota FASB tidak setuju. Menurut mereka, bunga dan dividen yang diterima sebenarnya termasuk aktivitas investasi (paragraf 22), dan bunga yang dibayar termasuk pendanaan, bukan biaya operasi (paragraf 23). Pandangan ini justru lebih sesuai dengan cara berpikir ilmu keuangan masa kini (Wolk et al., 2017).</w:t>
             </w:r>
           </w:p>
         </w:tc>
@@ -1109,7 +1109,7 @@
                 <w:i w:val="0"/>
                 <w:sz w:val="22"/>
               </w:rPr>
-              <w:t>Gimana kas, setara kas, dan transaksi nonkas diperlakukan?</w:t>
+              <w:t>Bagaimana kas, setara kas, dan transaksi nonkas diperlakukan?</w:t>
             </w:r>
           </w:p>
         </w:tc>
@@ -1130,7 +1130,7 @@
                 <w:i w:val="0"/>
                 <w:sz w:val="22"/>
               </w:rPr>
-              <w:t>Di SCF, kas itu uang tunai di tangan atau simpanan yang bisa diambil kapan aja, ditambah setara kas (</w:t>
+              <w:t>Dalam SCF, kas berarti uang tunai di tangan atau simpanan yang dapat diambil sewaktu-waktu, ditambah setara kas (</w:t>
             </w:r>
             <w:r>
               <w:rPr>
@@ -1148,7 +1148,7 @@
                 <w:i w:val="0"/>
                 <w:sz w:val="22"/>
               </w:rPr>
-              <w:t>), yaitu investasi jangka pendek yang gampang banget dicairkan jadi sejumlah kas yang sudah ketahuan nilainya. Sama seperti APB Opinion No. 19, SFAS No. 95 minta setiap transaksi investasi dan pendanaan yang nggak pakai kas tetap dilaporkan sebagai pelengkap, entah lewat skedul atau ditulis dalam bentuk cerita. Ini penerapan pendekatan mencakup-semua tadi, biar nggak ada satu pun transaksi perusahaan yang kelewat dari laporan (Wolk et al., 2017).</w:t>
+              <w:t>), yaitu investasi jangka pendek yang sangat mudah dicairkan menjadi sejumlah kas yang sudah diketahui nilainya. Sama seperti APB Opinion No. 19, SFAS No. 95 mewajibkan setiap transaksi investasi dan pendanaan yang tidak melibatkan kas tetap dilaporkan sebagai pelengkap, baik dalam bentuk skedul maupun narasi. Inilah penerapan pendekatan mencakup-semua, yang memastikan tidak ada satu pun transaksi perusahaan yang luput dari laporan (Wolk et al., 2017).</w:t>
             </w:r>
           </w:p>
         </w:tc>
@@ -1192,7 +1192,7 @@
                 <w:i w:val="0"/>
                 <w:sz w:val="22"/>
               </w:rPr>
-              <w:t>SFAS No. 95 ngebolehin arus kas operasi disajikan pakai metode langsung (</w:t>
+              <w:t>SFAS No. 95 membolehkan arus kas operasi disajikan dengan metode langsung (</w:t>
             </w:r>
             <w:r>
               <w:rPr>
@@ -1210,7 +1210,7 @@
                 <w:i w:val="0"/>
                 <w:sz w:val="22"/>
               </w:rPr>
-              <w:t>) atau tidak langsung (</w:t>
+              <w:t>) atau metode tidak langsung (</w:t>
             </w:r>
             <w:r>
               <w:rPr>
@@ -1228,7 +1228,7 @@
                 <w:i w:val="0"/>
                 <w:sz w:val="22"/>
               </w:rPr>
-              <w:t>). Metode langsung ngelaporin arus kas apa adanya yang sejajar sama pos laporan laba rugi seperti pendapatan dan harga pokok; infonya lebih kaya dan ini yang disukai FASB. Metode tidak langsung (atau metode rekonsiliasi) mulai dari laba akrual, lalu disesuaikan buat pos-pos yang nggak melibatkan kas. FASB ngaku metode langsung bisa lebih mahal, soalnya nggak semua perusahaan punya catatan yang rapi buat ngehasilin datanya, dan dalam praktik sering butuh "angka penyeimbang" biar laporannya pas. Kalau pakai metode langsung pun, perusahaan tetap wajib lampirin skedul yang nyocokin arus kas operasi sama laba bersih — jadi metode tidak langsung praktis selalu nongol. Bahkan sebagian anggota FASB ngerasa bolehnya metode tidak langsung itu malah bikin pengguna susah paham dan nurunin mutu laporan (Wolk et al., 2017; lihat Exhibit 13.2 dan 13.3).</w:t>
+              <w:t>). Metode langsung melaporkan arus kas apa adanya, sejajar dengan pos laporan laba rugi seperti pendapatan dan harga pokok penjualan. Metode ini menyajikan lebih banyak informasi dan menjadi pilihan FASB. Metode tidak langsung, yang juga disebut metode rekonsiliasi, bertolak dari laba akrual lalu disesuaikan untuk pos-pos yang tidak melibatkan kas. FASB mengakui metode langsung dapat lebih mahal, sebab tidak semua perusahaan memiliki catatan yang rapi untuk menghasilkan datanya, dan dalam praktik sering dibutuhkan angka penyeimbang agar laporannya cocok. Bila metode langsung dipakai pun, perusahaan tetap wajib melampirkan skedul yang mencocokkan arus kas operasi dengan laba bersih, sehingga metode tidak langsung praktis selalu hadir. Sebagian anggota FASB bahkan menilai izin atas metode tidak langsung membuat pengguna sulit memahami laporan dan menurunkan mutunya (Wolk et al., 2017; lihat Exhibit 13.2 dan 13.3).</w:t>
             </w:r>
           </w:p>
         </w:tc>
@@ -1403,7 +1403,7 @@
                 <w:i w:val="0"/>
                 <w:sz w:val="22"/>
               </w:rPr>
-              <w:t>Kenapa praktik lebih milih metode tidak langsung, dan apa temuan McEnroe?</w:t>
+              <w:t>Mengapa praktik condong ke metode tidak langsung, dan apa temuan McEnroe?</w:t>
             </w:r>
           </w:p>
         </w:tc>
@@ -1424,7 +1424,7 @@
                 <w:i w:val="0"/>
                 <w:sz w:val="22"/>
               </w:rPr>
-              <w:t>Kebanyakan perusahaan Amerika pakai metode tidak langsung, dan alasan utamanya kelihatannya soal biaya. Padahal dua metode ini ngehasilin angka arus kas operasi bersih yang sama persis — di Company M sama-sama $1.365 — yang beda cuma info yang ditampilkan: yang satu nunjukin arus kas buat penjualan dan harga pokok, yang lain nunjukin proses nyocokin laba akrual ke versi kasnya. Jadi ini soal biaya lawan manfaat info. Lucunya, riset (walau terbatas) malah nunjukin pengguna luar lebih suka metode langsung. Studi McEnroe ke 282 responden — ada analis keuangan, penasihat investasi, dosen akuntansi, sampai akuntan — nemu 56 persen milih metode langsung, 44 persen metode tidak langsung. Intinya: metode langsung gampang dibaca tapi susah dibuat, metode tidak langsung kebalikannya (Wolk et al., 2017).</w:t>
+              <w:t>Sebagian besar perusahaan Amerika memakai metode tidak langsung, dan alasan utamanya tampaknya soal biaya. Padahal kedua metode menghasilkan angka arus kas operasi bersih yang sama, yaitu $1.365 pada Company M. Yang berbeda hanyalah informasi yang ditampilkan: metode langsung menunjukkan arus kas untuk penjualan dan harga pokok, sedangkan metode tidak langsung menunjukkan proses mencocokkan laba akrual dengan versi kasnya. Jadi persoalannya adalah biaya berhadapan dengan manfaat informasi. Menariknya, riset yang terbatas justru menunjukkan pengguna luar lebih menyukai metode langsung. Studi McEnroe terhadap 282 responden, yang terdiri atas analis keuangan, penasihat investasi, profesor akuntansi, dan akuntan, menemukan 56 persen memilih metode langsung dan 44 persen metode tidak langsung. Singkatnya, metode langsung mudah dibaca tetapi sulit disusun, sedangkan metode tidak langsung sebaliknya (Wolk et al., 2017).</w:t>
             </w:r>
           </w:p>
         </w:tc>
@@ -1468,7 +1468,7 @@
                 <w:i w:val="0"/>
                 <w:sz w:val="22"/>
               </w:rPr>
-              <w:t>Ada satu masalah penting yang nempel di metode tidak langsung. Studi besar dari Bahnson, Miller, dan Budge nunjukin terjadinya nonartikulasi, yaitu pas arus kas yang muncul dari perubahan akun modal kerja perusahaan ternyata nggak sama dengan penyesuaian modal kerja yang ditulis di bagian operasi SCF. Akibatnya SCF kelihatan nggak nyambung sama neracanya sendiri, dan itu bikin pengguna bingung. Selisih kayak gini muncul di 75 persen kasus dalam sampel mereka, dan ukurannya nggak main-main. Di Exhibit 13.4, perubahan akun neraca 3M buat piutang usaha, persediaan, dan utang usaha diadu sama penyesuaian modal kerja di SCF; selisih di piutang usaha aja sampai sekitar 300 persen, bahkan ada kasus yang tandanya (plus/minus) malah kebalik (Wolk et al., 2017; lihat Exhibit 13.4).</w:t>
+              <w:t>Ada satu masalah penting yang melekat pada metode tidak langsung. Studi besar dari Bahnson, Miller, dan Budge menemukan terjadinya nonartikulasi, yaitu keadaan ketika arus kas dari perubahan akun modal kerja tidak sama dengan penyesuaian modal kerja yang ditulis di bagian operasi SCF. Akibatnya, SCF terlihat tidak sejalan dengan neracanya sendiri, dan hal ini membingungkan pengguna. Selisih seperti ini muncul pada 75 persen kasus dalam sampel mereka, dan ukurannya tidak kecil. Pada Exhibit 13.4, perubahan akun neraca 3M untuk piutang usaha, persediaan, dan utang usaha dibandingkan dengan penyesuaian modal kerja di SCF. Selisih pada piutang usaha saja mencapai sekitar 300 persen, bahkan pada beberapa kasus tandanya pun berbeda (Wolk et al., 2017; lihat Exhibit 13.4).</w:t>
             </w:r>
           </w:p>
         </w:tc>
@@ -1594,7 +1594,7 @@
                 <w:i w:val="0"/>
                 <w:sz w:val="22"/>
               </w:rPr>
-              <w:t>Ada tiga hal yang bikin nonartikulasi kejadian. Pertama, akuisisi anak perusahaan di tengah tahun: saldo modal kerja awal perusahaan yang dibeli nggak masuk ke neraca konsolidasi awal, jadi biar nyambung saldo yang ketinggalan itu harus ditambahin ke saldo awal. Kedua, transaksi akun modal kerja yang nggak nyentuh kas — ini bahkan kejadian di perusahaan yang nggak konsolidasi — misalnya nilai persediaan dinaikin/diturunin pas akuisisi, penyusutan yang dialokasiin ke persediaan yang diproduksi, atau akun modal kerja yang dipindah-pindah antara kategori lancar dan taklancar. Ketiga, satu akun utang usaha dipakai bareng buat beli aset modal kerja sekaligus aset di luar modal kerja: beli persediaan secara kredit itu operasi, tapi beli peralatan secara kredit itu investasi, jadi perubahan utang usaha di neraca nggak bakal sama dengan penyesuaiannya di bagian operasi. Oh iya, pada 2008 FASB dan IASB ngeluarin discussion paper yang ngusulin format baru; gabungin aktivitas operasi dan investasi jadi satu kelompok "business" dianggap berguna karena ngurangin peluang mindahin klasifikasi antar keduanya (Wolk et al., 2017).</w:t>
+              <w:t>Ada tiga hal yang menyebabkan nonartikulasi. Penyebab pertama adalah akuisisi anak perusahaan di tengah tahun. Saldo modal kerja awal perusahaan yang dibeli tidak masuk ke neraca konsolidasi awal, sehingga agar sejalan, saldo yang tertinggal itu harus ditambahkan ke saldo awal. Penyebab kedua adalah transaksi akun modal kerja yang tidak melibatkan kas, dan ini bahkan terjadi pada perusahaan yang tidak konsolidasi. Contohnya adalah penilaian-naik atau penilaian-turun pos modal kerja saat akuisisi pembelian (biasanya persediaan), alokasi penyusutan ke persediaan yang diproduksi, serta pemindahan akun modal kerja antara kategori lancar dan taklancar. Penyebab ketiga adalah satu akun utang usaha yang dipakai bersama untuk membeli aset modal kerja sekaligus aset di luar modal kerja. Pembelian persediaan secara kredit tergolong operasi, sedangkan pembelian peralatan secara kredit tergolong investasi, sehingga perubahan utang usaha di neraca tidak akan sama dengan penyesuaiannya di bagian operasi. Sebagai catatan, pada 2008 FASB dan IASB menerbitkan discussion paper yang mengusulkan format baru. Gagasan menggabungkan aktivitas operasi dan investasi menjadi satu kelompok "business" dipandang berguna karena memperkecil peluang pemindahan klasifikasi di antara keduanya (Wolk et al., 2017).</w:t>
             </w:r>
           </w:p>
         </w:tc>
@@ -1708,7 +1708,7 @@
                 <w:i w:val="0"/>
                 <w:sz w:val="22"/>
               </w:rPr>
-              <w:t>Apa keberatan Nurnberg soal klasifikasi SFAS No. 95?</w:t>
+              <w:t>Apa keberatan Nurnberg atas klasifikasi SFAS No. 95?</w:t>
             </w:r>
           </w:p>
         </w:tc>
@@ -1729,7 +1729,7 @@
                 <w:i w:val="0"/>
                 <w:sz w:val="22"/>
               </w:rPr>
-              <w:t>Selain tiga suara penolak tadi, Nurnberg ngajuin pertanyaan mendasar soal struktur SCF. Dia nyorot bahwa SCF naro penerimaan bunga dan dividen sebagai arus masuk operasi, dan pembayaran bunga sebagai arus keluar operasi — padahal menurut ilmu keuangan, yang pertama harusnya investasi dan yang kedua pendanaan. Pas nyusun SFAS No. 95, FASB ngikutin format laporan laba rugi yang berorientasi teori kepemilikan (</w:t>
+              <w:t>Selain tiga suara penolak tadi, Nurnberg mengajukan pertanyaan mendasar tentang struktur SCF. Ia menyoroti bahwa SCF menempatkan penerimaan bunga dan dividen sebagai arus masuk operasi, dan pembayaran bunga sebagai arus keluar operasi. Padahal menurut literatur keuangan, yang pertama seharusnya investasi dan yang kedua pendanaan. Dalam menyusun SFAS No. 95, FASB mengikuti format laporan laba rugi yang berorientasi teori kepemilikan (</w:t>
             </w:r>
             <w:r>
               <w:rPr>
@@ -1747,7 +1747,7 @@
                 <w:i w:val="0"/>
                 <w:sz w:val="22"/>
               </w:rPr>
-              <w:t>), yang mandang pendapatan dan beban bunga serta pendapatan dividen sebagai pos operasi. Ini beda sama teori entitas (</w:t>
+              <w:t>). Teori ini memandang pendapatan dan beban bunga serta pendapatan dividen sebagai pos operasi. Pandangan ini berbeda dengan teori entitas (</w:t>
             </w:r>
             <w:r>
               <w:rPr>
@@ -1765,7 +1765,7 @@
                 <w:i w:val="0"/>
                 <w:sz w:val="22"/>
               </w:rPr>
-              <w:t>), yang naro pendapatan bunga dan dividen sebagai investasi, dan beban bunga sebagai pendanaan. Ada juga alasan praktis: industri perbankan dukung bunga dimasukin ke operasi — yang buat bank emang masuk akal — biar nggak kelihatan punya arus kas operasi negatif. Konsistensi sama laporan laba rugi plus kepentingan bank inilah yang mungkin ngebentuk keputusan FASB (Wolk et al., 2017).</w:t>
+              <w:t>), yang menempatkan pendapatan bunga dan dividen sebagai investasi serta beban bunga sebagai pendanaan. Ada pula pertimbangan praktis. Industri perbankan mendukung bunga dimasukkan ke operasi, yang memang masuk akal bagi bank, agar tidak melaporkan arus kas operasi negatif. Konsistensi dengan laporan laba rugi ditambah kepentingan perbankan inilah yang mungkin membentuk keputusan FASB (Wolk et al., 2017).</w:t>
             </w:r>
           </w:p>
         </w:tc>
@@ -1788,7 +1788,7 @@
                 <w:i w:val="0"/>
                 <w:sz w:val="22"/>
               </w:rPr>
-              <w:t>Gimana sikap IAS 7 soal bunga dan dividen?</w:t>
+              <w:t>Bagaimana sikap IAS 7 atas bunga dan dividen?</w:t>
             </w:r>
           </w:p>
         </w:tc>
@@ -1809,7 +1809,7 @@
                 <w:i w:val="0"/>
                 <w:sz w:val="22"/>
               </w:rPr>
-              <w:t>IAS 7 ambil posisi yang lebih santai. Bunga dan dividen, baik yang diterima maupun dibayar, boleh dimasukin ke operasi, investasi, atau pendanaan, asalkan diperlakukan konsisten dari tahun ke tahun. Sikap ini bentrok sama orientasi proprietary-nya SFAS No. 95, sekaligus sama pendekatan entity theory yang dianjurin bab ini dan Bab 12. Buat bank, mandang bunga dan dividen sebagai arus kas operasi tetap wajar; jadi kalau IAS 7 ngebolehin klasifikasi itu khusus buat bank, IASB justru bakal dapet keseragaman di industri perbankan (Wolk et al., 2017).</w:t>
+              <w:t>IAS 7 mengambil sikap yang lebih lentur. Bunga dan dividen, baik yang diterima maupun dibayar, boleh dimasukkan ke aktivitas operasi, investasi, atau pendanaan, asalkan diperlakukan secara konsisten dari tahun ke tahun. Sikap ini berbeda dengan orientasi proprietary pada SFAS No. 95, dan juga dengan pendekatan entity theory yang dianjurkan bab ini serta Bab 12. Bagi bank, memandang bunga dan dividen sebagai arus kas operasi tetap wajar. Karena itu, seandainya IAS 7 membolehkan klasifikasi tersebut khusus bagi bank, IASB justru akan memperoleh keseragaman di industri perbankan (Wolk et al., 2017).</w:t>
             </w:r>
           </w:p>
         </w:tc>
@@ -1832,7 +1832,7 @@
                 <w:i w:val="0"/>
                 <w:sz w:val="22"/>
               </w:rPr>
-              <w:t>Gimana premium dan diskonto obligasi diperlakukan menurut Vent, Cowling, dan Sevalstad?</w:t>
+              <w:t>Bagaimana premium dan diskonto obligasi diperlakukan menurut Vent, Cowling, dan Sevalstad?</w:t>
             </w:r>
           </w:p>
         </w:tc>
@@ -1853,7 +1853,7 @@
                 <w:i w:val="0"/>
                 <w:sz w:val="22"/>
               </w:rPr>
-              <w:t>Misahin pendapatan bunga (operasi), beli saham perusahaan lain (investasi), dan pinjam atau lunasin pokok (pendanaan) bikin muncul pertanyaan lanjutan: premium atau diskonto obligasi masuk ke mana? Soalnya dia itu penyesuaian bunga, tapi sekaligus bagian dari pokok yang dipinjam. Vent, Cowling, dan Sevalstad nemu empat cara berbeda di laporan tahunan yang beneran terbit. Contohnya gini: perusahaan nerbitin obligasi kupon 8 persen, jangka empat tahun, nilai nominal $10.000, laku $11.000 pada 31 Desember 2000 — jadi ada premium $1.000. Dengan amortisasi garis lurus, beban bunga setahun jadi $550, yaitu kupon $800 dikurangi amortisasi premium $250. Cara pertama paling gampang diikutin dan cocok buat metode langsung, walau jumlah arus operasinya beda dari beban bunga akrual karena premium $1.000 masuk ke arus pendanaan tahun 2000. Cara kedua dan ketiga mindahin premium dari arus investasi ke operasi (cara kedua di tahun bayar 2004, cara ketiga di tahun terbit 2000). Cara keempat nyebar premium sepanjang umur obligasi. Wolk lebih milih cara pertama walau ada selisih antara nilai akrual dan kas, dan dia anggap cara keempat paling nggak masuk akal karena mecah arus kas tahunan $800 jadi dua bagian, jadinya malah salah ngegambarin arus kas yang sebenarnya. Ini contoh lain dari masalah alokasi (Wolk et al., 2017; lihat Exhibit 13.5).</w:t>
+              <w:t>Pemisahan antara pendapatan bunga (operasi), pembelian saham perusahaan lain (investasi), dan peminjaman atau pelunasan pokok (pendanaan) menimbulkan pertanyaan lanjutan: ke mana premium atau diskonto obligasi digolongkan? Pos ini adalah penyesuaian bunga, tetapi sekaligus bagian dari pokok yang dipinjam. Vent, Cowling, dan Sevalstad menemukan empat cara berbeda dalam laporan tahunan yang terbit. Contohnya begini. Sebuah perusahaan menerbitkan obligasi kupon 8 persen berjangka empat tahun dengan nilai nominal $10.000. Obligasi itu laku $11.000 pada 31 Desember 2000, sehingga ada premium $1.000. Dengan amortisasi garis lurus, beban bunga setahun menjadi $550, yaitu kupon $800 dikurangi amortisasi premium $250. Cara pertama paling mudah diikuti dan cocok dengan metode langsung, meski jumlah arus operasinya berbeda dari beban bunga akrual karena premium $1.000 masuk ke arus pendanaan tahun 2000. Cara kedua dan ketiga memindahkan premium dari arus investasi ke operasi, masing-masing pada tahun pembayaran 2004 dan tahun penerbitan 2000. Cara keempat menyebar premium sepanjang umur obligasi. Wolk lebih memilih cara pertama meski ada selisih antara nilai akrual dan kas, dan menilai cara keempat paling tidak masuk akal karena memecah arus kas tahunan $800 menjadi dua bagian sehingga keliru menggambarkan arus kas yang sebenarnya. Sekali lagi, ini adalah contoh masalah alokasi (Wolk et al., 2017; lihat Exhibit 13.5).</w:t>
             </w:r>
           </w:p>
         </w:tc>
@@ -1958,7 +1958,7 @@
                 <w:i w:val="0"/>
                 <w:sz w:val="22"/>
               </w:rPr>
-              <w:t>Gimana bunga dikapitalisasi (SFAS No. 34) dan sewa bikin dilema serupa?</w:t>
+              <w:t>Bagaimana bunga dikapitalisasi (SFAS No. 34) dan sewa menimbulkan dilema serupa?</w:t>
             </w:r>
           </w:p>
         </w:tc>
@@ -1979,7 +1979,7 @@
                 <w:i w:val="0"/>
                 <w:sz w:val="22"/>
               </w:rPr>
-              <w:t>Munter ngangkat masalah yang mirip. Pas pembayaran bunga dikapitalisasi sesuai SFAS No. 34, bunga itu keluar dari aktivitas operasi dan masuk ke investasi, jadi bagian dari biaya beli aset tetap. Nah, pertanyaannya: suatu kejadian itu digolongin berdasarkan sifat dasarnya (ini kan pembayaran bunga) atau berdasarkan tujuan akhirnya (buat dapetin aset)? Dilema yang sama muncul di sewa: pada sewa operasi semua pengeluaran kas masuk arus keluar operasi, sedangkan pada sewa pembiayaan porsi bunganya operasi tapi porsi pelunasan pokoknya pendanaan. Mana yang harusnya nentuin — sifat dasar atau tujuan akhir — sampai sekarang belum ada jawaban pastinya (Wolk et al., 2017).</w:t>
+              <w:t>Munter mengangkat masalah yang serupa. Ketika pembayaran bunga dikapitalisasi sesuai SFAS No. 34, bunga itu keluar dari aktivitas operasi dan masuk ke investasi sebagai bagian biaya perolehan aset tetap. Pertanyaannya, apakah suatu kejadian digolongkan menurut sifat dasarnya (yaitu pembayaran bunga) atau menurut tujuan akhirnya (yaitu memperoleh aset). Dilema yang sama muncul pada sewa. Pada sewa operasi, seluruh pengeluaran kas tergolong arus keluar operasi. Pada sewa pembiayaan, porsi bunga tergolong operasi sedangkan porsi pelunasan pokok tergolong pendanaan. Mana yang seharusnya menentukan, sifat dasar atau tujuan akhir, masih belum terjawab (Wolk et al., 2017).</w:t>
             </w:r>
           </w:p>
         </w:tc>
@@ -2002,7 +2002,7 @@
                 <w:i w:val="0"/>
                 <w:sz w:val="22"/>
               </w:rPr>
-              <w:t>Gimana SFAS No. 104 ngelonggarin penyajian lindung nilai?</w:t>
+              <w:t>Bagaimana SFAS No. 104 melonggarkan penyajian lindung nilai?</w:t>
             </w:r>
           </w:p>
         </w:tc>
@@ -2023,7 +2023,7 @@
                 <w:i w:val="0"/>
                 <w:sz w:val="22"/>
               </w:rPr>
-              <w:t>Di SFAS No. 95, kegiatan lindung nilai (</w:t>
+              <w:t>Dalam SFAS No. 95, kegiatan lindung nilai (</w:t>
             </w:r>
             <w:r>
               <w:rPr>
@@ -2041,7 +2041,7 @@
                 <w:i w:val="0"/>
                 <w:sz w:val="22"/>
               </w:rPr>
-              <w:t>) dianggap aktivitas investasi — kaku, cuma ngeliat sifat transaksinya. SFAS No. 104 yang ngerevisi aturan itu ngelonggarin dengan ngebolehin lindung nilai dikaitin ke akun neraca yang spesifik. Jadi kalau sebuah kontrak forward, futures, opsi, atau swap nyambung sama pos tertentu kayak persediaan — misalnya buat jagain dari naiknya harga persediaan — lindung nilai itu boleh ditaro bareng pos tersebut sebagai operasi, atau tetap dianggap investasi. Nurnberg dan Largay ngerasa kelonggaran ini umumnya nurunin keterbandingan, tapi bisa dimaklumi sebagai info yang lebih "halus" di situasi tertentu (Wolk et al., 2017).</w:t>
+              <w:t>) dianggap aktivitas investasi. Klasifikasi ini kaku karena hanya melihat sifat transaksinya. SFAS No. 104 yang merevisi aturan itu melonggarkannya dengan membolehkan lindung nilai dikaitkan ke akun neraca tertentu. Jika sebuah kontrak forward, futures, opsi, atau swap berkaitan dengan pos tertentu seperti persediaan, misalnya untuk melindungi dari kenaikan harga persediaan, lindung nilai itu boleh ditempatkan bersama pos tersebut sebagai operasi, atau tetap dianggap investasi. Nurnberg dan Largay menilai pelonggaran ini umumnya menurunkan keterbandingan, tetapi dapat dibenarkan sebagai informasi yang lebih halus dalam situasi tertentu (Wolk et al., 2017).</w:t>
             </w:r>
           </w:p>
         </w:tc>
@@ -2064,7 +2064,7 @@
                 <w:i w:val="0"/>
                 <w:sz w:val="22"/>
               </w:rPr>
-              <w:t>Seberapa berguna SCF buat analisis menurut model Ingram dan Lee?</w:t>
+              <w:t>Seberapa berguna SCF untuk analisis menurut model Ingram dan Lee?</w:t>
             </w:r>
           </w:p>
         </w:tc>
@@ -2085,7 +2085,7 @@
                 <w:i w:val="0"/>
                 <w:sz w:val="22"/>
               </w:rPr>
-              <w:t>Walaupun punya masalah klasifikasi dan nonartikulasi, SCF tetap berguna banget, dan riset Ingram dan Lee ngebuktiinnya dengan makai laporan laba rugi dan SCF barengan. Logika mereka: dari waktu ke waktu, perusahaan yang lagi tumbuh biasanya labanya lebih tinggi tapi arus kas operasinya lebih rendah. Kenapa? Karena ekspansi nambah persediaan dan piutang usaha; walau sebagian ketutup kenaikan utang usaha, efek bersih pertumbuhan modal kerja bikin kenaikan laba lebih gede dari kenaikan arus kas operasi tiap tahun. Pas ekspansi juga ada arus keluar buat beli aset tetap dan arus masuk dari utang atau saham baru, sementara dividen ditahan. Buat perusahaan yang lagi menyusut, polanya kebalik. Analisis statistik mereka ke hampir 1.000 perusahaan dari 1974 sampai 1992 secara umum ngedukung logika tadi, sekaligus nemu bahwa perusahaan yang lagi ekspansi cenderung punya utang (leverage) lebih besar daripada yang menyusut (Wolk et al., 2017).</w:t>
+              <w:t>Meski memiliki masalah klasifikasi dan nonartikulasi, SCF tetap sangat berguna, dan riset Ingram dan Lee membuktikannya dengan memakai laporan laba rugi dan SCF secara bersamaan. Argumen mereka, dari waktu ke waktu, perusahaan yang sedang tumbuh biasanya berlaba lebih tinggi tetapi berarus kas operasi lebih rendah. Sebabnya, ekspansi menambah persediaan dan piutang usaha. Meski sebagian tertutup kenaikan utang usaha, efek bersih pertumbuhan modal kerja membuat kenaikan laba melampaui kenaikan arus kas operasi setiap tahun. Pada fase ekspansi juga muncul arus keluar untuk membeli aset tetap dan arus masuk dari utang atau saham baru, sementara dividen ditahan. Bagi perusahaan yang menyusut, polanya berbalik. Analisis statistik mereka terhadap hampir 1.000 perusahaan sepanjang 1974 hingga 1992 secara umum mendukung argumen tersebut, sekaligus menemukan bahwa perusahaan yang berekspansi cenderung memikul utang lebih besar daripada yang menyusut (Wolk et al., 2017).</w:t>
             </w:r>
           </w:p>
         </w:tc>
@@ -2108,7 +2108,7 @@
                 <w:i w:val="0"/>
                 <w:sz w:val="22"/>
               </w:rPr>
-              <w:t>Gimana klasifikasi dimanipulasi di Tyco dan industri otomotif?</w:t>
+              <w:t>Bagaimana klasifikasi dimanipulasi pada Tyco dan industri otomotif?</w:t>
             </w:r>
           </w:p>
         </w:tc>
@@ -2129,7 +2129,7 @@
                 <w:i w:val="0"/>
                 <w:sz w:val="22"/>
               </w:rPr>
-              <w:t>SCF emang lebih susah diakalin daripada laba, tapi bukan berarti kebal. Karena banyak orang nganggap arus kas dari operasi (CFO) sebagai bagian paling penting, ada godaan buat naikin angkanya: geser arus keluar dari operasi ke investasi, atau tarik arus masuk dari investasi ke operasi. Total kasnya nggak berubah, tapi kalau nggak diteliti, orang langsung mikir positif. Maremont kasih contoh Tyco International di bisnis alarm rumah: kas buat ngembangin penjualan sendiri sama kas buat beli kontrak layanan dari dealer lain semestinya diperlakukan sama, tapi Tyco nyatet kontrak dealer yang dibeli sebagai "akuisisi" dan ngakuinnya sebagai arus keluar operasi dengan ritme yang jauh lebih lambat. Mulford, di Wall Street Journal, kasih contoh industri otomotif. Ford, General Motors, dan Harley-Davidson minjemin dana ke dealer lewat piutang wesel biar dealer beli persediaan; perusahaan ngakuin pendapatan penjualan tapi naro pinjaman itu sebagai aktivitas investasi, jadi CFO-nya keangkat. Di GM, CFO yang dilaporin $7,6 miliar, padahal kalau piutang wesel dianggap operasi, angkanya cuma $3,5 miliar. Sebaliknya Navistar malah mindahin piutang wesel dealernya ke operasi; Mark Oberle, direktur hubungan investor, nyebut itu bagian bisnis inti perusahaan manufaktur yang punya anak usaha pembiayaan. Jadi walau aturannya nggak dilanggar, area abu-abu kayak gini bikin perusahaan di industri yang sama bisa nampilin gambaran yang beda jauh (Wolk et al., 2017).</w:t>
+              <w:t>SCF memang lebih sulit dimanipulasi daripada laba, tetapi tidak kebal. Karena banyak pengguna menganggap arus kas dari operasi (CFO) sebagai bagian terpenting, muncul godaan untuk menaikkannya. Caranya, menggeser arus keluar dari operasi ke investasi, atau menarik arus masuk dari investasi ke operasi. Total kasnya tidak berubah, tetapi tanpa pemeriksaan teliti, pengguna langsung menilainya positif. Maremont mencontohkan Tyco International di bisnis alarm rumah. Kas untuk mengembangkan penjualan sendiri dan kas untuk membeli kontrak layanan dari dealer lain semestinya diperlakukan sama, tetapi Tyco mencatat kontrak dealer yang dibeli sebagai "akuisisi" dan mengakuinya sebagai arus keluar operasi dengan tempo yang jauh lebih lambat. Mulford, dalam Wall Street Journal, mencontohkan industri otomotif. Ford, General Motors, dan Harley-Davidson meminjamkan dana ke dealer dalam bentuk piutang wesel agar dealer membeli persediaan. Perusahaan mengakui pendapatan penjualan, tetapi menggolongkan pinjaman itu sebagai aktivitas investasi, sehingga CFO terangkat. Pada GM, CFO yang dilaporkan $7,6 miliar, padahal seandainya piutang wesel diperlakukan sebagai operasi, angkanya hanya $3,5 miliar. Sebaliknya, Navistar justru memindahkan piutang wesel dealernya ke operasi. Mark Oberle selaku direktur hubungan investor menyebutnya bagian dari bisnis inti perusahaan manufaktur yang memiliki anak usaha pembiayaan. Jadi, meski aturannya tidak dilanggar, area abu-abu seperti ini memungkinkan perusahaan dalam satu industri menampilkan gambaran yang sangat berbeda (Wolk et al., 2017).</w:t>
             </w:r>
           </w:p>
         </w:tc>
@@ -2152,7 +2152,7 @@
                 <w:i w:val="0"/>
                 <w:sz w:val="22"/>
               </w:rPr>
-              <w:t>Kenapa SCF harus dibaca utuh, dan apa pelajaran dari WorldCom?</w:t>
+              <w:t>Mengapa SCF harus dibaca utuh, dan apa pelajaran dari WorldCom?</w:t>
             </w:r>
           </w:p>
         </w:tc>
@@ -2173,7 +2173,7 @@
                 <w:i w:val="0"/>
                 <w:sz w:val="22"/>
               </w:rPr>
-              <w:t>Kebanyakan mantengin satu bagian SCF doang (yaitu CFO) itu bahaya, soalnya laporan ini ada tiga bagian dan semuanya penting. Pada 21 Juli 2002, WorldCom ngajuin reorganisasi sukarela berdasarkan Bab 11 Undang-Undang Kepailitan Amerika. Sebelum jatuh, perusahaan ini ngapitalisasi beban yang harusnya masuk aktivitas operasi; salah klasifikasi ini bikin CFO yang dilaporin ngegelembung dan laba bersihnya kelihatan meyakinkan. Banyak investor ketipu, tapi sebenarnya kalau SCF dibaca utuh, ada cukup tanda buat curiga. Exhibit 13.6 nampilin pos-pos terpilih SCF WorldCom: laba bersihnya positif selama tiga tahun sebelum bangkrut, tapi kalau CFI nunjukin investasi yang memang dibutuhkan, selisih CFO dikurangi CFI ngasih tahu berapa kas yang beneran tersisa buat investor — dan ternyata WorldCom terus kehabisan kas di tiga dari empat tahun terakhir, sampai bikin "lubang" kumulatif sebesar $12 miliar per 31 Desember 2001. Tinggal nunggu kapan lubang itu berhenti makin dalam. Investor yang cuekin satu atau lebih bagian SCF, ya nanggung sendiri akibatnya (Wolk et al., 2017; lihat Exhibit 13.6).</w:t>
+              <w:t>Memusatkan perhatian hanya pada satu bagian SCF, yaitu CFO, sangat berisiko, sebab laporan ini terdiri atas tiga bagian yang semuanya penting. Pada 21 Juli 2002, WorldCom mengajukan reorganisasi sukarela berdasarkan Bab 11 Undang-Undang Kepailitan Amerika Serikat. Sebelum jatuh, perusahaan ini mengapitalisasi beban yang seharusnya tergolong aktivitas operasi. Kesalahan klasifikasi ini menggelembungkan CFO yang dilaporkan dan membuat laba bersihnya tampak meyakinkan. Banyak investor terkecoh, padahal SCF yang dibaca secara utuh sebenarnya menyediakan cukup alasan untuk curiga. Exhibit 13.6 menampilkan pos-pos terpilih SCF WorldCom. Laba bersihnya positif selama tiga tahun menjelang pailit, tetapi jika CFI mencerminkan investasi yang diperlukan, selisih CFO dikurangi CFI menunjukkan berapa kas yang sebenarnya tersedia bagi investor. Ternyata WorldCom terus kehabisan kas pada tiga dari empat tahun terakhir, hingga menggali defisit kumulatif sebesar $12 miliar pada 31 Desember 2001. Tinggal menunggu kapan defisit itu berhenti membesar. Investor yang mengabaikan satu atau lebih bagian SCF menanggung sendiri akibatnya (Wolk et al., 2017; lihat Exhibit 13.6).</w:t>
             </w:r>
           </w:p>
         </w:tc>
@@ -2278,7 +2278,7 @@
                 <w:i w:val="0"/>
                 <w:sz w:val="22"/>
               </w:rPr>
-              <w:t>Apa yang dibutuhin pengguna menurut Buffett dan logika NPV?</w:t>
+              <w:t>Apa kebutuhan pengguna menurut Buffett dan logika NPV?</w:t>
             </w:r>
           </w:p>
         </w:tc>
@@ -2299,7 +2299,7 @@
                 <w:i w:val="0"/>
                 <w:sz w:val="22"/>
               </w:rPr>
-              <w:t>Di suratnya tahun 1988 ke pemegang saham Berkshire Hathaway, Warren Buffett ngerangkum apa yang sebenernya perlu dilaporin: data yang bantu pembaca yang ngerti keuangan jawab tiga hal — kira-kira perusahaan ini berharga berapa, seberapa mungkin dia bisa bayar kewajibannya nanti, dan seberapa bagus kerja manajernya. Singkatnya, laporan keuangan harus jadi bahan buat menilai perusahaan, ngambil keputusan kredit, dan ngukur kinerja manajemen. Buat nilai kinerja, kita butuh angka arus kas masa lalu yang akurat; buat keputusan kredit dan valuasi, kita butuh ramalan arus kas masa depan yang nggak bias (ini nyambung sama SFAC No. 1). Keputusan investasi pada dasarnya soal ngalokasiin modal pakai logika penganggaran modal: terima investasi kalau nilai sekarang dari arus kas bersih yang diharapkan itu positif — alias kalau NPV (</w:t>
+              <w:t>Dalam suratnya tahun 1988 kepada pemegang saham Berkshire Hathaway, Warren Buffett merangkum apa yang sebenarnya perlu dilaporkan, yaitu data yang membantu pembaca yang melek finansial menjawab tiga hal. Pertama, kira-kira berapa nilai perusahaan. Kedua, seberapa besar kemungkinannya memenuhi kewajiban masa depan. Ketiga, seberapa baik kinerja manajernya. Dengan kata lain, laporan keuangan harus menjadi bahan untuk menilai perusahaan, mengambil keputusan kredit, dan mengukur kinerja manajemen. Penilaian kinerja menuntut ukuran arus kas masa lalu yang akurat, sedangkan keputusan kredit dan valuasi menuntut ramalan arus kas masa depan yang tidak bias, sejalan dengan SFAC No. 1. Keputusan investasi pada dasarnya adalah alokasi modal yang memakai logika penganggaran modal: sebuah investasi diterima bila nilai sekarang dari arus kas bersih yang diharapkan bernilai positif, atau dengan kata lain bila NPV (</w:t>
             </w:r>
             <w:r>
               <w:rPr>
@@ -2317,7 +2317,7 @@
                 <w:i w:val="0"/>
                 <w:sz w:val="22"/>
               </w:rPr>
-              <w:t>, nilai sekarang bersih) positif. Sama halnya, beli saham itu layak kalau nilai sekarang arus kas masa depan per saham — alias nilai intrinsiknya — lebih gede dari harga pasar. Buffett ngedefinisiin nilai intrinsik sebagai nilai terdiskonto dari kas yang bisa ditarik dari bisnis sepanjang sisa umurnya (Wolk et al., 2017).</w:t>
+              <w:t>, nilai sekarang bersih) positif. Begitu pula pembelian saham, layak dilakukan bila nilai sekarang arus kas masa depan per saham, yaitu nilai intrinsiknya, melebihi harga pasar. Buffett mendefinisikan nilai intrinsik sebagai nilai terdiskonto dari kas yang dapat ditarik dari bisnis sepanjang sisa umurnya (Wolk et al., 2017).</w:t>
             </w:r>
           </w:p>
         </w:tc>
@@ -2361,7 +2361,7 @@
                 <w:i w:val="0"/>
                 <w:sz w:val="22"/>
               </w:rPr>
-              <w:t>Arus kas yang jadi dasar nentuin nilai intrinsik perusahaan itu namanya free cash flow (FCF, arus kas bebas). Kata Mulford dan Comiskey, kata "bebas" itu maksudnya nggak ada klaim yang lebih utama atas kas itu: kas yang beneran bebas dipakai, dan makainya nggak ganggu kemampuan perusahaan buat ngehasilin kas berikutnya. Ngikutin teori entitas, Wolk fokus ke arus kas ke perusahaan. FCF nggak bisa langsung dibaca dari SCF, tapi dirumusin di persamaan 13.2: FCF = NOPLAT dikurangi investasi pada modal terinvestasi operasi. NOPLAT (</w:t>
+              <w:t>Arus kas yang menjadi dasar penilaian nilai intrinsik perusahaan disebut free cash flow (FCF, arus kas bebas). Menurut Mulford dan Comiskey, kata "bebas" menunjuk pada tidak adanya klaim yang lebih utama atas kas itu. Kas tersebut bebas dipakai, dan pemakaiannya tidak mengganggu kemampuan perusahaan menghasilkan kas berikutnya. Mengikuti teori entitas, Wolk berfokus pada arus kas ke perusahaan. FCF tidak dapat dibaca langsung dari SCF, melainkan dirumuskan dalam persamaan 13.2: FCF sama dengan NOPLAT dikurangi investasi pada modal terinvestasi operasi. NOPLAT (</w:t>
             </w:r>
             <w:r>
               <w:rPr>
@@ -2379,7 +2379,7 @@
                 <w:i w:val="0"/>
                 <w:sz w:val="22"/>
               </w:rPr>
-              <w:t>) itu laba operasi bersih setelah pajak yang disesuaikan; dalam kasus sederhana, ya laba operasi setelah pajak. Investasi pada modal terinvestasi operasi biasanya dipecah jadi investasi di modal kerja operasi bersih dan di aset taklancar. Yang perlu diinget: FCF nggak masukin beban bunga (karena itu beban pendanaan), dan sejalan sama asumsi perusahaan bakal terus jalan, kas operasi dianggap bagian dari modal kerja operasi bersih, sama kayak piutang dan persediaan (Wolk et al., 2017).</w:t>
+              <w:t>) adalah laba operasi bersih setelah pajak yang disesuaikan, yang dalam kasus sederhana berarti laba operasi setelah pajak. Investasi pada modal terinvestasi operasi biasanya dipecah menjadi investasi pada modal kerja operasi bersih dan investasi pada aset taklancar. Yang perlu dicatat, FCF tidak memasukkan beban bunga karena bunga adalah beban pendanaan. Sejalan dengan asumsi perusahaan akan terus berjalan, kas operasi diperlakukan sebagai bagian modal kerja operasi bersih, sama seperti piutang dan persediaan (Wolk et al., 2017).</w:t>
             </w:r>
           </w:p>
         </w:tc>
@@ -2402,7 +2402,7 @@
                 <w:i w:val="0"/>
                 <w:sz w:val="22"/>
               </w:rPr>
-              <w:t>Gimana contoh ABC Company nyambungin CFO ke FCF?</w:t>
+              <w:t>Bagaimana contoh ABC Company menghubungkan CFO ke FCF?</w:t>
             </w:r>
           </w:p>
         </w:tc>
@@ -2423,7 +2423,7 @@
                 <w:i w:val="0"/>
                 <w:sz w:val="22"/>
               </w:rPr>
-              <w:t>Wolk pakai ABC Company buat nunjukin cara nyusun FCF. Exhibit 13.7 nampilin laporan laba rugi dan neraca ABC, dan dari situ disusun SCF di Exhibit 13.8 dengan CFO $527, $466, $434; CFI $(277), $(309), $(360); dan CFF $(306), $(78), $(58) buat 2005, 2006, 2007. Exhibit 13.9 terus nyusun statement of free cash flows: dari laba operasi dikurangi pajak basis kas ketemu NOPLAT $346, $333, $353, ditambah penyusutan jadi gross cash flow $561, $553, $581, dikurangi total investasi sampai FCF dari aset operasi jadi $332, $99, $80 (yang juga sama dengan FCF ke ekuitas). Exhibit 13.10 nutup dengan cara ngitung FCF langsung dari SCF: mulai dari CFO, tambahin beban bunga setelah pajak (buat ngebuang efek pendanaan), kurangin kenaikan kas operasi (karena dia bagian modal terinvestasi), lalu tambahin CFI (yang biasanya negatif, kayak $(277) di 2005 yang nurunin FCF), dan ketemu lagi FCF $332, $99, $80 (Wolk et al., 2017).</w:t>
+              <w:t>Wolk memakai ABC Company untuk memperagakan penyusunan FCF. Exhibit 13.7 menyajikan laporan laba rugi dan neraca ABC. Dari keduanya disusun SCF pada Exhibit 13.8 dengan CFO $527, $466, dan $434; CFI $(277), $(309), dan $(360); serta CFF $(306), $(78), dan $(58) untuk 2005, 2006, dan 2007. Exhibit 13.9 lalu menyusun statement of free cash flows. Dari laba operasi dikurangi pajak basis kas diperoleh NOPLAT $346, $333, dan $353. Ditambah penyusutan, angkanya menjadi gross cash flow $561, $553, dan $581. Dikurangi total investasi, FCF dari aset operasi menjadi $332, $99, dan $80, yang juga setara dengan FCF ke ekuitas. Exhibit 13.10 menutup dengan cara menghitung FCF langsung dari SCF. Bertolak dari CFO, beban bunga setelah pajak ditambahkan untuk menghapus efek pendanaan, kenaikan kas operasi dikurangkan karena merupakan bagian modal terinvestasi, lalu CFI ditambahkan. Angka CFI ini umumnya negatif, misalnya $(277) pada 2005 yang menekan FCF, sehingga diperoleh kembali FCF $332, $99, dan $80 (Wolk et al., 2017).</w:t>
             </w:r>
           </w:p>
         </w:tc>
@@ -2838,7 +2838,7 @@
                 <w:i w:val="0"/>
                 <w:sz w:val="22"/>
               </w:rPr>
-              <w:t>Ukuran kinerja mana yang dipakai itu tergantung waktu, sumber daya, dan tujuan valuasi kita. Yang pengen cepet, cukup lihat laba bersih. Yang mau ngerti operasi dan nimbang kualitas laba, fokus ke CFO. Buat ngehindarin masalah beban operasi yang digolongin investasi, dan biar dapet gambaran kemampuan ngehasilin kas bersih, masuk akal ngurangin CFI, jadi pakai selisih CFO dikurangi CFI. Dan karena CFO masih "kecampuran" beban bunga yang sebenernya pendanaan, kita bisa ngitung FCF biar bener-bener fokus ke operasi sekaligus ngakuin kas operasi sebagai bagian modal terinvestasi. Buat ABC, keempat ukuran ini di 2005, 2006, 2007 adalah laba bersih $320, $312, $331; CFO $527, $466, $434; CFO dikurangi CFI $250, $157, $74; dan FCF $332, $99, $80. Investor bisa naksir nilai intrinsik dengan ngediskontoin FCF yang diramalkan pakai WACC (</w:t>
+              <w:t>Ukuran kinerja mana yang dipakai bergantung pada waktu, sumber daya, dan tujuan valuasi pengguna. Pengguna yang ingin cepat cukup melihat laba bersih. Pengguna yang ingin memahami operasi dan menimbang kualitas laba berfokus pada CFO. Untuk menghindari masalah beban operasi yang digolongkan sebagai investasi, sekaligus menangkap kemampuan menghasilkan kas bersih, masuk akal mengurangkan CFI, sehingga diperoleh selisih CFO dikurangi CFI. Karena CFO masih tercampur beban bunga yang sebenarnya pendanaan, FCF dihitung agar benar-benar berfokus pada operasi sekaligus mengakui kas operasi sebagai bagian modal terinvestasi. Bagi ABC, keempat ukuran untuk 2005, 2006, dan 2007 adalah laba bersih $320, $312, dan $331; CFO $527, $466, dan $434; selisih CFO dikurangi CFI $250, $157, dan $74; serta FCF $332, $99, dan $80. Investor dapat menaksir nilai intrinsik dengan mendiskontokan FCF yang diramalkan memakai WACC (</w:t>
             </w:r>
             <w:r>
               <w:rPr>
@@ -2856,7 +2856,7 @@
                 <w:i w:val="0"/>
                 <w:sz w:val="22"/>
               </w:rPr>
-              <w:t>, biaya modal rata-rata tertimbang). Dengan empat ukuran yang bisa ngasih gambaran beda-beda, ya emang dunia nyata nggak pernah sesederhana itu (Wolk et al., 2017).</w:t>
+              <w:t>, biaya modal rata-rata tertimbang). Dengan empat ukuran yang dapat memberi gambaran berbeda, dunia nyata memang tidak pernah sesederhana yang diharapkan (Wolk et al., 2017).</w:t>
             </w:r>
           </w:p>
         </w:tc>
@@ -2970,7 +2970,7 @@
                 <w:i w:val="0"/>
                 <w:sz w:val="22"/>
               </w:rPr>
-              <w:t>Apa kata riset soal kas versus akrual (Lawson dan Lee)?</w:t>
+              <w:t>Apa pandangan riset tentang kas versus akrual (Lawson dan Lee)?</w:t>
             </w:r>
           </w:p>
         </w:tc>
@@ -2991,7 +2991,7 @@
                 <w:i w:val="0"/>
                 <w:sz w:val="22"/>
               </w:rPr>
-              <w:t>Lawson dan Lee, dua orang yang dari dulu dukung pelaporan arus kas, berpendapat bahwa laporan arus kas itu perlu buat ngegambarin kinerja, soalnya likuiditas itu bagian nggak terpisahin dari kinerja. Lee malah bilang arus kas, bukan laba, yang jadi hasil akhir aktivitas perusahaan — karena laba cuma abstraksi sedangkan kas itu sumber daya nyata. Model valuasi di literatur ekonomi keuangan sependapat bahwa arus kas perusahaanlah penentu akhir nilainya, bukan laba akrual. Tapi riset pasar modal yang terus berkembang nunjukin akrual ngasih info tambahan di luar arus kas literal soal harga saham. Jadi tafsiran yang masuk akal: kas dan akrual lebih berguna kalau dibaca barengan, jadi SCF itu pelengkap buat laporan akrual. Survei ke investor dan analis konsisten nunjukin analisis berbasis akrual masih dominan, walau survei yang dipesen Financial Accounting Foundation nemu bahwa data arus dana makin penting sementara data akrual makin turun (Wolk et al., 2017).</w:t>
+              <w:t>Lawson dan Lee, dua pendukung lama pelaporan arus kas, berpendapat bahwa laporan arus kas diperlukan untuk menggambarkan kinerja, sebab likuiditas adalah bagian tak terpisahkan dari kinerja. Lee bahkan menyatakan bahwa arus kas, bukan laba, adalah hasil akhir aktivitas perusahaan, karena laba hanyalah abstraksi sedangkan kas adalah sumber daya yang nyata. Model valuasi dalam literatur ekonomi keuangan sependapat bahwa arus kas perusahaanlah penentu akhir nilainya, bukan laba akrual. Namun, riset pasar modal yang terus berkembang menunjukkan akrual memberi informasi tambahan di luar arus kas, khususnya terkait harga saham. Maka tafsiran yang masuk akal adalah kas dan akrual lebih berguna bila dibaca bersama, sehingga SCF bersifat melengkapi laporan akrual. Survei terhadap investor dan analis secara konsisten menunjukkan analisis berbasis akrual masih dominan, meski survei yang ditugaskan Financial Accounting Foundation menemukan kepentingan data arus dana meningkat sementara data akrual menurun (Wolk et al., 2017).</w:t>
             </w:r>
           </w:p>
         </w:tc>
@@ -3014,7 +3014,7 @@
                 <w:i w:val="0"/>
                 <w:sz w:val="22"/>
               </w:rPr>
-              <w:t>Apa tiga rekomendasi Broome buat memperbaiki SCF?</w:t>
+              <w:t>Apa tiga rekomendasi Broome untuk memperbaiki SCF?</w:t>
             </w:r>
           </w:p>
         </w:tc>
@@ -3035,7 +3035,7 @@
                 <w:i w:val="0"/>
                 <w:sz w:val="22"/>
               </w:rPr>
-              <w:t>SCF itu alat penting buat investor, kreditor, dan manajer, tapi masih bisa diperbaiki. Berkaca dari rentetan skandal akuntansi kayak Adelphia, Dynegy, Qwest, Tyco, dan WorldCom, Broome berpendapat SCF bisa dan harus dibenahi, soalnya kebebasan SFAS No. 95 buat milih metode langsung atau tidak langsung malah bikin bingung; penyesuaian ribet di metode tidak langsung susah dipahami dan sering nggak bisa dicocokin sama perubahan akun neraca yang keliatan. Tiga usulannya: FASB sebaiknya mewajibkan metode langsung sekaligus rekonsiliasi laba bersih ke arus kas operasi; ngasih panduan klasifikasi yang lebih jelas buat ketiga bagian; dan nyusun rekonsiliasi pelengkap yang malah mulai dari arus kas operasi menuju laba bersih (kebalikan dari yang sekarang). Wolk setuju metode langsung sebaiknya diwajibkan; tapi kalau sistem pilihan tetap dipertahanin, perusahaan harusnya wajib nyajiin skedul transaksi nonkas yang ngaruh ke akun modal kerja, skedul rekonsiliasi buat akuisisi tengah tahun, dan secara umum ngejelasin asal tiap nonartikulasi di bagian operasi SCF (Wolk et al., 2017).</w:t>
+              <w:t>SCF adalah alat penting bagi investor, kreditor, dan manajer, tetapi masih dapat diperbaiki. Berlatar serangkaian skandal akuntansi seperti Adelphia, Dynegy, Qwest, Tyco, dan WorldCom, Broome berpendapat SCF dapat dan seharusnya dibenahi. Sebabnya, keleluasaan SFAS No. 95 yang membolehkan metode langsung atau tidak langsung justru menimbulkan kebingungan. Penyesuaian yang rumit pada metode tidak langsung sulit dipahami, dan dalam banyak kasus tidak dapat dicocokkan dengan perubahan akun neraca yang teramati. Broome mengajukan tiga usulan. Pertama, FASB sebaiknya mewajibkan metode langsung sekaligus rekonsiliasi laba bersih ke arus kas operasi. Kedua, FASB memberi panduan klasifikasi yang lebih jelas untuk ketiga bagian. Ketiga, rekonsiliasi pelengkap disusun mulai dari arus kas operasi menuju laba bersih, kebalikan dari praktik sekarang. Wolk setuju metode langsung sebaiknya diwajibkan. Namun seandainya sistem pilihan tetap dipertahankan, perusahaan sebaiknya wajib menyajikan skedul transaksi nonkas yang memengaruhi akun modal kerja, skedul rekonsiliasi untuk akuisisi tengah tahun, dan secara umum menjelaskan asal setiap nonartikulasi pada bagian operasi SCF (Wolk et al., 2017).</w:t>
             </w:r>
           </w:p>
         </w:tc>
@@ -3068,7 +3068,7 @@
           <w:i w:val="0"/>
           <w:sz w:val="24"/>
         </w:rPr>
-        <w:t>Inti Bab 13 ini sebenarnya cerita soal gimana laporan arus kas berkembang. Dulu ada Statement of Changes in Financial Position (SCFP), terus berubah jadi Statement of Cash Flows (SCF) yang kita pakai sekarang. SCFP yang diwajibkan APB Opinion No. 19 pada 1971 itu masih berupa laporan arus dana model "sumber dan penggunaan", dan ngebolehin "dana" diartikan macam-macam — kas, kas plus near cash, quick assets, atau modal kerja — dan kebanyakan perusahaan milih modal kerja karena paling murah dibuat. Masalahnya, modal kerja bersih itu ukuran likuiditas yang payah: ada pos tangguhan yang nggak ada urusannya sama kas, siklus operasinya bisa lebih dari setahun, dan persediaan dicatat pakai biaya. Makanya FASB lewat SFAS No. 95 pada 1987 ngeubah arti "dana" jadi kas dan ngegantiin SCFP. Jantung SFAS No. 95 itu pembagian tiga arah: aktivitas operasi, investasi, dan pendanaan, yang bikin klasifikasinya lebih konsisten, plus ada definisi kas dan setara kas serta kewajiban ngungkapin transaksi nonkas. Arus kas operasinya boleh disajikan pakai metode langsung (lebih informatif dan disukai FASB tapi mahal) atau metode tidak langsung (paling banyak dipakai karena murah, walau lebih susah dibaca).</w:t>
+        <w:t>Bab 13 menelusuri bagaimana pelaporan arus kas berkembang dari pendahulunya, yaitu Statement of Changes in Financial Position (SCFP), menjadi Statement of Cash Flows (SCF) yang dipakai sekarang. SCFP yang diwajibkan APB Opinion No. 19 pada 1971 masih berupa laporan arus dana dengan kerangka sumber dan penggunaan. Laporan ini membuka empat pilihan arti dana, yaitu kas, kas plus near cash, quick assets, atau modal kerja, dan sebagian besar perusahaan memilih modal kerja karena paling murah disusun. Masalahnya, modal kerja bersih adalah ukuran likuiditas yang lemah, sebab memuat pos tangguhan tanpa kaitan dengan kas, mengandaikan siklus operasi yang bisa lebih dari setahun, dan menilai persediaan berdasarkan biaya. Atas dasar itu, FASB melalui SFAS No. 95 pada 1987 mengubah arti dana menjadi kas dan menggantikan SCFP. Inti SFAS No. 95 adalah pembagian tiga arah, yaitu aktivitas operasi, investasi, dan pendanaan, yang membuat klasifikasi lebih konsisten. Standar ini juga memberi definisi kas dan setara kas serta mewajibkan pengungkapan transaksi nonkas. Arus kas operasi boleh disajikan dengan metode langsung, yang lebih informatif dan disukai FASB meski lebih mahal, atau metode tidak langsung, yang paling banyak dipakai karena lebih murah meski lebih sulit dibaca.</w:t>
       </w:r>
     </w:p>
     <w:p>
@@ -3083,7 +3083,7 @@
           <w:i w:val="0"/>
           <w:sz w:val="24"/>
         </w:rPr>
-        <w:t>Yang bagus, bab ini jujur soal dua kelemahan SCF. Pertama, nonartikulasi (temuan Bahnson, Miller &amp; Budge): penyesuaian modal kerja di bagian operasi sering nggak sama dengan perubahan akun neraca — kejadian di 75 persen sampel, dengan kasus 3M yang selisih piutangnya sampai 300 persen — gara-gara akuisisi tengah tahun, transaksi nonkas, dan akun yang dipakai bareng. Kedua, masalah klasifikasi: orientasi proprietary naro bunga dan dividen di operasi, padahal teori entitas dan ilmu keuangan ngegolongin keduanya investasi atau pendanaan; ditambah kelonggaran penerapan (IAS 7, premium obligasi versi Vent, Cowling &amp; Sevalstad, bunga dikapitalisasi SFAS No. 34, lindung nilai SFAS No. 104) yang ngebuka ruang manipulasi seperti di kasus Tyco, otomotif (CFO GM $7,6 miliar yang sebenernya $3,5 miliar), dan WorldCom. Tapi meski gitu, SCF tetap berguna banget buat analisis (model Ingram &amp; Lee, kebutuhan valuasi ala Buffett), dan dari sini lahir free cash flow (FCF = NOPLAT − investasi pada modal terinvestasi operasi) sebagai ukuran non-GAAP buat valuasi. Kesimpulan Wolk: pindah dari SCFP ke SCF bikin laporan lebih konsisten dan lebih bisa diandalkan buat meramal, karena lepas dari "kesewenang-wenangan" laba — asalkan SCF dibaca utuh, bukan cuma bagian arus kas operasinya doang (Wolk et al., 2017).</w:t>
+        <w:t>Bab ini juga jujur menjelaskan dua keterbatasan SCF. Pertama, nonartikulasi yang ditemukan Bahnson, Miller, dan Budge. Penyesuaian modal kerja di bagian operasi sering tidak sama dengan perubahan akun neraca. Hal ini terjadi pada 75 persen sampel, dengan kasus 3M yang menunjukkan selisih piutang hingga 300 persen, akibat akuisisi tengah tahun, transaksi nonkas, dan akun yang dipakai bersama. Kedua, masalah klasifikasi. Orientasi proprietary menempatkan bunga dan dividen di bagian operasi, padahal teori entitas dan literatur keuangan menggolongkannya sebagai investasi atau pendanaan. Kelonggaran penerapan, seperti pada IAS 7, premium obligasi versi Vent, Cowling, dan Sevalstad, bunga dikapitalisasi SFAS No. 34, serta lindung nilai SFAS No. 104, membuka ruang manipulasi yang tampak pada kasus Tyco, industri otomotif (CFO GM $7,6 miliar yang sebenarnya $3,5 miliar), dan WorldCom. Meski demikian, SCF tetap sangat berguna untuk analisis, sebagaimana ditunjukkan model Ingram dan Lee serta kebutuhan valuasi ala Buffett. Dari sinilah lahir free cash flow, dengan rumus FCF sama dengan NOPLAT dikurangi investasi pada modal terinvestasi operasi, sebagai ukuran non-GAAP untuk valuasi. Kesimpulan Wolk, perpindahan dari SCFP ke SCF meningkatkan konsistensi dan daya prediksi karena melepaskan diri dari kesewenang-wenangan laba, asalkan SCF dibaca secara utuh dan tidak dibatasi pada arus kas operasi saja (Wolk et al., 2017).</w:t>
       </w:r>
     </w:p>
     <w:p>
@@ -3128,7 +3128,7 @@
           <w:i w:val="0"/>
           <w:sz w:val="24"/>
         </w:rPr>
-        <w:t>Buat saya, SCF itu bukan laporan keuangan keempat yang berdiri sendiri, tapi laporan turunan yang nyusun ulang data dari laporan laba rugi dan neraca ke dalam tiga sudut pandang: operasi, investasi, dan pendanaan. Yang bikin dia berharga bukan datanya yang baru — datanya ya itu-itu juga — tapi caranya misahin bagian kas dari bagian akrual, sehingga muncul info baru soal likuiditas dan kualitas laba. Yang menarik, kelebihan terbesar SCF, yaitu kejelasan kas, justru jadi sumber masalahnya. Begitu standar harus mutusin suatu arus kas masuk ke bagian yang mana, kejelasan itu langsung terganggu sama pilihan teori (proprietary atau entity) dan pilihan metode (langsung atau tidak langsung). Jadi SCF itu konsepnya gampang, tapi cara nyajiinnya penuh keputusan yang nggak netral.</w:t>
+        <w:t>Menurut pemahaman saya, SCF bukan laporan keuangan keempat yang berdiri sendiri, melainkan laporan turunan yang menyusun ulang data dari laporan laba rugi dan neraca ke dalam tiga sudut pandang, yaitu operasi, investasi, dan pendanaan. Nilai SCF tidak terletak pada kebaruan datanya, sebab datanya memang sudah ada, melainkan pada cara ia memisahkan komponen kas dari komponen akrual. Pemisahan inilah yang menghasilkan informasi baru tentang likuiditas dan kualitas laba. Yang menarik, kelebihan utama SCF, yaitu kejelasan kas, sekaligus menjadi sumber masalahnya. Begitu standar harus memutuskan suatu arus kas masuk ke bagian yang mana, kejelasan itu terganggu oleh pilihan teori antara proprietary dan entity, serta oleh pilihan metode antara langsung dan tidak langsung. Jadi, SCF adalah laporan yang konsepnya sederhana tetapi penyajiannya penuh keputusan yang tidak netral.</w:t>
       </w:r>
     </w:p>
     <w:p>
@@ -3158,7 +3158,7 @@
           <w:i w:val="0"/>
           <w:sz w:val="24"/>
         </w:rPr>
-        <w:t>Materi ini penting karena nyentuh pertanyaan paling dasar soal bertahan hidupnya perusahaan: apakah dia ngehasilin kas yang cukup buat terus jalan? Laba bisa aja keliatan positif padahal kasnya menipis, dan kejadian kayak gini udah berkali-kali terbukti fatal. Belajar SCF itu ngelatih kita biar nggak cuma terpaku ke satu angka — entah laba bersih atau bahkan arus kas operasi — tapi baca interaksi ketiga bagiannya sekaligus. Ada pelajaran yang lebih dalam juga: materi ini nunjukin bahwa standar akuntansi itu hasil tawar-menawar politik dan ekonomi (contohnya tekanan industri perbankan soal klasifikasi bunga), bukan kebenaran yang netral. Justru ini pelajaran inti dari mata kuliah Pelaporan Keuangan Korporat.</w:t>
+        <w:t>Materi ini penting karena menyentuh pertanyaan paling mendasar tentang kelangsungan usaha, yaitu apakah perusahaan menghasilkan kas yang cukup untuk bertahan. Laba bisa saja terlihat positif sementara kas menipis, dan keadaan seperti ini sudah berkali-kali terbukti fatal. Belajar SCF melatih kita untuk tidak terpaku pada satu angka, baik laba bersih maupun arus kas operasi, melainkan membaca interaksi ketiga bagiannya sekaligus. Ada pula pelajaran yang lebih dalam. Materi ini menunjukkan bahwa standar akuntansi adalah hasil kompromi politik dan ekonomi, misalnya tekanan industri perbankan atas klasifikasi bunga, dan bukan kebenaran yang netral. Inilah pelajaran inti dari mata kuliah Pelaporan Keuangan Korporat.</w:t>
       </w:r>
     </w:p>
     <w:p>
@@ -3188,7 +3188,7 @@
           <w:i w:val="0"/>
           <w:sz w:val="24"/>
         </w:rPr>
-        <w:t>Penerapan SCF paling kerasa di analisis solvabilitas dan deteksi manipulasi. Contoh paling jelas ya WorldCom: selisih CFO dikurangi CFI yang terus negatif (sampai bikin "lubang" $12 miliar) udah ngasih tanda bahaya jauh sebelum laba bersih dan CFO yang dipoles lewat kapitalisasi beban itu ambruk. Pola yang sama keliatan di industri otomotif, pas GM ngelaporin CFO $7,6 miliar yang sebenernya cuma $3,5 miliar kalau piutang dealer dianggap operasi. Di praktik valuasi, FCF yang didiskontoin pakai WACC jadi tulang punggung penilaian saham — persis logika nilai intrinsik yang dianjurin Buffett. Jadi baik analis kredit maupun investor harusnya nyusun ulang arus kasnya dulu, jangan langsung ditelan mentah-mentah.</w:t>
+        <w:t>Penerapan SCF paling terasa dalam analisis solvabilitas dan deteksi manipulasi. Contoh paling jelas adalah WorldCom. Selisih CFO dikurangi CFI yang terus negatif, hingga membentuk defisit kumulatif $12 miliar, sudah memberi tanda bahaya jauh sebelum laba bersih dan CFO yang dipoles lewat kapitalisasi beban itu runtuh. Pola serupa terlihat pada industri otomotif, ketika GM melaporkan CFO $7,6 miliar yang sebenarnya hanya $3,5 miliar seandainya piutang dealer digolongkan operasi. Dalam praktik valuasi, FCF yang didiskontokan dengan WACC menjadi tulang punggung penilaian saham, persis seperti logika nilai intrinsik yang dianjurkan Buffett. Karena itu, baik analis kredit maupun investor sebaiknya menyusun ulang arus kas terlebih dahulu, bukan menerimanya begitu saja.</w:t>
       </w:r>
     </w:p>
     <w:p>
@@ -3218,7 +3218,7 @@
           <w:i w:val="0"/>
           <w:sz w:val="24"/>
         </w:rPr>
-        <w:t>Materi ini nyambung ke beberapa mata kuliah sekaligus. Di analisis laporan keuangan, SCF ngasih dasar rasio likuiditas dan kualitas laba yang lebih bisa dipercaya daripada rasio dari neraca. Di manajemen keuangan, konsep FCF, NOPLAT, NPV, dan WACC itu jembatan langsung ke teori penilaian dan penganggaran modal — bahkan definisi FCF di bab ini sama persis sama yang dipakai di corporate valuation. Di audit, masalah nonartikulasi dan ruang klasifikasi jadi area berisiko yang butuh pengujian lebih dalam, soalnya di situlah manajemen punya celah buat ngebingkai ulang kinerjanya.</w:t>
+        <w:t>Materi ini berkaitan dengan beberapa mata kuliah sekaligus. Dalam analisis laporan keuangan, SCF menyediakan dasar rasio likuiditas dan kualitas laba yang lebih dapat diandalkan daripada rasio dari neraca. Dalam manajemen keuangan, konsep FCF, NOPLAT, NPV, dan WACC menjadi jembatan langsung menuju teori penilaian dan penganggaran modal. Bahkan definisi FCF di bab ini sama dengan yang dipakai dalam corporate valuation. Dalam audit, masalah nonartikulasi dan ruang klasifikasi menjadi area berisiko yang menuntut pengujian lebih mendalam, sebab di titik itulah manajemen memiliki celah untuk membingkai ulang kinerjanya.</w:t>
       </w:r>
     </w:p>
     <w:p>
@@ -3248,7 +3248,7 @@
           <w:i w:val="0"/>
           <w:sz w:val="24"/>
         </w:rPr>
-        <w:t>Kelebihan SCF cukup nyata: dia ngurangin kesewenang-wenangan dalam ngukur laba, bikin perusahaan lebih bisa dibandingin, dan ngasih dasar yang relatif kuat buat nilai likuiditas dan daya ramal. Tapi keterbatasannya jangan ditutup-tutupi. Nonartikulasi bikin SCF metode tidak langsung keliatan nggak nyambung sama neraca di 75 persen kasus. Ruang klasifikasi yang dibiarin SFAS No. 95 — bunga yang proprietary, kelonggaran IAS 7, empat metode premium, lindung nilai SFAS No. 104 — bikin perusahaan sejenis bisa nampilin gambaran yang kebalik, jadi janji keterbandingan tadi ikut luntur. FCF sendiri, walau populer buat valuasi, statusnya non-GAAP: nggak terstandar, nggak bisa diambil langsung dari SCF, dan definisinya bisa beda-beda antarperusahaan. Jadi intinya, SCF unggul di hal yang lebih objektif (kas), tapi tetap kebawa masalah alokasi dan klasifikasi yang sebenernya pengen dia hindari.</w:t>
+        <w:t>Kelebihan SCF cukup nyata. SCF mengurangi kesewenang-wenangan dalam mengukur laba, memperbaiki keterbandingan antarperusahaan, dan memberi dasar yang relatif kuat untuk menilai likuiditas dan daya prediksi. Namun, keterbatasannya tidak boleh ditutupi. Nonartikulasi membuat SCF metode tidak langsung terlihat tidak sejalan dengan neraca pada 75 persen kasus. Ruang klasifikasi yang dibiarkan SFAS No. 95, mulai dari bunga yang diperlakukan secara proprietary, kelonggaran IAS 7, empat metode premium, hingga lindung nilai SFAS No. 104, memungkinkan perusahaan sejenis menampilkan gambaran yang berlawanan, sehingga keterbandingan yang dijanjikan ikut berkurang. FCF sendiri, meski populer untuk valuasi, berstatus non-GAAP. Artinya, FCF tidak terstandar, tidak dapat diambil langsung dari SCF, dan rentan terhadap perbedaan definisi antarperusahaan. Jadi, SCF unggul pada hal yang lebih objektif, yaitu kas, tetapi tetap mewarisi masalah alokasi dan klasifikasi yang sebenarnya ingin dihindarinya.</w:t>
       </w:r>
     </w:p>
     <w:p>
@@ -3278,7 +3278,7 @@
           <w:i w:val="0"/>
           <w:sz w:val="24"/>
         </w:rPr>
-        <w:t>Kalau ditarik dari semua pembahasan, SCF itu pada dasarnya versi khusus dari SCFP, bedanya "dana" diartikan sebagai kas, dan dia tetap berupa laporan turunan yang nyusun ulang data laba rugi dan neraca ke dalam tiga bagian: operasi, investasi, dan pendanaan. Pesan utamanya, yang nentuin nasib dan nilai perusahaan itu kas, bukan laba akrual, makanya SCF hadir buat ngeredam kesewenang-wenangan dalam ngukur laba sekaligus bikin laporan lebih bisa dibandingin dan lebih bisa diandalkan buat meramal. Manfaatnya jalan ke dua arah: buat pengguna luar, dia jadi dasar nilai likuiditas, fleksibilitas keuangan, dan kualitas laba; buat analis valuasi, dia jadi titik awal ngitung free cash flow yang didiskontoin pakai biaya modal. Di praktik, manfaat ini keliatan di analisis solvabilitas dan deteksi kecurangan — kasus WorldCom dan industri otomotif nunjukin bahwa baca SCF secara utuh, lintas tiga bagiannya, bisa nyingkap tekanan kas yang ngumpet di balik laba yang keliatan sehat. Tapi bab ini juga ngajarin kita buat rendah hati: nonartikulasi, ruang klasifikasi SFAS No. 95, dan sifat non-GAAP dari FCF bikin klaim objektivitas SCF ada batasnya. Sumbangan terbesarnya buat ilmu akuntansi adalah penegasan bahwa laporan berbasis kas dan berbasis akrual itu saling melengkapi, bukan saling gantiin, dan bahwa bagus-tidaknya sebuah standar diukur bukan dari selengkap apa, tapi dari seberapa jauh dia ngebatasin celah yang bisa nyesatin pengguna (Wolk et al., 2017).</w:t>
+        <w:t>Dari seluruh pembahasan, dapat disimpulkan bahwa SCF pada dasarnya adalah bentuk khusus dari SCFP dengan dana diartikan sebagai kas. SCF tetap berupa laporan turunan yang menyusun ulang data laba rugi dan neraca ke dalam tiga bagian, yaitu operasi, investasi, dan pendanaan. Pesan utamanya, kaslah yang menentukan kelangsungan dan nilai perusahaan, bukan laba akrual. Karena itu, SCF hadir untuk meredam kesewenang-wenangan dalam mengukur laba sekaligus meningkatkan keterbandingan dan daya prediksi. Manfaatnya berjalan ke dua arah. Bagi pengguna luar, SCF menjadi dasar untuk menilai likuiditas, fleksibilitas keuangan, dan kualitas laba. Bagi analis valuasi, SCF menjadi titik awal menghitung free cash flow yang didiskontokan dengan biaya modal. Dalam praktik, manfaat itu terlihat pada analisis solvabilitas dan deteksi kecurangan. Kasus WorldCom dan industri otomotif menunjukkan bahwa membaca SCF secara utuh, lintas ketiga bagiannya, dapat menyingkap tekanan kas yang tersembunyi di balik laba yang tampak sehat. Namun, bab ini juga mengajarkan sikap rendah hati. Nonartikulasi, ruang klasifikasi SFAS No. 95, dan sifat non-GAAP dari FCF membatasi klaim objektivitas SCF. Sumbangan terbesarnya bagi ilmu akuntansi adalah penegasan bahwa pelaporan berbasis kas dan berbasis akrual saling melengkapi, bukan saling menggantikan. Bab ini juga menegaskan bahwa mutu sebuah standar diukur bukan dari kelengkapannya semata, melainkan dari sejauh mana ia membatasi celah yang dapat menyesatkan pengguna (Wolk et al., 2017).</w:t>
       </w:r>
     </w:p>
     <w:p>
@@ -3318,7 +3318,7 @@
           <w:i w:val="0"/>
           <w:sz w:val="24"/>
         </w:rPr>
-        <w:t xml:space="preserve">Kenapa FASB lewat SFAS No. 95 (1987) akhirnya ngeartiin "dana" sebagai kas dan ngegantiin SCFP, dan apa tiga kelemahan modal kerja bersih sebagai ukuran likuiditas? </w:t>
+        <w:t xml:space="preserve">Mengapa FASB melalui SFAS No. 95 (1987) akhirnya mendefinisikan dana sebagai kas dan menggantikan SCFP, dan apa tiga kelemahan modal kerja bersih sebagai ukuran likuiditas? </w:t>
       </w:r>
       <w:r>
         <w:rPr>
@@ -3327,7 +3327,7 @@
           <w:i/>
           <w:sz w:val="24"/>
         </w:rPr>
-        <w:t>Jawaban: karena kas jauh lebih gampang dibaca. Modal kerja bersih dianggap lemah soalnya ada beban dan kredit tangguhan yang nggak ada urusannya sama kas, siklus operasinya bisa lebih dari setahun, dan persediaan dicatat pakai biaya jadi nggak nunjukin potensi kasnya.</w:t>
+        <w:t>Jawaban: karena kas jauh lebih jelas untuk dibaca. Modal kerja bersih dinilai lemah karena memuat beban dan kredit tangguhan yang tidak berkaitan dengan kas, mengandaikan siklus operasi yang bisa lebih dari setahun, dan menilai persediaan berdasarkan biaya sehingga tidak menunjukkan potensi kasnya.</w:t>
       </w:r>
     </w:p>
     <w:p>
@@ -3352,7 +3352,7 @@
           <w:i w:val="0"/>
           <w:sz w:val="24"/>
         </w:rPr>
-        <w:t xml:space="preserve">Apa itu pembagian tiga arah dalam SCF, dan apa isi keberatan tiga anggota FASB? </w:t>
+        <w:t xml:space="preserve">Apa yang dimaksud pembagian tiga arah dalam SCF, dan apa isi keberatan tiga anggota FASB? </w:t>
       </w:r>
       <w:r>
         <w:rPr>
@@ -3361,7 +3361,7 @@
           <w:i/>
           <w:sz w:val="24"/>
         </w:rPr>
-        <w:t>Jawaban: SCF ngebagi arus kas ke aktivitas operasi, investasi, dan pendanaan. Tiga anggota yang nolak berpendapat bunga dan dividen yang diterima itu sebenernya investasi, dan bunga yang dibayar itu pendanaan, bukan operasi.</w:t>
+        <w:t>Jawaban: SCF menggolongkan arus kas ke dalam aktivitas operasi, investasi, dan pendanaan. Tiga anggota yang menolak berpendapat bunga dan dividen yang diterima sebenarnya investasi, dan bunga yang dibayar adalah pendanaan, bukan operasi.</w:t>
       </w:r>
     </w:p>
     <w:p>
@@ -3386,7 +3386,7 @@
           <w:i w:val="0"/>
           <w:sz w:val="24"/>
         </w:rPr>
-        <w:t xml:space="preserve">Apa beda metode langsung dan tidak langsung, dan kenapa kebanyakan perusahaan Amerika milih metode tidak langsung padahal FASB lebih suka yang langsung? </w:t>
+        <w:t xml:space="preserve">Apa beda metode langsung dan tidak langsung, dan mengapa sebagian besar perusahaan Amerika memilih metode tidak langsung meski FASB lebih menyukai yang langsung? </w:t>
       </w:r>
       <w:r>
         <w:rPr>
@@ -3395,7 +3395,7 @@
           <w:i/>
           <w:sz w:val="24"/>
         </w:rPr>
-        <w:t>Jawaban: metode langsung ngelaporin arus kas apa adanya dan lebih informatif tapi mahal dibuat, sedangkan metode tidak langsung nyocokin laba akrual ke kas dan lebih murah — itu alasan dia dominan. Studi McEnroe malah nemu 56 persen pengguna milih metode langsung, 44 persen tidak langsung.</w:t>
+        <w:t>Jawaban: metode langsung melaporkan arus kas apa adanya dan lebih informatif tetapi mahal disusun, sedangkan metode tidak langsung mencocokkan laba akrual dengan kas dan lebih murah, sehingga lebih dominan. Studi McEnroe justru menemukan 56 persen pengguna memilih metode langsung dan 44 persen metode tidak langsung.</w:t>
       </w:r>
     </w:p>
     <w:p>
@@ -3420,7 +3420,7 @@
           <w:i w:val="0"/>
           <w:sz w:val="24"/>
         </w:rPr>
-        <w:t xml:space="preserve">Apa itu masalah nonartikulasi, siapa yang nelitiinnya, dan apa tiga penyebab utamanya? </w:t>
+        <w:t xml:space="preserve">Apa itu masalah nonartikulasi, siapa yang menelitinya, dan apa tiga penyebab utamanya? </w:t>
       </w:r>
       <w:r>
         <w:rPr>
@@ -3429,7 +3429,7 @@
           <w:i/>
           <w:sz w:val="24"/>
         </w:rPr>
-        <w:t>Jawaban: keadaan pas penyesuaian modal kerja di bagian operasi nggak sama dengan perubahan akun neraca, yang ditemuin Bahnson, Miller &amp; Budge di 75 persen sampel. Penyebabnya: akuisisi tengah tahun, transaksi modal kerja yang nggak nyentuh kas, dan satu akun utang usaha yang dipakai bareng buat pembelian operasi maupun investasi.</w:t>
+        <w:t>Jawaban: keadaan ketika penyesuaian modal kerja di bagian operasi tidak sama dengan perubahan akun neraca, yang ditemukan Bahnson, Miller, dan Budge pada 75 persen sampel. Penyebabnya adalah akuisisi tengah tahun, transaksi modal kerja yang tidak melibatkan kas, dan satu akun utang usaha yang dipakai bersama untuk pembelian operasi maupun investasi.</w:t>
       </w:r>
     </w:p>
     <w:p>
@@ -3454,7 +3454,7 @@
           <w:i w:val="0"/>
           <w:sz w:val="24"/>
         </w:rPr>
-        <w:t xml:space="preserve">Tulis rumus free cash flow dan jelasin kenapa FCF nggak bisa diambil langsung dari SCF. </w:t>
+        <w:t xml:space="preserve">Tuliskan rumus free cash flow dan jelaskan mengapa FCF tidak dapat diambil langsung dari SCF. </w:t>
       </w:r>
       <w:r>
         <w:rPr>
@@ -3463,7 +3463,7 @@
           <w:i/>
           <w:sz w:val="24"/>
         </w:rPr>
-        <w:t>Jawaban: FCF = NOPLAT − investasi pada modal terinvestasi operasi. Nggak bisa langsung soalnya CFO masih ngandung beban bunga pendanaan dan nggak nganggep kenaikan kas operasi sebagai investasi, jadi perlu disesuaikan — tambah bunga setelah pajak, kurangi kenaikan kas operasi, terus tambahin CFI.</w:t>
+        <w:t>Jawaban: FCF sama dengan NOPLAT dikurangi investasi pada modal terinvestasi operasi. FCF tidak dapat diambil langsung karena CFO masih mengandung beban bunga pendanaan dan tidak memperlakukan kenaikan kas operasi sebagai investasi, sehingga perlu disesuaikan dengan menambah bunga setelah pajak, mengurangi kenaikan kas operasi, lalu menambahkan CFI.</w:t>
       </w:r>
     </w:p>
     <w:p>
@@ -3488,7 +3488,7 @@
           <w:i w:val="0"/>
           <w:sz w:val="24"/>
         </w:rPr>
-        <w:t xml:space="preserve">Pakai kasus WorldCom, jelasin kenapa SCF harus dibaca utuh dan jangan berhenti di arus kas operasi aja. </w:t>
+        <w:t xml:space="preserve">Dengan kasus WorldCom, jelaskan mengapa SCF harus dibaca secara utuh dan tidak berhenti pada arus kas operasi saja. </w:t>
       </w:r>
       <w:r>
         <w:rPr>
@@ -3497,7 +3497,7 @@
           <w:i/>
           <w:sz w:val="24"/>
         </w:rPr>
-        <w:t>Jawaban: WorldCom ngapitalisasi beban operasi jadi CFO-nya ngegelembung dan laba bersih keliatan meyakinkan. Tapi selisih CFO dikurangi CFI yang terus negatif nyingkap "lubang" kumulatif $12 miliar per 31 Desember 2001 — tanda yang cuma keliatan kalau ketiga bagian SCF dibaca barengan.</w:t>
+        <w:t>Jawaban: WorldCom mengapitalisasi beban operasi sehingga CFO membengkak dan laba bersih tampak meyakinkan. Namun selisih CFO dikurangi CFI yang terus negatif menyingkap defisit kumulatif $12 miliar pada 31 Desember 2001, tanda yang hanya terlihat bila ketiga bagian SCF dibaca bersama.</w:t>
       </w:r>
     </w:p>
     <w:p>
@@ -3522,7 +3522,7 @@
           <w:i w:val="0"/>
           <w:sz w:val="24"/>
         </w:rPr>
-        <w:t xml:space="preserve">Kenapa klasifikasi bunga dan dividen nunjukin ketegangan antara proprietary theory dan entity theory, dan gimana sikap IAS 7? </w:t>
+        <w:t xml:space="preserve">Mengapa klasifikasi bunga dan dividen menunjukkan ketegangan antara proprietary theory dan entity theory, dan bagaimana sikap IAS 7? </w:t>
       </w:r>
       <w:r>
         <w:rPr>
@@ -3531,7 +3531,7 @@
           <w:i/>
           <w:sz w:val="24"/>
         </w:rPr>
-        <w:t>Jawaban: SFAS No. 95 berorientasi proprietary jadi bunga dan dividen masuk operasi, sedangkan entity theory ngegolongin keduanya investasi atau pendanaan. IAS 7 lebih santai — boleh operasi, investasi, atau pendanaan, asalkan konsisten dari tahun ke tahun.</w:t>
+        <w:t>Jawaban: SFAS No. 95 berorientasi proprietary sehingga bunga dan dividen masuk ke operasi, sedangkan entity theory menggolongkannya sebagai investasi atau pendanaan. IAS 7 bersikap lebih lentur, yaitu membolehkan klasifikasi operasi, investasi, atau pendanaan asalkan konsisten dari tahun ke tahun.</w:t>
       </w:r>
     </w:p>
     <w:p>

</xml_diff>